<commit_message>
The function has been completed, with grab data  from the geekdaxue website.
</commit_message>
<xml_diff>
--- a/架构整洁之道中文版 - Clean Architecture.docx
+++ b/架构整洁之道中文版 - Clean Architecture.docx
@@ -129,7 +129,7 @@
         <w:br/>
         <w:t>It struck me then that this was nonsense; every line of code contains at least one design decision, and therefore anyone who writes code has a much greater impact on the quality of the software than a PowerPoint jockey like me ever could.</w:t>
         <w:br/>
-        <w:t>这让我无比受挫，每一行代码本身都至少包含了一条设计决策，任何一个写代码的家伙对软件质量的影响都远在我这个 PowerPoint 专业户之上。</w:t>
+        <w:t>这让我无比受挫，每一行代码本身都至少包含了一条设计决策，任何一个写代码的家伙对软件质量的影响都远在我这个 PowerPoint 专业户之上。编程</w:t>
         <w:br/>
         <w:t>And then, thankfully, the Agile Software Development revolution arrived and put architects like me out of our misery. I’m a programmer. I like programming. And the best way I’ve found to have a positive impact on code is to write it.</w:t>
         <w:br/>
@@ -141,7 +141,7 @@
         <w:br/>
         <w:t>Development teams were set free to focus on what matters and to concentrate their efforts on things that add value. Instead of waiting weeks or months for a Big Architecture document so they could dutifully ignore it and write the code they were going to write anyway, teams could just agree to a test with their customer, have a quick design session to get their bearings, and then write the code they were going to write anyway.</w:t>
         <w:br/>
-        <w:t>现在！开发团队可以自由地专注于真正重要的内容，并思考如何为他们所做的事情添加更多价值了。也就是说，他们现在再也不需要浪费几周或几个月的时间等待那些大型架构的设计文档了，他们可以名正言顺地忽略这些设计，直接按照自己的想法编写代码。然后，开发团队只需要安排客户直接参与测试，并在快速设计会议上得到用户的支持，然后他们就可以继续写代码了。</w:t>
+        <w:t>现在！开发团队可以自由地专注于真正重要的内容，并思考如何为他们所做的事情添加更多价值了。也就是说，他们现在再也不需要浪费几周或几个月的时间等待那些大型架构的设计文档了，他们可以名正言顺地忽略这些设计，直接按照自己的想法编写代码。然后，开发团队只需要安排客户直接参与测试，并在快速设计会议上得到用户的支持，然后他们就可以继续写代码了。图书与文学</w:t>
         <w:br/>
         <w:t>The Big Architecture dinosaurs were gone, and small, nimble Just-Enough-Design-Up-Front-with-Plenty-of-Refactoring mammals replaced us. Software architecture became responsive.</w:t>
         <w:br/>
@@ -155,7 +155,7 @@
         <w:br/>
         <w:t>把架构设计工作交给程序员的问题就是，程序员必须学会像架构师一样思考问题。事实证明，我们在大型架构时代学到的东西也并非一文不值。其设计软件结构的方法依然在我们保持软件的适应和扩展能力方面有着深远的影响，即使在短期开发中也是如此。</w:t>
         <w:br/>
-        <w:t>Every design decision needs to leave the door open for future changes. Like playing pool, each shot isn’t just about sinking that ball; it’s also about lining up the next shot. Writing working code that doesn’t block future code is a non-trivial skillset. It takes years to master.</w:t>
+        <w:t>Every design decision needs to leave the door open for future changes. Like playing pool, each shot isn’t just about sinking that ball; it’s also about lining up the next shot. Writing working code that doesn’t block future code is a non-trivial skillset. It takes years to master.软件</w:t>
         <w:br/>
         <w:t>我们的每一项设计决策都必须为未来的变化敞开大门。就像打台球一样，我们的每一杆击球都不只是为了要把球打进洞里，它也事关下一杆击球时所在的位置。让我们现在编写的代码不对未来的代码产生阻碍是一项非常重要的技能，通常需要花费多年的时间才能掌握。</w:t>
         <w:br/>
@@ -173,7 +173,7 @@
         <w:br/>
         <w:t>Now you’ve seen how it’s possible to write code that delivers value today without blocking future value tomorrow; the onus is on you to put in the practice so you can apply these principles to your own code.</w:t>
         <w:br/>
-        <w:t>现在，你们也看到了如何才能写出既能提供当前价值，又不会阻碍未来价值的代码，期待你们也能亲自实践这些设计原则，并将其应用到自己的代码中。</w:t>
+        <w:t>现在，你们也看到了如何才能写出既能提供当前价值，又不会阻碍未来价值的代码，期待你们也能亲自实践这些设计原则，并将其应用到自己的代码中。开发工具</w:t>
         <w:br/>
         <w:t>Like riding a bicycle, you can’t master software design just by reading about it. To get the best from a book like this, you need to get practical. Analyze your code and look for the kinds of problems Bob highlights, then practice refactoring the code to fix these problems. If you’re new to the refactoring discipline, then this will be a doubly valuable experience.</w:t>
         <w:br/>
@@ -181,7 +181,7 @@
         <w:br/>
         <w:t>Learn how you can incorporate design principles and Clean Architecture into your development processes, so that new code is less likely to cause pain. For example, if you’re doing TDD, make a point of having a little design review after passing each test, and clean up as you go. (It’s way cheaper than fixing bad designs later.) Perhaps, before you commit code, ask a colleague to review it with you. And look into the possibility of adding a code “quality gate” to your build pipeline as a last line of defense against unclean architecture. (And if you don’t have a build pipeline, maybe it’s time to create one?)</w:t>
         <w:br/>
-        <w:t>我们得学会将书中的这些设计原则以及整洁架构融入自己的开发过程中，这可以大大减少新代码给我们带来的麻烦。例如，如果我们现在正在进行一次测试驱动的开发（TDD），就可以在每一次测试之后做一些设计审查，并及时整理我们的设计（这比事后再修复这些不良设计要省时省力得多）。或者，在提交代码之前，我们也可以邀请同事一起审查代码。另外，我们也可以研究在构建软件的管道中引入一些代码的“质量把关”机制，以作为防止架构设计不够清晰分明的最后一道防线。（如果你还没有设置构建软件的管道，现在是否可以考虑设置一个了？）</w:t>
+        <w:t>我们得学会将书中的这些设计原则以及整洁架构融入自己的开发过程中，这可以大大减少新代码给我们带来的麻烦。例如，如果我们现在正在进行一次测试驱动的开发（TDD），就可以在每一次测试之后做一些设计审查，并及时整理我们的设计（这比事后再修复这些不良设计要省时省力得多）。或者，在提交代码之前，我们也可以邀请同事一起审查代码。另外，我们也可以研究在构建软件的管道中引入一些代码的“质量把关”机制，以作为防止架构设计不够清晰分明的最后一道防线。（如果你还没有设置构建软件的管道，现在是否可以考虑设置一个了？）图书与文学</w:t>
         <w:br/>
         <w:t>Most important of all is to talk about Clean Architecture. Talk about it with your team. Talk about it with the wider developer community. Quality is everybody’s business, and it’s important to reach a consensus about the difference between good and bad architecture.</w:t>
         <w:br/>
@@ -191,7 +191,7 @@
         <w:br/>
         <w:t>我们必须意识到，大部分的软件开发者是没有太多架构意识的。就像 25 年前的我一样，是更有经验的开发者让我了解了架构。一旦我们一头扎进了整洁架构中，就会花时间围绕着它思考问题，并玩转它。</w:t>
         <w:br/>
-        <w:t>While the technology landscape for developers evolves continuously, foundational principles like the ones described here rarely change. I have little doubt that this is a book that’s going to stay on your shelf for many years after your copy of Lean JSON Cloud NoSQL for Dummies has ended up in a yard sale. I hope it does for your Design Fu what Bob’s original papers did for mine.</w:t>
+        <w:t>While the technology landscape for developers evolves continuously, foundational principles like the ones described here rarely change. I have little doubt that this is a book that’s going to stay on your shelf for many years after your copy of Lean JSON Cloud NoSQL for Dummies has ended up in a yard sale. I hope it does for your Design Fu what Bob’s original papers did for mine.软件</w:t>
         <w:br/>
         <w:t>虽然开发者所在的技术环境一直在不断地发展，但本书所讨论的这些基本设计原则几乎不会发生变化。我一点都不怀疑在你们把 Lean JSON Cloud NoSQL for Dummies 当废纸卖掉很多年之后，这本书会还留在你们的书架上。我希望这本书会 对你们有很大的帮助，就像 Bob 那篇原创论文对我的帮助一样。</w:t>
         <w:br/>
@@ -260,201 +260,1983 @@
         <w:br/>
         <w:t>THE GOAL? 目标是什么</w:t>
         <w:br/>
+        <w:t>And the goal of those decisions? The goal of good software design? That goal is nothing less than my utopian description:</w:t>
+        <w:br/>
+        <w:t>所有这些决策的终极目标是什么呢？ 一个好的软件设计的终极目标是什么呢？就像我之前描述过的：</w:t>
+        <w:br/>
+        <w:t>The goal of software architecture is to minimize the human resources required to build and maintain the required system.</w:t>
+        <w:br/>
+        <w:t>软件架构的终极目标是，用最小的人力成本来满足构建和维护该系统的需求。</w:t>
+        <w:br/>
+        <w:t>The measure of design quality is simply the measure of the effort required to meet the needs of the customer. If that effort is low, and stays low throughout the lifetime of the system, the design is good. If that effort grows with each new release, the design is bad. It’s as simple as that.</w:t>
+        <w:br/>
+        <w:t>一个软件架构的优劣，可以用它满足用户需求所需要的成本来衡量。如果该成本很低，并且在系统的整个生命周期内一直都能维持这样的低成本，那么这个系统的设计就是优良的。如果该系统的每次发布都会提升下一次变更的成本，那么这个设计就是不好的。就这么简单。</w:t>
+        <w:br/>
+        <w:t>CASE STUDY 案例分析</w:t>
+        <w:br/>
+        <w:t>As an example, consider the following case study. It includes real data from a real company that wishes to remain anonymous.</w:t>
+        <w:br/>
+        <w:t>下面来看一个真实案例，该案例中的数据均来源于一个要求匿名的真实公司。</w:t>
+        <w:br/>
+        <w:t>First, let’s look at the growth of the engineering staff. I’m sure you’ll agree that this trend is very encouraging. Growth like that shown in Figure 1.1 must be an indication of significant success!</w:t>
+        <w:br/>
+        <w:t>首先，我们来看一下工程师团队规模的增长。你肯定认为这个增长趋势是特别可喜的，像图 1.1 中的这种增长线条一定是公司业务取得巨大成功的直观体现。</w:t>
+        <w:br/>
+        <w:t>Growth of the engineering staff</w:t>
+        <w:br/>
+        <w:t>Reproduced with permission from a slide presentation by Jason Gorman</w:t>
+        <w:br/>
+        <w:t>Now let’s look at the company’s productivity over the same time period, as measured by simple lines of code (Figure 1.2).</w:t>
+        <w:br/>
+        <w:t>现在再让我们来看一下整个公司同期的生产效率（productivity），这里用简单的代码行数作为指标（参见图 1.2）。</w:t>
+        <w:br/>
+        <w:t>Productivity over the same period of time</w:t>
+        <w:br/>
+        <w:t>Clearly something is going wrong here. Even though every release is supported by an ever-increasing number of developers, the growth of the code looks like it is approaching an asymptote.</w:t>
+        <w:br/>
+        <w:t>这明显是有问题的。伴随着产品的每次发布，公司的工程师团队在持续不断地扩展壮大，但是仅从代码行数的增长来看，该产品却正在逐渐陷入困境。</w:t>
+        <w:br/>
+        <w:t>Now here’s the really scary graph: Figure 1.3 shows how the cost per line of code has changed over time.</w:t>
+        <w:br/>
+        <w:t>还有更可怕的：图 1.3 展示的是同期内每行代码的变更成本。</w:t>
+        <w:br/>
+        <w:t>These trends aren’t sustainable. It doesn’t matter how profitable the company might be at the moment: Those curves will catastrophically drain the profit from the business model and drive the company into a stall, if not into a downright collapse.</w:t>
+        <w:br/>
+        <w:t>显然，图中展示的趋势是不可持续的。不管公司现在的利润率有多高，图中线条表明，按这个趋势下去，公司的利润会被一点点榨干，整个公司会因此陷入困境，甚至直接关门倒闭。</w:t>
+        <w:br/>
+        <w:t>What caused this remarkable change in productivity? Why was the code 40 times more expensive to produce in release 8 as opposed to release 1?</w:t>
+        <w:br/>
+        <w:t>究竟是什么因素造成生产力的大幅变化呢？为什么第 8 代产品的构建成本要 比第 1 代产品高 40 倍？</w:t>
+        <w:br/>
+        <w:t>Cost per line of code over time</w:t>
+        <w:br/>
+        <w:t>THE SIGNATURE OF A MESS 乱麻系统的特点</w:t>
+        <w:br/>
+        <w:t>What you are looking at is the signature of a mess. When systems are thrown together in a hurry, when the sheer number of programmers is the sole driver of output, and when little or no thought is given to the cleanliness of the code or the structure of the design, then you can bank on riding this curve to its ugly end.</w:t>
+        <w:br/>
+        <w:t>我们在这里看到的是一个典型的乱麻系统。这种系统一般都是没有经过设计，匆匆忙忙被构建起来的。然后为了加快发布的速度，拼命地往团队里加入新人，同时加上决策层对代码质量提升和设计结构优化存在着持续的、长久的忽视，这种状态能持续下去就怪了。</w:t>
+        <w:br/>
+        <w:t>Figure 1.4 shows what this curve looks like to the developers. They started out at nearly 100% productivity, but with each release their productivity declined. By the fourth release, it was clear that their productivity was going to bottom out in an asymptotic approach to zero.</w:t>
+        <w:br/>
+        <w:t>图 1.4 展示了系统开发者的切身体会。他们一开始的效率都接近 100%，然而伴随着每次产品的发布，他们的生产力直线下降。到了产品的第 4 版本时，很明显大家的生产力已经不可避免地趋近为零了。编程</w:t>
+        <w:br/>
+        <w:t>Productivity by release</w:t>
+        <w:br/>
+        <w:t>From the developers’ point of view, this is tremendously frustrating, because everyone is working hard. Nobody has decreased their effort.</w:t>
+        <w:br/>
+        <w:t>对系统的开发者来说，这会带来很大的挫败感，因为团队中并没有人偷懒，每个人还都是和之前一样在拼命工作。</w:t>
+        <w:br/>
+        <w:t>And yet, despite all their heroics, overtime, and dedication, they simply aren’t getting much of anything done anymore. All their effort has been diverted away from features and is now consumed with managing the mess. Their job, such as it is, has changed into moving the mess from one place to the next, and the next, and the next, so that they can add one more meager little feature.</w:t>
+        <w:br/>
+        <w:t>然而，不管他们投入了多少个人时间，救了多少次火，加了多少次班，他们的产出始终上不去。工程师的大部分时间都消耗在对现有系统的修修补补上，而不是真正完成实际的新功能。这些工程师真正的任务是：拆了东墙补西墙，周而往复，偶尔有精力能顺便实现一点小功能。</w:t>
+        <w:br/>
+        <w:t>THE EXECUTIVE VIEW 管理层视角</w:t>
+        <w:br/>
+        <w:t>If you think that’s bad, imagine what this picture looks like to the executives! Consider Figure 1.5, which depicts monthly development payroll for the same period.</w:t>
+        <w:br/>
+        <w:t>如果你觉得开发者们这样就已经够苦了，那么就再想想公司髙管们的感受吧! 请看图 1.5，该部门月工资同期图。</w:t>
+        <w:br/>
+        <w:t>Monthly development payroll by release</w:t>
+        <w:br/>
+        <w:t>Release 1 was delivered with a monthly payroll of a few hundred thousand dollars. The second release cost a few hundred thousand more. By the eighth release monthly payroll was $20 million, and climbing.</w:t>
+        <w:br/>
+        <w:t>如你所见，产品的第 1 版是在月总工资 10 万美元左右的时候上线的。第 2 版又花掉了几十万美元。当发布第 8 版的时候，部门月工资已经达到了 2 千万美元，而且还在持续上升。</w:t>
+        <w:br/>
+        <w:t>Just this chart alone is scary. Clearly something startling is happening. One hopes that revenues are outpacing costs and therefore justifying the expense. But no matter how you look at this curve, it’s cause for concern.</w:t>
+        <w:br/>
+        <w:t>也许我们可以指望该公司的营收增长远远超出成本增长，这样公司就还能维持正常运转。但是这么惊人的曲线还是值得我们深入挖掘其中存在的巨大问题的。</w:t>
+        <w:br/>
+        <w:t>But now compare the curve in Figure 1.5 with the lines of code written per release in Figure 1.2. That initial few hundred thousand dollars per month bought a lot of functionality—but the final $20 million bought almost nothing! Any CFO would look at these two graphs and know that immediate action is necessary to stave off disaster.</w:t>
+        <w:br/>
+        <w:t>现在，只要将图 1.5 的月工资曲线和图 1.2 的每次发布代码行数曲线对比一下，任何一个理性的 CEO 都会一眼看出其中的问题：最开始的十几万美元工资给公司带来了很多新功能、新收益，而最后的 2 千万美元几乎全打了水漂。应立刻采取行动解决这个问题，刻不容缓。</w:t>
+        <w:br/>
+        <w:t>But which action can be taken? What has gone wrong? What has caused this incredible decline in productivity? What can executives do, other than to stamp their feet and rage at the developers?</w:t>
+        <w:br/>
+        <w:t>但是具体采取什么样的行动才能解决问题呢？究竟问题出在哪里？是什么造成了工程师生产力的直线下降？高管们除了跺脚、发飙，还能做什么呢？</w:t>
+        <w:br/>
+        <w:t>WHAT WENT WRONG? 问题到底在哪里</w:t>
+        <w:br/>
+        <w:t>Nearly 2600 years ago, Aesop told the story of the Tortoise and the Hare. The moral of that story has been stated many times in many different ways:</w:t>
+        <w:br/>
+        <w:t>大约 2600 年前，《伊索寓言》里写到了龟兔赛跑的故事。这个故事的主题思想可以归纳为以下几种：</w:t>
+        <w:br/>
+        <w:t>“Slow and steady wins the race.”</w:t>
+        <w:br/>
+        <w:t>“The race is not to the swift, nor the battle to the strong.”</w:t>
+        <w:br/>
+        <w:t>“The more haste, the less speed.”</w:t>
+        <w:br/>
+        <w:t>慢但是稳，是成功的秘诀。</w:t>
+        <w:br/>
+        <w:t>该比赛并不是拼谁开始跑得快，也不是拼谁更有力气的。</w:t>
+        <w:br/>
+        <w:t>心态越急，反而跑得越慢。</w:t>
+        <w:br/>
+        <w:t>The story itself illustrates the foolishness of overconfidence. The Hare, so confident in its intrinsic speed, does not take the race seriously, and so naps while the Tortoise crosses the finish line.</w:t>
+        <w:br/>
+        <w:t>这个故事本身揭露的是过度自信的愚蠢行为。兔子由于对自己速度的过度自信，没有把乌龟当回事，结果乌龟爬过终点线取得胜利的时候，它还在睡觉。</w:t>
+        <w:br/>
+        <w:t>Modern developers are in a similar race, and exhibit a similar overconfidence. Oh, they don’t sleep—far from it. Most modern developers work their butts off. But a part of their brain does sleep—the part that knows that good, clean, well-designed code matters.</w:t>
+        <w:br/>
+        <w:t>这和现代软件研发工作有点类似，现在的软件研发工程师都有点过于自信。哦，当然，他们确实不会偷懒，一点也不。但是他们真正偷懒的地方在于——持续低估那些好的、良好设计的、整洁的代码的重要性。编程</w:t>
+        <w:br/>
+        <w:t>These developers buy into a familiar lie: “We can clean it up later; we just have to get to market first!” Of course, things never do get cleaned up later, because market pressures never abate. Getting to market first simply means that you’ve now got a horde of competitors on your tail, and you have to stay ahead of them by running as fast as you can.</w:t>
+        <w:br/>
+        <w:t>这些工程师们普遍用一句话来欺骗自己：“我们可以未来再重构代码，产品上线最重要！”但是结果大家都知道，产品上线以后重构工作就再没人提起了。市场的压力永远也不会消退，作为首先上市的产品，后面有无数的竞争对手追赶，必须要比他们跑得更快才能保持领先。</w:t>
+        <w:br/>
+        <w:t>And so the developers never switch modes. They can’t go back and clean things up because they’ve got to get the next feature done, and the next, and the next, and the next. And so the mess builds, and productivity continues its asymptotic approach toward zero.</w:t>
+        <w:br/>
+        <w:t>所以，重构的时机永远不会再有了。工程师们忙于完成新功能，新功能做不完，哪有时间重构老的代码？循环往复，系统成了一团乱麻，主产效率持续直线下降，直至为零。</w:t>
+        <w:br/>
+        <w:t>Just as the Hare was overconfident in its speed, so the developers are overconfident in their ability to remain productive. But the creeping mess of code that saps their productivity never sleeps and never relents. If given its way, it will reduce productivity to zero in a matter of months.</w:t>
+        <w:br/>
+        <w:t>结果就像龟兔赛跑中过于自信的兔子一样，软件研发工程师们对自己保持高产出的能力过于自信了。但是乱成一团的系统代码可没有休息时间，也不会放松。如果不严加提防，在几个月之内，整个研发团队就会陷入困境。</w:t>
+        <w:br/>
+        <w:t>The bigger lie that developers buy into is the notion that writing messy code makes them go fast in the short term, and just slows them down in the long term. Developers who accept this lie exhibit the hare’s overconfidence in their ability to switch modes from making messes to cleaning up messes sometime in the future, but they also make a simple error of fact. The fact is that making messes is always slower than staying clean, no matter which time scale you are using.</w:t>
+        <w:br/>
+        <w:t>工程师们经常相信的另外一个错误观点是： “在工程中容忍糟糕的代码存在可以在短期内加快该工程上线的速度，未来这些代码会造成一些额外的工作量，但是并没有什么大不了。”相信这些鬼话的工程师对自己清理乱麻代码的能力过于自信了。但是更重要的是，他们还忽视了一个自然规律：无论是从短期还是长期来看，胡乱编写代码的工作速度其实比循规蹈矩更慢。</w:t>
+        <w:br/>
+        <w:t>Consider the results of a remarkable experiment performed by Jason Gorman depicted in Figure 1.6. Jason conducted this test over a period of six days. Each day he completed a simple program to convert integers into Roman numerals. He knew his work was complete when his predefined set of acceptance tests passed. Each day the task took a little less than 30 minutes. Jason used a well-known cleanliness discipline named test-driven development (TDD) on the first, third, and fifth days. On the other three days, he wrote the code without that discipline.</w:t>
+        <w:br/>
+        <w:t>图 1.6 展示的是 Jason Gorman 进行的一次为期 6 天的实验。在该实验中，Jaosn 每天都编写一段代码，功能是将一个整数转化为相应罗马数字的字符串。当事先定义好的一个测试集完全通过时，即认为当天工作完成。每天实验的时长不超过 30 分钟。第一天、第三天和第五天，Jason 在编写代码的过程中采用了业界知名的优质代码方法论：测试驱动开发（TDD），而其他三天他则直接从头开始编写代码。</w:t>
+        <w:br/>
+        <w:t>Time to completion by iterations and use/non-use of TDD</w:t>
+        <w:br/>
+        <w:t>First, notice the learning curve apparent in Figure 1.6. Work on the latter days is completed more quickly than the former days. Notice also that work on the TDD days proceeded approximately 10% faster than work on the non-TDD days, and that even the slowest TDD day was faster than the fastest non-TDD day.</w:t>
+        <w:br/>
+        <w:t>首先，我们要关注的是图 1.6 中那些柱状图。很显然，日子越往后，完成工作所需的时间就越少。同时，我们也可以看到当人们采用了 TDD 方法编程后，一般就会比未采用 TDD 方法编程少用 10%的时间，并且采用 TDD 方法编程时最差的一天也比未采用 TDD 方法编程时最好的一天用时要短。</w:t>
+        <w:br/>
+        <w:t>Some folks might look at that result and think it’s a remarkable outcome. But to those who haven’t been deluded by the Hare’s overconfidence, the result is expected, because they know this simple truth of software development:</w:t>
+        <w:br/>
+        <w:t>对于这个结果，有些人可能会觉得挺意外的。但是对常年关注软件开发本质的人来说，它其实揭示了软件开发的一个核心特点：</w:t>
+        <w:br/>
+        <w:t>The only way to go fast, is to go well.</w:t>
+        <w:br/>
+        <w:t>要想跑得快，先要跑得稳。</w:t>
+        <w:br/>
+        <w:t>And that’s the answer to the executive’s dilemma. The only way to reverse the decline in productivity and the increase in cost is to get the developers to stop thinking like the overconfident Hare and start taking responsibility for the mess that they’ve made.</w:t>
+        <w:br/>
+        <w:t>综上所述，管理层扭转局面的唯一选择就是扭转开发者的观念，让他们从过度自信的兔子模式转变回来，为自己构建的乱麻系统负起责任来。编程</w:t>
+        <w:br/>
+        <w:t>The developers may think that the answer is to start over from scratch and redesign the whole system—but that’s just the Hare talking again. The same overconfidence that led to the mess is now telling them that they can build it better if only they can start the race over. The reality is less rosy:</w:t>
+        <w:br/>
+        <w:t>当然，某些软件研发工程师可能会认为挽救一个系统的唯一办法是抛弃现有系统，设计一个全新的系统来替代。但是这里仍然没有逃离过度自信。试问：如果是工程师的过度自信导致了目前的一团乱麻，开始，结果就会更好呢？</w:t>
+        <w:br/>
+        <w:t>Their overconfidence will drive the redesign into the same mess as the original project.</w:t>
+        <w:br/>
+        <w:t>那么，我们有什么理由认为让他们从头第 1 章设计与架构究竟是什么过度自信只会使得重构设计陷入和原项目一样的困局中。</w:t>
+        <w:br/>
+        <w:t>CONCLUSION 本章小结</w:t>
+        <w:br/>
+        <w:t>In every case, the best option is for the development organization to recognize and avoid its own overconfidence and to start taking the quality of its software architecture seriously.</w:t>
+        <w:br/>
+        <w:t>不管怎么看，研发团队最好的选择是清晰地认识并避开工程师们过度自信的特点，开始认真地对待自己的代码架构，对其质量负责。</w:t>
+        <w:br/>
+        <w:t>To take software architecture seriously, you need to know what good software architecture is. To build a system with a design and an architecture that minimize effort and maximize productivity, you need to know which attributes of system architecture lead to that end.</w:t>
+        <w:br/>
+        <w:t>要想提高自己软件架构的质量，就需要先知道什么是优秀的软件架构。而为了在系统构建过程中采用好的设计和架构以便减少构建成本，提高生产力，又需要先了解系统架构的各种属性与成本和生产力的关系。软件</w:t>
+        <w:br/>
+        <w:t>That’s what this book is about. It describes what good clean architectures and designs look like, so that software developers can build systems that will have long profitable lifetimes.</w:t>
+        <w:br/>
+        <w:t>这就是这本书的主题。本书为读者描述了什么是优秀的、整洁的软件架构与设计，读者可以参考这些设计来构建一个长期稳定的、持久优秀的系统。</w:t>
+      </w:r>
+    </w:p>
+    <w:p>
+      <w:pPr>
+        <w:pStyle w:val="Title"/>
+      </w:pPr>
+      <w:r>
+        <w:t>Chap2. 两个价值维度</w:t>
+      </w:r>
+    </w:p>
+    <w:p>
+      <w:r>
+        <w:t>Chap2. A TALE OF TWO VALUES 两个价值维度</w:t>
+        <w:br/>
+        <w:t>BEHAVIOR 行为价值</w:t>
+        <w:br/>
+        <w:t>ARCHITECTURE 架构价值</w:t>
+        <w:br/>
+        <w:t>THE GREATER VALUE 哪个价值维度更重要</w:t>
+        <w:br/>
+        <w:t>EISENHOWER’S MATRIX 艾森豪威尔矩阵</w:t>
+        <w:br/>
+        <w:t>FIGHT FOR THE ARCHITECTURE 为好的软件架构而持续斗争</w:t>
+        <w:br/>
+        <w:t>Chap2. A TALE OF TWO VALUES 两个价值维度</w:t>
+        <w:br/>
+        <w:t>Every software system provides two different values to the stakeholders: behavior and structure. Software developers are responsible for ensuring that both those values remain high. Unfortunately, they often focus on one to the exclusion of the other. Even more unfortunately, they often focus on the lesser of the two values, leaving the software system eventually valueless.</w:t>
+        <w:br/>
+        <w:t>对于每个软件系统，我们都对以通过行为和架构两个维度来休现它的实际价值。软件研发人员应该确保自己的系统在这两个维度上的实际价值都能长时间维持在很高的状态。不幸的是，他们往往只关注一个维度，而忽视了另外一个维度。更不幸的是，他们常常关注的还是错误的维度，这导致了系统的价值最终趋降为零。</w:t>
+        <w:br/>
+        <w:t>BEHAVIOR 行为价值</w:t>
+        <w:br/>
+        <w:t>The first value of software is its behavior. Programmers are hired to make machines behave in a way that makes or saves money for the stakeholders. We do this by helping the stakeholders develop a functional specification, or requirements document. Then we write the code that causes the stakeholder’s machines to satisfy those requirements.</w:t>
+        <w:br/>
+        <w:t>软件系统的行为是其最直观的价值维度。程序员的工作就是让机器按照某种指定方式运转，给系统的使用者创造或者提高利润。程序员们为了达到这个目的，往往需要帮助系统使用者编写一个对系统功能的定义，也就是需求文档。然后，程序员们再把需求文档转化为实际的代码。</w:t>
+        <w:br/>
+        <w:t>When the machine violates those requirements, programmers get their debuggers out and fix the problem.</w:t>
+        <w:br/>
+        <w:t>当机器出现异常行为时，程序员要负责调试，解决这些问题。</w:t>
+        <w:br/>
+        <w:t>Many programmers believe that is the entirety of their job. They believe their job is to make the machine implement the requirements and to fix any bugs. They are sadly mistaken.</w:t>
+        <w:br/>
+        <w:t>大部分程序员认为这就是他们的全部工作。他们的工作是且仅是：按照需求文档编写代码，并且修复任何 Bug。这真是大错特错。</w:t>
+        <w:br/>
+        <w:t>ARCHITECTURE 架构价值</w:t>
+        <w:br/>
+        <w:t>The second value of software has to do with the word “software”—a compound word composed of “soft” and “ware.” The word “ware” means “product”; the word “soft”… Well, that’s where the second value lies.</w:t>
+        <w:br/>
+        <w:t>软件系统的第二个价值维度，就体现在软件这个英文单词上：software。“ware” 的意思是“产品”，而 “soft” 的意思，不言而喻，是指软件的灵活性。</w:t>
+        <w:br/>
+        <w:t>Software was invented to be “soft.” It was intended to be a way to easily change the behavior of machines. If we’d wanted the behavior of machines to be hard to change, we would have called it hardware.</w:t>
+        <w:br/>
+        <w:t>软件系统必须保持灵活。软件发明的目的，就是让我们可以以一种灵活的方式来改变机器的工作行为。对机器上那些很难改变的工作行为，我们通常称之为硬件（hardware）。</w:t>
+        <w:br/>
+        <w:t>To fulfill its purpose, software must be soft—that is, it must be easy to change. When the stakeholders change their minds about a feature, that change should be simple and easy to make. The difficulty in making such a change should be proportional only to the scope of the change, and not to the shape of the change.</w:t>
+        <w:br/>
+        <w:t>为了达到软件的本来目的，软件系统必须够“软” 也就是说，软件应该容易被修改。当需求方改变需求的时候，随之所需的软件变更必须可以简单而方便地实现。变更实施的难度应该和变更的范畴（scope）成等比关系，而与变更的具体形状（shape）无关。</w:t>
+        <w:br/>
+        <w:t>It is this difference between scope and shape that often drives the growth in software development costs. It is the reason that costs grow out of proportion to the size of the requested changes. It is the reason that the first year of development is much cheaper than the second, and the second year is much cheaper than the third.</w:t>
+        <w:br/>
+        <w:t>需求变更的范畴与形状，是决定对应软件变更实施成本高低的关键。这就是为什么有的代码变更的成本与其实现的功能改变不成比例。这也是为什么第二年的研发成本比第一年的高很多，第三年又比第二年更高。</w:t>
+        <w:br/>
+        <w:t>From the stakeholders’ point of view, they are simply providing a stream of changes of roughly similar scope. From the developers’ point of view, the stakeholders are giving them a stream of jigsaw puzzle pieces that they must fit into a puzzle of ever-increasing complexity. Each new request is harder to fit than the last, because the shape of the system does not match the shape of the request.</w:t>
+        <w:br/>
+        <w:t>从系统相关方（Stakeholder）的角度来看，他们所提出的一系列的变更需求的范畴都是类似的，因此成本也应该是固定的。但是从研发者角度来看，系统用户持续不断的变更需求就像是要求他们不停地用一堆不同形状的拼图块，拼成一个新的形状。整个拼图的过程越来越困难，因为现有系统的形状永远和需求的形状不一致.</w:t>
+        <w:br/>
+        <w:t>I’m using the word “shape” here in a unconventional way, but I think the metaphor is apt. Software developers often feel as if they are forced to jam square pegs into round holes.</w:t>
+        <w:br/>
+        <w:t>我们在这里使用了“形状”这个词，这可能不是该词的标准用法，但是其寓意应该很明确。毕竟，软件工程师们经常会觉得自己的工作就是把方螺丝拧到圆螺丝孔里面。</w:t>
+        <w:br/>
+        <w:t>The problem, of course, is the architecture of the system. The more this architecture prefers one shape over another, the more likely new features will be harder and harder to fit into that structure. Therefore architectures should be as shape agnostic are practical.</w:t>
+        <w:br/>
+        <w:t>问题的实际根源当然就是系统的架构设计。如果系统的架构设计偏向某种特定的“形状”，那么新的变更就会越来越难以实施。所以，好的系统架构设计应该尽可能做到与“形状”无关。</w:t>
+        <w:br/>
+        <w:t>THE GREATER VALUE 哪个价值维度更重要</w:t>
+        <w:br/>
+        <w:t>Function or architecture? Which of these two provides the greater value? Is it more important for the software system to work, or is it more important for the software system to be easy to change?</w:t>
+        <w:br/>
+        <w:t>那么，究竟是系统行为更重要，还是系统架构的灵活性更重要？哪个价值更大?系统正常工作更重要，还是系统易于修改更重要？</w:t>
+        <w:br/>
+        <w:t>If you ask the business managers, they’ll often say that it’s more important for the software system to work. Developers, in turn, often go along with this attitude. But it’s the wrong attitude. I can prove that it is wrong with the simple logical tool of examining the extremes.</w:t>
+        <w:br/>
+        <w:t>如果这个问题由业务部门来回答，他们通常认为系统正常工作很重要。系统开发人员常常也就跟随采取了这种态度。但是这种态度是错误的。下面我就用简单的逻辑推导来证明这个态度的错误性。</w:t>
+        <w:br/>
+        <w:t>If you give me a program that works perfectly but is impossible to change, then it won’t work when the requirements change, and I won’t be able to make it work. Therefore the program will become useless.</w:t>
+        <w:br/>
+        <w:t>If you give me a program that does not work but is easy to change, then I can make it work, and keep it working as requirements change. Therefore the program will remain continually useful.</w:t>
+        <w:br/>
+        <w:t>如果某程序可以正常工作，但是无法修改，那么当需求变更的时候它就不再能够正常工作了，我们也无法通过修改让它能继续正常工作。因此，这个程序的价值将成为 0。</w:t>
+        <w:br/>
+        <w:t>如果某程序目前无法正常工作，但是我们可以很容易地修改它，那么将它改好，并且随着需求变化不停地修改它，都应该是很容易的事。因此，这个程序会持续产生价值。</w:t>
+        <w:br/>
+        <w:t>You may not find this argument convincing. After all, there’s no such thing as a program that is impossible to change. However, there are systems that are practically impossible to change, because the cost of change exceeds the benefit of change. Many systems reach that point in some of their features or configurations.</w:t>
+        <w:br/>
+        <w:t>当然，上面的逻辑论断可能不足以说服大家，修改的。但是，现实中有一些系统确实无法更改，因为其变更实施的成本会远远超过变更带来的价值。你在实际工作中一定遇到过很多这样的例了。</w:t>
+        <w:br/>
+        <w:t>If you ask the business managers if they want to be able to make changes, they’ll say that of course they do, but may then qualify their answer by noting that the current functionality is more important than any later flexibility. In contrast, if the business managers ask you for a change, and your estimated costs for that change are unaffordably high, the business managers will likely be furious that you allowed the system to get to the point where the change was impractical.</w:t>
+        <w:br/>
+        <w:t>如果你问业务部门，是否想要能够变更需求，他们的回答一般是肯定的，而且他们会增加一句：完成现在的功能比实现未来的灵活度更重要。但讽刺的是，如果事后业务部门提出了一项需求，而你的预估工作量大大超出他们的预期，这帮家伙通常会对你放任系统混乱到无法变更的状态而勃然大怒。</w:t>
+        <w:br/>
+        <w:t>EISENHOWER’S MATRIX 艾森豪威尔矩阵</w:t>
+        <w:br/>
+        <w:t>Consider President Dwight D. Eisenhower’s matrix of importance versus urgency (Figure 2.1). Of this matrix, Eisenhower said:</w:t>
+        <w:br/>
+        <w:t>我们来看美国前总统艾森豪威尔的紧急/重要矩阵（参见图 2.1），面对这个矩阵，艾森豪威尔曾说道：</w:t>
+        <w:br/>
+        <w:t>I have two kinds of problems, the urgent and the important. The urgent are not important, and the important are never urgent.1</w:t>
+        <w:br/>
+        <w:t>我有两种难题：紧急的和重要的，而紧急的难题永远是不重要的，重要的难题永远是不紧急的。</w:t>
+        <w:br/>
+        <w:t>Eisenhower matrix</w:t>
+        <w:br/>
+        <w:t>There is a great deal of truth to this old adage. Those things that are urgent are rarely of great importance, and those things that are important are seldom of great urgency.</w:t>
+        <w:br/>
+        <w:t>虽然老调重弹，但其中的道理依然成立。确实，紧急的事情常常没那么重要，而重要的事情则似乎永远也排不上优先级。</w:t>
+        <w:br/>
+        <w:t>The first value of software—behavior—is urgent but not always particularly important.</w:t>
+        <w:br/>
+        <w:t>软件系统的第一个价值维度：系统行为，是紧急的，但是并不总是特别重要。</w:t>
+        <w:br/>
+        <w:t>The second value of software—architecture—is important but never particularly urgent.</w:t>
+        <w:br/>
+        <w:t>软件系统的第二个价值维度：系统架构，是重要的，但是并不总是特别紧急。</w:t>
+        <w:br/>
+        <w:t>Of course, some things are both urgent and important. Other things are not urgent and not important. Ultimately, we can arrange these four couplets into priorities:</w:t>
+        <w:br/>
+        <w:t>当然，我们会有些重要且紧急的事情，也会有一些事情不重要也不紧急。最终我们应将这四类事情进行如下排序：</w:t>
+        <w:br/>
+        <w:t>Urgent and important</w:t>
+        <w:br/>
+        <w:t>Not urgent and important</w:t>
+        <w:br/>
+        <w:t>Urgent and not important</w:t>
+        <w:br/>
+        <w:t>Not urgent and not important</w:t>
+        <w:br/>
+        <w:t>重要且紧急</w:t>
+        <w:br/>
+        <w:t>重要不紧急</w:t>
+        <w:br/>
+        <w:t>不重要但紧急</w:t>
+        <w:br/>
+        <w:t>不重要且不紧急</w:t>
+        <w:br/>
+        <w:t>Note that the architecture of the code—the important stuff—is in the top two positions of this list, whereas the behavior of the code occupies the first and third positions.</w:t>
+        <w:br/>
+        <w:t>在这里你可以看到，软件的系统架构——那些重要的事情——占据了该列表的前两位，而系统行为——那些紧急的事情——只占据了第一和第三位。</w:t>
+        <w:br/>
+        <w:t>The mistake that business managers and developers often make is to elevate items in position 3 to position 1. In other words, they fail to separate those features that are urgent but not important from those features that truly are urgent and important. This failure then leads to ignoring the important architecture of the system in favor of the unimportant features of the system.</w:t>
+        <w:br/>
+        <w:t>业务部门与研发人员经常犯的共同错误就是将第三优先级的事情提到第一优先级去做。换句话说，他们没有把真正紧急并且重要的功能和紧急但是不重要的功能分开。这个错误导致了重要的事被忽略了，重要的系统架构问题让位给了不重要的系统行为功能。</w:t>
+        <w:br/>
+        <w:t>The dilemma for software developers is that business managers are not equipped to evaluate the importance of architecture. That’s what software developers were hired to do. Therefore it is the responsibility of the software development team to assert the importance of architecture over the urgency of features.</w:t>
+        <w:br/>
+        <w:t>但研发人员还忘了一点，那就是业务部门原本就是没有能力评估系统架构的重要程度的，这本来就应该是研发人员自己的工作职责！所以，平衡系统架构的重要性与功能的紧急程度这件事，是软件研发人员自己的职责。</w:t>
+        <w:br/>
+        <w:t>FIGHT FOR THE ARCHITECTURE 为好的软件架构而持续斗争</w:t>
+        <w:br/>
+        <w:t>Fulfilling this responsibility means wading into a fight—or perhaps a better word is “struggle.” Frankly, that’s always the way these things are done. The development team has to struggle for what they believe to be best for the company, and so do the management team, and the marketing team, and the sales team, and the operations team. It’s always a struggle.</w:t>
+        <w:br/>
+        <w:t>为了做好上述职责，软件团队必须做好斗争的准备——或者说“长期抗争”的准备。现状就是这样。研发团队必须从公司长远利益出发与其他部门抗争，这和管理团队的工作一样，甚至市场团队、销售团队、运营团队都是这样。公司内部的抗争本来就是无止境的。</w:t>
+        <w:br/>
+        <w:t>Effective software development teams tackle that struggle head on. They unabashedly squabble with all the other stakeholders as equals. Remember, as a software developer, you are a stakeholder. You have a stake in the software that you need to safeguard. That’s part of your role, and part of your duty. And it’s a big part of why you were hired.</w:t>
+        <w:br/>
+        <w:t>有成效的软件研发团队会迎难而上，毫不掩饰地与所有其他的系统相关方进行平等的争吵。请记住，作为—名软件开发人员，你也是相关者之一。软件系统的可维护性需要由你来保护，这是你角色的一部分，也是你职责中不可缺少的一部分。公司雇你的很大一部分原因就是需要有人来做这件事。</w:t>
+        <w:br/>
+        <w:t>This challenge is doubly important if you are a software architect. Software architects are, by virtue of their job description, more focused on the structure of the system than on its features and functions. Architects create an architecture that allows those features and functions to be easily developed, easily modified, and easily extended.</w:t>
+        <w:br/>
+        <w:t>如果你是软件架构师，那么这项工作就加倍重要了。软件架构师这一职责本身就应更关注系统的整体结构，而不是具体的功能和系统行为的实现，软件架构师必须创建出一个可以让功能实现起来更容易、修改起来更简单、扩展起来更轻松的软件架构。</w:t>
+        <w:br/>
+        <w:t>Just remember: If architecture comes last, then the system will become ever more costly to develop, and eventually change will become practically impossible for part or all of the system. If that is allowed to happen, it means the software development team did not fight hard enough for what they knew was necessary.</w:t>
+        <w:br/>
+        <w:t>请记住：如果忽视软件架构的价值，系统将会变得越来越难以维护，终会有一天，系统将会变得再也无法修改。如果系统变成了这个样子，那么说明软件开发团队没有和需求方做足够的抗争，没有完成自己应尽的职责。</w:t>
+      </w:r>
+    </w:p>
+    <w:p>
+      <w:pPr>
+        <w:pStyle w:val="Title"/>
+      </w:pPr>
+      <w:r>
+        <w:t>Chap3. 编程范式总览</w:t>
+      </w:r>
+    </w:p>
+    <w:p>
+      <w:r>
+        <w:t>Chap3. PARADIGM OVERVIEW 编程范式总览</w:t>
+        <w:br/>
+        <w:t>STRUCTURED PROGRAMMING 结构化编程</w:t>
+        <w:br/>
+        <w:t>OBJECT-ORIENTED PROGRAMMING 面向对象编程</w:t>
+        <w:br/>
+        <w:t>FUNCTIONAL PROGRAMMING 函数式编程</w:t>
+        <w:br/>
+        <w:t>FOOD FOR THOUGHT 仅供思考</w:t>
+        <w:br/>
+        <w:t>CONCLUSION 本章小结</w:t>
+        <w:br/>
+        <w:t>Chap3. PARADIGM OVERVIEW 编程范式总览</w:t>
+        <w:br/>
+        <w:t>The three paradigms included in this overview chapter are structured programming, object-orient programming, and functional programming.</w:t>
+        <w:br/>
+        <w:t>本章将讲述三个编程范式，它们分别是结构化编程（structured programming）、 面向对象编程（object-oriented programming）以及函数式编程（functional programming）。</w:t>
+        <w:br/>
+        <w:t>STRUCTURED PROGRAMMING 结构化编程</w:t>
+        <w:br/>
         <w:t>深入探索</w:t>
         <w:br/>
-        <w:t>software</w:t>
-        <w:br/>
-        <w:t>图书</w:t>
-        <w:br/>
-        <w:t>开发</w:t>
-        <w:br/>
-        <w:t>And the goal of those decisions? The goal of good software design? That goal is nothing less than my utopian description:</w:t>
-        <w:br/>
-        <w:t>所有这些决策的终极目标是什么呢？ 一个好的软件设计的终极目标是什么呢？就像我之前描述过的：</w:t>
-        <w:br/>
-        <w:t>The goal of software architecture is to minimize the human resources required to build and maintain the required system.</w:t>
-        <w:br/>
-        <w:t>软件架构的终极目标是，用最小的人力成本来满足构建和维护该系统的需求。</w:t>
-        <w:br/>
-        <w:t>The measure of design quality is simply the measure of the effort required to meet the needs of the customer. If that effort is low, and stays low throughout the lifetime of the system, the design is good. If that effort grows with each new release, the design is bad. It’s as simple as that.</w:t>
-        <w:br/>
-        <w:t>一个软件架构的优劣，可以用它满足用户需求所需要的成本来衡量。如果该成本很低，并且在系统的整个生命周期内一直都能维持这样的低成本，那么这个系统的设计就是优良的。如果该系统的每次发布都会提升下一次变更的成本，那么这个设计就是不好的。就这么简单。</w:t>
-        <w:br/>
-        <w:t>CASE STUDY 案例分析</w:t>
+        <w:t>编程语言</w:t>
+        <w:br/>
+        <w:t>programmer</w:t>
+        <w:br/>
+        <w:t>computer</w:t>
+        <w:br/>
+        <w:t>The first paradigm to be adopted (but not the first to be invented) was structured programming, which was discovered by Edsger Wybe Dijkstra in 1968. Dijkstra showed that the use of unrestrained jumps (goto statements) is harmful to program structure. As we’ll see in the chapters that follow, he replaced those jumps with the more familiar if/then/else and do/while/until constructs.</w:t>
+        <w:br/>
+        <w:t>结构化编程是第一个普遍被采用的编程范式（但是却不是第一个被提出的），由 Edsger Wybe Dijkstra 于 1968 年最先提出。与此同时，Dijkstra 还论证了使用 goto 这样的无限制跳转语句将会损害程序的整体结构。接下来的章节我们还会说到，二是这位 Dijkstra 最先主张用我们现在熟知的 if/then/else 语句和 do/while/until 语句来代替跳转语句的。</w:t>
+        <w:br/>
+        <w:t>We can summarize the structured programming paradigm as follows:</w:t>
+        <w:br/>
+        <w:t>我们可以将结构化编程范式归结为一句话：</w:t>
+        <w:br/>
+        <w:t>Structured programming imposes discipline on direct transfer of control.</w:t>
+        <w:br/>
+        <w:t>结构化编程对程序控制权的直接转移进行了限制和规范。</w:t>
+        <w:br/>
+        <w:t>OBJECT-ORIENTED PROGRAMMING 面向对象编程</w:t>
         <w:br/>
         <w:t>深入探索</w:t>
         <w:br/>
-        <w:t>software development</w:t>
-        <w:br/>
-        <w:t>软件研发</w:t>
-        <w:br/>
-        <w:t>书架</w:t>
-        <w:br/>
-        <w:t>As an example, consider the following case study. It includes real data from a real company that wishes to remain anonymous.</w:t>
-        <w:br/>
-        <w:t>下面来看一个真实案例，该案例中的数据均来源于一个要求匿名的真实公司。</w:t>
-        <w:br/>
-        <w:t>First, let’s look at the growth of the engineering staff. I’m sure you’ll agree that this trend is very encouraging. Growth like that shown in Figure 1.1 must be an indication of significant success!</w:t>
-        <w:br/>
-        <w:t>首先，我们来看一下工程师团队规模的增长。你肯定认为这个增长趋势是特别可喜的，像图 1.1 中的这种增长线条一定是公司业务取得巨大成功的直观体现。</w:t>
-        <w:br/>
-        <w:t>Growth of the engineering staff</w:t>
-        <w:br/>
-        <w:t>Reproduced with permission from a slide presentation by Jason Gorman</w:t>
-        <w:br/>
-        <w:t>Now let’s look at the company’s productivity over the same time period, as measured by simple lines of code (Figure 1.2).</w:t>
-        <w:br/>
-        <w:t>现在再让我们来看一下整个公司同期的生产效率（productivity），这里用简单的代码行数作为指标（参见图 1.2）。</w:t>
-        <w:br/>
-        <w:t>Productivity over the same period of time</w:t>
-        <w:br/>
-        <w:t>Clearly something is going wrong here. Even though every release is supported by an ever-increasing number of developers, the growth of the code looks like it is approaching an asymptote.</w:t>
-        <w:br/>
-        <w:t>这明显是有问题的。伴随着产品的每次发布，公司的工程师团队在持续不断地扩展壮大，但是仅从代码行数的增长来看，该产品却正在逐渐陷入困境。</w:t>
-        <w:br/>
-        <w:t>Now here’s the really scary graph: Figure 1.3 shows how the cost per line of code has changed over time.</w:t>
-        <w:br/>
-        <w:t>还有更可怕的：图 1.3 展示的是同期内每行代码的变更成本。</w:t>
-        <w:br/>
-        <w:t>These trends aren’t sustainable. It doesn’t matter how profitable the company might be at the moment: Those curves will catastrophically drain the profit from the business model and drive the company into a stall, if not into a downright collapse.</w:t>
-        <w:br/>
-        <w:t>显然，图中展示的趋势是不可持续的。不管公司现在的利润率有多高，图中线条表明，按这个趋势下去，公司的利润会被一点点榨干，整个公司会因此陷入困境，甚至直接关门倒闭。</w:t>
-        <w:br/>
-        <w:t>What caused this remarkable change in productivity? Why was the code 40 times more expensive to produce in release 8 as opposed to release 1?</w:t>
-        <w:br/>
-        <w:t>究竟是什么因素造成生产力的大幅变化呢？为什么第 8 代产品的构建成本要 比第 1 代产品高 40 倍？</w:t>
-        <w:br/>
-        <w:t>Cost per line of code over time</w:t>
-        <w:br/>
-        <w:t>THE SIGNATURE OF A MESS 乱麻系统的特点</w:t>
-        <w:br/>
-        <w:t>What you are looking at is the signature of a mess. When systems are thrown together in a hurry, when the sheer number of programmers is the sole driver of output, and when little or no thought is given to the cleanliness of the code or the structure of the design, then you can bank on riding this curve to its ugly end.</w:t>
-        <w:br/>
-        <w:t>我们在这里看到的是一个典型的乱麻系统。这种系统一般都是没有经过设计，匆匆忙忙被构建起来的。然后为了加快发布的速度，拼命地往团队里加入新人，同时加上决策层对代码质量提升和设计结构优化存在着持续的、长久的忽视，这种状态能持续下去就怪了。</w:t>
-        <w:br/>
-        <w:t>Figure 1.4 shows what this curve looks like to the developers. They started out at nearly 100% productivity, but with each release their productivity declined. By the fourth release, it was clear that their productivity was going to bottom out in an asymptotic approach to zero.</w:t>
-        <w:br/>
-        <w:t>图 1.4 展示了系统开发者的切身体会。他们一开始的效率都接近 100%，然而伴随着每次产品的发布，他们的生产力直线下降。到了产品的第 4 版本时，很明显大家的生产力已经不可避免地趋近为零了。编程</w:t>
-        <w:br/>
-        <w:t>Productivity by release</w:t>
-        <w:br/>
-        <w:t>From the developers’ point of view, this is tremendously frustrating, because everyone is working hard. Nobody has decreased their effort.</w:t>
-        <w:br/>
-        <w:t>对系统的开发者来说，这会带来很大的挫败感，因为团队中并没有人偷懒，每个人还都是和之前一样在拼命工作。</w:t>
-        <w:br/>
-        <w:t>And yet, despite all their heroics, overtime, and dedication, they simply aren’t getting much of anything done anymore. All their effort has been diverted away from features and is now consumed with managing the mess. Their job, such as it is, has changed into moving the mess from one place to the next, and the next, and the next, so that they can add one more meager little feature.</w:t>
-        <w:br/>
-        <w:t>然而，不管他们投入了多少个人时间，救了多少次火，加了多少次班，他们的产出始终上不去。工程师的大部分时间都消耗在对现有系统的修修补补上，而不是真正完成实际的新功能。这些工程师真正的任务是：拆了东墙补西墙，周而往复，偶尔有精力能顺便实现一点小功能。</w:t>
-        <w:br/>
-        <w:t>THE EXECUTIVE VIEW 管理层视角</w:t>
-        <w:br/>
-        <w:t>If you think that’s bad, imagine what this picture looks like to the executives! Consider Figure 1.5, which depicts monthly development payroll for the same period.</w:t>
-        <w:br/>
-        <w:t>如果你觉得开发者们这样就已经够苦了，那么就再想想公司髙管们的感受吧! 请看图 1.5，该部门月工资同期图。</w:t>
-        <w:br/>
-        <w:t>Monthly development payroll by release</w:t>
-        <w:br/>
-        <w:t>Release 1 was delivered with a monthly payroll of a few hundred thousand dollars. The second release cost a few hundred thousand more. By the eighth release monthly payroll was $20 million, and climbing.</w:t>
-        <w:br/>
-        <w:t>如你所见，产品的第 1 版是在月总工资 10 万美元左右的时候上线的。第 2 版又花掉了几十万美元。当发布第 8 版的时候，部门月工资已经达到了 2 千万美元，而且还在持续上升。</w:t>
-        <w:br/>
-        <w:t>Just this chart alone is scary. Clearly something startling is happening. One hopes that revenues are outpacing costs and therefore justifying the expense. But no matter how you look at this curve, it’s cause for concern.</w:t>
-        <w:br/>
-        <w:t>也许我们可以指望该公司的营收增长远远超出成本增长，这样公司就还能维持正常运转。但是这么惊人的曲线还是值得我们深入挖掘其中存在的巨大问题的。</w:t>
-        <w:br/>
-        <w:t>But now compare the curve in Figure 1.5 with the lines of code written per release in Figure 1.2. That initial few hundred thousand dollars per month bought a lot of functionality—but the final $20 million bought almost nothing! Any CFO would look at these two graphs and know that immediate action is necessary to stave off disaster.</w:t>
-        <w:br/>
-        <w:t>现在，只要将图 1.5 的月工资曲线和图 1.2 的每次发布代码行数曲线对比一下，任何一个理性的 CEO 都会一眼看出其中的问题：最开始的十几万美元工资给公司带来了很多新功能、新收益，而最后的 2 千万美元几乎全打了水漂。应立刻采取行动解决这个问题，刻不容缓。</w:t>
-        <w:br/>
-        <w:t>But which action can be taken? What has gone wrong? What has caused this incredible decline in productivity? What can executives do, other than to stamp their feet and rage at the developers?</w:t>
-        <w:br/>
-        <w:t>但是具体采取什么样的行动才能解决问题呢？究竟问题出在哪里？是什么造成了工程师生产力的直线下降？高管们除了跺脚、发飙，还能做什么呢？</w:t>
-        <w:br/>
-        <w:t>WHAT WENT WRONG? 问题到底在哪里</w:t>
-        <w:br/>
-        <w:t>Nearly 2600 years ago, Aesop told the story of the Tortoise and the Hare. The moral of that story has been stated many times in many different ways:</w:t>
-        <w:br/>
-        <w:t>大约 2600 年前，《伊索寓言》里写到了龟兔赛跑的故事。这个故事的主题思想可以归纳为以下几种：</w:t>
-        <w:br/>
-        <w:t>“Slow and steady wins the race.”</w:t>
-        <w:br/>
-        <w:t>“The race is not to the swift, nor the battle to the strong.”</w:t>
-        <w:br/>
-        <w:t>“The more haste, the less speed.”</w:t>
-        <w:br/>
-        <w:t>慢但是稳，是成功的秘诀。</w:t>
-        <w:br/>
-        <w:t>该比赛并不是拼谁开始跑得快，也不是拼谁更有力气的。</w:t>
-        <w:br/>
-        <w:t>心态越急，反而跑得越慢。</w:t>
-        <w:br/>
-        <w:t>The story itself illustrates the foolishness of overconfidence. The Hare, so confident in its intrinsic speed, does not take the race seriously, and so naps while the Tortoise crosses the finish line.</w:t>
-        <w:br/>
-        <w:t>这个故事本身揭露的是过度自信的愚蠢行为。兔子由于对自己速度的过度自信，没有把乌龟当回事，结果乌龟爬过终点线取得胜利的时候，它还在睡觉。</w:t>
-        <w:br/>
-        <w:t>Modern developers are in a similar race, and exhibit a similar overconfidence. Oh, they don’t sleep—far from it. Most modern developers work their butts off. But a part of their brain does sleep—the part that knows that good, clean, well-designed code matters.</w:t>
-        <w:br/>
-        <w:t>这和现代软件研发工作有点类似，现在的软件研发工程师都有点过于自信。哦，当然，他们确实不会偷懒，一点也不。但是他们真正偷懒的地方在于——持续低估那些好的、良好设计的、整洁的代码的重要性。编程</w:t>
-        <w:br/>
-        <w:t>These developers buy into a familiar lie: “We can clean it up later; we just have to get to market first!” Of course, things never do get cleaned up later, because market pressures never abate. Getting to market first simply means that you’ve now got a horde of competitors on your tail, and you have to stay ahead of them by running as fast as you can.</w:t>
-        <w:br/>
-        <w:t>这些工程师们普遍用一句话来欺骗自己：“我们可以未来再重构代码，产品上线最重要！”但是结果大家都知道，产品上线以后重构工作就再没人提起了。市场的压力永远也不会消退，作为首先上市的产品，后面有无数的竞争对手追赶，必须要比他们跑得更快才能保持领先。</w:t>
-        <w:br/>
-        <w:t>And so the developers never switch modes. They can’t go back and clean things up because they’ve got to get the next feature done, and the next, and the next, and the next. And so the mess builds, and productivity continues its asymptotic approach toward zero.</w:t>
-        <w:br/>
-        <w:t>所以，重构的时机永远不会再有了。工程师们忙于完成新功能，新功能做不完，哪有时间重构老的代码？循环往复，系统成了一团乱麻，主产效率持续直线下降，直至为零。</w:t>
-        <w:br/>
-        <w:t>Just as the Hare was overconfident in its speed, so the developers are overconfident in their ability to remain productive. But the creeping mess of code that saps their productivity never sleeps and never relents. If given its way, it will reduce productivity to zero in a matter of months.</w:t>
-        <w:br/>
-        <w:t>结果就像龟兔赛跑中过于自信的兔子一样，软件研发工程师们对自己保持高产出的能力过于自信了。但是乱成一团的系统代码可没有休息时间，也不会放松。如果不严加提防，在几个月之内，整个研发团队就会陷入困境。</w:t>
-        <w:br/>
-        <w:t>The bigger lie that developers buy into is the notion that writing messy code makes them go fast in the short term, and just slows them down in the long term. Developers who accept this lie exhibit the hare’s overconfidence in their ability to switch modes from making messes to cleaning up messes sometime in the future, but they also make a simple error of fact. The fact is that making messes is always slower than staying clean, no matter which time scale you are using.</w:t>
-        <w:br/>
-        <w:t>工程师们经常相信的另外一个错误观点是： “在工程中容忍糟糕的代码存在可以在短期内加快该工程上线的速度，未来这些代码会造成一些额外的工作量，但是并没有什么大不了。”相信这些鬼话的工程师对自己清理乱麻代码的能力过于自信了。但是更重要的是，他们还忽视了一个自然规律：无论是从短期还是长期来看，胡乱编写代码的工作速度其实比循规蹈矩更慢。</w:t>
-        <w:br/>
-        <w:t>Consider the results of a remarkable experiment performed by Jason Gorman depicted in Figure 1.6. Jason conducted this test over a period of six days. Each day he completed a simple program to convert integers into Roman numerals. He knew his work was complete when his predefined set of acceptance tests passed. Each day the task took a little less than 30 minutes. Jason used a well-known cleanliness discipline named test-driven development (TDD) on the first, third, and fifth days. On the other three days, he wrote the code without that discipline.</w:t>
-        <w:br/>
-        <w:t>图 1.6 展示的是 Jason Gorman 进行的一次为期 6 天的实验。在该实验中，Jaosn 每天都编写一段代码，功能是将一个整数转化为相应罗马数字的字符串。当事先定义好的一个测试集完全通过时，即认为当天工作完成。每天实验的时长不超过 30 分钟。第一天、第三天和第五天，Jason 在编写代码的过程中采用了业界知名的优质代码方法论：测试驱动开发（TDD），而其他三天他则直接从头开始编写代码。</w:t>
-        <w:br/>
-        <w:t>Time to completion by iterations and use/non-use of TDD</w:t>
-        <w:br/>
-        <w:t>First, notice the learning curve apparent in Figure 1.6. Work on the latter days is completed more quickly than the former days. Notice also that work on the TDD days proceeded approximately 10% faster than work on the non-TDD days, and that even the slowest TDD day was faster than the fastest non-TDD day.</w:t>
-        <w:br/>
-        <w:t>首先，我们要关注的是图 1.6 中那些柱状图。很显然，日子越往后，完成工作所需的时间就越少。同时，我们也可以看到当人们采用了 TDD 方法编程后，一般就会比未采用 TDD 方法编程少用 10%的时间，并且采用 TDD 方法编程时最差的一天也比未采用 TDD 方法编程时最好的一天用时要短。</w:t>
-        <w:br/>
-        <w:t>Some folks might look at that result and think it’s a remarkable outcome. But to those who haven’t been deluded by the Hare’s overconfidence, the result is expected, because they know this simple truth of software development:</w:t>
-        <w:br/>
-        <w:t>对于这个结果，有些人可能会觉得挺意外的。但是对常年关注软件开发本质的人来说，它其实揭示了软件开发的一个核心特点：</w:t>
-        <w:br/>
-        <w:t>The only way to go fast, is to go well.</w:t>
-        <w:br/>
-        <w:t>要想跑得快，先要跑得稳。</w:t>
-        <w:br/>
-        <w:t>And that’s the answer to the executive’s dilemma. The only way to reverse the decline in productivity and the increase in cost is to get the developers to stop thinking like the overconfident Hare and start taking responsibility for the mess that they’ve made.</w:t>
-        <w:br/>
-        <w:t>综上所述，管理层扭转局面的唯一选择就是扭转开发者的观念，让他们从过度自信的兔子模式转变回来，为自己构建的乱麻系统负起责任来。编程</w:t>
-        <w:br/>
-        <w:t>The developers may think that the answer is to start over from scratch and redesign the whole system—but that’s just the Hare talking again. The same overconfidence that led to the mess is now telling them that they can build it better if only they can start the race over. The reality is less rosy:</w:t>
-        <w:br/>
-        <w:t>当然，某些软件研发工程师可能会认为挽救一个系统的唯一办法是抛弃现有系统，设计一个全新的系统来替代。但是这里仍然没有逃离过度自信。试问：如果是工程师的过度自信导致了目前的一团乱麻，开始，结果就会更好呢？</w:t>
-        <w:br/>
-        <w:t>Their overconfidence will drive the redesign into the same mess as the original project.</w:t>
-        <w:br/>
-        <w:t>那么，我们有什么理由认为让他们从头第 1 章设计与架构究竟是什么过度自信只会使得重构设计陷入和原项目一样的困局中。</w:t>
+        <w:t>电子计算机</w:t>
+        <w:br/>
+        <w:t>computer programming</w:t>
+        <w:br/>
+        <w:t>程序设计</w:t>
+        <w:br/>
+        <w:t>The second paradigm to be adopted was actually discovered two years earlier, in 1966, by Ole Johan Dahl and Kristen Nygaard. These two programmers noticed that the function call stack frame in the ALGOL language could be moved to a heap, thereby allowing local variables declared by a function to exist long after the function returned. The function became a constructor for a class, the local variables became instance variables, and the nested functions became methods. This led inevitably to the discovery of polymorphism through the disciplined use of function pointers.</w:t>
+        <w:br/>
+        <w:t>说到编程领域中第二个被广泛采用的编程范式，当然就是面向对象编程了：事实上，这个编程范式的提出比结构化编程还早了两年，是在 1966 年由 Ole Johan Dahl 和 Kriste Nygaard 在论文中总结归纳出来的。这两个程序员注意到在 ALGOL 语言中. 函数调用堆栈（call stack frame）可以被挪到堆内存区域里，这样函数定义的本地变量就可以在函数返回之后继续存在。这个函数就成为了一个类（class）的构造函数，而它所定义的本地变量就是类的成员变量，构造函数定义的嵌套函数就成为了成员方法（method）。这样一来，我们就可以利用多态（polymorphism）来限制用户对函数指针的使用。编程</w:t>
+        <w:br/>
+        <w:t>We can summarize the object-oriented programming paradigm as follows:</w:t>
+        <w:br/>
+        <w:t>在这里，我们也可以用一句话来总结面向对象编程：</w:t>
+        <w:br/>
+        <w:t>Object-oriented programming imposes discipline on indirect transfer of control.</w:t>
+        <w:br/>
+        <w:t>面向对象编程对程序控制权的间接转移进行了限制和规范。</w:t>
+        <w:br/>
+        <w:t>FUNCTIONAL PROGRAMMING 函数式编程</w:t>
+        <w:br/>
+        <w:t>深入探索</w:t>
+        <w:br/>
+        <w:t>programmer</w:t>
+        <w:br/>
+        <w:t>computer</w:t>
+        <w:br/>
+        <w:t>程序设计</w:t>
+        <w:br/>
+        <w:t>编程语言</w:t>
+        <w:br/>
+        <w:t>电子计算机</w:t>
+        <w:br/>
+        <w:t>computer programming</w:t>
+        <w:br/>
+        <w:t>PROGRAMMING</w:t>
+        <w:br/>
+        <w:t>软件</w:t>
+        <w:br/>
+        <w:t>programming</w:t>
+        <w:br/>
+        <w:t>编程</w:t>
+        <w:br/>
+        <w:t>The third paradigm, which has only recently begun to be adopted, was the first to be invented. Indeed, its invention predates computer programming itself. Functional programming is the direct result of the work of Alonzo Church, who in 1936 invented l-calculus while pursuing the same mathematical problem that was motivating Alan Turing at the same time. His l-calculus is the foundation of the LISP language, invented in 1958 by John McCarthy. A foundational notion of l-calculus is immutability—that is, the notion that the values of symbols do not change. This effectively means that a functional language has no assignment statement. Most functional languages do, in fact, have some means to alter the value of a variable, but only under very strict discipline.</w:t>
+        <w:br/>
+        <w:t>尽管第三个编程范式是近些年才刚刚开始被采用的，但它其实是三个范式中最先被发明的。事实上，函数式编程概念是基于与阿兰·图灵同时代的数学家 Alonzo Church 在 1936 年发明的入演算的直接衍生物。1958 年 John Mccarthy 利用其作为基础发明了 LISP 语言。众所周知，λ 演算法的一个核心思想是不可变性——某个符号所对应的值是永远不变的，所以从理论上来说，函数式编程语言中应该是没有赋值语句的。大部分函数式编程语言只允许在非常严格的限制条件下，才可以更改某个变量的值。</w:t>
+        <w:br/>
+        <w:t>We can summarize the functional programming paradigm as follows:</w:t>
+        <w:br/>
+        <w:t>因此，我们在这里可以将函数式编程范式总结为下面这句话：</w:t>
+        <w:br/>
+        <w:t>Functional programming imposes discipline upon assignment.</w:t>
+        <w:br/>
+        <w:t>函数式编程对程序中的赋值进行了限制和规范。</w:t>
+        <w:br/>
+        <w:t>FOOD FOR THOUGHT 仅供思考</w:t>
+        <w:br/>
+        <w:t>Notice the pattern that I’ve quite deliberately set up in introducing these three programming paradigms: Each of the paradigms removes capabilities from the programmer. None of them adds new capabilities. Each imposes some kind of extra discipline that is negative in its intent. The paradigms tell us what not to do, more than they tell us what to do.</w:t>
+        <w:br/>
+        <w:t>如你所见，我在介绍三个编程范式的时候，有意采用了上面这种格式，目的是凸显每个编程范式的实际含义——它们都从某一方面限制和规范了程序员的能力。没有一个范式是增加新能力的。也就是说，每个编程范式的目的都是设置限制。这些范式主要是为了告诉我们不能做什么，而不是可以做什么。</w:t>
+        <w:br/>
+        <w:t>Another way to look at this issue is to recognize that each paradigm takes something away from us. The three paradigms together remove goto statements, function pointers, and assignment. Is there anything left to take away?</w:t>
+        <w:br/>
+        <w:t>另外，我们应该认识到，这三个编程范式分别限制了 goto 语句、函数指针和赋值语句的使用。那么除此之外，还有什么可以去除的吗？</w:t>
+        <w:br/>
+        <w:t>Probably not. Thus these three paradigms are likely to be the only three we will see—at least the only three that are negative. Further evidence that there are no more such paradigms is that they were all discovered within the ten years between 1958 and 1968. In the many decades that have followed, no new paradigms have been added.</w:t>
+        <w:br/>
+        <w:t>可能没有了。因此这三个编程范式可能是仅有的三个了——如果单论去除能力的编程范式的话。支撑这一结论的另外一个证据是，三个编程范式都是在 1958 年到 1968 年这 10 年间被提出来的，后续再也没有新的编程范式出现过。</w:t>
         <w:br/>
         <w:t>CONCLUSION 本章小结</w:t>
         <w:br/>
-        <w:t>In every case, the best option is for the development organization to recognize and avoid its own overconfidence and to start taking the quality of its software architecture seriously.</w:t>
-        <w:br/>
-        <w:t>不管怎么看，研发团队最好的选择是清晰地认识并避开工程师们过度自信的特点，开始认真地对待自己的代码架构，对其质量负责。</w:t>
-        <w:br/>
-        <w:t>To take software architecture seriously, you need to know what good software architecture is. To build a system with a design and an architecture that minimize effort and maximize productivity, you need to know which attributes of system architecture lead to that end.</w:t>
-        <w:br/>
-        <w:t>要想提高自己软件架构的质量，就需要先知道什么是优秀的软件架构。而为了在系统构建过程中采用好的设计和架构以便减少构建成本，提高生产力，又需要先了解系统架构的各种属性与成本和生产力的关系。软件</w:t>
-        <w:br/>
-        <w:t>That’s what this book is about. It describes what good clean architectures and designs look like, so that software developers can build systems that will have long profitable lifetimes.</w:t>
-        <w:br/>
-        <w:t>这就是这本书的主题。本书为读者描述了什么是优秀的、整洁的软件架构与设计，读者可以参考这些设计来构建一个长期稳定的、持久优秀的系统。</w:t>
+        <w:t>What does this history lesson on paradigms have to do with architecture? Everything. We use polymorphism as the mechanism to cross architectural boundaries; we use functional programming to impose discipline on the location of and access to data; and we use structured programming as the algorithmic foundation of our modules.</w:t>
+        <w:br/>
+        <w:t>大家可能会问，这些编程范式的历史知识与软件架构有关系吗？当然有，而目关系相当密切。譬如说，多态是我们跨越架构边界的手段，函数式编程是我们规范和限制数据存放位置与访问权限的手段，结构化编程则是各模块的算法实现基础。编程</w:t>
+        <w:br/>
+        <w:t>Notice how well those three align with the three big concerns of architecture: function, separation of components, and data management.</w:t>
+        <w:br/>
+        <w:t>这和软件架构的三大关注重点不谋而合：功能性、组件独立性以及数据管理。</w:t>
+      </w:r>
+    </w:p>
+    <w:p>
+      <w:pPr>
+        <w:pStyle w:val="Title"/>
+      </w:pPr>
+      <w:r>
+        <w:t>Chap4. 结构化编程</w:t>
+      </w:r>
+    </w:p>
+    <w:p>
+      <w:r>
+        <w:t>Chap4. STRUCTURED PROGRAMMING 结构化编程</w:t>
+        <w:br/>
+        <w:t>PROOF 可推导性</w:t>
+        <w:br/>
+        <w:t>A HARMFUL PROCLAMATION goto 是有害的</w:t>
+        <w:br/>
+        <w:t>FUNCTIONAL DECOMPOSITION 功能性降解拆分</w:t>
+        <w:br/>
+        <w:t>NO FORMAL PROOFS 形式化证明没有发生</w:t>
+        <w:br/>
+        <w:t>SCIENCE TO THE RESCUE 科学来救场</w:t>
+        <w:br/>
+        <w:t>TESTS 测试</w:t>
+        <w:br/>
+        <w:t>CONCLUSION 本章小结</w:t>
+        <w:br/>
+        <w:t>Chap4. STRUCTURED PROGRAMMING 结构化编程</w:t>
+        <w:br/>
+        <w:t>Edsger Wybe Dijkstra was born in Rotterdam in 1930. He survived the bombing of Rotterdam during World War II, along with the German occupation of the Netherlands, and in 1948 graduated from high school with the highest possible marks in math, physics, chemistry, and biology. In March 1952, at the age of 21 (and just 9 months before I was born), Dijkstra took a job with the Mathematical Center of Amsterdam as the Netherlands’ very first programmer.</w:t>
+        <w:br/>
+        <w:t>Edsger Wybe Dijkstra 于 1930 年出生在荷兰鹿特丹。生于乱世，他亲身经历了第二次世界大战中的鹿特丹大轰炸、德国占领荷兰等事件。1948 年，他以数学、物理、化学以及生物全满分的成绩高中毕业。1952 年 3 月，年仅 21 岁的 Dijkstra （此时距离我出生还有 9 个月时间）入职荷兰阿姆斯特丹数学中心，成为了荷兰的第一个程序员。数学</w:t>
+        <w:br/>
+        <w:t>In 1955, having been a programmer for three years, and while still a student, Dijkstra concluded that the intellectual challenge of programming was greater than the intellectual challenge of theoretical physics. As a result, he chose programming as his long-term career.</w:t>
+        <w:br/>
+        <w:t>1955 年，在从事编程工作 3 年之后，当时还是一个学生的 Dijkstra 就认为编程相比理论物理更有挑战性，因此他选择将编程作为终身职业。</w:t>
+        <w:br/>
+        <w:t>In 1957, Dijkstra married Maria Debets. At the time, you had to state your profession as part of the marriage rites in the Netherlands. The Dutch authorities were unwilling to accept “programmer” as Dijkstra’s profession; they had never heard of such a profession. To satisfy them, Dijkstra settled for “theoretical physicist” as his job title.</w:t>
+        <w:br/>
+        <w:t>1957 年，Dijkstra 与 Maria Debets 结婚了。在当时的荷兰，新郎新娘必须在结婚仪式上公布自己的职业。而当时的荷兰官方政府拒绝承认“程序员”这一职业，因为他们从来没有听说过。最终 Dijkstra 不得不继续使用”理论物理学家这一职位名称。</w:t>
+        <w:br/>
+        <w:t>As part of deciding to make programming his career, Dijkstra conferred with his boss, Adriaan van Wijngaarden. Dijkstra was concerned that no one had identified a discipline, or science, of programming, and that he would therefore not be taken seriously. His boss replied that Dijkstra might very well be one of the people who would discover such disciplines, thereby evolving software into a science.</w:t>
+        <w:br/>
+        <w:t>Dijkstra 和他的老板 Adriaan van Wijingaarden 曾经讨论过将“程序员”当作终身职业这件事，Dijkstra 最担心的是由于没有人认真地对待过编程这件事或者将它当作是一门学术学科对待，他的科研成果可能将不会得到认真对待。而 Adriaan 则建议 Dijkstra：为什么不亲自去开创这门学科呢?科学</w:t>
+        <w:br/>
+        <w:t>Dijkstra started his career in the era of vacuum tubes, when computers were huge, fragile, slow, unreliable, and (by today’s standards) extremely limited. In those early years, programs were written in binary, or in very crude assembly language. Input took the physical form of paper tape or punched cards. The edit/compile/test loop was hours—if not days—long.</w:t>
+        <w:br/>
+        <w:t>当时还是真空管阶段。计算机体积巨大，运行缓慢，还非常容易出故障，功能（与今天对比）十分有限。人们还是直接使用二进制数，或者使用非常原始的汇编语言编程。计算机的输入方式则还是用纸卷带或者是打孔卡片。要想执行完整的编辑、编译、测试流程是非常耗时的，通常需要数小时或者数天才能完成。</w:t>
+        <w:br/>
+        <w:t>It was in this primitive environment that Dijkstra made his great discoveries.</w:t>
+        <w:br/>
+        <w:t>Dijkstra 就是在这样原始的条件下做出其非凡的成就的。</w:t>
+        <w:br/>
+        <w:t>PROOF 可推导性</w:t>
+        <w:br/>
+        <w:t>The problem that Dijkstra recognized, early on, was that programming is hard, and that programmers don’t do it very well. A program of any complexity contains too many details for a human brain to manage without help. Overlooking just one small detail results in programs that may seem to work, but fail in surprising ways.软件</w:t>
+        <w:br/>
+        <w:t>Dijkstra 很早就得出的结论是：编程是一项难度很大的活动。一段程序无论复杂与否，都包含了很多的细节信息。如果没有工具的帮助，这些细节的信息是远远超过一个程序员的认知能力范围的。而在一段程序中，哪怕仅仅是一个小细节的错误，也会造成整个程序出错。</w:t>
+        <w:br/>
+        <w:t>Dijkstra’s solution was to apply the mathematical discipline of proof. His vision was the construction of a Euclidian hierarchy of postulates, theorems, corollaries, and lemmas. Dijkstra thought that programmers could use that hierarchy the way mathematicians do. In other words, programmers would use proven structures, and tie them together with code that they would then prove correct themselves.</w:t>
+        <w:br/>
+        <w:t>Dijkstra 提出的解决方案是采用数学推导方法。他的想法是借鉴数学中的公理（Postulate）、定理（Theorem）、推论（Corollary）和引理（Lemma），形成一种欧几里得结构。Dijkstra 认为程序员可以像数学家一样对自己的程序进行推理证明。换句话说，程序员可以用代码将一些已证明可用的结构串联起来，只要自行证明这些额外代码是正确的，就可以推导出整个程序的正确性。</w:t>
+        <w:br/>
+        <w:t>Of course, to get this going, Dijkstra realized that he would have to demonstrate the technique for writing basic proofs of simple algorithms. This he found to be quite challenging.</w:t>
+        <w:br/>
+        <w:t>当然，在这之前，必须先展示如何推导证明简单算法的正确性，这本身就是一件极具挑战性的工作。</w:t>
+        <w:br/>
+        <w:t>During his investigation, Dijkstra discovered that certain uses of goto statements prevent modules from being decomposed recursively into smaller and smaller units, thereby preventing use of the divide-and-conquer approach necessary for reasonable proofs.编程</w:t>
+        <w:br/>
+        <w:t>Dijkstra 在研究过程中发现了一个问题：goto 语句的某些用法会导致某个模块 无法被递归拆分成更小的、可证明的单元，这会导致无法采用分解法来将大型问题进一步拆分成更小的、可证明的部分。</w:t>
+        <w:br/>
+        <w:t>Other uses of goto, however, did not have this problem. Dijkstra realized that these “good” uses of goto corresponded to simple selection and iteration control structures such as if/then/else and do/while. Modules that used only those kinds of control structures could be recursively subdivided into provable units.</w:t>
+        <w:br/>
+        <w:t>goto 语句的其他用法虽然不会导致这种问题，但是 Dijkstra 意识到它们的实际效果其实和更简单的分支结构 if-then-else 以及循环结构 do-while 是一致的。如果代码中只采用了这两类控制结构，则一定可以将程序分解成更小的、可证明的单元。</w:t>
+        <w:br/>
+        <w:t>Dijkstra knew that those control structures, when combined with sequential execution, were special. They had been identified two years before by Böhm and Jacopini, who proved that all programs can be constructed from just three structures: sequence, selection, and iteration.</w:t>
+        <w:br/>
+        <w:t>事实上，Dijkstra 很早就知道将这些控制结构与顺序结构的程序组合起来很有用。因为在两年前，Bohm 和 Jocopini 刚刚证明了人们可以用顺序结构、分支结构、循环结构这三种结构构造出任何程序。</w:t>
+        <w:br/>
+        <w:t>This discovery was remarkable: The very control structures that made a module provable were the same minimum set of control structures from which all programs can be built. Thus structured programming was born.计算机硬件</w:t>
+        <w:br/>
+        <w:t>这个发现非常重要：因为它证明了我们构建可推导模块所需要的控制结构集与构建所有程序所需的控制结构集的最小集是等同的。这样—来，结构化编程就诞生了。</w:t>
+        <w:br/>
+        <w:t>Dijkstra showed that sequential statements could be proved correct through simple enumeration. The technique mathematically traced the inputs of the sequence to the outputs of the sequence. This approach was no different from any normal mathematical proof.</w:t>
+        <w:br/>
+        <w:t>Dijkstra 展示了顺序结构的正确性可以通过枚举法证明，其过程与其他一般的数学推导过程是一样的：针对序列中的每个输入，跟踪其对应的输出值的变化就可以了。</w:t>
+        <w:br/>
+        <w:t>Dijkstra tackled selection through reapplication of enumeration. Each path through the selection was enumerated. If both paths eventually produced appropriate mathematical results, then the proof was solid.</w:t>
+        <w:br/>
+        <w:t>同样的，Dijkstra 利用枚举法又证明了分支结构的可推导性。因为我们只要能用枚举法证明分支结构中每条路径的正确性，自然就可以推导出分支结构本身的正确性。</w:t>
+        <w:br/>
+        <w:t>Iteration was a bit different. To prove an iteration correct, Dijkstra had to use induction. He proved the case for 1 by enumeration. Then he proved the case that if N was assumed correct, N + 1 was correct, again by enumeration. He also proved the starting and ending criteria of the iteration by enumeration.开发工具</w:t>
+        <w:br/>
+        <w:t>循环结构的证明过程则有所不同，为了证明一段循环程序的正确性，Dijkstra 需要采用数学归纳法。具体来说就是，首先要用枚举法证明循环 1 次的正确性。接下来再证明如果循环 N 次是正确的，那么循环 N+1 次也同样也是正确的。最后还要用枚举法证明循环结构的起始与结束条件的正确性。</w:t>
+        <w:br/>
+        <w:t>Such proofs were laborious and complex—but they were proofs. With their development, the idea that a Euclidean hierarchy of theorems could be constructed seemed reachable.</w:t>
+        <w:br/>
+        <w:t>尽管这些证明过程本身非常复杂和烦琐，但确实是完备的。有了这样的证明过程，用欧几里得层级构造定理的方式来验证程序正确性的目标，貌似近在咫尺了。</w:t>
+        <w:br/>
+        <w:t>A HARMFUL PROCLAMATION goto 是有害的</w:t>
+        <w:br/>
+        <w:t>In 1968, Dijkstra wrote a letter to the editor of CACM, which was published in the March issue. The title of this letter was “Go To Statement Considered Harmful.” The article outlined his position on the three control structures.</w:t>
+        <w:br/>
+        <w:t>1968 年，Dijkstra 曾经给 CACM 的编辑写过一封信。这封信后来发表于 CACM 3 月刊，标题是 Go To Statement Considered Harmful，Dijkstra 在信中具体描绘了他对三种控制结构的看法。</w:t>
+        <w:br/>
+        <w:t>And the programming world caught fire. Back then we didn’t have an Internet, so people couldn’t post nasty memes of Dijkstra, and they couldn’t flame him online. But they could, and they did, write letters to the editors of many published journals.数学</w:t>
+        <w:br/>
+        <w:t>这可捅了个大篓子。由于当时还没有互联网，大家还不能直接上网发帖来对 Dijkstra 进行冷嘲热讽，他们唯一能做的，也是大部分人的选择，就是不停地给各种公开发表的报刊的编辑们写信。</w:t>
+        <w:br/>
+        <w:t>Those letters weren’t necessarily all polite. Some were intensely negative; others voiced strong support for his position. And so the battle was joined, ultimately to last about a decade.</w:t>
+        <w:br/>
+        <w:t>可想而知，有的信件的措辞并不那么友善，甚至是非常负面的。但是，也不乏强烈支持者。总之，这场火热的争论持续了超过 10 年。</w:t>
+        <w:br/>
+        <w:t>Eventually the argument petered out. The reason was simple: Dijkstra had won. As computer languages evolved, the goto statement moved ever rearward, until it all but disappeared. Most modern languages do not have a goto statement—and, of course, LISP never did.</w:t>
+        <w:br/>
+        <w:t>当然，这场辩论最终还是逐渐停止了。原因很简单：Dijkstra 是对的。随着编程语言的演进，goto 语句的重要性越来越小，最终甚至消失了。如今大部分的现代编程语言中都已经没有了 goto 语句。哦，对了，LISP 里从来就没有过！</w:t>
+        <w:br/>
+        <w:t>Nowadays we are all structured programmers, though not necessarily by choice. It’s just that our languages don’t give us the option to use undisciplined direct transfer of control.</w:t>
+        <w:br/>
+        <w:t>现如今，无论是否自愿，我们都是结构化编程范式的践行者了，因为我们用的编程语言基本上都已经禁止了不受限制的直接控制转移语句。编程</w:t>
+        <w:br/>
+        <w:t>Some may point to named breaks in Java or exceptions as goto analogs. In fact, these structures are not the utterly unrestricted transfers of control that older languages like Fortran or COBOL once had. Indeed, even languages that still support the goto keyword often restrict the target to within the scope of the current function.</w:t>
+        <w:br/>
+        <w:t>或许有些人会指出，Java 中的带命名的 break 语句或者 Exception 都和 goto 很类似。这些语法结构与老的编程语言（类似 FORTRAN 和 COBOL）中的完全无限制的 goto 语句根本不一样。就算那些还支持 goto 关键词的编程语言也通常限制了 goto 的目标不能超出当前函数范围。</w:t>
+        <w:br/>
+        <w:t>FUNCTIONAL DECOMPOSITION 功能性降解拆分</w:t>
+        <w:br/>
+        <w:t>Structured programming allows modules to be recursively decomposed into provable units, which in turn means that modules can be functionally decomposed. That is, you can take a large-scale problem statement and decompose it into high-level functions. Each of those functions can then be decomposed into lower-level functions, ad infinitum. Moreover, each of those decomposed functions can be represented using the restricted control structures of structured programming.</w:t>
+        <w:br/>
+        <w:t>既然结构化编程范式可将模块递归降解拆分为可推导的单元，这就意味着模块了可以按功能进行降解拆分。这样一来，我们就可以将一个大型问题拆分为一系列高级函数的组合，而这些高级函数各自又可以继续被拆分为一系列低级函数，如此无限递归。更重要的是，每个被拆分出来的函数也都可以用结构化编程范式来书写。</w:t>
+        <w:br/>
+        <w:t>Building on this foundation, disciplines such as structured analysis and structured design became popular in the late 1970s and throughout the 1980s. Men like Ed Yourdon, Larry Constantine, Tom DeMarco, and Meilir Page-Jones promoted and popularized these techniques throughout that period. By following these disciplines, programmers could break down large proposed systems into modules and components that could be further broken down into tiny provable functions.</w:t>
+        <w:br/>
+        <w:t>以此为理论基础，在 20 世纪 70 年代晚期到 10 年代中期出现的结构化分析与结构化设计工作才能广为人知。Ed Yourdon、Larry Constantine、Tom DeMarco 以及 Meilir Page Jones 在这期间为此做了很多推广工作。通过采用这些技巧，程序员可以将大型系统设计拆分成模块和组件，而这些模块和组件最终可以拆分为更小的、可证明的函数。</w:t>
+        <w:br/>
+        <w:t>NO FORMAL PROOFS 形式化证明没有发生</w:t>
+        <w:br/>
+        <w:t>But the proofs never came. The Euclidean hierarchy of theorems was never built. And programmers at large never saw the benefits of working through the laborious process of formally proving each and every little function correct. In the end, Dijkstra’s dream faded and died. Few of today’s programmers believe that formal proofs are an appropriate way to produce high-quality software.软件</w:t>
+        <w:br/>
+        <w:t>但是，人人都用完整的形式化证明的一天没有到来。大部分人不会真的按照欧几里得结构为每个小函数书写冗长复杂的正确性证明过程。Dijkstra 的梦想最终并没有实现。没有几个程序员会认为形式化验证是产出高质量软件的必备条件。</w:t>
+        <w:br/>
+        <w:t>Of course, formal, Euclidian style, mathematical proofs are not the only strategy for proving something correct. Another highly successful strategy is the scientific method.</w:t>
+        <w:br/>
+        <w:t>当然，形式化的、欧几里得式的数学推导证明并不是证明结构化编程正确性的唯一手段。下面我们来看另外一个十分成功的策略：科学证明法。</w:t>
+        <w:br/>
+        <w:t>SCIENCE TO THE RESCUE 科学来救场</w:t>
+        <w:br/>
+        <w:t>Science is fundamentally different from mathematics, in that scientific theories and laws cannot be proven correct. I cannot prove to you that Newton’s second law of motion, F = ma, or law of gravity, F = Gm1m2/r2, are correct. I can demonstrate these laws to you, and I can make measurements that show them correct to many decimal places, but I cannot prove them in the sense of a mathematical proof. No matter how many experiments I conduct or how much empirical evidence I gather, there is always the chance that some experiment will show that those laws of motion and gravity are incorrect.</w:t>
+        <w:br/>
+        <w:t>科学和数学在证明方法上有着根本性的不同，科学理论和科学定律通常是无法被证明的，譬如我们并没有办法证明牛顿第二运动定律 F=ma 或者万有引力定律 F=Gm1m2/r^2 是正确的，但我们可以用实际案例来演示这些定律的正确性，并通过高精度测量来证明当相关精度达到小数点后多少位时，被测量对象仍然一直满足这个定律。但我们始终没有办法像用数学方法一样推导出这个定律。而且，不管我们进行多少次正确的实验，也无法排除今后会存在某一次实验可以推翻牛顿第二运动定律与万有引力定律的可能性。数学</w:t>
+        <w:br/>
+        <w:t>That is the nature of scientific theories and laws: They are falsifiable but not provable.</w:t>
+        <w:br/>
+        <w:t>这就是科学理论和科学定律的特点：它们可以被证伪，但是没有办法被证明。</w:t>
+        <w:br/>
+        <w:t>And yet we bet our lives on these laws every day. Every time you get into a car, you bet your life that F = ma is a reliable description of the way the world works. Every time you take a step, you bet your health and safety that F = Gm1m2/r2 is correct.</w:t>
+        <w:br/>
+        <w:t>但是我们仍然每天都在依赖这些定律生活。开车的时候，我们就等于是在用性命担保 F=ma 是对世界运转方式的一个可靠的描述。每当我们迈出一步的时候，和等于在亲身证明 F=Gm1m2/r^2 是正确的。</w:t>
+        <w:br/>
+        <w:t>Science does not work by proving statements true, but rather by proving statements false. Those statements that we cannot prove false, after much effort, we deem to be true enough for our purposes.</w:t>
+        <w:br/>
+        <w:t>科学方法论不需要证明某条结论是正确的，只需要想办法证明它是错误的。如果某个结论经过一定的努力无法证伪，我们则认为它在当下是足够正确的。</w:t>
+        <w:br/>
+        <w:t>Of course, not all statements are provable. The statement “This is a lie” is neither true nor false. It is one of the simplest examples of a statement that is not provable.科学</w:t>
+        <w:br/>
+        <w:t>当然，不是所有的结论都可以被证明或者证伪的。举一个最简单的不可证明的例子：“这句话是假的”，非真也非伪。</w:t>
+        <w:br/>
+        <w:t>Ultimately, we can say that mathematics is the discipline of proving provable statements true. Science, in contrast, is the discipline of proving provable statements false.</w:t>
+        <w:br/>
+        <w:t>最终，我们可以说数学是要将可证明的结论证明，而与之相反，科学研究则是要将可证明的结论证伪。</w:t>
+        <w:br/>
+        <w:t>TESTS 测试</w:t>
+        <w:br/>
+        <w:t>Dijkstra once said, “Testing shows the presence, not the absence, of bugs.” In other words, a program can be proven incorrect by a test, but it cannot be proven correct. All that tests can do, after sufficient testing effort, is allow us to deem a program to be correct enough for our purposes.</w:t>
+        <w:br/>
+        <w:t>Dijkstra 曾经说过“测试只能展示 Bug 的存在，并不能证明不存在 Bug”，换句话说，一段程序可以由一个测试来证明其错误性，但是却不能被证明是正确的。测试的作用是让我们得出某段程序已经足够实现当前目标这一结论。</w:t>
+        <w:br/>
+        <w:t>The implications of this fact are stunning. Software development is not a mathematical endeavor, even though it seems to manipulate mathematical constructs. Rather, software is like a science. We show correctness by failing to prove incorrectness, despite our best efforts.编程</w:t>
+        <w:br/>
+        <w:t>这一事实所带来的影响是惊人的。软件开发虽然看起来是在操作很多数学结构，其实不是一个数学研究过程。恰恰相反，软件开发更像是一门科学研究学科，我们通过无法证伪来证明软件的正确性。</w:t>
+        <w:br/>
+        <w:t>Such proofs of incorrectness can be applied only to provable programs. A program that is not provable—due to unrestrained use of goto, for example—cannot be deemed correct no matter how many tests are applied to it.</w:t>
+        <w:br/>
+        <w:t>注意，这种证伪过程只能应用于可证明的程序上。某段程序如果是不可证明的，例如，其中采用了不加限制的 goto 语句，那么无论我们为它写多少测试，也不能够证明其正确性。</w:t>
+        <w:br/>
+        <w:t>Structured programming forces us to recursively decompose a program into a set of small provable functions. We can then use tests to try to prove those small provable functions incorrect. If such tests fail to prove incorrectness, then we deem the functions to be correct enough for our purposes.</w:t>
+        <w:br/>
+        <w:t>结构化编程范式促使我们先将一段程序递归降解为一系列可证明的小函数，然后再编写相关的测试来试图证明这些函数是错误的。如果这些测试无法证伪这些函数，那么我们就可以认为这些函数是足够正确的，进而推导整个程序是正确的。</w:t>
+        <w:br/>
+        <w:t>CONCLUSION 本章小结</w:t>
+        <w:br/>
+        <w:t>It is this ability to create falsifiable units of programming that makes structured programming valuable today. This is the reason that modern languages do not typically support unrestrained goto statements. Moreover, at the architectural level, this is why we still consider functional decomposition to be one of our best practices.</w:t>
+        <w:br/>
+        <w:t>结构化编程范式中最有价值的地方就是，它赋予了我们创造可证伪程序单元的能力。这就是为什么现代编程语言一般不支持无限制的 goto 语句。更重要的是，这也是为什么在架构设计领域，功能性降解拆分仍然是最佳实践之一。</w:t>
+        <w:br/>
+        <w:t>At every level, from the smallest function to the largest component, software is like a science and, therefore, is driven by falsifiability. Software architects strive to define modules, components, and services that are easily falsifiable (testable). To do so, they employ restrictive disciplines similar to structured programming, albeit at a much higher level.开发工具</w:t>
+        <w:br/>
+        <w:t>无论在哪一个层面上，从最小的函数到最大组件，软件开发的过程都和科学研究非常类似，它们都是由证伪驱动的。软件架构师需要定义可以方便地进行证伪（测试）的模块、组件以及服务。为了达到这个目的，他们需要将类似结构化编程的限制方法应用在更高的层面上。</w:t>
+        <w:br/>
+        <w:t>It is those restrictive disciplines that we will study in some detail in the chapters to come.</w:t>
+        <w:br/>
+        <w:t>我们在接下来的章节中将会深入研究这些限制性的方法。</w:t>
+      </w:r>
+    </w:p>
+    <w:p>
+      <w:pPr>
+        <w:pStyle w:val="Title"/>
+      </w:pPr>
+      <w:r>
+        <w:t>Chap5. 面向对象编程</w:t>
+      </w:r>
+    </w:p>
+    <w:p>
+      <w:r>
+        <w:t>Chap5. OBJECT-ORIENTED PROGRAMMING 面向对象编程</w:t>
+        <w:br/>
+        <w:t>ENCAPSULATION? 封装</w:t>
+        <w:br/>
+        <w:t>INHERITANCE? 继承</w:t>
+        <w:br/>
+        <w:t>POLYMORPHISM? 多态</w:t>
+        <w:br/>
+        <w:t>THE POWER OF POLYMORPHISM 多态的强大性</w:t>
+        <w:br/>
+        <w:t>DEPENDENCY INVERSION 依赖反转</w:t>
+        <w:br/>
+        <w:t>CONCLUSION 本章小结</w:t>
+        <w:br/>
+        <w:t>Chap5. OBJECT-ORIENTED PROGRAMMING 面向对象编程</w:t>
+        <w:br/>
+        <w:t>As we will see, the basis of a good architecture is the understanding and application of the principles of object-oriented design (OO). But just what is OO?</w:t>
+        <w:br/>
+        <w:t>稍后我们会讲到，设计一个优秀的软件架构要基于对面向对象设计（Object-Oriented Design）的深入理解及应用。但我们首先得弄明白一个问题：究竟什么是面向对象？</w:t>
+        <w:br/>
+        <w:t>One answer to this question is “The combination of data and function.” Although often cited, this is a very unsatisfying answer because it implies that o.f() is somehow different from f(o). This is absurd. Programmers were passing data structures into functions long before 1966, when Dahl and Nygaard moved the function call stack frame to the heap and invented OO.</w:t>
+        <w:br/>
+        <w:t>对于这个问题，一种常见的回答是“数据与函数的组合”。这种说法虽然被广为引用，但总显得并不是那么贴切，因为它似乎暗示了 o.f() 与 f(o) 之间是有区别的，这显然不是事实。面向对象理论是在 1966 年提出的，当时 Dahl 和 Nygaard 主要是将函数调用栈迁移到了堆区域中。数据结构被用作函数的调用参数这件事情远比这发生的时间更早。</w:t>
+        <w:br/>
+        <w:t>Another common answer to this question is “A way to model the real world.” This is an evasive answer at best. What does “modeling the real world” actually mean, and why is it something we would want to do? Perhaps this statement is intended to imply that OO makes software easier to understand because it has a closer relationship to the real world—but even that statement is evasive and too loosely defined. It does not tell us what OO is.</w:t>
+        <w:br/>
+        <w:t>另一种常见的回答是“面向对象编程是一种对真实世界进行建模的方式”，这种回答只能算作避重就轻。“对真实世界的建模”到底要如何进行？我们为什么要这么做，有什么好处？也许这句话意味着是“由于采用面向对象方式构建的软件与真实世界的关系更紧密，所以面向对象编程可以使得软件开发更容易”——即使这样说，也仍然逃避了关键问题——面向对象编程究竟是什么?</w:t>
+        <w:br/>
+        <w:t>Some folks fall back on three magic words to explain the nature of OO: encapsulation, inheritance, and polymorphism. The implication is that OO is the proper admixture of these three things, or at least that an OO language must support these three things.</w:t>
+        <w:br/>
+        <w:t>还有些人在回答这个问题的时候，往往会搬出一些神秘的词语，譬如封装（encapsulation）、继承（inheritance）、多态（polymorphism）。其隐含意思就是说面向对象编程是这三项的有机组合，或者任何一种支持面向对象的编程语言必须支持这三个特性。</w:t>
+        <w:br/>
+        <w:t>Let’s examine each of these concepts in turn.</w:t>
+        <w:br/>
+        <w:t>那么，我们接下来可以逐个来分析一下这三个概念。</w:t>
+        <w:br/>
+        <w:t>ENCAPSULATION? 封装</w:t>
+        <w:br/>
+        <w:t>The reason encapsulation is cited as part of the definition of OO is that OO languages provide easy and effective encapsulation of data and function. As a result, a line can be drawn around a cohesive set of data and functions. Outside of that line, the data is hidden and only some of the functions are known. We see this concept in action as the private data members and the public member functions of a class.</w:t>
+        <w:br/>
+        <w:t>导致封装这个概念经常被引用为面向对象编程定义的一部分。通过釆用封装特性，我们可以把一组相关联的数据和函数圈起来，便圈外血的代码只能看见部分函数，数据则完全不可见。譬如在实际应用中，类（class）中的公共函数和私有成员变量就是这样。</w:t>
+        <w:br/>
+        <w:t>This idea is certainly not unique to OO. Indeed, we had perfect encapsulation in C. Consider this simple C program:</w:t>
+        <w:br/>
+        <w:t>然而，这个特性其实并不是面向对象编程所独有的。其实，c 语言也支持完整的封装，下面来看一个简单的 c 程序：</w:t>
+        <w:br/>
+        <w:t>point.h</w:t>
+        <w:br/>
+        <w:t>struct Point;</w:t>
+        <w:br/>
+        <w:t>struct Point* makePoint(double x, double y);</w:t>
+        <w:br/>
+        <w:t>double distance (struct Point *p1, struct Point *p2);</w:t>
+        <w:br/>
+        <w:t>point.c</w:t>
+        <w:br/>
+        <w:t>#include "point.h"</w:t>
+        <w:br/>
+        <w:t>#include &lt;stdlib.h&gt;</w:t>
+        <w:br/>
+        <w:t>#include &lt;math.h&gt;</w:t>
+        <w:br/>
+        <w:t>struct Point {</w:t>
+        <w:br/>
+        <w:t xml:space="preserve">  double x,y;</w:t>
+        <w:br/>
+        <w:t>};</w:t>
+        <w:br/>
+        <w:t>struct Point* makepoint(double x, double y) {</w:t>
+        <w:br/>
+        <w:t xml:space="preserve">  struct Point* p = malloc(sizeof(struct Point));</w:t>
+        <w:br/>
+        <w:t xml:space="preserve">  p-&gt;x = x;</w:t>
+        <w:br/>
+        <w:t xml:space="preserve">  p-&gt;y = y;</w:t>
+        <w:br/>
+        <w:t xml:space="preserve">  return p;</w:t>
+        <w:br/>
+        <w:t>}</w:t>
+        <w:br/>
+        <w:t>double distance(struct Point* p1, struct Point* p2) {</w:t>
+        <w:br/>
+        <w:t xml:space="preserve">  double dx = p1-&gt;x - p2-&gt;x;</w:t>
+        <w:br/>
+        <w:t xml:space="preserve">  double dy = p1-&gt;y - p2-&gt;y;</w:t>
+        <w:br/>
+        <w:t xml:space="preserve">  return sqrt(dx*dx+dy*dy);</w:t>
+        <w:br/>
+        <w:t>}</w:t>
+        <w:br/>
+        <w:t>The users of point.h have no access whatsoever to the members of struct Point. They can call the makePoint() function, and the distance() function, but they have absolutely no knowledge of the implementation of either the Point data structure or the functions.</w:t>
+        <w:br/>
+        <w:t>显然，使用 point.h 的程序是没有 Point 结构体成员的访问权限的。它们只能调用 makePoint() 函数和 distance() 函数，但对它们来说，Point 这个数据结构体的内部细节，以及函数的具体实现方式都是不可见的。</w:t>
+        <w:br/>
+        <w:t>This is perfect encapsulation—in a non-OO language. C programmers used to do this kind of thing all the time. We would forward declare data structures and functions in header files, and then implement them in implementation files. Our users never had access to the elements in those implementation files.</w:t>
+        <w:br/>
+        <w:t>这正是完美封装 虽然 C 语言是非面向对象的编程语言。上述 C 程序是很常见的。在头文件中进行数据结构以及函数定义的前置声明（forward declare），然后 在程序文件中具体实现。程序文件中的具体实现细节对使用者来说是不可见的。</w:t>
+        <w:br/>
+        <w:t>But then came OO in the form of C++—and the perfect encapsulation of C was broken.</w:t>
+        <w:br/>
+        <w:t>而 C++作为一种面向对象编程语言，反而破坏了 c 的完美封装性。</w:t>
+        <w:br/>
+        <w:t>The C++ compiler, for technical reasons,1 needed the member variables of a class to be declared in the header file of that class. So our Point program changed to look like this:</w:t>
+        <w:br/>
+        <w:t>由于一些技术原，C++编译器要求类的成员变量必须在该类的头文件中声明。这样一来，我们的 point.h 程序随之就改成了这样：</w:t>
+        <w:br/>
+        <w:t>point.h</w:t>
+        <w:br/>
+        <w:t>class Point {</w:t>
+        <w:br/>
+        <w:t>public:</w:t>
+        <w:br/>
+        <w:t xml:space="preserve">  Point(double x, double y);</w:t>
+        <w:br/>
+        <w:t xml:space="preserve">  double distance(const Point&amp; p) const;</w:t>
+        <w:br/>
+        <w:t>private:</w:t>
+        <w:br/>
+        <w:t xml:space="preserve">  double x;</w:t>
+        <w:br/>
+        <w:t xml:space="preserve">  double y;</w:t>
+        <w:br/>
+        <w:t>};</w:t>
+        <w:br/>
+        <w:t>point.cc</w:t>
+        <w:br/>
+        <w:t>#include "point.h"</w:t>
+        <w:br/>
+        <w:t>#include &lt;math.h&gt;</w:t>
+        <w:br/>
+        <w:t>Point::Point(double x, double y)</w:t>
+        <w:br/>
+        <w:t>: x(x), y(y)</w:t>
+        <w:br/>
+        <w:t>{}</w:t>
+        <w:br/>
+        <w:t>double Point::distance(const Point&amp; p) const {</w:t>
+        <w:br/>
+        <w:t xml:space="preserve">  double dx = x-p.x;</w:t>
+        <w:br/>
+        <w:t xml:space="preserve">  double dy = y-p.y;</w:t>
+        <w:br/>
+        <w:t xml:space="preserve">  return sqrt(dx*dx + dy*dy);</w:t>
+        <w:br/>
+        <w:t>}</w:t>
+        <w:br/>
+        <w:t>Clients of the header file point.h know about the member variables x and y! The compiler will prevent access to them, but the client still knows they exist. For example, if those member names are changed, the point.cc file must be recompiled! Encapsulation has been broken.</w:t>
+        <w:br/>
+        <w:t>好了，point.h 文件的使用者现在知道了成员变量 x 和 y 的存在！虽然编译器会禁止对这两个变量的直接访问，但是使用者仍然知道了它们的存在。而且，如果 x 和 y 变量名称被改变了，point.cc 也必须重新编译才行！这样的封装性显然是不完美的。</w:t>
+        <w:br/>
+        <w:t>Indeed, the way encapsulation is partially repaired is by introducing the public, private, and protected keywords into the language. This, however, was a hack necessitated by the technical need for the compiler to see those variables in the header file.</w:t>
+        <w:br/>
+        <w:t>当然，C++通过在编程语言层面引入 public、private、protected 这些关键词，部分维护了封装性。但所有这些都是为了解决编译器自身的技术实现问题而引入的 hack——编译器由于技术实现原因必须在头文件中看到成员变量的定义。</w:t>
+        <w:br/>
+        <w:t>Java and C# simply abolished the header/implementation split altogether, thereby weakening encapsulation even more. In these languages, it is impossible to separate the declaration and definition of a class.</w:t>
+        <w:br/>
+        <w:t>而 Java 和 C# 则彻底抛弃了头文件与实现文件分离的编程方式，这其实进一步削弱了封装性。因为在这些语言中，我们是无法区分一个类的声明和定义的。</w:t>
+        <w:br/>
+        <w:t>For these reasons, it is difficult to accept that OO depends on strong encapsulation. Indeed, many OO languages2 have little or no enforced encapsulation.</w:t>
+        <w:br/>
+        <w:t>由于上述原因，我们很难说强封装是面向对象编程的必要条件。而事实上，有很多面向对象编程语言|对封装性并没有强制性的要求。</w:t>
+        <w:br/>
+        <w:t>OO certainly does depend on the idea that programmers are well-behaved enough to not circumvent encapsulated data. Even so, the languages that claim to provide OO have only weakened the once perfect encapsulation we enjoyed with C.</w:t>
+        <w:br/>
+        <w:t>面向对象编程在应用上确实会要求程序员尽量避免破坏数据的封装性。但实际情况是，那些声称自己提供面向对象编程支持的编程语言，相对于 C 这种完美封装的语言而言，其封装性都被削弱了，而不是加强了。</w:t>
+        <w:br/>
+        <w:t>INHERITANCE? 继承</w:t>
+        <w:br/>
+        <w:t>If OO languages did not give us better encapsulation, then they certainly gave us inheritance.</w:t>
+        <w:br/>
+        <w:t>既然面向对象编程语言并没有提供更好的封装性，那么在继承性方面又如何呢？</w:t>
+        <w:br/>
+        <w:t>Well—sort of. Inheritance is simply the redeclaration of a group of variables and functions within an enclosing scope. This is something C programmers3 were able to do manually long before there was an OO language.</w:t>
+        <w:br/>
+        <w:t>嗯，其实也就一般般吧。简而言之，继承的主要作用是让我们可以在某个作用域内对外部定义的某一组变量与函数进行覆盖。这事实上也是 c 程序员早在面向对象编程语言发明之前就一直在做的事了。</w:t>
+        <w:br/>
+        <w:t>Consider this addition to our original point.h C program:</w:t>
+        <w:br/>
+        <w:t>下面，看一下刚才的 C 程序 point.h 的扩展版：</w:t>
+        <w:br/>
+        <w:t>namedPoint.h</w:t>
+        <w:br/>
+        <w:t>struct NamedPoint;</w:t>
+        <w:br/>
+        <w:t>struct NamedPoint* makeNamedPoint(double x, double y, char* name);</w:t>
+        <w:br/>
+        <w:t>void setName(struct NamedPoint* np, char* name);</w:t>
+        <w:br/>
+        <w:t>char* getName(struct NamedPoint* np);</w:t>
+        <w:br/>
+        <w:t>namedPoint.c</w:t>
+        <w:br/>
+        <w:t>#include "namedPoint.h"</w:t>
+        <w:br/>
+        <w:t>#include &lt;stdlib.h&gt;</w:t>
+        <w:br/>
+        <w:t>struct NamedPoint {</w:t>
+        <w:br/>
+        <w:t xml:space="preserve">  double x,y;</w:t>
+        <w:br/>
+        <w:t xml:space="preserve">  char* name;</w:t>
+        <w:br/>
+        <w:t>};</w:t>
+        <w:br/>
+        <w:t>struct NamedPoint* makeNamedPoint(double x, double y, char* name) {</w:t>
+        <w:br/>
+        <w:t xml:space="preserve">  struct NamedPoint* p = malloc(sizeof(struct NamedPoint));</w:t>
+        <w:br/>
+        <w:t xml:space="preserve">  p-&gt;x = x;</w:t>
+        <w:br/>
+        <w:t xml:space="preserve">  p-&gt;y = y;</w:t>
+        <w:br/>
+        <w:t xml:space="preserve">  p-&gt;name = name;</w:t>
+        <w:br/>
+        <w:t xml:space="preserve">  return p;</w:t>
+        <w:br/>
+        <w:t>}</w:t>
+        <w:br/>
+        <w:t>void setName(struct NamedPoint* np, char* name) {</w:t>
+        <w:br/>
+        <w:t xml:space="preserve">  np-&gt;name = name;</w:t>
+        <w:br/>
+        <w:t>}</w:t>
+        <w:br/>
+        <w:t>char* getName(struct NamedPoint* np) {</w:t>
+        <w:br/>
+        <w:t xml:space="preserve">  return np-&gt;name;</w:t>
+        <w:br/>
+        <w:t>}</w:t>
+        <w:br/>
+        <w:t>main.c</w:t>
+        <w:br/>
+        <w:t>#include "point.h"</w:t>
+        <w:br/>
+        <w:t>#include "namedPoint.h"</w:t>
+        <w:br/>
+        <w:t>#include &lt;stdio.h&gt;</w:t>
+        <w:br/>
+        <w:t>int main(int ac, char** av) {</w:t>
+        <w:br/>
+        <w:t xml:space="preserve">  struct NamedPoint* origin = makeNamedPoint(0.0, 0.0, "origin");</w:t>
+        <w:br/>
+        <w:t xml:space="preserve">  struct NamedPoint* upperRight = makeNamedPoint  (1.0, 1.0, "upperRight");</w:t>
+        <w:br/>
+        <w:t xml:space="preserve">  printf("distance=%f\n",</w:t>
+        <w:br/>
+        <w:t xml:space="preserve">    distance(</w:t>
+        <w:br/>
+        <w:t xml:space="preserve">             (struct Point*) origin,</w:t>
+        <w:br/>
+        <w:t xml:space="preserve">             (struct Point*) upperRight));</w:t>
+        <w:br/>
+        <w:t>}</w:t>
+        <w:br/>
+        <w:t>If you look carefully at the main program, you’ll see that the NamedPoint data structure acts as though it is a derivative of the Point data structure. This is because the order of the first two fields in NamedPoint is the same as Point. In short, NamedPoint can masquerade as Point because NamedPoint is a pure superset of Point and maintains the ordering of the members that correspond to Point.</w:t>
+        <w:br/>
+        <w:t>请仔细观察 main 函数，这里 NamedPoint 数据结构是被当作 Point 数据结构的一个衍生体來使用的。之所以可以这样做，是因为 NamedPoint 结构体的前两个成员的顺用与 Point 结构休的完全一致。简单来说，NamedPoint 之所以可以被伪装成 Point 来使用，是因为 NamedPoint 是 Point 结构体的一个超集，同两者共同成员的顺序也是一样的。</w:t>
+        <w:br/>
+        <w:t>This kind of trickery was a common practice4 of programmers prior to the advent of OO. In fact, such trickery is how C++ implements single inheritance.</w:t>
+        <w:br/>
+        <w:t>面这种编程方式虽然看上去有些投机取巧，但是在面向对象理论被提出之前，这已经很常见了。其实，C++内部就是这样实现单继承的。</w:t>
+        <w:br/>
+        <w:t>Thus we might say that we had a kind of inheritance long before OO languages were invented. That statement wouldn’t quite be true, though. We had a trick, but it’s not nearly as convenient as true inheritance. Moreover, multiple inheritance is a considerably more difficult to achieve by such trickery.</w:t>
+        <w:br/>
+        <w:t>因此，我们可以说，早在面向对象编程语言被发明之前，对继承性的支持就已经存在很久了。当然了，这种支持用了一些投机取巧的手段，并不像如今的继昼：样便利易用，而且，多重继承（multiple inheritance）如果还想用这种方法来实现，就更难了。</w:t>
+        <w:br/>
+        <w:t>Note also that in main.c, I was forced to cast the NamedPoint arguments to Point. In a real OO language, such upcasting would be implicit.</w:t>
+        <w:br/>
+        <w:t>同时应该注意的是，在 main.c 中，程序员必须强制将 NamedPoint 的参数类型转换为 Point，而在真正的面向对象编程语言中，这种类型的向上转换通常应该是隐性的。</w:t>
+        <w:br/>
+        <w:t>It’s fair to say that while OO languages did not give us something completely brand new, it did make the masquerading of data structures significantly more convenient.</w:t>
+        <w:br/>
+        <w:t>综上所述，我们可以认为，虽然面向对象编程在继承性方面并没有开创出新，但是的确在数据结构的伪装性上提供了相当程度的便利性。</w:t>
+        <w:br/>
+        <w:t>To recap: We can award no point to OO for encapsulation, and perhaps a half-point for inheritance. So far, that’s not such a great score.</w:t>
+        <w:br/>
+        <w:t>回顾一下到目前为止的分析，面向对象编程在封装性上得 0 分，在继承性上勉强可以得 0.5 分（满分为 1)。</w:t>
+        <w:br/>
+        <w:t>But there’s one more attribute to consider.</w:t>
+        <w:br/>
+        <w:t>下面，我们还有最后一个特性要讨论。</w:t>
+        <w:br/>
+        <w:t>POLYMORPHISM? 多态</w:t>
+        <w:br/>
+        <w:t>Did we have polymorphic behavior before OO languages? Of course we did. Consider this simple C copy program.</w:t>
+        <w:br/>
+        <w:t>在面向编程对象语言被发明之前，我们所使用的编程语言能支持多态吗? 答案是肯定的，请注意看下面这段用 C 语言编写的 copy 程序：</w:t>
+        <w:br/>
+        <w:t>#include &lt;stdio.h&gt;</w:t>
+        <w:br/>
+        <w:t>void copy() {</w:t>
+        <w:br/>
+        <w:t xml:space="preserve">  int c;</w:t>
+        <w:br/>
+        <w:t xml:space="preserve">  while ((c=getchar()) != EOF)</w:t>
+        <w:br/>
+        <w:t xml:space="preserve">    putchar(c);</w:t>
+        <w:br/>
+        <w:t>}</w:t>
+        <w:br/>
+        <w:t>The function getchar() reads from STDIN. But which device is STDIN? The putchar() function writes to STDOUT. But which device is that? These functions are polymorphic—their behavior depends on the type of STDIN and STDOUT.</w:t>
+        <w:br/>
+        <w:t>在上述程序中，函数 getchar() 主要负责从 STDTN 中读取数据。但是 STDLLN 究竟指代的是哪个设备呢？同样的道理，putchar() 主要负责将数据写入 STDOUT，而 STDOUT 又指代的是哪个设备呢？很显然，这类函数其实就具有多态性，因为它们的行为依赖于 STDIN 和 STDOUT 的具体类型。</w:t>
+        <w:br/>
+        <w:t>It’s as though STDIN and STDOUT are Java-style interfaces that have implementations for each device. Of course, there are no interfaces in the example C program—so how does the call to getchar() actually get delivered to the device driver that reads the character?</w:t>
+        <w:br/>
+        <w:t>这里的 STDIN 和 STDOUT 与 Java 中的接口类似，各种设备都有各自的实现。当然，这个 C 程序中是没有接口这个概念的，那么 getchar() 这个调用的动作是 如何真正传递到设备驱动程序中，从而读取到具体内容的呢？</w:t>
+        <w:br/>
+        <w:t>The answer to that question is pretty straightforward. The UNIX operating system requires that every IO device driver provide five standard functions:5 open, close, read, write, and seek. The signatures of those functions must be identical for every IO driver.</w:t>
+        <w:br/>
+        <w:t>其实很简单，UNIX 操作系统强制要求每个 IO 设备都要提供 open、close、read、write 和 seek 这 5 个标准函数。也就是说，每个 IO 设备驱动程序对这 5 种函数的实现在函数调用上必须保持一致。</w:t>
+        <w:br/>
+        <w:t>The FILE data structure contains five pointers to functions. In our example, it might look like this:</w:t>
+        <w:br/>
+        <w:t>首先，FILE 数据结构体中包含了相对应的 5 个函数指针，分别用于指向这些函数：</w:t>
+        <w:br/>
+        <w:t>struct FILE {</w:t>
+        <w:br/>
+        <w:t xml:space="preserve">  void (*open)(char* name, int mode);</w:t>
+        <w:br/>
+        <w:t xml:space="preserve">  void (*close)();</w:t>
+        <w:br/>
+        <w:t xml:space="preserve">  int (*read)();</w:t>
+        <w:br/>
+        <w:t xml:space="preserve">  void (*write)(char);</w:t>
+        <w:br/>
+        <w:t xml:space="preserve">  void (*seek)(long index, int mode);</w:t>
+        <w:br/>
+        <w:t>};</w:t>
+        <w:br/>
+        <w:t>The IO driver for the console will define those functions and load up a FILE data structure with their addresses—something like this:</w:t>
+        <w:br/>
+        <w:t>然后，譬如控制台设备的 IO 驱动程序就会提供这 5 个函数的实际定义，将 FILE 结构体的函数指针指向这些对应的实现函数：</w:t>
+        <w:br/>
+        <w:t>#include "file.h"</w:t>
+        <w:br/>
+        <w:t>void open(char* name, int mode) {/*...*/}</w:t>
+        <w:br/>
+        <w:t>void close() {/*...*/};</w:t>
+        <w:br/>
+        <w:t>int read() {int c;/*...*/ return c;}</w:t>
+        <w:br/>
+        <w:t>void write(char c) {/*...*/}</w:t>
+        <w:br/>
+        <w:t>void seek(long index, int mode) {/*...*/}</w:t>
+        <w:br/>
+        <w:t>struct FILE console = {open, close, read, write, seek};</w:t>
+        <w:br/>
+        <w:t>Now if STDIN is defined as a FILE*, and if it points to the console data structure, then getchar() might be implemented this way:</w:t>
+        <w:br/>
+        <w:t>现在，如果 STDIN 的定义是 FILE*，并同时指向了 console 这个数据结构，那么 getchar() 的实现方式就是这样的：</w:t>
+        <w:br/>
+        <w:t>extern struct FILE* STDIN;</w:t>
+        <w:br/>
+        <w:t>int getchar() {</w:t>
+        <w:br/>
+        <w:t xml:space="preserve">  return STDIN-&gt;read();</w:t>
+        <w:br/>
+        <w:t>}</w:t>
+        <w:br/>
+        <w:t>In other words, getchar() simply calls the function pointed to by the read pointer of the FILE data structure pointed to by STDIN.</w:t>
+        <w:br/>
+        <w:t>换句话说，getchar() 只是调用了 STDIN 所指向的 FIL E 数据结构体中的 read 函数指针指向的函数。</w:t>
+        <w:br/>
+        <w:t>This simple trick is the basis for all polymorphism in OO. In C++, for example, every virtual function within a class has a pointer in a table called a vtable, and all calls to virtual functions go through that table. Constructors of derivatives simply load their versions of those functions into the vtable of the object being created.</w:t>
+        <w:br/>
+        <w:t>这个简单的编程技巧正是面向对象编程中多态的基础。例如在 C++中，类中的每个虚函数（virtual function）的地址都被记录在一个名叫 vtable 的数据结构里。我们对虚函数的每次调用都要先查询这个表，其衍生类的构造函数负责将该衍生类的虚函数地址加载到整个对象的 vtable 中。</w:t>
+        <w:br/>
+        <w:t>The bottom line is that polymorphism is an application of pointers to functions. Programmers have been using pointers to functions to achieve polymorphic behavior since Von Neumann architectures were first implemented in the late 1940s. In other words, OO has provided nothing new.</w:t>
+        <w:br/>
+        <w:t>归根结底，多态其实不过就是函数指针的一种应用。自从 20 世纪 40 年代末期冯·诺依曼架构诞生那天起，程序员们就一直在使用函数指针模拟多态了。也就是说，面向对象编程在多态方面没有提出任何新概念。</w:t>
+        <w:br/>
+        <w:t>Ah, but that’s not quite correct. OO languages may not have given us polymorphism, but they have made it much safer and much more convenient.</w:t>
+        <w:br/>
+        <w:t>当然了，面向对象编程语言虽然在多态上并没有理论创新，但它们也确实让多态变得更安全、更便于使用了。</w:t>
+        <w:br/>
+        <w:t>The problem with explicitly using pointers to functions to create polymorphic behavior is that pointers to functions are dangerous. Such use is driven by a set of manual conventions. You have to remember to follow the convention to initialize those pointers. You have to remember to follow the convention to call all your functions through those pointers. If any programmer fails to remember these conventions, the resulting bug can be devilishly hard to track down and eliminate.</w:t>
+        <w:br/>
+        <w:t>用函数指针显式实现多态的问题就在于函数指针的危险性。毕竟，函数指针的调用依赖于一系列需要人为遵守的约定。程序员必须严格按照固定约定来初始化函数指针，并同样严格地按照约定来调用这些指针。只要有一个程序员没有遵守这些约定，整个程序就会产生极其难以跟踪和消除的 Bug。</w:t>
+        <w:br/>
+        <w:t>OO languages eliminate these conventions and, therefore, these dangers. Using an OO language makes polymorphism trivial. That fact provides an enormous power that old C programmers could only dream of. On this basis, we can conclude that OO imposes discipline on indirect transfer of control.</w:t>
+        <w:br/>
+        <w:t>面向对象编程语言为我们消除人工遵守这些约定的必要，也就等于消除了这方面的危险性。采用面向对象编程语言让多态实现变得非常简单，让一个传统 C 程序员可以去做以前不敢想的事情。综上所述，我们认为面向对象编程其实是对程序间接控制权的转移进行了约束。</w:t>
+        <w:br/>
+        <w:t>THE POWER OF POLYMORPHISM 多态的强大性</w:t>
+        <w:br/>
+        <w:t>What’s so great about polymorphism? To better appreciate its charms, let’s reconsider the example copy program. What happens to that program if a new IO device is created? Suppose we want to use the copy program to copy data from a handwriting recognition device to a speech synthesizer device: How do we need to change the copy program to get it to work with those new devices?</w:t>
+        <w:br/>
+        <w:t>那么多态的优势在哪里呢？为了让读者更好地理解多态的好处，我们需要再来看一下刚才的 copy 程序。如果要支持新的 IO 设备，该程序需要做什么改动呢？譬如，假设我们想要用该 copy 程序从一个手写识别设备将数据复制到另一个语音合成设备中，我们需要针对 copy 程序做什么改动，才能实现这个目标呢？</w:t>
+        <w:br/>
+        <w:t>We don’t need any changes at all! Indeed, we don’t even need to recompile the copy program. Why? Because the source code of the copy program does not depend on the source code of the IO drivers. As long as those IO drivers implement the five standard functions defined by FILE, the copy program will be happy to use them.</w:t>
+        <w:br/>
+        <w:t>答案是完全不需要做任何改动！确实，我们甚至不需要重新编译该 copy 程序。为什么？因为 copy 程序的源代码并不依赖于 IO 设备驱动程序的代码。只要 IO 设备驱动程序实现了 FILE 结构体中定义的 5 个标准函数，该 copy 程序就可以正常使用它们。</w:t>
+        <w:br/>
+        <w:t>In short, the IO devices have become plugins to the copy program.</w:t>
+        <w:br/>
+        <w:t>简单来说，IO 设备变成了 copy 程序的插件。</w:t>
+        <w:br/>
+        <w:t>Why did the UNIX operating system make IO devices plugins? Because we learned, in the late 1950s, that our programs should be device independent. Why? Because we wrote lots of programs that were device dependent, only to discover that we really wanted those programs to do the same job but use a different device.</w:t>
+        <w:br/>
+        <w:t>为什么 UNIX 操作系统会将 IO 设备设计成插件形式呢？因为自 20 世纪 50 年代末期以来，我们学到了一个重要经验：程序应该与设备无关。这个经验从何而来呢？因为一度所有程序都是设备相关的，但是后来我们发现自己其实真正需要的是在不同的设备上实现同样的功能。</w:t>
+        <w:br/>
+        <w:t>For example, we often wrote programs that read input data from decks of cards,6 and then punched new decks of cards as output. Later, our customers stopped giving us decks of cards and started giving us reels of magnetic tape. This was very inconvenient, because it meant rewriting large portions of the original program. It would be very convenient if the same program worked interchangeably with cards or tape.</w:t>
+        <w:br/>
+        <w:t>例如，我们曾经写过一些程序，需要从卡片盒中的打孔卡片读取数据，同时要通过在新的卡片上打孔来输出数据。后来，客户不再使用打孔卡片，而开始使用磁带卷了。这就给我们带来了很多麻烦，很多程序都需要重写。于是我们就会想，如果这段程序可以同时操作打孔卡片和磁带那该多好。</w:t>
+        <w:br/>
+        <w:t>The plugin architecture was invented to support this kind of IO device independence, and has been implemented in almost every operating system since its introduction. Even so, most programmers did not extend the idea to their own programs, because using pointers to functions was dangerous.</w:t>
+        <w:br/>
+        <w:t>插件式架构就是为了支持这种 IO 不相关性而发明的，它几乎在随后的所有系统中都有应用。但即使多态有如此多优点，大部分程序员还是没有将插件特性引入他们自己的程序中，因为函数指针实在是太危险了。</w:t>
+        <w:br/>
+        <w:t>OO allows the plugin architecture to be used anywhere, for anything.</w:t>
+        <w:br/>
+        <w:t>而面向对象编程的出现使得这种插件式架构可以在任何地方被安全地使用。</w:t>
+        <w:br/>
+        <w:t>DEPENDENCY INVERSION 依赖反转</w:t>
+        <w:br/>
+        <w:t>Imagine what software was like before a safe and convenient mechanism for polymorphism was available. In the typical calling tree, main functions called high-level functions, which called mid-level functions, which called low-level functions. In that calling tree, however, source code dependencies inexorably followed the flow of control (Figure 5.1).</w:t>
+        <w:br/>
+        <w:t>我们可以想象一下在安全和便利的多态支持出现之前，软件是什么样子的。下面有一个典型的调用树的例子，main 函数调用了一些高层函数，这些高层函数又调用了一些中层函数，这些中层函数又继续调用了一些底层函数。在这里，源代码面的依赖不可避免地要跟随程序的控制流（详见图 5.1）。</w:t>
+        <w:br/>
+        <w:t>Source code dependencies versus flow of control</w:t>
+        <w:br/>
+        <w:t>For mainq1w2e3r4 to call one of the high-level functions, it had to mention the name of the module that contained that function In C, this was a #include. In Java, it was an import statement. In C#, it was a using statement. Indeed, every caller was forced to mention the name of the module that contained the callee.</w:t>
+        <w:br/>
+        <w:t>如你所见，main 函数为了调用高层函数，它就必须能够看到这个函数所在模块。在 C 中，我们会通过 #include 来实现，在 Java 中则通过 import 来实现，而在 C# 中则用的是 using 语句。总之，每个函数的调用方都必须要引用被调用方所在的模块。</w:t>
+        <w:br/>
+        <w:t>This requirement presented the software architect with few, if any, options. The flow of control was dictated by the behavior of the system, and the source code dependencies were dictated by that flow of control.</w:t>
+        <w:br/>
+        <w:t>显然，这样做就导致了我们在软件架构上别无选择。在这里，系统行为决定了控制流，而控制流则决定了源代码依赖关系。</w:t>
+        <w:br/>
+        <w:t>When polymorphism is brought into play, however, something very different can happen (Figure 5.2).</w:t>
+        <w:br/>
+        <w:t>但一旦我们使用了多态，情况就不一样了（详见图 5.2）。</w:t>
+        <w:br/>
+        <w:t>Dependency inversion</w:t>
+        <w:br/>
+        <w:t>In Figure 5.2, module HL1 calls the F() function in module ML1. The fact that it calls this function through an interface is a source code contrivance. At runtime, the interface doesn’t exist. HL1 simply calls F() within ML1.7</w:t>
+        <w:br/>
+        <w:t>在图 5.2 中，模块 HL1 调用了 ML1 模块中的 F() 函数，这里的调用是通过源代码级别的接口来实现的。当然在程序实际运行时，接口这个概念是不存在的，HL1 会调用 ML1 中的 F() 函数。</w:t>
+        <w:br/>
+        <w:t>Note, however, that the source code dependency (the inheritance relationship) between ML1 and the interface I points in the opposite direction compared to the flow of control. This is called dependency inversion, and its implications for the software architect are profound.</w:t>
+        <w:br/>
+        <w:t>请注意模块 ML1 和接口 I 在源代码上的依赖关系（或者叫继承关系），该关系的方向和控制流正好是相反的，我们称之为依赖反转。这种反转对软件架构设计的影响是非常大的。</w:t>
+        <w:br/>
+        <w:t>The fact that OO languages provide safe and convenient polymorphism means that any source code dependency, no matter where it is, can be inverted.</w:t>
+        <w:br/>
+        <w:t>事实上，通过利用面向编程语言所提供的这种安全便利的多态实现，无论我们面对怎样的源代码级别的依赖关系，都可以将其反转。</w:t>
+        <w:br/>
+        <w:t>Now look back at that calling tree in Figure 5.1, and its many source code dependencies. Any of those source code dependencies can be turned around by inserting an interface between them.</w:t>
+        <w:br/>
+        <w:t>现在，我们可以再回头来看图 5.1 中的调用树，就会发现其中的众多源代码依赖关系都可以通过引入接口的方式来进行反转。</w:t>
+        <w:br/>
+        <w:t>With this approach, software architects working in systems written in OO languages have absolute control over the direction of all source code dependencies in the system. They are not constrained to align those dependencies with the flow of control. No matter which module does the calling and which module is called, the software architect can point the source code dependency in either direction.</w:t>
+        <w:br/>
+        <w:t>通过这种方法，软件架构师可以完全控制采用了面向对象这种编程方式的系统中所有的源代码依赖关系，而不再受到系统控制流的限制。不管哪个模块调用或者被调用，软件架构师都可以随意更改源代码依赖关系。</w:t>
+        <w:br/>
+        <w:t>That is power! That is the power that OO provides. That’s what OO is really all about—at least from the architect’s point of view.</w:t>
+        <w:br/>
+        <w:t>这就是面向对象编程的好处，同时也是面向对象编程这种范式的核心本质至少对一个软件架构师来说是这样的。</w:t>
+        <w:br/>
+        <w:t>What can you do with that power? As an example, you can rearrange the source code dependencies of your system so that the database and the user interface (UI) depend on the business rules (Figure 5.3), rather than the other way around.</w:t>
+        <w:br/>
+        <w:t>这种能力有什么用呢？在下面的例子中，我们可以用它来让数据库模块和用户界面模块都依赖于业务逻辑模块（见图 5.3），而非相反。</w:t>
+        <w:br/>
+        <w:t>The database and the user interface depend on the business rules</w:t>
+        <w:br/>
+        <w:t>This means that the UI and the database can be plugins to the business rules. It means that the source code of the business rules never mentions the UI or the database.</w:t>
+        <w:br/>
+        <w:t>这意味着我们让用户界面和数据库都成为业务逻辑的插件。也就是说，业务逻辑模块的源代码不需要引入用户界面和数据库这两个模块。</w:t>
+        <w:br/>
+        <w:t>As a consequence, the business rules, the UI, and the database can be compiled into three separate components or deployment units (e.g., jar files, DLLs, or Gem files) that have the same dependencies as the source code. The component containing the business rules will not depend on the components containing the UI and database.</w:t>
+        <w:br/>
+        <w:t>这样一来，业务逻辑、用户界面以及数据库就可以被编译成三个独立的组件或者部署单元（例如 jar 文件、DLL 文件、Gem 文件等）了，这些组件或者部署单元的依赖关系与源代码的依赖关系是一致的，业务逻辑组件也不会依赖于用户界面和数据库这两个组件。</w:t>
+        <w:br/>
+        <w:t>In turn, the business rules can be deployed independently of the UI and the database. Changes to the UI or the database need not have any effect on the business rules. Those components can be deployed separately and independently.</w:t>
+        <w:br/>
+        <w:t>于是，业务逻辑组件就可以独立于用户界面和数据库来进行部署了，我们对用户界面或者数据库的修改将不会对业务逻辑产生任何影响，这些组件都可以被分另独立地部署。</w:t>
+        <w:br/>
+        <w:t>In short, when the source code in a component changes, only that component needs to be redeployed. This is independent deployability.</w:t>
+        <w:br/>
+        <w:t>简单来说，当某个组件的源代码需要修改时，仅仅需要重新部署该组件，不需要更改其他组件，这就是独立部署能力。</w:t>
+        <w:br/>
+        <w:t>If the modules in your system can be deployed independently, then they can be developed independently by different teams. That’s independent developability.</w:t>
+        <w:br/>
+        <w:t>如果系统中的所有组件都可以独立部署，那它们就可以由不同的团队并行开发，这就是所谓的独立开发能力。</w:t>
+        <w:br/>
+        <w:t>CONCLUSION 本章小结</w:t>
+        <w:br/>
+        <w:t>What is OO? There are many opinions and many answers to this question. To the software architect, however, the answer is clear: OO is the ability, through the use of polymorphism, to gain absolute control over every source code dependency in the system. It allows the architect to create a plugin architecture, in which modules that contain high-level policies are independent of modules that contain low-level details. The low-level details are relegated to plugin modules that can be deployed and developed independently from the modules that contain high-level policies.</w:t>
+        <w:br/>
+        <w:t>面向对象编程到底是什么？业界在这个问题上存在着很多不同的说法和意见。然而对一个软件架构师来说，其含义应该是非常明确的：面向对象编程就是以对象为手段来对源代码中的依赖关系进行控制的能力，这种能力让软件架构师可以构建出某种插件式架构，让高层策略性组件与底层实现性组件相分离，底层组件可必编译成插件，实现独立于高层组件的开发和部署。</w:t>
+      </w:r>
+    </w:p>
+    <w:p>
+      <w:pPr>
+        <w:pStyle w:val="Title"/>
+      </w:pPr>
+      <w:r>
+        <w:t>Chap6. 函数式编程</w:t>
+      </w:r>
+    </w:p>
+    <w:p>
+      <w:r>
+        <w:t>Chap6. FUNCTIONAL PROGRAMMING 函数式编程</w:t>
+        <w:br/>
+        <w:t>SQUARES OF INTEGERS 整数平方</w:t>
+        <w:br/>
+        <w:t>IMMUTABILITY AND ARCHITECTURE 不可变性与软件架构</w:t>
+        <w:br/>
+        <w:t>SEGREGATION OF MUTABILITY 可变性的隔离</w:t>
+        <w:br/>
+        <w:t>EVENT SOURCING 事件溯源</w:t>
+        <w:br/>
+        <w:t>CONCLUSION 本章小结</w:t>
+        <w:br/>
+        <w:t>Chap6. FUNCTIONAL PROGRAMMING 函数式编程</w:t>
+        <w:br/>
+        <w:t>In many ways, the concepts of functional programming predate programming itself. This paradigm is strongly based on the l-calculus invented by Alonzo Church in the 1930s.</w:t>
+        <w:br/>
+        <w:t>函数式编程所依赖的原理，在很多方而其实是早于编程本身出现的。因为函数式编程这种范式强烈依赖于 Alonzo Church 在 20 世纪 30 年代发明的 λ 演算。</w:t>
+        <w:br/>
+        <w:t>SQUARES OF INTEGERS 整数平方</w:t>
+        <w:br/>
+        <w:t>To explain what functional programming is, it’s best to examine some examples. Let’s investigate a simple problem: printing the squares of the first 25 integers.</w:t>
+        <w:br/>
+        <w:t>我们最好还是用一个例子来解释什么是函数式编程。请看下面的这个例子：这段代码想要输出前 25 个整数的平方值。</w:t>
+        <w:br/>
+        <w:t>In a language like Java, we might write the following:</w:t>
+        <w:br/>
+        <w:t>如果使用 Java 语言，代码如下：</w:t>
+        <w:br/>
+        <w:t>public class Squint {</w:t>
+        <w:br/>
+        <w:t xml:space="preserve">  public static void main(String args[]) {</w:t>
+        <w:br/>
+        <w:t xml:space="preserve">    for (int i=0; i&lt;25; i++)</w:t>
+        <w:br/>
+        <w:t xml:space="preserve">      System.out.println(i*i);</w:t>
+        <w:br/>
+        <w:t xml:space="preserve">  }</w:t>
+        <w:br/>
+        <w:t>}</w:t>
+        <w:br/>
+        <w:t>In a language like Clojure, which is a derivative of Lisp, and is functional, we might implement this same program as follows:</w:t>
+        <w:br/>
+        <w:t>下面我们改用 Clojure 语言来写这个程序，Clojure 是 LISP 语言的一种衍生体，属于函数式编程语言。其代码如下：</w:t>
+        <w:br/>
+        <w:t>(println (take 25 (map (fn [x] (* x x)) (range))))</w:t>
+        <w:br/>
+        <w:t>If you don’t know Lisp, then this might look a little strange. So let me reformat it a bit and add some comments.</w:t>
+        <w:br/>
+        <w:t>如果读者对 LISP 不熟悉，这段代码可能看起来很奇怪。没关系，让我们换一种格式，用注释来说明一下吧：</w:t>
+        <w:br/>
+        <w:t>(println ;___________________ Print</w:t>
+        <w:br/>
+        <w:t xml:space="preserve">  (take 25 ;_________________ the first 25</w:t>
+        <w:br/>
+        <w:t xml:space="preserve">    (map (fn [x] (* x x)) ;__ squares</w:t>
+        <w:br/>
+        <w:t xml:space="preserve">      (range)))) ;___________ of Integers</w:t>
+        <w:br/>
+        <w:t>It should be clear that println, take, map, and range are all functions. In Lisp, you call a function by putting it in parentheses. For example, (range) calls the range function.</w:t>
+        <w:br/>
+        <w:t>很明显，这里的 println、take、map 和 range 都是函数。在 LISP 中，函数是通过括号来调用的，例如（range）表达式就是在调用 range 函数。</w:t>
+        <w:br/>
+        <w:t>The expression (fn [x] (* x x)) is an anonymous function that calls the multiply function, passing its input argument in twice. In other words, it computes the square of its input.</w:t>
+        <w:br/>
+        <w:t>而表达式 (fn [x] (* xx)) 则是一个匿名函数，该函数用同样的值作为参数调用了乘法函数。换句话说，该函数计算的是平方值。</w:t>
+        <w:br/>
+        <w:t>Looking at the whole thing again, it’s best to start with the innermost function call.</w:t>
+        <w:br/>
+        <w:t>现在让我们回过头再看一下这整句代码，从最内侧的函数调用开始：</w:t>
+        <w:br/>
+        <w:t>The range function returns a never-ending list of integers starting with 0.</w:t>
+        <w:br/>
+        <w:t>This list is passed into the map function, which calls the anonymous squaring function on each element, producing a new never-ending list of all the squares.</w:t>
+        <w:br/>
+        <w:t>The list of squares is passed into the take function, which returns a new list with only the first 25 elements.</w:t>
+        <w:br/>
+        <w:t>The println function prints its input, which is a list of the first 25 squares of integers.</w:t>
+        <w:br/>
+        <w:t>range 函数会返回一个从 0 开始的整数无穷列表。</w:t>
+        <w:br/>
+        <w:t>然后该列表会被传入 map 函数，并针对列表中的每个元素，调用求平方值的匿名函数，产生了一个无穷多的、包含平方值的列表。</w:t>
+        <w:br/>
+        <w:t>接着再将这个列表传入 take 函数，后者会返回一个仅包含前 25 个元素的 新列表。</w:t>
+        <w:br/>
+        <w:t>println 函数将它的参数输出，该参数就是上面这个包含了 25 个平方值的 列表。</w:t>
+        <w:br/>
+        <w:t>If you find yourself terrified by the concept of never-ending lists, don’t worry. Only the first 25 elements of those never-ending lists are actually created. That’s because no element of a never-ending list is evaluated until it is accessed.</w:t>
+        <w:br/>
+        <w:t>读者不用担心上面提到的无穷列表。因为这些列表中的元素只有在被访问时才会被创建，所以实际上只有前 25 个元素是真正被创建了的。</w:t>
+        <w:br/>
+        <w:t>If you found all of that confusing, then you can look forward to a glorious time learning all about Clojure and functional programming. It is not my goal to teach you about these topics here.</w:t>
+        <w:br/>
+        <w:t>如果上述内容还是让读者觉得云里雾里的话，可以自行学习一下 Clojure 和函数式编程，本书的目标并不是要教你学会这门语言，因此不再展开。</w:t>
+        <w:br/>
+        <w:t>Instead, my goal here is to point out something very dramatic about the difference between the Clojure and Java programs. The Java program uses a mutable variable—a variable that changes state during the execution of the program. That variable is i—the loop control variable. No such mutable variable exists in the Clojure program. In the Clojure program, variables like x are initialized, but they are never modified.</w:t>
+        <w:br/>
+        <w:t>相反，我们讨论它的主要目标是要突显出 Clojure 和 Java 这两种语言之间的巨大区别。在 Java 程序中，我们使用的是可变量，即变量 i，该变量的值会随着程序执行的过程而改变，故被称为循环控制变量。而 Clojure 程序中是不存在这种变量的，变量 x 一旦被初始化之后，就不会再被更改了。</w:t>
+        <w:br/>
+        <w:t>This leads us to a surprising statement: Variables in functional languages do not vary.</w:t>
+        <w:br/>
+        <w:t>这句话有点出人意料：函数式编程语言中的变量（Variable）是不可变（Vary）的。</w:t>
+        <w:br/>
+        <w:t>IMMUTABILITY AND ARCHITECTURE 不可变性与软件架构</w:t>
+        <w:br/>
+        <w:t>Why is this point important as an architectural consideration? Why would an architect be concerned with the mutability of variables? The answer is absurdly simple: All race conditions, deadlock conditions, and concurrent update problems are due to mutable variables. You cannot have a race condition or a concurrent update problem if no variable is ever updated. You cannot have deadlocks without mutable locks.</w:t>
+        <w:br/>
+        <w:t>为什么不可变性是软件架构设计需要考虑的重点呢？为什么软件架构帅要操心变量的可变性呢？答案显而易见：所有的竞争问题、死锁问题、并发更新问题都是由可变变量导致的。如果变量永远不会被更改，那就不可能产生竞争或者并发更新问题。如果锁状态是不可变的，那就永远不会产生死锁问题。</w:t>
+        <w:br/>
+        <w:t>In other words, all the problems that we face in concurrent applications—all the problems we face in applications that require multiple threads, and multiple processors—cannot happen if there are no mutable variables.</w:t>
+        <w:br/>
+        <w:t>换句话说，一切并发应用遇到的问题，一切由于使用多线程、多处理器而引起的问题，如果没有可变变量的话都不对能发工。</w:t>
+        <w:br/>
+        <w:t>As an architect, you should be very interested in issues of concurrency. You want to make sure that the systems you design will be robust in the presence of multiple threads and processors. The question you must be asking yourself, then, is whether immutability is practicable.</w:t>
+        <w:br/>
+        <w:t>作为一个软件架构师，当然应该要对并发问题保持高度关注。我们需要确保自己设计的系统在多线程、多处理器环境中能稳定工作。所以在这里，我们实际应该要问的问题是：不可变性是否实际可行？</w:t>
+        <w:br/>
+        <w:t>The answer to that question is affirmative, if you have infinite storage and infinite processor speed. Lacking those infinite resources, the answer is a bit more nuanced. Yes, immutability can be practicable, if certain compromises are made.</w:t>
+        <w:br/>
+        <w:t>如果我们能忽略存储器与处理器在速度上的限制，那么答案是肯定的。否则的话，不可变性只有在一定情况下是可行的。</w:t>
+        <w:br/>
+        <w:t>Let’s look at some of those compromises.</w:t>
+        <w:br/>
+        <w:t>下面让我们来看一下它具体该如何做到可行。</w:t>
+        <w:br/>
+        <w:t>SEGREGATION OF MUTABILITY 可变性的隔离</w:t>
+        <w:br/>
+        <w:t>One of the most common compromises in regard to immutability is to segregate the application, or the services within the application, into mutable and immutable components. The immutable components perform their tasks in a purely functional way, without using any mutable variables. The immutable components communicate with one or more other components that are not purely functional, and allow for the state of variables to be mutated (Figure 6.1).</w:t>
+        <w:br/>
+        <w:t>一种常见方式是将应用程序，或者是应用程序的内部服务进行切分，划分为可变的和不可变的两种组件。不可变组件用纯函数的方式来执行任务，期间不更改任何状态。这些不可变的组件将通过与一个或多个非函数式组件通信的方式来修改变量状态（参见图 6.1）。</w:t>
+        <w:br/>
+        <w:t>Mutating state and transactional memory</w:t>
+        <w:br/>
+        <w:t>Since mutating state exposes those components to all the problems of concurrency, it is common practice to use some kind of transactional memory to protect the mutable variables from concurrent updates and race conditions.</w:t>
+        <w:br/>
+        <w:t>由于状态的修改会导致一系列并发问题的产生，所以我们通常会采用某种事务型内存来保护可变变量，避免同步更新和竞争状态的发生。</w:t>
+        <w:br/>
+        <w:t>Transactional memory simply treats variables in memory the same way a database treats records on disk.1 It protects those variables with a transaction- or retry-based scheme.</w:t>
+        <w:br/>
+        <w:t>事务型内存基本上与数据库保护磁盘数据的方式 1 类似，通常釆用的是事务或者重试机制。</w:t>
+        <w:br/>
+        <w:t>A simple example of this approach is Clojure’s atom facility:</w:t>
+        <w:br/>
+        <w:t>下面我们可以用 Clojure 中的 atom 机制来写一个简单的例子：</w:t>
+        <w:br/>
+        <w:t>(def counter (atom 0)) ; initialize counter to 0</w:t>
+        <w:br/>
+        <w:t>(swap! counter inc)    ; safely increment counter.</w:t>
+        <w:br/>
+        <w:t>In this code, the counter variable is defined as an atom. In Clojure, an atom is a special kind of variable whose value is allowed to mutate under very disciplined conditions that are enforced by the swap! function.</w:t>
+        <w:br/>
+        <w:t>在这段代码中，counter 变量被定义为 atom 类型。在 Clojure 中，atom 是一类特殊的变量，它被允许在 swap!函数定义的严格条件下进行更改。</w:t>
+        <w:br/>
+        <w:t>The swap! function, shown in the preceding code, takes two arguments: the atom to be mutated, and a function that computes the new value to be stored in the atom. In our example code, the counter atom will be changed to the value computed by the inc function, which simply increments its argument.</w:t>
+        <w:br/>
+        <w:t>至于 swap! 函数，如同上面代码所写，它需要两个参数：一个是被用来修改的 atom 类型实例，另一个是用来计算新值的函数。在上面的代码中，inc 函数会将参数加 1 并存入 counter 这个 atom 实例。</w:t>
+        <w:br/>
+        <w:t>The strategy used by swap! is a traditional compare and swap algorithm. The value of counter is read and passed to inc. When inc returns, the value of counter is locked and compared to the value that was passed to inc. If the value is the same, then the value returned by inc is stored in counter and the lock is released. Otherwise, the lock is released, and the strategy is retried from the beginning.</w:t>
+        <w:br/>
+        <w:t>在这里，swap!所采用的策略是传统的比较+替换算法。即先读取 counter 变量的值，再将其传入 inc 函数。然后当 inc 函数返回时，将原先用锁保护起来的 counter 值与传入 inc 时的值进行比较。如果两边的值一致，则将 inc 函数返回的值存入 counter，释放锁。否则，先释放锁，再从头进行重试。</w:t>
+        <w:br/>
+        <w:t>The atom facility is adequate for simple applications. Unfortunately, it cannot completely safeguard against concurrent updates and deadlocks when multiple dependent variables come into play. In those instances, more elaborate facilities can be used.</w:t>
+        <w:br/>
+        <w:t>当然，atom 这个机制只适用于上面这种简单的应用程序，它并不适用于解决由多个相关变量同时需要更改所引发的并发更新问题和死锁问题，要想解决这些问题，我们就需要用到更复杂的机制。</w:t>
+        <w:br/>
+        <w:t>The point is that well-structured applications will be segregated into those components that do not mutate variables and those that do. This kind of segregation is supported by the use of appropriate disciplines to protect those mutated variables.</w:t>
+        <w:br/>
+        <w:t>这里的要点是：一个架构设计良好的应用程序应该将状态修改的部分和不需要修改状态的部分隔离成单独的组件，然后用合适的机制来保护可变量。</w:t>
+        <w:br/>
+        <w:t>Architects would be wise to push as much processing as possible into the immutable components, and to drive as much code as possible out of those components that must allow mutation.</w:t>
+        <w:br/>
+        <w:t>软件架构师应该着力于将大部分处理逻辑都归于不可变组件中，可变状态组件的逻辑应该越少越好。</w:t>
+        <w:br/>
+        <w:t>EVENT SOURCING 事件溯源</w:t>
+        <w:br/>
+        <w:t>The limits of storage and processing power have been rapidly receding from view. Nowadays it is common for processors to execute billions of instructions per second and to have billions of bytes of RAM. The more memory we have, and the faster our machines are, the less we need mutable state.</w:t>
+        <w:br/>
+        <w:t>随着存储和处理能力的大幅进步，现在拥有每秒可以执行数十亿条指令的处理器，以及数十亿字节内存的计算机已经很常见了。而内存越大，处理速度越快，我们对可变状态的依赖就会越少。</w:t>
+        <w:br/>
+        <w:t>As a simple example, imagine a banking application that maintains the account balances of its customers. It mutates those balances when deposit and withdrawal transactions are executed.</w:t>
+        <w:br/>
+        <w:t>举个简单的例子，假设某个银行应用程序需要维护客户账户余额信息，当它放行存取款事务时，就要同时负责修改余额记录。</w:t>
+        <w:br/>
+        <w:t>Now imagine that instead of storing the account balances, we store only the transactions. Whenever anyone wants to know the balance of an account, we simply add up all the transactions for that account, from the beginning of time. This scheme requires no mutable variables.</w:t>
+        <w:br/>
+        <w:t>如果我们不保存具体账户余额，仅仅保存事务日志，那么当有人想查询账户余额时。我们就将全部交易记录取出，并且每次都得从最开始到当下进行累计。当然，这样的设计就不需要维护任何可变变量了。</w:t>
+        <w:br/>
+        <w:t>Obviously, this approach sounds absurd. Over time, the number of transactions would grow without bound, and the processing power required to compute the totals would become intolerable. To make this scheme work forever, we would need infinite storage and infinite processing power.</w:t>
+        <w:br/>
+        <w:t>但显而易见，这种实现是有些不合理的。因为随着时间的推移，事务的数目会无限制增长，每次处理总额所需要的处理能力很快就会变得不能接受。如果想使这种设计永远可行的话，我们将需要无限容量的存储，以及无限的处理能力。</w:t>
+        <w:br/>
+        <w:t>But perhaps we don’t have to make the scheme work forever. And perhaps we have enough storage and enough processing power to make the scheme work for the reasonable lifetime of the application.</w:t>
+        <w:br/>
+        <w:t>但是可能我们并不需要这个设计永远可行，而且可能在整个程序的生命周期内，我们有足够的存储和处理能力来满足它。</w:t>
+        <w:br/>
+        <w:t>This is the idea behind event sourcing.2 Event sourcing is a strategy wherein we store the transactions, but not the state. When state is required, we simply apply all the transactions from the beginning of time.</w:t>
+        <w:br/>
+        <w:t>这就是事件溯源，在这种体系下，我们只存储事务记录，不存储具体状态。当需要具体状态时，我们只要从头开始计算所有的事务即可。</w:t>
+        <w:br/>
+        <w:t>Of course, we can take shortcuts. For example, we can compute and save the state every midnight. Then, when the state information is required, we need compute only the transactions since midnight.</w:t>
+        <w:br/>
+        <w:t>Now consider the data storage required for this scheme: We would need a lot of it. Realistically, offline data storage has been growing so fast that we now consider trillions of bytes to be small—so we have a lot of it.</w:t>
+        <w:br/>
+        <w:t>在存储方面，这种架构的确需要很大的存储容量。如今离线数据存储器的增长是非常快的，现在 1 TB 对我们来说也已经不算什么了。</w:t>
+        <w:br/>
+        <w:t>More importantly, nothing ever gets deleted or updated from such a data store. As a consequence, our applications are not CRUD; they are just CR. Also, because neither updates nor deletions occur in the data store, there cannot be any concurrent update issues.</w:t>
+        <w:br/>
+        <w:t>更重要的是，这种数据存储模式中不存在删除和更新的情况，我们的应用程序不是 CRUD，而是 CR。因为更新和删除这两种操作都不存在了，自然也就不存在并发问题。</w:t>
+        <w:br/>
+        <w:t>If we have enough storage and enough processor power, we can make our applications entirely immutable—and, therefore, entirely functional.</w:t>
+        <w:br/>
+        <w:t>如果我们有足够大的存储量和处理能力，应用程序就可以用完全不可变的、纯函数式的方式来编程。</w:t>
+        <w:br/>
+        <w:t>If this still sounds absurd, it might help if you remembered that this is precisely the way your source code control system works.</w:t>
+        <w:br/>
+        <w:t>如果读者还是觉得这听起来不太靠谱，可以想想我们现在用的源代码管理程序，它们正是用这种方式工作的！</w:t>
+        <w:br/>
+        <w:t>CONCLUSION 本章小结</w:t>
+        <w:br/>
+        <w:t>To summarize:</w:t>
+        <w:br/>
+        <w:t>下面我们来总结一下：</w:t>
+        <w:br/>
+        <w:t>Structured programming is discipline imposed upon direct transfer of control.</w:t>
+        <w:br/>
+        <w:t>Object-oriented programming is discipline imposed upon indirect transfer of control.</w:t>
+        <w:br/>
+        <w:t>Functional programming is discipline imposed upon variable assignment.</w:t>
+        <w:br/>
+        <w:t>结构化编程是多对程序控制权的直接转移的限制。</w:t>
+        <w:br/>
+        <w:t>面向对象编程是对程序控制权的间接转移的限制。</w:t>
+        <w:br/>
+        <w:t>函数式编程是对程序中赋值操作的限制。</w:t>
+        <w:br/>
+        <w:t>Each of these three paradigms has taken something away from us. Each restricts some aspect of the way we write code. None of them has added to our power or our capabilities.</w:t>
+        <w:br/>
+        <w:t>这三个编程范式都对程序员提出了新的限制。每个范式都约束了某种编写代码的方式，没有一个编程范式是在增加新能力。</w:t>
+        <w:br/>
+        <w:t>What we have learned over the last half-century is what not to do.</w:t>
+        <w:br/>
+        <w:t>也就是说，我们过去 50 年学到的东西主要是——什么不应该做。</w:t>
+        <w:br/>
+        <w:t>With that realization, we have to face an unwelcome fact: Software is not a rapidly advancing technology. The rules of software are the same today as they were in 1946, when Alan Turing wrote the very first code that would execute in an electronic computer. The tools have changed, and the hardware has changed, but the essence of software remains the same.</w:t>
+        <w:br/>
+        <w:t>我们必须面对这种不友好的现实：软件构建并不是一个迅速前进的技术。今天构建软件的规则和 1946 年阿兰·图灵写下电子计算机的第一行代码时是一样的。尽管工具变化了，硬件变化了，但是软件编程的核心没有变。</w:t>
+        <w:br/>
+        <w:t>Software—the stuff of computer programs—is composed of sequence, selection, iteration, and indirection. Nothing more. Nothing less.</w:t>
+        <w:br/>
+        <w:t>总而言之，软件，或者说计算机程序无一例外是由顺序结构、分支结构、循环结构和间接转移这几种行为组合而成的，无可增加，也缺一不可。</w:t>
+      </w:r>
+    </w:p>
+    <w:p>
+      <w:pPr>
+        <w:pStyle w:val="Title"/>
+      </w:pPr>
+      <w:r>
+        <w:t>Chap7. SRP：单一职责原则</w:t>
+      </w:r>
+    </w:p>
+    <w:p>
+      <w:r>
+        <w:t>Chap7. SRP: THE SINGLE RESPONSIBILITY PRINCIPLE SRP：单一职责原则</w:t>
+        <w:br/>
+        <w:t>SYMPTOM 1: ACCIDENTAL DUPLICATION 反面案例 1：重复的假象</w:t>
+        <w:br/>
+        <w:t>SYMPTOM 2: MERGES 反面案例 2：代码合井</w:t>
+        <w:br/>
+        <w:t>SOLUTIONS 解决方案</w:t>
+        <w:br/>
+        <w:t>CONCLUSION 本章小结</w:t>
+        <w:br/>
+        <w:t>Chap7. SRP: THE SINGLE RESPONSIBILITY PRINCIPLE SRP：单一职责原则</w:t>
+        <w:br/>
+        <w:t>Of all the SOLID principles, the Single Responsibility Principle (SRP) might be the least well understood. That’s likely because it has a particularly inappropriate name. It is too easy for programmers to hear the name and then assume that it means that every module should do just one thing.</w:t>
+        <w:br/>
+        <w:t>SRP 是 SOLID 五大设计原则中最容易被误解的一个。也许是名字的原因，很多程序员根据 SRP 这个名字想当然地认为这个原则就是指：每个模块都应该只做一件事。</w:t>
+        <w:br/>
+        <w:t>Make no mistake, there is a principle like that. A function should do one, and only one, thing. We use that principle when we are refactoring large functions into smaller functions; we use it at the lowest levels. But it is not one of the SOLID principles—it is not the SRP.</w:t>
+        <w:br/>
+        <w:t>没错，后者的确也是一个设订原则，即确保一个函数只完成一个功能。我们在将大型函数亜构成小函数时经常会用到这个原则，但这只是一个面向底层实现细节的设计原则，并不是 SRP 的全部。</w:t>
+        <w:br/>
+        <w:t>Historically, the SRP has been described this way:</w:t>
+        <w:br/>
+        <w:t>在历史上，我们曾经这样描述 SRP 这一设计原则：</w:t>
+        <w:br/>
+        <w:t>A module should have one, and only one, reason to change.</w:t>
+        <w:br/>
+        <w:t>任何一个软件模块都应该有且仅有一个被修改的原因。</w:t>
+        <w:br/>
+        <w:t>Software systems are changed to satisfy users and stakeholders; those users and stakeholders are the “reason to change” that the principle is talking about. Indeed, we can rephrase the principle to say this:</w:t>
+        <w:br/>
+        <w:t>在现实环境中，软件系统为了满足用户和所有者的要求，必然要经常做出这样那样的修改。而该系统的用户或者所有者就是该设计原则中所指的“被修改的原因”。所以，我们也可以这样描述 SRP：</w:t>
+        <w:br/>
+        <w:t>A module should be responsible to one, and only one, user or stakeholder.</w:t>
+        <w:br/>
+        <w:t>任何一个软件模块都应该只对一个用户（User）或系统利益相关者（Stakeholder）负责。</w:t>
+        <w:br/>
+        <w:t>Unfortunately, the words “user” and “stakeholder” aren’t really the right words to use here. There will likely be more than one user or stakeholder who wants the system changed in the same way. Instead, we’re really referring to a group—one or more people who require that change. We’ll refer to that group as an actor.</w:t>
+        <w:br/>
+        <w:t>不过，这里的“用户”和 “系统利益相关者”在用词上也并不完全准确，它们很有可能指的是一个或多个用户和利益相关者，只要这些人希望对系统进行的变更是相似的，就可以归为一类——一个或多个有共同需求的人。在这里，我们将其称为行为者（actor）。</w:t>
+        <w:br/>
+        <w:t>Thus the final version of the SRP is:</w:t>
+        <w:br/>
+        <w:t>所以，对于 SRP 的最终描述就变成了：</w:t>
+        <w:br/>
+        <w:t>A module should be responsible to one, and only one, actor.</w:t>
+        <w:br/>
+        <w:t>任何一个软件模块都应该只对某一类行为者负责。</w:t>
+        <w:br/>
+        <w:t>Now, what do we mean by the word “module”? The simplest definition is just a source file. Most of the time that definition works fine. Some languages and development environments, though, don’t use source files to contain their code. In those cases a module is just a cohesive set of functions and data structures.</w:t>
+        <w:br/>
+        <w:t>那么，上文中提到的“软件模块”究竟又是在指什么呢？大部分情况下，其最简单的定义就是指一个源代码文件。然而，有些编程语言和编程环境并不是用源代码文件来存储程序的。在这些情况下，“软件模块”指的就是一组紧密相关的函数和数据结构。</w:t>
+        <w:br/>
+        <w:t>That word “cohesive” implies the SRP. Cohesion is the force that binds together the code responsible to a single actor.</w:t>
+        <w:br/>
+        <w:t>在这里，“相关”这个词实际上就隐含了 SRP 这一原则。代码与数据就是靠着与某一类行为者的相关性被组合在一起的。</w:t>
+        <w:br/>
+        <w:t>Perhaps the best way to understand this principle is by looking at the symptoms of violating it.</w:t>
+        <w:br/>
+        <w:t>或许，理解这个设计原则最好的办法就是计大家来看一些反面案例。</w:t>
+        <w:br/>
+        <w:t>SYMPTOM 1: ACCIDENTAL DUPLICATION 反面案例 1：重复的假象</w:t>
+        <w:br/>
+        <w:t>My favorite example is the Employee class from a payroll application. It has three methods: calculatePay(), reportHours(), and save() (Figure 7.1).</w:t>
+        <w:br/>
+        <w:t>这是我最喜欢举的一个例子：某个工资管理程序中的 Employee 类有三个函数 calculatePay()、reportHours() 和 save()（见图 7.1）。</w:t>
+        <w:br/>
+        <w:t>The Employee class</w:t>
+        <w:br/>
+        <w:t>This class violates the SRP because those three methods are responsible to three very different actors.</w:t>
+        <w:br/>
+        <w:t>如你所见，这个类的三个函数分别对应的是三类非常不同的行为者，违反了 SRP 设计原则。</w:t>
+        <w:br/>
+        <w:t>The calculatePay() method is specified by the accounting department, which reports to the CFO.</w:t>
+        <w:br/>
+        <w:t>The reportHours() method is specified and used by the human resources department, which reports to the COO.</w:t>
+        <w:br/>
+        <w:t>The save() method is specified by the database administrators (DBAs), who report to the CTO.</w:t>
+        <w:br/>
+        <w:t>calculatePay() 函数是由财务部门制定的，他们负责向 CFO 汇报。</w:t>
+        <w:br/>
+        <w:t>reportHours() 函数是由人力资源部门制定并使用的，他们负责向 COO 汇报。</w:t>
+        <w:br/>
+        <w:t>save() 函数是由 DBA 制定的，他们负责向 CTO 汇报。</w:t>
+        <w:br/>
+        <w:t>By putting the source code for these three methods into a single Employee class, the developers have coupled each of these actors to the others. This coupling can cause the actions of the CFO’s team to affect something that the COO’s team depends on.</w:t>
+        <w:br/>
+        <w:t>这三个函数被放在同一个源代码文件，即同一个 Employee 类中，程序员这样 做实际上就等于使三类行为者的行为耦合在了一起，这有可能会导致 CFO 团队的命令影响到 C 00 团队所依赖的功能。</w:t>
+        <w:br/>
+        <w:t>For example, suppose that the calculatePay() function and the reportHours() function share a common algorithm for calculating non-overtime hours. Suppose also that the developers, who are careful not to duplicate code, put that algorithm into a function named regularHours() (Figure 7.2).</w:t>
+        <w:br/>
+        <w:t>例如，calculatePay() 函数和 reportHours() 函数使用同样的逻辑来计算正常工作时数。程序员为了避免重复编码，通常会将该算法单独实现为一个名为 regularHours() 的函数（见图 7.2）。</w:t>
+        <w:br/>
+        <w:t>Shared algorithm</w:t>
+        <w:br/>
+        <w:t>Now suppose that the CFO’s team decides that the way non-overtime hours are calculated needs to be tweaked. In contrast, the COO’s team in HR does not want that particular tweak because they use non-overtime hours for a different purpose.</w:t>
+        <w:br/>
+        <w:t>接下来，假设 CFO 团队需要修改正常工作时数的计算方法，而 COO 带领的 HR 团队不需要这个修改，因为他们对数据的用法是不同的。</w:t>
+        <w:br/>
+        <w:t>A developer is tasked to make the change, and sees the convenient regularHours() function called by the calculatePay() method. Unfortunately, that developer does not notice that the function is also called by the reportHours() function.</w:t>
+        <w:br/>
+        <w:t>这时候，负责这项修改的程序员会注意到 calculatePay() 函数调用了 regularHours() 函数，但可能不会注意到该函数会同时被 reportHours() 调用。</w:t>
+        <w:br/>
+        <w:t>The developer makes the required change and carefully tests it. The CFO’s team validates that the new function works as desired, and the system is deployed.</w:t>
+        <w:br/>
+        <w:t>于是，该程序员就这样按照要求进行了修改，同时 CFO 团队的成员验证了新算法工作正常。这项修改最终被成功部署上线了。</w:t>
+        <w:br/>
+        <w:t>Of course, the COO’s team doesn’t know that this is happening. The HR personnel continue to use the reports generated by the reportHours() function—but now they contain incorrect numbers. Eventually the problem is discovered, and the COO is livid because the bad data has cost his budget millions of dollars.</w:t>
+        <w:br/>
+        <w:t>但是，COO 团队显然完全不知道这些事情的发生，HR 仍然在使用 reportHours() 产生的报表，随后就会发现他们的数据出错了！最终这个问题让 COO 十分愤怒，因为这些错误的数据给公司造成了几百万美元的损失。</w:t>
+        <w:br/>
+        <w:t>We’ve all seen things like this happen. These problems occur because we put code that different actors depend on into close proximity. The SRP says to separate the code that different actors depend on.</w:t>
+        <w:br/>
+        <w:t>与此类似的事情我们肯定多多少少都经历过。这类问题发生的根源就是因为我们将不同行为者所依赖的代码强凑到了一起。对此，SRP 强调这类代码一定要被分开。</w:t>
+        <w:br/>
+        <w:t>SYMPTOM 2: MERGES 反面案例 2：代码合井</w:t>
+        <w:br/>
+        <w:t>It’s not hard to imagine that merges will be common in source files that contain many different methods. This situation is especially likely if those methods are responsible to different actors.</w:t>
+        <w:br/>
+        <w:t>一个拥有很多函数的源代码文件必然会经历很多次代码合并，该文件中的这些函数分别服务不同行为者的情况就更常见了。</w:t>
+        <w:br/>
+        <w:t>For example, suppose that the CTO’s team of DBAs decides that there should be a simple schema change to the Employee table of the database. Suppose also that the COO’s team of HR clerks decides that they need a change in the format of the hours report.</w:t>
+        <w:br/>
+        <w:t>例如，CTO 团队的 DBA 决定要对 Employee 数据库表结构进行简单修改。与此同时，COO 团队的 HR 需要修改工作时数报表的格式。</w:t>
+        <w:br/>
+        <w:t>Two different developers, possibly from two different teams, check out the Employee class and begin to make changes. Unfortunately their changes collide. The result is a merge.</w:t>
+        <w:br/>
+        <w:t>这样一来，就很可能出现两个来自不同团队的程序员分别对 Employee 类进行 修改的情况。不出意外的话，他们各自的修改一定会互相冲突，这就必须要进行代码合并。</w:t>
+        <w:br/>
+        <w:t>I probably don’t need to tell you that merges are risky affairs. Our tools are pretty good nowadays, but no tool can deal with every merge case. In the end, there is always risk.</w:t>
+        <w:br/>
+        <w:t>In our example, the merge puts both the CTO and the COO at risk. It’s not inconceivable that the CFO could be affected as well.</w:t>
+        <w:br/>
+        <w:t>在这个例子中，这次代码合并不仅有可能让 CTO 和 COO 要求的功能出错，甚至连 CFO 原本正常的功能也可能收到影响。</w:t>
+        <w:br/>
+        <w:t>There are many other symptoms that we could investigate, but they all involve multiple people changing the same source file for different reasons.</w:t>
+        <w:br/>
+        <w:t>事实上，这样的案例还有很多，我们就不一一列举了。它们的一个共同点是，多人为了不同的目的修改了同一份源代码，这很容易造成问题的产生。</w:t>
+        <w:br/>
+        <w:t>Once again, the way to avoid this problem is to separate code that supports different actors.</w:t>
+        <w:br/>
+        <w:t>而避免这种问题产生的方法就是将服务不同行为者的代码进行切分。</w:t>
+        <w:br/>
+        <w:t>SOLUTIONS 解决方案</w:t>
+        <w:br/>
+        <w:t>There are many different solutions to this problem. Each moves the functions into different classes.</w:t>
+        <w:br/>
+        <w:t>我们有很多不同的方法可以用来解决上面的问题，每一种方法都需要将相关的函数划分成不同的类。</w:t>
+        <w:br/>
+        <w:t>Perhaps the most obvious way to solve the problem is to separate the data from the functions. The three classes share access to EmployeeData, which is a simple data structure with no methods (Figure 7.3). Each class holds only the source code necessary for its particular function. The three classes are not allowed to know about each other. Thus any accidental duplication is avoided.</w:t>
+        <w:br/>
+        <w:t>其中，最简单直接的办法是将数据与函数分离，设计三个类共同使用一个不包括函数的、十分简单的 EmployeeData 类（见图 7.3），每个类只包含与之相关的函数代码，互相不可见，这样就不存在互相依赖的情况了。</w:t>
+        <w:br/>
+        <w:t>The three classes do not know about each other</w:t>
+        <w:br/>
+        <w:t>The downside of this solution is that the developers now have three classes that they have to instantiate and track. A common solution to this dilemma is to use the Facade pattern (Figure 7.4).</w:t>
+        <w:br/>
+        <w:t>这种解决方案的坏处在于：程序员现在需要在程序里处理三个类。另一种解决办法是使用 Facade 设计模式（见图 7.4）。</w:t>
+        <w:br/>
+        <w:t>The Facade pattern</w:t>
+        <w:br/>
+        <w:t>The EmployeeFacade contains very little code. It is responsible for instantiating and delegating to the classes with the functions.</w:t>
+        <w:br/>
+        <w:t>这样一来，EmployeeFacade 类所需要的代码量就很少了，它仅仅包含了初始化和调用三个具体实现类的函数。</w:t>
+        <w:br/>
+        <w:t>Some developers prefer to keep the most important business rules closer to the data. This can be done by keeping the most important method in the original Employee class and then using that class as a Facade for the lesser functions (Figure 7.5).</w:t>
+        <w:br/>
+        <w:t>当然，也有些程序员更倾向于把最重要的业务逻辑与数据放在一起，那么我们也可以选择将最重要的函数保留在 Employee 类中，同时用这个类来调用其他没那么重要的函数（见图 7.5）。</w:t>
+        <w:br/>
+        <w:t>The most important method is kept in the original Employee class and used as a Facade for the lesser functions</w:t>
+        <w:br/>
+        <w:t>You might object to these solutions on the basis that every class would contain just one function. This is hardly the case. The number of functions required to calculate pay, generate a report, or save the data is likely to be large in each case. Each of those classes would have many private methods in them.</w:t>
+        <w:br/>
+        <w:t>读者也许会反对上面这些解决方案，因为看上去这里的每个类中都只有一个函数。事实上并非如此，因为无论是计算工资、生成报表还是保存数据都是一个很复杂的过程，每个类都可能包含了许多私有函数。</w:t>
+        <w:br/>
+        <w:t>Each of the classes that contain such a family of methods is a scope. Outside of that scope, no one knows that the private members of the family exist.</w:t>
+        <w:br/>
+        <w:t>总而言之，上面的每一个类都分别容纳了一组作用于相同作用域的函数，而在该作用域之外，它们各自的私有函数是互相不可见的。</w:t>
+        <w:br/>
+        <w:t>CONCLUSION 本章小结</w:t>
+        <w:br/>
+        <w:t>The Single Responsibility Principle is about functions and classes—but it reappears in a different form at two more levels. At the level of components, it becomes the Common Closure Principle. At the architectural level, it becomes the Axis of Change responsible for the creation of Architectural Boundaries. We’ll be studying all of these ideas in the chapters to come.</w:t>
+        <w:br/>
+        <w:t>单一职责原则主要讨论的是函数和类之间的关系——但是它在两个讨论层面上会以不同的形式出现。在组件层面，我们可以将其称为共同闭包原则（Common Closure Principle)，在软件架构层面，它则是用于奠定架构边界的变更轴心（Axis of Change）。我们在接下来的章节中会深入学习这些原则。</w:t>
+      </w:r>
+    </w:p>
+    <w:p>
+      <w:pPr>
+        <w:pStyle w:val="Title"/>
+      </w:pPr>
+      <w:r>
+        <w:t>Chap8. OCP：开闭原则</w:t>
+      </w:r>
+    </w:p>
+    <w:p>
+      <w:r>
+        <w:t>Chap8. OCP: THE OPEN-CLOSED PRINCIPLE OCP：开闭原则</w:t>
+        <w:br/>
+        <w:t>A THOUGHT EXPERIMENT 思想实验</w:t>
+        <w:br/>
+        <w:t>DIRECTIONAL CONTROL 依赖方向的控制</w:t>
+        <w:br/>
+        <w:t>INFORMATION HIDING 信息隐藏</w:t>
+        <w:br/>
+        <w:t>CONCLUSION 本章小结</w:t>
+        <w:br/>
+        <w:t>Chap8. OCP: THE OPEN-CLOSED PRINCIPLE OCP：开闭原则</w:t>
+        <w:br/>
+        <w:t>The Open-Closed Principle (OCP) was coined in 1988 by Bertrand Meyer.1 It says:</w:t>
+        <w:br/>
+        <w:t>开闭原则（OCP）是 Bertrand Meyer 在 1988 年提出的，该设计原则认为：</w:t>
+        <w:br/>
+        <w:t>A software artifact should be open for extension but closed for modification.</w:t>
+        <w:br/>
+        <w:t>设计良好的计算机软件应该易于扩展，同时抗拒修改。</w:t>
+        <w:br/>
+        <w:t>In other words, the behavior of a software artifact ought to be extendible, without having to modify that artifact.</w:t>
+        <w:br/>
+        <w:t>换句话说，一个设计良好的计算机系统应该在不需要修改的前提下就可以轻易被扩展。</w:t>
+        <w:br/>
+        <w:t>This, of course, is the most fundamental reason that we study software architecture. Clearly, if simple extensions to the requirements force massive changes to the software, then the architects of that software system have engaged in a spectacular failure.</w:t>
+        <w:br/>
+        <w:t>其实这也是我们研究软件架构的根本目的。如果对原始需求的小小延伸就需要对原有的软件系统进行大幅修改，那么这个系统的架构设计显然是失败的。</w:t>
+        <w:br/>
+        <w:t>Most students of software design recognize the OCP as a principle that guides them in the design of classes and modules. But the principle takes on even greater significance when we consider the level of architectural components.</w:t>
+        <w:br/>
+        <w:t>尽管大部分软件设计师都已经认可了 OCP 是设计类与模块时的重要原则，但是在软件架构层面，这项原则的意义则更为重大。</w:t>
+        <w:br/>
+        <w:t>A thought experiment will make this clear.</w:t>
+        <w:br/>
+        <w:t>下面，让我们用一个思想实验来做一些说明。</w:t>
+        <w:br/>
+        <w:t>A THOUGHT EXPERIMENT 思想实验</w:t>
+        <w:br/>
+        <w:t>Imagine, for a moment, that we have a system that displays a financial summary on a web page. The data on the page is scrollable, and negative numbers are rendered in red.</w:t>
+        <w:br/>
+        <w:t>假设我们现在要设计一个在 Web 页面上展示财务数据的系统，页面上的数据要可以滚动显示，其中负值应显示为红色。</w:t>
+        <w:br/>
+        <w:t>Now imagine that the stakeholders ask that this same information be turned into a report to be printed on a black-and-white printer. The report should be properly paginated, with appropriate page headers, page footers, and column labels. Negative numbers should be surrounded by parentheses.</w:t>
+        <w:br/>
+        <w:t>接下来，该系统的所有者又要求同样的数据需要形成一个报表，该报表要能用黑白打印机打印，并且其报表格式要得到合理分页，每页都要包含页头、页尾及栏目名。同时，负值应该以括号表示。</w:t>
+        <w:br/>
+        <w:t>Clearly, some new code must be written. But how much old code will have to change?</w:t>
+        <w:br/>
+        <w:t>显然，我们需要增加一些代码来完成这个要求。但在这里我们更关注的问题是，满足新的要求需要更改多少旧代码。</w:t>
+        <w:br/>
+        <w:t>A good software architecture would reduce the amount of changed code to the barest minimum. Ideally, zero.</w:t>
+        <w:br/>
+        <w:t>一个好的软件架构设计师会努力将旧代码的修改需求量降至最小，甚至为 0。</w:t>
+        <w:br/>
+        <w:t>How? By properly separating the things that change for different reasons (the Single Responsibility Principle), and then organizing the dependencies between those things properly (the Dependency Inversion Principle).</w:t>
+        <w:br/>
+        <w:t>但该如何实现这一点呢？我们可以先将满足不同需求的代码分组（即 SRP），然后再来调整这些分组之间的依赖关系（即 DIP）。</w:t>
+        <w:br/>
+        <w:t>By applying the SRP, we might come up with the data-flow view shown in Figure 8.1. Some analysis procedure inspects the financial data and produces reportable data, which is then formatted appropriately by the two reporter processes.</w:t>
+        <w:br/>
+        <w:t>利用 SRP，我们可以按图 8.1 中所展示的方式来处理数据流。即先用一段分析程序处理原始的财务数据，以形成报表的数据结构，最后再用两个不同的报表生成器来产生报表。</w:t>
+        <w:br/>
+        <w:t>Applying the SRP</w:t>
+        <w:br/>
+        <w:t>The essential insight here is that generating the report involves two separate responsibilities: the calculation of the reported data, and the presentation of that data into a web- and printer-friendly form.</w:t>
+        <w:br/>
+        <w:t>这里的核心就是将应用生成报表的过程拆成两个不同的操作。即先计算出报表数据，再生成具体的展示报表（分别以网页及纸质的形式展示）。</w:t>
+        <w:br/>
+        <w:t>Having made this separation, we need to organize the source code dependencies to ensure that changes to one of those responsibilities do not cause changes in the other. Also, the new organization should ensure that the behavior can be extended without undo modification.</w:t>
+        <w:br/>
+        <w:t>接下来，我们就该修改其源代码之间的依赖关系了。这样做的目的是保证其中一个操作被修改之后不会影响到另外一个操作。同时，我们所构建的新的组织形式应该保证该程序后续在行为上的扩展都无须修改现有代码。</w:t>
+        <w:br/>
+        <w:t>We accomplish this by partitioning the processes into classes, and separating those classes into components, as shown by the double lines in the diagram in Figure 8.2. In this figure, the component at the upper left is the Controller. At the upper right, we have the Interactor. At the lower right, there is the Database. Finally, at the lower left, there are four components that represent the Presenters and the Views.</w:t>
+        <w:br/>
+        <w:t>在具体实现上，我们会将整个程序进程划分成一系列的类，然后再将这些类分割成不同的组件。下面，我们用图 8.2 中的那些双线框来具体描述一下整个实现。在这个图中，左上角的组件是 Controller，右上角是 Interactor，右下角是 Database，左下角则有四个组件分别用于代表不同的 Presenter 和 View。</w:t>
+        <w:br/>
+        <w:t>Partitioning the processes into classes and separating the classes into components</w:t>
+        <w:br/>
+        <w:t>Classes marked with &lt;I&gt; are interfaces; those marked with &lt;DS&gt; are data structures. Open arrowheads are using relationships. Closed arrowheads are implements or inheritance relationships.</w:t>
+        <w:br/>
+        <w:t>在图 8.2 中，用 &lt;I&gt; 标记的类代表接口，用 &lt;DS&gt; 标记的则代表数据结构；开放箭头指代的是使用关系，闭合箭头则指代了实现与继承关系。</w:t>
+        <w:br/>
+        <w:t>The first thing to notice is that all the dependencies are source code dependencies. An arrow pointing from class A to class B means that the source code of class A mentions the name of class B, but class B mentions nothing about class A. Thus, in Figure 8.2, FinancialDataMapper knows about FinancialDataGateway through an implements relationship, but FinancialDataGateway knows nothing at all about FinancialDataMapper.</w:t>
+        <w:br/>
+        <w:t>首先，我们在图 8.2 中看到的所有依赖关系都是其源代码中存在的依赖关系。这里，从类 A 指向类 B 的箭头意味着 A 的源代码中涉及了 B，但 是 B 的源代码中并不涉及 A。因此在图 8.2 中，FinancialDataMapper 在实现接口时需要知道 FinancialDataGateway 的实现，而 FinancialDataGateway 则完全知道 FinancialDataMapper 的实现。</w:t>
+        <w:br/>
+        <w:t>The next thing to notice is that each double line is crossed in one direction only. This means that all component relationships are unidirectional, as shown in the component graph in Figure 8.3. These arrows point toward the components that we want to protect from change.</w:t>
+        <w:br/>
+        <w:t>其次，这里很重要的一点是这些双线框的边界都是单向跨越的。也就是说，上图中所有组件之间的关系都是单向依赖的，如图 8.3 所示，图中的箭头都指向那些我们不想经常更改的组件。</w:t>
+        <w:br/>
+        <w:t>The component relationships are unidirectional</w:t>
+        <w:br/>
+        <w:t>Let me say that again: If component A should be protected from changes in component B, then component B should depend on component A.</w:t>
+        <w:br/>
+        <w:t>让我们再来复述一下这里的设计原则：如果 A 组件不想被 B 组件上发生的修改所影响，那么就应该让 B 组件依赖于 A 组件。</w:t>
+        <w:br/>
+        <w:t>We want to protect the Controller from changes in the Presenters. We want to protect the Presenters from changes in the Views. We want to protect the Interactor from changes in—well, anything.</w:t>
+        <w:br/>
+        <w:t>所以现在的情况是，我们不想让发生在 Presenter 上的修改影响到 Controller，也不想让发生在 View 上的修改影响到 Presenter。而最关键的是，我们不想让任何修改影响到 Interactor。</w:t>
+        <w:br/>
+        <w:t>The Interactor is in the position that best conforms to the OCP. Changes to the Database, or the Controller, or the Presenters, or the Views, will have no impact on the Interactor.</w:t>
+        <w:br/>
+        <w:t>其中，Interactor 组件是整个系统中最符合 OCP 的。发生在 Database、Controller、Presenter 甚至 View 上的修改都不会影响到 Interactor。</w:t>
+        <w:br/>
+        <w:t>Why should the Interactor hold such a privileged position? Because it contains the business rules. The Interactor contains the highest-level policies of the application. All the other components are dealing with peripheral concerns. The Interactor deals with the central concern.</w:t>
+        <w:br/>
+        <w:t>为什么 Interactor 会被放在这么重要的位置上呢？因为它是该程序的业务逻辑所在之处，Interactor 中包含了其最高层次的应用策略。其他组件都只是负责处理周边的辅助逻辑，只有 Interactor 才是核心组件。</w:t>
+        <w:br/>
+        <w:t>Even though the Controller is peripheral to the Interactor, it is nevertheless central to the Presenters and Views. And while the Presenters might be peripheral to the Controller, they are central to the Views.</w:t>
+        <w:br/>
+        <w:t>虽然 Controller 组件只是 Interactor 的附属品，但它却是 Presenter 和 View 所服务的核心。同样的，虽然 Presenter 组件是 Controller 的附属品，但它却是 View 所服务的核心。</w:t>
+        <w:br/>
+        <w:t>Notice how this creates a hierarchy of protection based on the notion of “level.” Interactors are the highest-level concept, so they are the most protected. Views are among the lowest-level concepts, so they are the least protected. Presenters are higher level than Views, but lower level than the Controller or the Interactor.</w:t>
+        <w:br/>
+        <w:t>另外需要注意的是，这里利用“层级”这个概念创造了一系列不同的保护层级。譬如，Interactor 是最高层的抽象，所以它被保护得最严密，而 Presenter 比 View 时层级高，但比 Controller 和 Interactor 的层级低。</w:t>
+        <w:br/>
+        <w:t>This is how the OCP works at the architectural level. Architects separate functionality based on how, why, and when it changes, and then organize that separated functionality into a hierarchy of components. Higher-level components in that hierarchy are protected from the changes made to lower-level components.</w:t>
+        <w:br/>
+        <w:t>以上就是我们在软件架构层次上对 OCP 这一设计原则的应用。软件架构师可以根据相关函数被修改的原因、修改的方式及修改的时间来对其进行分组隔离，并将这些互相隔离的函数分组整理成组件结构，使得高阶组件不会因低阶组件被修改而受到影响。</w:t>
+        <w:br/>
+        <w:t>DIRECTIONAL CONTROL 依赖方向的控制</w:t>
+        <w:br/>
+        <w:t>If you recoiled in horror from the class design shown earlier, look again. Much of the complexity in that diagram was intended to make sure that the dependencies between the components pointed in the correct direction.</w:t>
+        <w:br/>
+        <w:t>如果刚刚的类设计把你吓着了，别害怕！你刚刚在图表中所看到的复杂度是我们想要对组件之间的依赖方向进行控制而产生的。</w:t>
+        <w:br/>
+        <w:t>For example, the FinancialDataGateway interface between the FinancialReportGenerator and the FinancialDataMapper exists to invert the dependency that would otherwise have pointed from the Interactor component to the Database component. The same is true of the FinancialReportPresenter interface, and the two View interfaces.</w:t>
+        <w:br/>
+        <w:t>例如，FinanciaIReportGenerator 和 FinancialDataMapper 之间的 Financial Da taGateway 接口是为了反转 Interactor 与 Database 之间的依赖关系而产生的。同样的，FinancialReportPresenter 接口与两个 View 接口之间也类似于这种情况。</w:t>
+        <w:br/>
+        <w:t>INFORMATION HIDING 信息隐藏</w:t>
+        <w:br/>
+        <w:t>The FinancialReportRequester interface serves a different purpose. It is there to protect the FinancialReportController from knowing too much about the internals of the Interactor. If that interface were not there, then the Controller would have transitive dependencies on the FinancialEntities.</w:t>
+        <w:br/>
+        <w:t>当然，FinancialReportRequester 接口的作用则完全不同，它的作用是保护 FinancialReportController 不过度依赖于 Interactor 的内部细节。如果没有这个接口，则 Controller 将会传递性地依赖于 FinancialEntities。</w:t>
+        <w:br/>
+        <w:t>Transitive dependencies are a violation of the general principle that software entities should not depend on things they don’t directly use. We’ll encounter that principle again when we talk about the Interface Segregation Principle and the Common Reuse Principle.</w:t>
+        <w:br/>
+        <w:t>这种传递性依赖违反了“软件系统不应该依赖其不直接使用的组件”这一基本原则。之后，我们会在讨论接口隔离原则和共同复用原则的时候再次提到这一点。</w:t>
+        <w:br/>
+        <w:t>So, even though our first priority is to protect the Interactor from changes to the Controller, we also want to protect the Controller from changes to the Interactor by hiding the internals of the Interactor.</w:t>
+        <w:br/>
+        <w:t>所以，虽然我们的首要目的是为了让 Interactor 屏蔽掉发生在 Controller 上的修改，但也需要通过隐藏 Interactor 内部细节的方法来让其屏蔽掉来自 Controller 的依赖。</w:t>
+        <w:br/>
+        <w:t>CONCLUSION 本章小结</w:t>
+        <w:br/>
+        <w:t>The OCP is one of the driving forces behind the architecture of systems. The goal is to make the system easy to extend without incurring a high impact of change. This goal is accomplished by partitioning the system into components, and arranging those components into a dependency hierarchy that protects higher-level components from changes in lower-level components.</w:t>
+        <w:br/>
+        <w:t>OCP 是我们进行系统架构设计的主导原则，其主要目标是让系统易于扩展，同时限制其每次被修改所影响的范围。实现方式是通过将系统划分为一系列组件，并且将这些组件间的依赖关系按层次结构进行组织，使得高阶组件不会因低阶组件被修改而受到影响。</w:t>
+      </w:r>
+    </w:p>
+    <w:p>
+      <w:pPr>
+        <w:pStyle w:val="Title"/>
+      </w:pPr>
+      <w:r>
+        <w:t>Chap9. LSP：里氏替换原则</w:t>
+      </w:r>
+    </w:p>
+    <w:p>
+      <w:r>
+        <w:t>Chap9. LSP: THE LISKOV SUBSTITUTION PRINCIPLE LSP：里氏替换原则</w:t>
+        <w:br/>
+        <w:t>GUIDING THE USE OF INHERITANCE 继承的使用指导</w:t>
+        <w:br/>
+        <w:t>THE SQUARE/RECTANGLE PROBLEM 正方形/长方形问题</w:t>
+        <w:br/>
+        <w:t>LSP AND ARCHITECTURE LSP 与软件架构</w:t>
+        <w:br/>
+        <w:t>EXAMPLE LSP VIOLATION 违反 LSP 的案例</w:t>
+        <w:br/>
+        <w:t>CONCLUSION 本章小结</w:t>
+        <w:br/>
+        <w:t>Chap9. LSP: THE LISKOV SUBSTITUTION PRINCIPLE LSP：里氏替换原则</w:t>
+        <w:br/>
+        <w:t>In 1988, Barbara Liskov wrote the following as a way of defining subtypes.</w:t>
+        <w:br/>
+        <w:t>1988 年，Barbara Liskov 在描述如何定义子类型时写下了这样一段话：</w:t>
+        <w:br/>
+        <w:t>What is wanted here is something like the following substitution property: If for each object o1 of type S there is an object o2 of type T such that for all programs P defined in terms of T, the behavior of P is unchanged when o1 is substituted for o2 then S is a subtype of T.1</w:t>
+        <w:br/>
+        <w:t>这里需要的是一种可替换性：如果对于每个类型是 S 的对象 o1 都存在一个类型为 T 的对象 o2，能使操作 T 类型的程序 P 在用 o2 替换 o1 时行为保持不变，我们就可以将 S 称为 T 的子类型。</w:t>
+        <w:br/>
+        <w:t>To understand this idea, which is known as the Liskov Substitution Principle (LSP), let’s look at some examples.</w:t>
+        <w:br/>
+        <w:t>为了让读者理解这段话中所体现的设计理念，也就是里氏替换原则（LSP），我们可以来看几个例子。</w:t>
+        <w:br/>
+        <w:t>GUIDING THE USE OF INHERITANCE 继承的使用指导</w:t>
+        <w:br/>
+        <w:t>Imagine that we have a class named License, as shown in Figure 9.1. This class has a method named calcFee(), which is called by the Billing application. There are two “subtypes” of License: PersonalLicense and BusinessLicense. They use different algorithms to calculate the license fee.</w:t>
+        <w:br/>
+        <w:t>假设我们有一个 License 类，其结构如图 9.1 所示。该类中有一个名为 calcFee() 的方法，该方法将由 Billing 应用程序来调用。而 License 类有两个“子类型”：PersonalLicense 与 BusinessLicense，这两个类会用不同的算法来计算授权费用。</w:t>
+        <w:br/>
+        <w:t>License, and its derivatives, conform to LSP</w:t>
+        <w:br/>
+        <w:t>This design conforms to the LSP because the behavior of the Billing application does not depend, in any way, on which of the two subtypes it uses. Both of the subtypes are substitutable for the License type.</w:t>
+        <w:br/>
+        <w:t>上述设计是符合 LSP 原则的，因为 Billing 应用程序的行为并不依赖于其使用的任何一个衍生类。也就是说，这两个衍生类的对象都是可以用来替换 License 类对象的。</w:t>
+        <w:br/>
+        <w:t>THE SQUARE/RECTANGLE PROBLEM 正方形/长方形问题</w:t>
+        <w:br/>
+        <w:t>The canonical example of a violation of the LSP is the famed (or infamous, depending on your perspective) square/rectangle problem (Figure 9.2).</w:t>
+        <w:br/>
+        <w:t>正方形/长方形问题是个著名（或者说臭名远扬）的违反 LSP 的设计案例（这个问题的结构如图 9.2 所示）。</w:t>
+        <w:br/>
+        <w:t>The infamous square/rectangle problem</w:t>
+        <w:br/>
+        <w:t>In this example, Square is not a proper subtype of Rectangle because the height and width of the Rectangle are independently mutable; in contrast, the height and width of the Square must change together. Since the User believes it is communicating with a Rectangle, it could easily get confused. The following code shows why:</w:t>
+        <w:br/>
+        <w:t>在这个案例中，Square 类并不是 Rectangle 类的子类型，因为 Rectangle 类的高和宽可以分别修改，而 Square 类的高和宽则必须一同修改。由于 User 类 始终认为自己在操作 Rectangle 类，因此会带来一些混淆。例如在下面的代码中：</w:t>
+        <w:br/>
+        <w:t>Rectangle r = …</w:t>
+        <w:br/>
+        <w:t>r.setW(5);</w:t>
+        <w:br/>
+        <w:t>r.setH(2);</w:t>
+        <w:br/>
+        <w:t>assert(r.area() == 10);</w:t>
+        <w:br/>
+        <w:t>If the … code produced a Square, then the assertion would fail.</w:t>
+        <w:br/>
+        <w:t>很显然，如果上述代码在…处返回的是 Square 类，则最后的这个 assert 是不会成立的。</w:t>
+        <w:br/>
+        <w:t>The only way to defend against this kind of LSP violation is to add mechanisms to the User (such as an if statement) that detects whether the Rectangle is, in fact, a Square. Since the behavior of the User depends on the types it uses, those types are not substitutable.</w:t>
+        <w:br/>
+        <w:t>如果想要防范这种违反 LSP 的行为，唯一的办法就是在 user 类中增加用于区分 Rectangle 和 Square 的检测逻辑（例如增加 if 语句）。但这样一来，user 为的行为又将依赖于它所使用的类，这两个类就不能互相替换了。</w:t>
+        <w:br/>
+        <w:t>LSP AND ARCHITECTURE LSP 与软件架构</w:t>
+        <w:br/>
+        <w:t>In the early years of the object-oriented revolution, we thought of the LSP as a way to guide the use of inheritance, as shown in the previous sections. However, over the years the LSP has morphed into a broader principle of software design that pertains to interfaces and implementations.</w:t>
+        <w:br/>
+        <w:t>在面向对象这场编程革命兴起的早期，我们的普遍认知正如上文所说，认为 LSP 只不过是指导如何使用继承关系的一种方法，然而随着时间的推移，LSP 逐渐演变成了一种更广泛的、指导接口与其实现方式的设计原则。</w:t>
+        <w:br/>
+        <w:t>The interfaces in question can be of many forms. We might have a Java-style interface, implemented by several classes. Or we might have several Ruby classes that share the same method signatures. Or we might have a set of services that all respond to the same REST interface.</w:t>
+        <w:br/>
+        <w:t>这里提到的接口可以有多种形式——可以是 Java 风格的接口，具有多个实现类；也可以像 Ruby 一样，几个类共用一样的方法签名，甚至可以是几个服务响应同一个 REST 接口。</w:t>
+        <w:br/>
+        <w:t>In all of these situations, and more, the LSP is applicable because there are users who depend on well-defined interfaces, and on the substitutability of the implementations of those interfaces.</w:t>
+        <w:br/>
+        <w:t>LSP 适用于上述所有的应用场景，因为这些场景中的用户都依赖于一种接口，并且都期待实现该接口的类之间能具有可替换性。</w:t>
+        <w:br/>
+        <w:t>The best way to understand the LSP from an architectural viewpoint is to look at what happens to the architecture of a system when the principle is violated.</w:t>
+        <w:br/>
+        <w:t>想要从软件架构的角度来理解 LSP 的意义，最好的办法还是来看几个反面案例。</w:t>
+        <w:br/>
+        <w:t>EXAMPLE LSP VIOLATION 违反 LSP 的案例</w:t>
+        <w:br/>
+        <w:t>Assume that we are building an aggregator for many taxi dispatch services. Customers use our website to find the most appropriate taxi to use, regardless of taxi company. Once the customer makes a decision, our system dispatches the chosen taxi by using a restful service.</w:t>
+        <w:br/>
+        <w:t>假设我们现在正在构建一个提供出租车调度服务的系统。在该系统中，用户可以通过访问我们的网站，从多个出租车公司内寻找最适合自己的出租车。当用户选定车子时，该系统会通过调用 restful 服务接口来调度这辆车。</w:t>
+        <w:br/>
+        <w:t>Now assume that the URI for the restful dispatch service is part of the information contained in the driver database. Once our system has chosen a driver appropriate for the customer, it gets that URI from the driver record and then uses it to dispatch the driver.</w:t>
+        <w:br/>
+        <w:t>接下来，我们再假设该 restful 调度服务接口的 URI 被存储在司机数据库中。一旦该系统选中了最合适的出租车司机，它就会从司机数据库的记录中读取相应的 URI 信息，并通过调用这个 URI 来调度汽车。</w:t>
+        <w:br/>
+        <w:t>Suppose Driver Bob has a dispatch URI that looks like this:</w:t>
+        <w:br/>
+        <w:t>也就是说，如果司机 Bob 的记录中包含如下调度 URI：</w:t>
+        <w:br/>
+        <w:t>purplecab.com/driver/Bob</w:t>
+        <w:br/>
+        <w:t>Our system will append the dispatch information onto this URI and send it with a PUT, as follows:</w:t>
+        <w:br/>
+        <w:t>那么，我们的系统就会将调度信息附加在这个 URI 上，并发送这样一个 PUT 请求：</w:t>
+        <w:br/>
+        <w:t>purplecab.com/driver/Bob</w:t>
+        <w:br/>
+        <w:t xml:space="preserve">       /pickupAddress/24 Maple St.</w:t>
+        <w:br/>
+        <w:t xml:space="preserve">       /pickupTime/153</w:t>
+        <w:br/>
+        <w:t xml:space="preserve">       /destination/ORD</w:t>
+        <w:br/>
+        <w:t>Clearly, this means that all the dispatch services, for all the different companies, must conform to the same REST interface. They must treat the pickupAddress, pickupTime, and destination fields identically.</w:t>
+        <w:br/>
+        <w:t>很显然，这意味着所存参与该调度服务的公司都必须遵守同样的 REST 接口，它们必须用同样的方式处理 pickupAddress、pickupTime 和 destination 字段。</w:t>
+        <w:br/>
+        <w:t>Now suppose the Acme taxi company hired some programmers who didn’t read the spec very carefully. They abbreviated the destination field to just dest. Acme is the largest taxi company in our area, and Acme’s CEO’s ex-wife is our CEO’s new wife, and … Well, you get the picture. What would happen to the architecture of our system?</w:t>
+        <w:br/>
+        <w:t>接下来，我们再假设 Acme 出租车公司现在招聘的程序员由于没有仔细阅读上述接口定义，结果将 destination 字段缩写成了 dest。而 Acme 又是本地最大的出租车公司，另外，Acme CEO 的前妻不巧还是我们 CEO 的新欢……你懂的！这这会对系统的架构造成什么影响呢？</w:t>
+        <w:br/>
+        <w:t>Obviously, we would need to add a special case. The dispatch request for any Acme driver would have to be constructed using a different set of rules from all the other drivers.</w:t>
+        <w:br/>
+        <w:t>显然，我们需要为系统增加一类特殊用例，以应对 Acme 司机的调度请求。这必须要用另外一套规则来构建。</w:t>
+        <w:br/>
+        <w:t>The simplest way to accomplish this goal would be to add an if statement to the module that constructed the dispatch command:</w:t>
+        <w:br/>
+        <w:t>最简单的做法当然是增加一条 if 语句：</w:t>
+        <w:br/>
+        <w:t>if (driver.getDispatchUri().startsWith("acme.com"))…</w:t>
+        <w:br/>
+        <w:t>But, of course, no architect worth his or her salt would allow such a construction to exist in the system. Putting the word “acme” into the code itself creates an opportunity for all kinds of horrible and mysterious errors, not to mention security breaches.</w:t>
+        <w:br/>
+        <w:t>然而很明显，任何一个称职的软件架构师都不会允许这样一条语句出现在自己的系统中。因为直接将“acme”这样的字串写入代码会留下各种各样神奇又可怕的错误隐患，甚至会导致安全问题。</w:t>
+        <w:br/>
+        <w:t>For example, what if Acme became even more successful and bought the Purple Taxi company. What if the merged company maintained the separate brands and the separate websites, but unified all of the original companies’ systems? Would we have to add another if statement for “purple”?</w:t>
+        <w:br/>
+        <w:t>例如，Acme 也许会变得更加成功，最终收购了 Purple 出租车公司。然后，它们在保留了各自名字的同时却统一了彼此的计算机系统。在这种情况下，系统中难道还要再增加一条“purple”的特例吗？</w:t>
+        <w:br/>
+        <w:t>Our architect would have to insulate the system from bugs like this by creating some kind of dispatch command creation module that was driven by a configuration database keyed by the dispatch URI. The configuration data might look something like this:</w:t>
+        <w:br/>
+        <w:t>软件架构师应该创建一个调度请求创建组件，并让该组件使用一个配置数据库来保存 URI 组装格式，这样的方式可以保护系统不受外界因素变化的影响。例如其配置信息可以如下：</w:t>
+        <w:br/>
+        <w:t>URI Dispatch Format</w:t>
+        <w:br/>
+        <w:t>Acme.com /pickupAddress/%s/pickupTime/%s/dest/%s</w:t>
+        <w:br/>
+        <w:t>*.* /pickupAddress/%s/pickupTime/%s/destination/%s</w:t>
+        <w:br/>
+        <w:t>And so our architect has had to add a significant and complex mechanism to deal with the fact that the interfaces of the restful services are not all substitutable.</w:t>
+        <w:br/>
+        <w:t>但这样一来，软件架构师就需要通过增加一个复杂的组件来应对并不完全能实现互相替换的 restful 服务接口。</w:t>
+        <w:br/>
+        <w:t>CONCLUSION 本章小结</w:t>
+        <w:br/>
+        <w:t>The LSP can, and should, be extended to the level of architecture. A simple violation of substitutability, can cause a system’s architecture to be polluted with a significant amount of extra mechanisms.</w:t>
+        <w:br/>
+        <w:t>LSP 可以且应该被应用于软件架构层面，因为一旦违背了可替换也该系统架构就不得不为此增添大量复杂的应对机制。</w:t>
       </w:r>
     </w:p>
     <w:p>
@@ -495,12 +2277,12 @@
         <w:br/>
         <w:t>深入探索</w:t>
         <w:br/>
+        <w:t>应用程序</w:t>
+        <w:br/>
+        <w:t>框架</w:t>
+        <w:br/>
         <w:t>软件框架</w:t>
         <w:br/>
-        <w:t>应用程序</w:t>
-        <w:br/>
-        <w:t>Python</w:t>
-        <w:br/>
         <w:t>Again, if we imagine that this is implemented in a statically typed language like Java, then the source code of User1 will depend on U1Ops, and op1, but will not depend on OPS. Thus a change to OPS that User1 does not care about will not cause User1 to be recompiled and redeployed.</w:t>
         <w:br/>
         <w:t>这个问题可以通过将不同的操作隔离成接口来解决，具体如图 10.2 所示。同样，我们也假设这个例子是用 Java 这种静态类型语言来实现的，那么现在 User1 的源代码会依赖于 U1Ops 和 op1，但不会依赖于 OPS。这样一来，我们之后对 OPS 做的修改只要不影响到 User1 的功能，就不需要重新编译和部署 User1 了。编程</w:t>
@@ -525,9 +2307,9 @@
         <w:br/>
         <w:t>深入探索</w:t>
         <w:br/>
+        <w:t>编程语言</w:t>
+        <w:br/>
         <w:t>应用</w:t>
-        <w:br/>
-        <w:t>framework</w:t>
         <w:br/>
         <w:t>Python</w:t>
         <w:br/>
@@ -610,11 +2392,11 @@
         <w:br/>
         <w:t>深入探索</w:t>
         <w:br/>
-        <w:t>框架</w:t>
-        <w:br/>
-        <w:t>Software</w:t>
-        <w:br/>
-        <w:t>Application</w:t>
+        <w:t>应用程序</w:t>
+        <w:br/>
+        <w:t>coding</w:t>
+        <w:br/>
+        <w:t>application</w:t>
         <w:br/>
         <w:t>Every change to an abstract interface corresponds to a change to its concrete implementations. Conversely, changes to concrete implementations do not always, or even usually, require changes to the interfaces that they implement. Therefore interfaces are less volatile than implementations.</w:t>
         <w:br/>
@@ -2007,6 +3789,8 @@
         <w:br/>
         <w:t>The deployment of the system.</w:t>
         <w:br/>
+        <w:t>开发工具</w:t>
+        <w:br/>
         <w:t>系统的用例与正常运行。</w:t>
         <w:br/>
         <w:t>系统的维护。</w:t>
@@ -2021,7 +3805,7 @@
         <w:br/>
         <w:t>我们先来看第一个支持目标：用例。我们认为一个系统的架构必须能够支持其自身的设计意图。也就是说，如果某系统是一个购物车应用，那么该系统的架构就必须非常直观地支持这类应用可能会涉及的所有用例。事实上，这本来就是架构师们首先要关注的问题，也是架构设计过程中的首要工作。软件的架构必须为其用例提供支持。</w:t>
         <w:br/>
-        <w:t>However, as we discussed previously, architecture does not wield much influence over the behavior of the system. There are very few behavioral options that the architecture can leave open. But influence isn’t everything. The most important thing a good architecture can do to support behavior is to clarify and expose that behavior so that the intent of the system is visible at the architectural level.</w:t>
+        <w:t>However, as we discussed previously, architecture does not wield much influence over the behavior of the system. There are very few behavioral options that the architecture can leave open. But influence isn’t everything. The most important thing a good architecture can do to support behavior is to clarify and expose that behavior so that the intent of the system is visible at the architectural level.编程</w:t>
         <w:br/>
         <w:t>然而，正如我们前面所讨论的，一个系统的架构对其行为并没有太大的影响。虽然架构也可以限制一些行为选项，但这种影响所涉及的范围并不大。一个设计良好的架构在行为上对系统最重要的作用就是明确和显式地反映系统设计意图的行为，使其在架构层面上可见。</w:t>
         <w:br/>
@@ -2037,7 +3821,7 @@
         <w:br/>
         <w:t>Architecture plays a more substantial, and less cosmetic, role in supporting the operation of the system. If the system must handle 100,000 customers per second, the architecture must support that kind of throughput and response time for each use case that demands it. If the system must query big data cubes in milliseconds, then the architecture must be structured to allow this kind of operation.</w:t>
         <w:br/>
-        <w:t>架构在支持系统运行方面扮演着更实际的角色。如果某个系统每秒要处理 100 000 个用户，该系统的架构就必须能支持这种级别的吞吐量和响应时间。同样的，如果某个系统要在毫秒级的时间内完成对大数据仓库的查询，那么该系统的架构也必须能支持这类操作。</w:t>
+        <w:t>架构在支持系统运行方面扮演着更实际的角色。如果某个系统每秒要处理 100 000 个用户，该系统的架构就必须能支持这种级别的吞吐量和响应时间。同样的，如果某个系统要在毫秒级的时间内完成对大数据仓库的查询，那么该系统的架构也必须能支持这类操作。软件</w:t>
         <w:br/>
         <w:t>For some systems, this will mean arranging the processing elements of the system into an array of little services can be run in parallel on many different servers. For other systems, it will mean a plethora of little lightweight threads sharing the address space of a single process within a single processor. Still other systems will need just a few processes running in isolated address spaces. And some systems can even survive as simple monolithic programs running in a single process.</w:t>
         <w:br/>
@@ -2049,7 +3833,7 @@
         <w:br/>
         <w:t>DEVELOPMENT 开发</w:t>
         <w:br/>
-        <w:t>Architecture plays a significant role in supporting the development environment. This is where Conway’s law comes into play. Conway’s law says:</w:t>
+        <w:t>Architecture plays a significant role in supporting the development environment. This is where Conway’s law comes into play. Conway’s law says:操作系统</w:t>
         <w:br/>
         <w:t>系统的架构在支持开发环境方面当然扮演着重要的角色，我们在这里可以引述一下康威定律：</w:t>
         <w:br/>
@@ -2063,7 +3847,7 @@
         <w:br/>
         <w:t>DEPLOYMENT 部署</w:t>
         <w:br/>
-        <w:t>The architecture also plays a huge role in determining the ease with which the system is deployed. The goal is “immediate deployment.” A good architecture does not rely on dozens of little configuration scripts and property file tweaks. It does not require manual creation of directories or files that must be arranged just so. A good architecture helps the system to be immediately deployable after build.</w:t>
+        <w:t>The architecture also plays a huge role in determining the ease with which the system is deployed. The goal is “immediate deployment.” A good architecture does not rely on dozens of little configuration scripts and property file tweaks. It does not require manual creation of directories or files that must be arranged just so. A good architecture helps the system to be immediately deployable after build.编程</w:t>
         <w:br/>
         <w:t>一个系统的架构在其部署的便捷性方面起到的作用也是非常大的。设计目标一定是实现“立刻部署”。一个设计良好的架构通常不会依赖于成堆的脚本与配置文件，也不需要用户手动创建一堆“有严格要求”的目录与文件。总而言之，一个设计良好的软件架构可以让系统在构建完成之后立刻就能部署。</w:t>
         <w:br/>
@@ -2075,7 +3859,7 @@
         <w:br/>
         <w:t>A good architecture balances all of these concerns with a component structure that mutually satisfies them all. Sounds easy, right? Well, it’s easy for me to write that.</w:t>
         <w:br/>
-        <w:t>一个设计良好的架构应该充分地权衡以上所述的所有关注点，然后尽可能塔成一个可以同时满足所有需求的组件结构。这说起来还挺容易的，不是吗？</w:t>
+        <w:t>一个设计良好的架构应该充分地权衡以上所述的所有关注点，然后尽可能塔成一个可以同时满足所有需求的组件结构。这说起来还挺容易的，不是吗？软件</w:t>
         <w:br/>
         <w:t>The reality is that achieving this balance is pretty hard. The problem is that most of the time we don’t know what all the use cases are, nor do we know the operational constraints, the team structure, or the deployment requirements. Worse, even if we did know them, they will inevitably change as the system moves through its life cycle. In short, the goals we must meet are indistinct and inconstant. Welcome to the real world.</w:t>
         <w:br/>
@@ -2087,7 +3871,7 @@
         <w:br/>
         <w:t>A good architecture makes the system easy to change, in all the ways that it must change, by leaving options open.</w:t>
         <w:br/>
-        <w:t>一个设计良好的架构应该通过保留可选项的方式，让系统在任何情况下都能方便地做出必要的变更。</w:t>
+        <w:t>一个设计良好的架构应该通过保留可选项的方式，让系统在任何情况下都能方便地做出必要的变更。开发工具</w:t>
         <w:br/>
         <w:t>DECOUPLING LAYERS 按层解耦</w:t>
         <w:br/>
@@ -2097,7 +3881,7 @@
         <w:br/>
         <w:t>What changes for different reasons? There are some obvious things. User interfaces change for reasons that have nothing to do with business rules. Use cases have elements of both. Clearly, then, a good architect will want to separate the UI portions of a use case from the business rule portions in such a way that they can be changed independently of each other, while keeping those use cases visible and clear.</w:t>
         <w:br/>
-        <w:t>哪些部分的变更原因是不同的呢？这在有些情况下是很显而易见的。譬如，用户界面的变更原因肯定和业务逻辑是不相关的，而业务用例则通常在两边都存在着相关的元素。所以很显然，优秀的架构师应该会将用例的 UI 部分与其业务逻辑部分隔离，这样这两部分就既可以各自进行变更，也能保证用例的完整清晰。</w:t>
+        <w:t>哪些部分的变更原因是不同的呢？这在有些情况下是很显而易见的。譬如，用户界面的变更原因肯定和业务逻辑是不相关的，而业务用例则通常在两边都存在着相关的元素。所以很显然，优秀的架构师应该会将用例的 UI 部分与其业务逻辑部分隔离，这样这两部分就既可以各自进行变更，也能保证用例的完整清晰。操作系统</w:t>
         <w:br/>
         <w:t>Business rules themselves may be closely tied to the application, or they may be more general. For example, the validation of input fields is a business rule that is closely tied to the application itself. In contrast, the calculation of interest on an account and the counting of inventory are business rules that are more closely associated with the domain. These two different kinds of rules will change at different rates, and for different reasons—so they should be separated so that they can be independently changed.</w:t>
         <w:br/>
@@ -2107,7 +3891,7 @@
         <w:br/>
         <w:t>至于数据库，以及其所采用的查询语言，甚至表结构，这些都是系统的技术细节信息，它们与业务规则或 UI 毫无关系。这就意味着它们的变更原因、变更速率必然与系统的其他方面各不相同。因此，架构师也应该将它们与系统其他部分隔离，以方便各自的变更。</w:t>
         <w:br/>
-        <w:t>Thus we find the system divided into decoupled horizontal layers—the UI, application-specific business rules, application-independent business rules, and the database, just to mention a few.</w:t>
+        <w:t>Thus we find the system divided into decoupled horizontal layers—the UI, application-specific business rules, application-independent business rules, and the database, just to mention a few.计算机与电子产品</w:t>
         <w:br/>
         <w:t>这样一来，我们就发现了一个系统可以被解耦成若干个水平分层应用独有的业务逻辑、领域普适的业务逻辑、数据库等。</w:t>
         <w:br/>
@@ -2119,7 +3903,7 @@
         <w:br/>
         <w:t>At the same time, use cases are narrow vertical slices that cut through the horizontal layers of the system. Each use case uses some UI, some application-specific business rules, some application-independent business rules, and some database functionality. Thus, as we are dividing the system in to horizontal layers, we are also dividing the system into thin vertical use cases that cut through those layers.</w:t>
         <w:br/>
-        <w:t>与此同时，这些用例也是上述系统水平分层的一个个垂直切面。每个用例都会用到一些 UI、特定应用的业务逻辑、应用无关的业务逻辑以及数据库功能。因此，我们时系统水平切分成多个分层的同时，也在按用例将其切分成多个垂直切分。</w:t>
+        <w:t>与此同时，这些用例也是上述系统水平分层的一个个垂直切面。每个用例都会用到一些 UI、特定应用的业务逻辑、应用无关的业务逻辑以及数据库功能。因此，我们时系统水平切分成多个分层的同时，也在按用例将其切分成多个垂直切分。软件</w:t>
         <w:br/>
         <w:t>To achieve this decoupling, we separate the UI of the add-order use case from the UI of the delete-order use case. We do the same with the business rules, and with the database. We keep the use cases separate down the vertical height of the system.</w:t>
         <w:br/>
@@ -2131,7 +3915,7 @@
         <w:br/>
         <w:t>DECOUPLING MODE 解耦的模式</w:t>
         <w:br/>
-        <w:t>Now think of what all that decoupling means for the second bullet: operations. If the different aspects of the use cases are separated, then those that must run at a high throughput are likely already separated from those that must run at a low throughput. If the UI and the database have been separated from the business rules, then they can run in different servers. Those that require higher bandwidth can be replicated in many servers.</w:t>
+        <w:t>Now think of what all that decoupling means for the second bullet: operations. If the different aspects of the use cases are separated, then those that must run at a high throughput are likely already separated from those that must run at a low throughput. If the UI and the database have been separated from the business rules, then they can run in different servers. Those that require higher bandwidth can be replicated in many servers.数据管理</w:t>
         <w:br/>
         <w:t>现在我们来想想所有的这些解耦动作对架构设计的第二个目标——系统运行——究竟有什么意义。如果不同面向之间的用例得到了良好的隔离，那么需要高吞吐量的用例就和需要低吞吐量的用例互相自然分开了。如果 UI 和数据库的部分能从业务逻辑分离出来，那么它们就可以运行在不同的服务器上。而且需要较大带宽的应用也可以在多个服务器上运行多个实例。</w:t>
         <w:br/>
@@ -2143,7 +3927,7 @@
         <w:br/>
         <w:t>许多架构帅将上面这种组件称为“服务”，或“微服务”，至于是前者还是后者，往往取决于某些非常模糊的代码行数阈值。对于这种基于服务来构建的架构，架构师们通常称之为面向服务的架构（service-oriented architecture）。</w:t>
         <w:br/>
-        <w:t>If that nomenclature set off some alarm bells in your mind, don’t worry. I’m not going to tell you that SoA is the best possible architecture, or that micro-services are the wave of the future. The point being made here is that sometimes we have to separate our components all the way to the service level.</w:t>
+        <w:t>If that nomenclature set off some alarm bells in your mind, don’t worry. I’m not going to tell you that SoA is the best possible architecture, or that micro-services are the wave of the future. The point being made here is that sometimes we have to separate our components all the way to the service level.计算机与电子产品</w:t>
         <w:br/>
         <w:t>如果因为这里提到了 SOA 这个概念而引起了某些读者的警觉，请不用担心，在这里并没有鼓吹 SOA 是一种最佳的软件架构，或者微服务就是未来的潮流。我只是认为有时候我们必须把组件切割到服务这个应用层次。</w:t>
         <w:br/>
@@ -2161,7 +3945,7 @@
         <w:br/>
         <w:t>我们进行架构设计的第三个目标是支持系统的开发。很显然，当系统组件之间被高度解耦之后，开发团队之间的干扰就大大减少了。譬如说，如果系统的业务逻辑与其 UI 无关，那么专注于 UI 开发的团队就不会对专注于业务逻辑开发的团队造成多大的影响。同样的，如果系统的各个用例之间相互隔离，那么专注于 addOrder 用例的团队就不太可能干扰到负责 deleteOrder 用例的团队。</w:t>
         <w:br/>
-        <w:t>So long as the layers and use cases are decoupled, the architecture of the system will support the organization of the teams, irrespective of whether they are organized as feature teams, component teams, layer teams, or some other variation.</w:t>
+        <w:t>So long as the layers and use cases are decoupled, the architecture of the system will support the organization of the teams, irrespective of whether they are organized as feature teams, component teams, layer teams, or some other variation.软件</w:t>
         <w:br/>
         <w:t>只要系统按照其水平分层和用例进行了恰当的解耦，整个系统的架构就可以支持多团队开发，不管团队组织形式是分功能开发、分组件开发、分层开发，还是按照别的什么变量分工都可以。</w:t>
         <w:br/>
@@ -2175,7 +3959,7 @@
         <w:br/>
         <w:t>Architects often fall into a trap—a trap that hinges on their fear of duplication.</w:t>
         <w:br/>
-        <w:t>架构师们经常会钻进一个牛角尖——害怕重复。</w:t>
+        <w:t>架构师们经常会钻进一个牛角尖——害怕重复。操作系统</w:t>
         <w:br/>
         <w:t>Duplication is generally a bad thing in software. We don’t like duplicated code. When code is truly duplicated, we are honor-bound as professionals to reduce and eliminate it.</w:t>
         <w:br/>
@@ -2185,7 +3969,7 @@
         <w:br/>
         <w:t>但是重复也存在着很多种情况。其中有些是真正的重复，在这种情况下，每个实例上发生的每项变更都必须同时应用到其所有的副本上。重复的情况中也有一些是假的，或者说这种重复只是表面性的。如果有两段看起来重复的代码，它们走的是不同的演进路径，也就是说它们有着不同的变更速率和变更缘由，那么这两段代码就不是真正的重复。等我们几年后再回过头来看，可能就会发现这两段代码是非常不一样的了。</w:t>
         <w:br/>
-        <w:t>Now imagine two use cases that have very similar screen structures. The architects will likely be strongly tempted to share the code for that structure. But should they? Is that true duplication? Or it is accidental?</w:t>
+        <w:t>Now imagine two use cases that have very similar screen structures. The architects will likely be strongly tempted to share the code for that structure. But should they? Is that true duplication? Or it is accidental?编程</w:t>
         <w:br/>
         <w:t>现在，我们假设某系统中有两个用例在屏幕展现形式上非常类似。每当这种时候，架构师们就很可能非常想复用同一段代码来处理它们的屏幕展示。那么，我们到底是否应该这样做呢？这里是真正的重复，还只是一种表面性的重复？</w:t>
         <w:br/>
@@ -2197,7 +3981,7 @@
         <w:br/>
         <w:t>当我们按用例垂直切分系统时，这样的问题会经常出现。我们经常遇到一些不同的用例为了上述原因被耦合在了一起。不管是因为它们展现形式类似，还是使用了相似的语法、相似的数据库查询/表结构等，总之，我们一定要小心避免对任何重复都要立即消除的应激反应模式中。一定要确保这些消除动作只针对那些真正意义上的重复。</w:t>
         <w:br/>
-        <w:t>By the same token, when you are separating layers horizontally, you might notice that the data structure of a particular database record is very similar to the data structure of a particular screen view. You may be tempted to simply pass the database record up to the UI, rather than to create a view model that looks the same and copy the elements across. Be careful: This duplication is almost certainly accidental. Creating the separate view model is not a lot of effort, and it will help you keep the layers properly decoupled.</w:t>
+        <w:t>By the same token, when you are separating layers horizontally, you might notice that the data structure of a particular database record is very similar to the data structure of a particular screen view. You may be tempted to simply pass the database record up to the UI, rather than to create a view model that looks the same and copy the elements across. Be careful: This duplication is almost certainly accidental. Creating the separate view model is not a lot of effort, and it will help you keep the layers properly decoupled.计算机与电子产品</w:t>
         <w:br/>
         <w:t>同样的道理，当我们对系统进行水平分层时，也可能会发现某个数据库记录的结构和某个屏幕展示的数据接口非常相似。我们可能也会为了避免再创建一个看起来相同的视图模型并在两者之间复制元素，而选择直接将数据库记录传递给 UI 层。我们也一定要小心，这里几乎肯定只是一种表面性的重复。而且，另外创建一个视图模型并不会花费太多力气，这可以帮助我们保持系统水平分层之间的隔离。</w:t>
         <w:br/>
@@ -2211,7 +3995,7 @@
         <w:br/>
         <w:t>源码层次：我们可以控制源代码模块之间的依赖关系，以此来实现一个模块的变更不会导致其他模块也需要变更或重新编译（例如 Ruby Gem）。</w:t>
         <w:br/>
-        <w:t>In this decoupling mode the components all execute in the same address space, and communicate with each other using simple function calls. There is a single executable loaded into computer memory. People often call this a monolithic structure.</w:t>
+        <w:t>In this decoupling mode the components all execute in the same address space, and communicate with each other using simple function calls. There is a single executable loaded into computer memory. People often call this a monolithic structure.开发工具</w:t>
         <w:br/>
         <w:t>在这种解耦模式下，系统所有的组件都会在同一个地址空间内执行，它们会通过简单的函数调用来进行彼此的交互。这类系统在运行时是作为一个执行文件被统一加载到计算机内存中的。人们经常把这种模式叫作单体结构。</w:t>
         <w:br/>
@@ -2225,6 +4009,8 @@
         <w:br/>
         <w:t>Service level. We can reduce the dependencies down to the level of data structures, and communicate solely through network packets such that every execution unit is entirely independent of source and binary changes to others (e.g., services or micro-services).</w:t>
         <w:br/>
+        <w:t>软件</w:t>
+        <w:br/>
         <w:t>服务层次：我们可以将组件间的依赖关系降低到数据结构级别’然后仅通过网络数据包来进行通信。这样系统的每个执行单元在源码层和二进制层都会是一个独立的个体，它们的变更不会影响其他地方（例如常见的服务或微服务就都是如此的）。</w:t>
         <w:br/>
         <w:t>What is the best mode to use?</w:t>
@@ -2237,7 +4023,7 @@
         <w:br/>
         <w:t>For example, it’s not difficult to imagine that a system that runs comfortably on one server right now might grow to the point where some of its components ought to run on separate servers. While the system runs on a single server, the source-level decoupling might be sufficient. Later, however, it might require decoupling into deployable units, or even services.</w:t>
         <w:br/>
-        <w:t>例如，我们不难想象，一个在某台服务器上运行良好的程序发展到一定程度，可能就会需要将其某些组件迁移到其他服务器上才能满足运行要求。当该系统只运行在一台服务器上时，我们进行源码层次的解耦就已经足够了。但在这之后，我们可能需要进行部署单元层次的解耦，甚至服务层次的解耦。</w:t>
+        <w:t>例如，我们不难想象，一个在某台服务器上运行良好的程序发展到一定程度，可能就会需要将其某些组件迁移到其他服务器上才能满足运行要求。当该系统只运行在一台服务器上时，我们进行源码层次的解耦就已经足够了。但在这之后，我们可能需要进行部署单元层次的解耦，甚至服务层次的解耦。数据管理</w:t>
         <w:br/>
         <w:t>One solution (which seems to be popular at the moment) is to simply decouple at the service level by default. A problem with this approach is that it is expensive and encourages coarse-grained decoupling. No matter how “micro” the micro-services get, the decoupling is not likely to be fine-grained enough.</w:t>
         <w:br/>
@@ -2247,9 +4033,9 @@
         <w:br/>
         <w:t>服务层次解耦的另一个问题是不仅系统资源成本高昂，而且研发成本更高。处理服务边界不仅非常耗费内存、处理器资源，而且更耗费人力。虽然内存和处理器越来越便宜，但是人力成本可一直都很高。</w:t>
         <w:br/>
-        <w:t>My preference is to push the decoupling to the point where a service could be formed. should it become necessary; but then to leave the components in the same address space as long as possible. This leaves the option for a service open.</w:t>
-        <w:br/>
-        <w:t>通常，我会倾向于将系统的解耦推行到某种一旦有需要就可以随时转变为服务的程度即可，让整个程序尽量长时间地保持单体结构，以便给未来留下可选项。</w:t>
+        <w:t>My preference is to push the decoupling to the point where a service could be formed. should it become necessary; but then to leave the components in the same address space as long as possible. This leaves the option for a service open.开发工具</w:t>
+        <w:br/>
+        <w:t>通常，我会倾向于将系统的解耦推行到某种一旦有需要就可以随时转变为服务的程度即可，让整个程序尽量长时间地保持单体结构，以便给未来留下可选项。计算机与电子产品</w:t>
         <w:br/>
         <w:t>With this approach, initially the components are separated at the source code level. That may be good enough for the duration of the project’s lifetime. If, however, deployment or development issues arise, driving some of the decoupling to a deployment level may be sufficient—at least for a while.</w:t>
         <w:br/>
@@ -2261,7 +4047,7 @@
         <w:br/>
         <w:t>Over time, the operational needs of the system may decline. What once required decoupling at the service level may now require only deployment-level or even source-level decoupling.</w:t>
         <w:br/>
-        <w:t>而随着时间的流逝，系统的运维需求可能又会降低。之前需要进行服务层次解耦的系统可能现在只需要进行部署层次或源码层次的解耦就够了。</w:t>
+        <w:t>而随着时间的流逝，系统的运维需求可能又会降低。之前需要进行服务层次解耦的系统可能现在只需要进行部署层次或源码层次的解耦就够了。操作系统</w:t>
         <w:br/>
         <w:t>A good architecture will allow a system to be born as a monolith, deployed in a single file, but then to grow into a set of independently deployable units, and then all the way to independent services and/or micro-services. Later, as things change, it should allow for reversing that progression and sliding all the way back down into a monolith.</w:t>
         <w:br/>
@@ -2275,7 +4061,7 @@
         <w:br/>
         <w:t>Yes, this is tricky. And I’m not saying that the change of decoupling modes should be a trivial configuration option (though sometimes that is appropriate). What I’m saying is that the decoupling mode of a system is one of those things that is likely to change with time, and a good architect foresees and appropriately facilitates those changes.</w:t>
         <w:br/>
-        <w:t>是的，要达到上述要求难度不小。我并没有说系统的部署模式就一定要是某种简单的配置项（虽然在某些情况下的确应该这样做）。这里的主要观点认为，一个系统所适用的解耦模式可能会随着时间而变化，优秀的架构师应该能预见这一点，并且做岀相应的对策。</w:t>
+        <w:t>是的，要达到上述要求难度不小。我并没有说系统的部署模式就一定要是某种简单的配置项（虽然在某些情况下的确应该这样做）。这里的主要观点认为，一个系统所适用的解耦模式可能会随着时间而变化，优秀的架构师应该能预见这一点，并且做岀相应的对策。编程</w:t>
       </w:r>
     </w:p>
     <w:p>
@@ -2782,7 +4568,7 @@
         <w:br/>
         <w:t>Chap19. POLICY AND LEVEL 策略与层次</w:t>
         <w:br/>
-        <w:t>Software systems are statements of policy. Indeed, at its core, that’s all a computer program actually is. A computer program is a detailed description of the policy by which inputs are transformed into outputs.软件</w:t>
+        <w:t>Software systems are statements of policy. Indeed, at its core, that’s all a computer program actually is. A computer program is a detailed description of the policy by which inputs are transformed into outputs.</w:t>
         <w:br/>
         <w:t>本质上，所有的软件都是一组策略语句的集合。是的，可以说计算机程序不过就是一组仔细描述如何将输入转化为输出的策略语句的集合。</w:t>
         <w:br/>
@@ -2794,7 +4580,7 @@
         <w:br/>
         <w:t>软件架构设计的工作重点之一就是，将这些策略彼此分离，然后将它们按照变更的方式进行重新分组。其中变更原因、时间和层次相同的策略应该被分到同一个组件中。反之，变更原因、时间和层次不同的策略则应该分属于不同的组件。</w:t>
         <w:br/>
-        <w:t>The art of architecture often involves forming the regrouped components into a directed acyclic graph. The nodes of the graph are the components that contain policies at the same level. The directed edges are the dependencies between those components. They connect components that are at different levels.计算机硬件</w:t>
+        <w:t>The art of architecture often involves forming the regrouped components into a directed acyclic graph. The nodes of the graph are the components that contain policies at the same level. The directed edges are the dependencies between those components. They connect components that are at different levels.</w:t>
         <w:br/>
         <w:t>架构设计的工作常常需要将组件重排组合成为一个有向无环图。图中的每一个节点代表的是一个拥有相同层次策略的组件，每一条单向链接都代表了一种组件之间的依赖关系，它们将不同级别的组件链接起来。</w:t>
         <w:br/>
@@ -2810,7 +4596,7 @@
         <w:br/>
         <w:t>A strict definition of “level” is “the distance from the inputs and outputs.” The farther a policy is from both the inputs and the outputs of the system, the higher its level. The policies that manage input and output are the lowest-level policies in the system.</w:t>
         <w:br/>
-        <w:t>我们对“层次”是严格按照“输入与输出之间的距离”来定义的。也就是说，一条策略距离系统的输入/输出越远，它所属的层次就越高。而直接管理输入/输出的策略在系统中的层次是最低的。编程</w:t>
+        <w:t>我们对“层次”是严格按照“输入与输出之间的距离”来定义的。也就是说，一条策略距离系统的输入/输出越远，它所属的层次就越高。而直接管理输入/输出的策略在系统中的层次是最低的。</w:t>
         <w:br/>
         <w:t>The data flow diagram in Figure 19.1 depicts a simple encryption program that reads characters from an input device, translates the characters using a table, and then writes the translated characters to an output device. The data flows are shown as curved solid arrows. The properly designed source code dependencies are shown as straight dashed lines.</w:t>
         <w:br/>
@@ -2824,7 +4610,7 @@
         <w:br/>
         <w:t>Note that the data flows and the source code dependencies do not always point in the same direction. This, again, is part of the art of software architecture. We want source code dependencies to be decoupled from data flow and coupled to level.</w:t>
         <w:br/>
-        <w:t>另外需要注意的是，图 19.1 中的数据流向和源码中的依赖关系并不总处于同一方向上。这也是软件架构设计工作的一部分。我们希望源码中的依赖关系与其数据流向脫钩，而与组件所在的层次挂钩。数学</w:t>
+        <w:t>另外需要注意的是，图 19.1 中的数据流向和源码中的依赖关系并不总处于同一方向上。这也是软件架构设计工作的一部分。我们希望源码中的依赖关系与其数据流向脫钩，而与组件所在的层次挂钩。</w:t>
         <w:br/>
         <w:t>It would be easy to create an incorrect architecture by writing the encryption program like this:</w:t>
         <w:br/>
@@ -2842,7 +4628,7 @@
         <w:br/>
         <w:t>A better architecture for this system is shown in the class diagram in Figure 19.2. Note the dashed border surrounding the Encrypt class, and the CharWriter and CharReader interfaces. All dependencies crossing that border point inward. This unit is the highest-level element in the system.</w:t>
         <w:br/>
-        <w:t>更好的系统架构设计应如图 19.2 所示。请注意图 19.2 中被虚线框起来的 Encrypt 类及其两个接口 CharReader 和 CharWriter。所有的依赖关系都指向了边界内部。这一切都说明它是系统中最高层次的组件。软件</w:t>
+        <w:t>更好的系统架构设计应如图 19.2 所示。请注意图 19.2 中被虚线框起来的 Encrypt 类及其两个接口 CharReader 和 CharWriter。所有的依赖关系都指向了边界内部。这一切都说明它是系统中最高层次的组件。</w:t>
         <w:br/>
         <w:t>Class diagram showing a better architecture for the system</w:t>
         <w:br/>
@@ -2868,7 +4654,7 @@
         <w:br/>
         <w:t>Another way to look at this issue is to note that lower-level components should be plugins to the higher-level components. The component diagram in Figure 19.3 shows this arrangement. The Encryption component knows nothing of the IODevices component; the IODevices component depends on the Encryption component.</w:t>
         <w:br/>
-        <w:t>从另一个角度来说，低层组件应该成为高层组件的插件。图 19.3 中的组件图展示了这种关系，我们可以看到 Encryption 组件对 IODevices 组件的情况一无所知，而 IODevices 组件则依赖于 Encryption 组件。数学</w:t>
+        <w:t>从另一个角度来说，低层组件应该成为高层组件的插件。图 19.3 中的组件图展示了这种关系，我们可以看到 Encryption 组件对 IODevices 组件的情况一无所知，而 IODevices 组件则依赖于 Encryption 组件。</w:t>
         <w:br/>
         <w:t>Lower-level components should plug in to higher-level components</w:t>
         <w:br/>
@@ -2877,179 +4663,6 @@
         <w:t>At this point, this discussion of policies has involved a mixture of the Single Responsibility Principle, the Open-Closed Principle, the Common Closure Principle, the Dependency Inversion Principle, the Stable Dependencies Principle, and the Stable Abstractions Principle. Look back and see if you can identify where each principle was used, and why.</w:t>
         <w:br/>
         <w:t>综上所述，本章针对策略的讨论涉及单一职责原则（SRP）、开闭原则（OCP）、共同闭包原则（CCP）、依赖反转原则（DIP）、稳定依赖原则（SDP）以及稳定抽象原则（SAP）。读者可以自行结合之前的内容来匹配每个原则所适用的场景以及背后的原因。</w:t>
-      </w:r>
-    </w:p>
-    <w:p>
-      <w:pPr>
-        <w:pStyle w:val="Title"/>
-      </w:pPr>
-      <w:r>
-        <w:t>Chap2. 两个价值维度</w:t>
-      </w:r>
-    </w:p>
-    <w:p>
-      <w:r>
-        <w:t>Chap2. A TALE OF TWO VALUES 两个价值维度</w:t>
-        <w:br/>
-        <w:t>BEHAVIOR 行为价值</w:t>
-        <w:br/>
-        <w:t>ARCHITECTURE 架构价值</w:t>
-        <w:br/>
-        <w:t>THE GREATER VALUE 哪个价值维度更重要</w:t>
-        <w:br/>
-        <w:t>EISENHOWER’S MATRIX 艾森豪威尔矩阵</w:t>
-        <w:br/>
-        <w:t>FIGHT FOR THE ARCHITECTURE 为好的软件架构而持续斗争</w:t>
-        <w:br/>
-        <w:t>Chap2. A TALE OF TWO VALUES 两个价值维度</w:t>
-        <w:br/>
-        <w:t>Every software system provides two different values to the stakeholders: behavior and structure. Software developers are responsible for ensuring that both those values remain high. Unfortunately, they often focus on one to the exclusion of the other. Even more unfortunately, they often focus on the lesser of the two values, leaving the software system eventually valueless.</w:t>
-        <w:br/>
-        <w:t>对于每个软件系统，我们都对以通过行为和架构两个维度来休现它的实际价值。软件研发人员应该确保自己的系统在这两个维度上的实际价值都能长时间维持在很高的状态。不幸的是，他们往往只关注一个维度，而忽视了另外一个维度。更不幸的是，他们常常关注的还是错误的维度，这导致了系统的价值最终趋降为零。</w:t>
-        <w:br/>
-        <w:t>BEHAVIOR 行为价值</w:t>
-        <w:br/>
-        <w:t>The first value of software is its behavior. Programmers are hired to make machines behave in a way that makes or saves money for the stakeholders. We do this by helping the stakeholders develop a functional specification, or requirements document. Then we write the code that causes the stakeholder’s machines to satisfy those requirements.</w:t>
-        <w:br/>
-        <w:t>软件系统的行为是其最直观的价值维度。程序员的工作就是让机器按照某种指定方式运转，给系统的使用者创造或者提高利润。程序员们为了达到这个目的，往往需要帮助系统使用者编写一个对系统功能的定义，也就是需求文档。然后，程序员们再把需求文档转化为实际的代码。</w:t>
-        <w:br/>
-        <w:t>When the machine violates those requirements, programmers get their debuggers out and fix the problem.</w:t>
-        <w:br/>
-        <w:t>当机器出现异常行为时，程序员要负责调试，解决这些问题。</w:t>
-        <w:br/>
-        <w:t>Many programmers believe that is the entirety of their job. They believe their job is to make the machine implement the requirements and to fix any bugs. They are sadly mistaken.</w:t>
-        <w:br/>
-        <w:t>大部分程序员认为这就是他们的全部工作。他们的工作是且仅是：按照需求文档编写代码，并且修复任何 Bug。这真是大错特错。</w:t>
-        <w:br/>
-        <w:t>ARCHITECTURE 架构价值</w:t>
-        <w:br/>
-        <w:t>The second value of software has to do with the word “software”—a compound word composed of “soft” and “ware.” The word “ware” means “product”; the word “soft”… Well, that’s where the second value lies.</w:t>
-        <w:br/>
-        <w:t>软件系统的第二个价值维度，就体现在软件这个英文单词上：software。“ware” 的意思是“产品”，而 “soft” 的意思，不言而喻，是指软件的灵活性。</w:t>
-        <w:br/>
-        <w:t>Software was invented to be “soft.” It was intended to be a way to easily change the behavior of machines. If we’d wanted the behavior of machines to be hard to change, we would have called it hardware.</w:t>
-        <w:br/>
-        <w:t>软件系统必须保持灵活。软件发明的目的，就是让我们可以以一种灵活的方式来改变机器的工作行为。对机器上那些很难改变的工作行为，我们通常称之为硬件（hardware）。</w:t>
-        <w:br/>
-        <w:t>To fulfill its purpose, software must be soft—that is, it must be easy to change. When the stakeholders change their minds about a feature, that change should be simple and easy to make. The difficulty in making such a change should be proportional only to the scope of the change, and not to the shape of the change.</w:t>
-        <w:br/>
-        <w:t>为了达到软件的本来目的，软件系统必须够“软” 也就是说，软件应该容易被修改。当需求方改变需求的时候，随之所需的软件变更必须可以简单而方便地实现。变更实施的难度应该和变更的范畴（scope）成等比关系，而与变更的具体形状（shape）无关。</w:t>
-        <w:br/>
-        <w:t>It is this difference between scope and shape that often drives the growth in software development costs. It is the reason that costs grow out of proportion to the size of the requested changes. It is the reason that the first year of development is much cheaper than the second, and the second year is much cheaper than the third.</w:t>
-        <w:br/>
-        <w:t>需求变更的范畴与形状，是决定对应软件变更实施成本高低的关键。这就是为什么有的代码变更的成本与其实现的功能改变不成比例。这也是为什么第二年的研发成本比第一年的高很多，第三年又比第二年更高。</w:t>
-        <w:br/>
-        <w:t>From the stakeholders’ point of view, they are simply providing a stream of changes of roughly similar scope. From the developers’ point of view, the stakeholders are giving them a stream of jigsaw puzzle pieces that they must fit into a puzzle of ever-increasing complexity. Each new request is harder to fit than the last, because the shape of the system does not match the shape of the request.</w:t>
-        <w:br/>
-        <w:t>从系统相关方（Stakeholder）的角度来看，他们所提出的一系列的变更需求的范畴都是类似的，因此成本也应该是固定的。但是从研发者角度来看，系统用户持续不断的变更需求就像是要求他们不停地用一堆不同形状的拼图块，拼成一个新的形状。整个拼图的过程越来越困难，因为现有系统的形状永远和需求的形状不一致.</w:t>
-        <w:br/>
-        <w:t>I’m using the word “shape” here in a unconventional way, but I think the metaphor is apt. Software developers often feel as if they are forced to jam square pegs into round holes.</w:t>
-        <w:br/>
-        <w:t>我们在这里使用了“形状”这个词，这可能不是该词的标准用法，但是其寓意应该很明确。毕竟，软件工程师们经常会觉得自己的工作就是把方螺丝拧到圆螺丝孔里面。</w:t>
-        <w:br/>
-        <w:t>The problem, of course, is the architecture of the system. The more this architecture prefers one shape over another, the more likely new features will be harder and harder to fit into that structure. Therefore architectures should be as shape agnostic are practical.</w:t>
-        <w:br/>
-        <w:t>问题的实际根源当然就是系统的架构设计。如果系统的架构设计偏向某种特定的“形状”，那么新的变更就会越来越难以实施。所以，好的系统架构设计应该尽可能做到与“形状”无关。</w:t>
-        <w:br/>
-        <w:t>THE GREATER VALUE 哪个价值维度更重要</w:t>
-        <w:br/>
-        <w:t>Function or architecture? Which of these two provides the greater value? Is it more important for the software system to work, or is it more important for the software system to be easy to change?</w:t>
-        <w:br/>
-        <w:t>那么，究竟是系统行为更重要，还是系统架构的灵活性更重要？哪个价值更大?系统正常工作更重要，还是系统易于修改更重要？</w:t>
-        <w:br/>
-        <w:t>If you ask the business managers, they’ll often say that it’s more important for the software system to work. Developers, in turn, often go along with this attitude. But it’s the wrong attitude. I can prove that it is wrong with the simple logical tool of examining the extremes.</w:t>
-        <w:br/>
-        <w:t>如果这个问题由业务部门来回答，他们通常认为系统正常工作很重要。系统开发人员常常也就跟随采取了这种态度。但是这种态度是错误的。下面我就用简单的逻辑推导来证明这个态度的错误性。</w:t>
-        <w:br/>
-        <w:t>If you give me a program that works perfectly but is impossible to change, then it won’t work when the requirements change, and I won’t be able to make it work. Therefore the program will become useless.</w:t>
-        <w:br/>
-        <w:t>If you give me a program that does not work but is easy to change, then I can make it work, and keep it working as requirements change. Therefore the program will remain continually useful.</w:t>
-        <w:br/>
-        <w:t>如果某程序可以正常工作，但是无法修改，那么当需求变更的时候它就不再能够正常工作了，我们也无法通过修改让它能继续正常工作。因此，这个程序的价值将成为 0。</w:t>
-        <w:br/>
-        <w:t>如果某程序目前无法正常工作，但是我们可以很容易地修改它，那么将它改好，并且随着需求变化不停地修改它，都应该是很容易的事。因此，这个程序会持续产生价值。</w:t>
-        <w:br/>
-        <w:t>You may not find this argument convincing. After all, there’s no such thing as a program that is impossible to change. However, there are systems that are practically impossible to change, because the cost of change exceeds the benefit of change. Many systems reach that point in some of their features or configurations.</w:t>
-        <w:br/>
-        <w:t>当然，上面的逻辑论断可能不足以说服大家，修改的。但是，现实中有一些系统确实无法更改，因为其变更实施的成本会远远超过变更带来的价值。你在实际工作中一定遇到过很多这样的例了。</w:t>
-        <w:br/>
-        <w:t>If you ask the business managers if they want to be able to make changes, they’ll say that of course they do, but may then qualify their answer by noting that the current functionality is more important than any later flexibility. In contrast, if the business managers ask you for a change, and your estimated costs for that change are unaffordably high, the business managers will likely be furious that you allowed the system to get to the point where the change was impractical.</w:t>
-        <w:br/>
-        <w:t>如果你问业务部门，是否想要能够变更需求，他们的回答一般是肯定的，而且他们会增加一句：完成现在的功能比实现未来的灵活度更重要。但讽刺的是，如果事后业务部门提出了一项需求，而你的预估工作量大大超出他们的预期，这帮家伙通常会对你放任系统混乱到无法变更的状态而勃然大怒。</w:t>
-        <w:br/>
-        <w:t>EISENHOWER’S MATRIX 艾森豪威尔矩阵</w:t>
-        <w:br/>
-        <w:t>Consider President Dwight D. Eisenhower’s matrix of importance versus urgency (Figure 2.1). Of this matrix, Eisenhower said:</w:t>
-        <w:br/>
-        <w:t>我们来看美国前总统艾森豪威尔的紧急/重要矩阵（参见图 2.1），面对这个矩阵，艾森豪威尔曾说道：</w:t>
-        <w:br/>
-        <w:t>I have two kinds of problems, the urgent and the important. The urgent are not important, and the important are never urgent.1</w:t>
-        <w:br/>
-        <w:t>我有两种难题：紧急的和重要的，而紧急的难题永远是不重要的，重要的难题永远是不紧急的。</w:t>
-        <w:br/>
-        <w:t>Eisenhower matrix</w:t>
-        <w:br/>
-        <w:t>There is a great deal of truth to this old adage. Those things that are urgent are rarely of great importance, and those things that are important are seldom of great urgency.</w:t>
-        <w:br/>
-        <w:t>虽然老调重弹，但其中的道理依然成立。确实，紧急的事情常常没那么重要，而重要的事情则似乎永远也排不上优先级。</w:t>
-        <w:br/>
-        <w:t>The first value of software—behavior—is urgent but not always particularly important.</w:t>
-        <w:br/>
-        <w:t>软件系统的第一个价值维度：系统行为，是紧急的，但是并不总是特别重要。</w:t>
-        <w:br/>
-        <w:t>The second value of software—architecture—is important but never particularly urgent.</w:t>
-        <w:br/>
-        <w:t>软件系统的第二个价值维度：系统架构，是重要的，但是并不总是特别紧急。</w:t>
-        <w:br/>
-        <w:t>Of course, some things are both urgent and important. Other things are not urgent and not important. Ultimately, we can arrange these four couplets into priorities:</w:t>
-        <w:br/>
-        <w:t>当然，我们会有些重要且紧急的事情，也会有一些事情不重要也不紧急。最终我们应将这四类事情进行如下排序：</w:t>
-        <w:br/>
-        <w:t>Urgent and important</w:t>
-        <w:br/>
-        <w:t>Not urgent and important</w:t>
-        <w:br/>
-        <w:t>Urgent and not important</w:t>
-        <w:br/>
-        <w:t>Not urgent and not important</w:t>
-        <w:br/>
-        <w:t>重要且紧急</w:t>
-        <w:br/>
-        <w:t>重要不紧急</w:t>
-        <w:br/>
-        <w:t>不重要但紧急</w:t>
-        <w:br/>
-        <w:t>不重要且不紧急</w:t>
-        <w:br/>
-        <w:t>Note that the architecture of the code—the important stuff—is in the top two positions of this list, whereas the behavior of the code occupies the first and third positions.</w:t>
-        <w:br/>
-        <w:t>在这里你可以看到，软件的系统架构——那些重要的事情——占据了该列表的前两位，而系统行为——那些紧急的事情——只占据了第一和第三位。</w:t>
-        <w:br/>
-        <w:t>The mistake that business managers and developers often make is to elevate items in position 3 to position 1. In other words, they fail to separate those features that are urgent but not important from those features that truly are urgent and important. This failure then leads to ignoring the important architecture of the system in favor of the unimportant features of the system.</w:t>
-        <w:br/>
-        <w:t>业务部门与研发人员经常犯的共同错误就是将第三优先级的事情提到第一优先级去做。换句话说，他们没有把真正紧急并且重要的功能和紧急但是不重要的功能分开。这个错误导致了重要的事被忽略了，重要的系统架构问题让位给了不重要的系统行为功能。</w:t>
-        <w:br/>
-        <w:t>The dilemma for software developers is that business managers are not equipped to evaluate the importance of architecture. That’s what software developers were hired to do. Therefore it is the responsibility of the software development team to assert the importance of architecture over the urgency of features.</w:t>
-        <w:br/>
-        <w:t>但研发人员还忘了一点，那就是业务部门原本就是没有能力评估系统架构的重要程度的，这本来就应该是研发人员自己的工作职责！所以，平衡系统架构的重要性与功能的紧急程度这件事，是软件研发人员自己的职责。</w:t>
-        <w:br/>
-        <w:t>FIGHT FOR THE ARCHITECTURE 为好的软件架构而持续斗争</w:t>
-        <w:br/>
-        <w:t>Fulfilling this responsibility means wading into a fight—or perhaps a better word is “struggle.” Frankly, that’s always the way these things are done. The development team has to struggle for what they believe to be best for the company, and so do the management team, and the marketing team, and the sales team, and the operations team. It’s always a struggle.</w:t>
-        <w:br/>
-        <w:t>为了做好上述职责，软件团队必须做好斗争的准备——或者说“长期抗争”的准备。现状就是这样。研发团队必须从公司长远利益出发与其他部门抗争，这和管理团队的工作一样，甚至市场团队、销售团队、运营团队都是这样。公司内部的抗争本来就是无止境的。</w:t>
-        <w:br/>
-        <w:t>Effective software development teams tackle that struggle head on. They unabashedly squabble with all the other stakeholders as equals. Remember, as a software developer, you are a stakeholder. You have a stake in the software that you need to safeguard. That’s part of your role, and part of your duty. And it’s a big part of why you were hired.</w:t>
-        <w:br/>
-        <w:t>有成效的软件研发团队会迎难而上，毫不掩饰地与所有其他的系统相关方进行平等的争吵。请记住，作为—名软件开发人员，你也是相关者之一。软件系统的可维护性需要由你来保护，这是你角色的一部分，也是你职责中不可缺少的一部分。公司雇你的很大一部分原因就是需要有人来做这件事。</w:t>
-        <w:br/>
-        <w:t>This challenge is doubly important if you are a software architect. Software architects are, by virtue of their job description, more focused on the structure of the system than on its features and functions. Architects create an architecture that allows those features and functions to be easily developed, easily modified, and easily extended.</w:t>
-        <w:br/>
-        <w:t>如果你是软件架构师，那么这项工作就加倍重要了。软件架构师这一职责本身就应更关注系统的整体结构，而不是具体的功能和系统行为的实现，软件架构师必须创建出一个可以让功能实现起来更容易、修改起来更简单、扩展起来更轻松的软件架构。</w:t>
-        <w:br/>
-        <w:t>Just remember: If architecture comes last, then the system will become ever more costly to develop, and eventually change will become practically impossible for part or all of the system. If that is allowed to happen, it means the software development team did not fight hard enough for what they knew was necessary.</w:t>
-        <w:br/>
-        <w:t>请记住：如果忽视软件架构的价值，系统将会变得越来越难以维护，终会有一天，系统将会变得再也无法修改。如果系统变成了这个样子，那么说明软件开发团队没有和需求方做足够的抗争，没有完成自己应尽的职责。</w:t>
       </w:r>
     </w:p>
     <w:p>
@@ -3346,8 +4959,6 @@
         <w:br/>
         <w:t>BCE, introduced by Ivar Jacobson from his book Object Oriented Software Engineering: A Use-Case Driven Approach</w:t>
         <w:br/>
-        <w:t>软件</w:t>
-        <w:br/>
         <w:t>六边形架构 （Hexagonal Architecture）（也称为端口与适配器架构，Ports and Adpaters）： 该架构由 Alistair Cockburn 首先提出。Steve Freeman 和 Nat Pryce 在他们合写的著作 Growing Object oriented software with Tests 一书中对该架构做了隆重的推荐。</w:t>
         <w:br/>
         <w:t>DCI 架构：由 James Coplien 和 Trygve Reenskaug 首先提出。</w:t>
@@ -3382,8 +4993,6 @@
         <w:br/>
         <w:t>独立于任何外部机构：这些系统的业务逻辑并不需要知道任何其他外部接口的存在。</w:t>
         <w:br/>
-        <w:t>开发工具</w:t>
-        <w:br/>
         <w:t>The diagram in Figure 22.1 is an attempt at integrating all these architectures into a single actionable idea.</w:t>
         <w:br/>
         <w:t>下面我们要通过图 22.1 将上述所有架构的设计理念综合成为一个独立的理念。</w:t>
@@ -3394,12 +5003,12 @@
         <w:br/>
         <w:t>深入探索</w:t>
         <w:br/>
-        <w:t>应用程序</w:t>
-        <w:br/>
-        <w:t>library</w:t>
-        <w:br/>
         <w:t>软件框架</w:t>
         <w:br/>
+        <w:t>框架</w:t>
+        <w:br/>
+        <w:t>software</w:t>
+        <w:br/>
         <w:t>The concentric circles in Figure 22.1 represent different areas of software. In general, the further in you go, the higher level the software becomes. The outer circles are mechanisms. The inner circles are policies.</w:t>
         <w:br/>
         <w:t>图 22.1 中的同心圆分别代表了软件系统中的不同层次，通常越靠近中心，其所在的软件层次就越高。基本上，外层圆代表的是机制，内层圆代表的是策略。</w:t>
@@ -3408,7 +5017,7 @@
         <w:br/>
         <w:t>当然这其中有一条贯穿整个架构设计的规则，即它的依赖关系规则：</w:t>
         <w:br/>
-        <w:t>Source code dependencies must point only inward, toward higher-level policies.编程</w:t>
+        <w:t>Source code dependencies must point only inward, toward higher-level policies.</w:t>
         <w:br/>
         <w:t>源码中的依赖关系必须只指向同心圆的内层，即由低层机制指向高层策略。</w:t>
         <w:br/>
@@ -3422,7 +5031,7 @@
         <w:br/>
         <w:t>ENTITIES 业务实体</w:t>
         <w:br/>
-        <w:t>Entities encapsulate enterprise-wide Critical Business Rules. An entity can be an object with methods, or it can be a set of data structures and functions. It doesn’t matter so long as the entities can be used by many different applications in the enterprise.计算机与电子产品</w:t>
+        <w:t>Entities encapsulate enterprise-wide Critical Business Rules. An entity can be an object with methods, or it can be a set of data structures and functions. It doesn’t matter so long as the entities can be used by many different applications in the enterprise.</w:t>
         <w:br/>
         <w:t>业务实体这一层中封装的是整个系统的关键业务逻辑，一个业务实体既可以是一个带有方法的对象，也可以是一组数据结构和函数的集合。无论如何，只要它能被系统中的其他不同应用复用就可以。</w:t>
         <w:br/>
@@ -3434,7 +5043,7 @@
         <w:br/>
         <w:t>The software in the use cases layer contains application-specific business rules. It encapsulates and implements all of the use cases of the system. These use cases orchestrate the flow of data to and from the entities, and direct those entities to use their Critical Business Rules to achieve the goals of the use case.</w:t>
         <w:br/>
-        <w:t>软件的用例层中通常包含的是特定应用场景下的业务逻辑，这里面封装并实现了整个系统的所有用例。这些用例引导了数据在业务实体之间的流入/流出，并指挥着业务实体利用其中的关键业务逻辑来实现用例的设计目标。数据管理</w:t>
+        <w:t>软件的用例层中通常包含的是特定应用场景下的业务逻辑，这里面封装并实现了整个系统的所有用例。这些用例引导了数据在业务实体之间的流入/流出，并指挥着业务实体利用其中的关键业务逻辑来实现用例的设计目标。</w:t>
         <w:br/>
         <w:t>We do not expect changes in this layer to affect the entities. We also do not expect this layer to be affected by changes to externalities such as the database, the UI, or any of the common frameworks. The use cases layer is isolated from such concerns.</w:t>
         <w:br/>
@@ -3446,7 +5055,7 @@
         <w:br/>
         <w:t>INTERFACE ADAPTERS 接口适配器</w:t>
         <w:br/>
-        <w:t>The software in the interface adapters layer is a set of adapters that convert data from the format most convenient for the use cases and entities, to the format most convenient for some external agency such as the database or the web. It is this layer, for example, that will wholly contain the MVC architecture of a GUI. The presenters, views, and controllers all belong in the interface adapters layer. The models are likely just data structures that are passed from the controllers to the use cases, and then back from the use cases to the presenters and views.软件</w:t>
+        <w:t>The software in the interface adapters layer is a set of adapters that convert data from the format most convenient for the use cases and entities, to the format most convenient for some external agency such as the database or the web. It is this layer, for example, that will wholly contain the MVC architecture of a GUI. The presenters, views, and controllers all belong in the interface adapters layer. The models are likely just data structures that are passed from the controllers to the use cases, and then back from the use cases to the presenters and views.</w:t>
         <w:br/>
         <w:t>软件的接口适配器层中通常是一组数据转换器，它们负责将数据从对用例和业务实体而言最方便操作的格式，转化成外部系统（譬如数据库以及 Web）最方便操作的格式。例如，这一层中应该包含整个 GUI MVC 框架。展示器、视图、控制器都应该属于接口适配器层。而模型部分则应该由控制器传递给用例，再由用例传回展示器和视图。</w:t>
         <w:br/>
@@ -3460,7 +5069,7 @@
         <w:br/>
         <w:t>FRAMEWORKS AND DRIVERS 框架与驱动程序</w:t>
         <w:br/>
-        <w:t>The outermost layer of the model in Figure 22.1 is generally composed of frameworks and tools such as the database and the web framework. Generally you don’t write much code in this layer, other than glue code that communicates to the next circle inward.开发工具</w:t>
+        <w:t>The outermost layer of the model in Figure 22.1 is generally composed of frameworks and tools such as the database and the web framework. Generally you don’t write much code in this layer, other than glue code that communicates to the next circle inward.</w:t>
         <w:br/>
         <w:t>图 22.1 中最外层的模型层一般是由工具、数据库、Web 框架等组成的。在这一层中，我们通常只需要编写一些与内层沟通的黏合性代码。</w:t>
         <w:br/>
@@ -3472,7 +5081,7 @@
         <w:br/>
         <w:t>The circles in Figure 22.1 are intended to be schematic: You may find that you need more than just these four. There’s no rule that says you must always have just these four. However, the Dependency Rule always applies. Source code dependencies always point inward. As you move inward, the level of abstraction and policy increases. The outermost circle consists of low-level concrete details. As you move inward, the software grows more abstract and encapsulates higher-level policies. The innermost circle is the most general and highest level.</w:t>
         <w:br/>
-        <w:t>图 22.1 中所显示的同心圆只是为了说明架构的结构，真正的架构很可能会超过四层。并没有某个规则约定一个系统的架构有且只能有四层。然而，这其中的依赖关系原则是不变的。也就是说，源码层面的依赖关系一定要指向同心圆的内侧。层次越往内，其抽象和策略的层次越高，同时软件的抽象程度就越高，其包含的高层策略就越多。最内层的圆中包含的是最通用、最高层的策略，最外层的圆包含的是最具体的实现细节。数据管理</w:t>
+        <w:t>图 22.1 中所显示的同心圆只是为了说明架构的结构，真正的架构很可能会超过四层。并没有某个规则约定一个系统的架构有且只能有四层。然而，这其中的依赖关系原则是不变的。也就是说，源码层面的依赖关系一定要指向同心圆的内侧。层次越往内，其抽象和策略的层次越高，同时软件的抽象程度就越高，其包含的高层策略就越多。最内层的圆中包含的是最通用、最高层的策略，最外层的圆包含的是最具体的实现细节。</w:t>
         <w:br/>
         <w:t>CROSSING BOUNDARIES 跨越边界</w:t>
         <w:br/>
@@ -3484,7 +5093,7 @@
         <w:br/>
         <w:t>这里，我们通常釆用依赖反转原则（DIP）来解决这种相反性。例如，在 Java 这一类的语言中，可以通过调整代码中的接口和继承关系，利用源码中的依赖关系来限制控制流只能在正确的地方跨越架构边界。</w:t>
         <w:br/>
-        <w:t>For example, suppose the use case needs to call the presenter. This call must not be direct because that would violate the Dependency Rule: No name in an outer circle can be mentioned by an inner circle. So we have the use case call an interface (shown in Figure 22.1 as “use case output port”) in the inner circle, and have the presenter in the outer circle implement it.计算机与电子产品</w:t>
+        <w:t>For example, suppose the use case needs to call the presenter. This call must not be direct because that would violate the Dependency Rule: No name in an outer circle can be mentioned by an inner circle. So we have the use case call an interface (shown in Figure 22.1 as “use case output port”) in the inner circle, and have the presenter in the outer circle implement it.</w:t>
         <w:br/>
         <w:t>假设某些用例代码需要调用展示器，这里一定不能直接调用，因为这样做会违反依赖关系原则：内层圆中的代码不能引用其外层的声明。我们需要让业务逻辑代码调用一个内层接口（图 22.1 中的“用例输出端”），并让展示器来负责实现这个接口。</w:t>
         <w:br/>
@@ -3496,7 +5105,7 @@
         <w:br/>
         <w:t>Typically the data that crosses the boundaries consists of simple data structures. You can use basic structs or simple data transfer objects if you like. Or the data can simply be arguments in function calls. Or you can pack it into a hashmap, or construct it into an object. The important thing is that isolated, simple data structures are passed across the boundaries. We don’t want to cheat and pass Entity objects or database rows. We don’t want the data structures to have any kind of dependency that violates the Dependency Rule.</w:t>
         <w:br/>
-        <w:t>一般来说，会跨越边界的数据在数据结构上都是很简单的。如果可以的话，我们会尽量采用一些基本的结构体或简单的可传输数据对象。或者直接通过函数调用的参数来传递数据。另外，我们也可以将数据放入哈希表，或整合成某种对象。这里最重要的是这个跨边界传输的对象应该有一个独立、简单的数据结构。总之，不要投机取巧直接传递业务实体或数据库记录对象。同时，这些传递的数据结构中也不应该存在违反依赖规则的依赖关系。软件</w:t>
+        <w:t>一般来说，会跨越边界的数据在数据结构上都是很简单的。如果可以的话，我们会尽量采用一些基本的结构体或简单的可传输数据对象。或者直接通过函数调用的参数来传递数据。另外，我们也可以将数据放入哈希表，或整合成某种对象。这里最重要的是这个跨边界传输的对象应该有一个独立、简单的数据结构。总之，不要投机取巧直接传递业务实体或数据库记录对象。同时，这些传递的数据结构中也不应该存在违反依赖规则的依赖关系。</w:t>
         <w:br/>
         <w:t>For example, many database frameworks return a convenient data format in response to a query. We might call this a “row structure.” We don’t want to pass that row structure inward across a boundary. Doing so would violate the Dependency Rule because it would force an inner circle to know something about an outer circle.</w:t>
         <w:br/>
@@ -3508,7 +5117,7 @@
         <w:br/>
         <w:t>A TYPICAL SCENARIO 一个常见的应用场景</w:t>
         <w:br/>
-        <w:t>The diagram in Figure 22.2 shows a typical scenario for a web-based Java system using a database. The web server gathers input data from the user and hands it to the Controller on the upper left. The Controller packages that data into a plain old Java object and passes this object through the InputBoundary to the UseCaseInteractor. The UseCaseInteractor interprets that data and uses it to control the dance of the Entities. It also uses the DataAccessInterface to bring the data used by those Entities into memory from the Database. Upon completion, the UseCaseInteractor gathers data from the Entities and constructs the OutputData as another plain old Java object. The OutputData is then passed through the OutputBoundary interface to the Presenter.编程</w:t>
+        <w:t>The diagram in Figure 22.2 shows a typical scenario for a web-based Java system using a database. The web server gathers input data from the user and hands it to the Controller on the upper left. The Controller packages that data into a plain old Java object and passes this object through the InputBoundary to the UseCaseInteractor. The UseCaseInteractor interprets that data and uses it to control the dance of the Entities. It also uses the DataAccessInterface to bring the data used by those Entities into memory from the Database. Upon completion, the UseCaseInteractor gathers data from the Entities and constructs the OutputData as another plain old Java object. The OutputData is then passed through the OutputBoundary interface to the Presenter.</w:t>
         <w:br/>
         <w:t>接下来，我们将会在图 22.2 中看到一个基于 Web 的使用数据库的 Java 系统。在该系统中，Web 服务器会从用户那里收集信息，并将它们交给左上角的 controller。然后，controller 将这些信息包装成一个简单的 Java 对象，并让该对象穿越 InputBoundary 被传递到 UseCaseInteractor。接下来，我们会让 UseCaseInteractor 解析数据，并通过它来控制与 Entities 的交互。同时，我们还会用 DataAccessInterface 将 Entities 需要用到的数据从 Database 加载到内存中。随后，UseCaselnteractor 会负责从 Entities 收集数据，并将 OutputData 组装成另一个简单的 Java 对象。最后，OutputData 会穿越 OutputBoundary 被传递给 Presenter。</w:t>
         <w:br/>
@@ -3516,7 +5125,7 @@
         <w:br/>
         <w:t>The job of the Presenter is to repackage the OutputData into viewable form as the ViewModel, which is yet another plain old Java object. The ViewModel contains mostly Strings and flags that the View uses to display the data. Whereas the OutputData may contain Date objects, the Presenter will load the ViewModel with corresponding Strings already formatted properly for the user. The same is true of Currency objects or any other business-related data. Button and MenuItem names are placed in the ViewModel, as are flags that tell the View whether those Buttons and MenuItems should be gray.</w:t>
         <w:br/>
-        <w:t>接下来，Presenter 的任务是将 OutPutData 重新打包成可展示的 ViewModel，这也是一个简单的 Java 对象。ViewModel 中基本上只包含字符串和一些 View 都会用到的开关数据。同时，OutputData 中可能会包含一些 D ate 对象，Presenter 会将其格式化成可对用户展示的字符串，并将其填充到 ViewModel 中。同理，Currency 对象和其他业务相关的数据也会经历类似的操作。如你所见，Button 和 Menuitems 的命名定义位于 ViewModel 中，并且其中还包括了用于告知 View 层 Button 和 Menuitems 是否可用的开关数据。设备驱动程序</w:t>
+        <w:t>接下来，Presenter 的任务是将 OutPutData 重新打包成可展示的 ViewModel，这也是一个简单的 Java 对象。ViewModel 中基本上只包含字符串和一些 View 都会用到的开关数据。同时，OutputData 中可能会包含一些 D ate 对象，Presenter 会将其格式化成可对用户展示的字符串，并将其填充到 ViewModel 中。同理，Currency 对象和其他业务相关的数据也会经历类似的操作。如你所见，Button 和 Menuitems 的命名定义位于 ViewModel 中，并且其中还包括了用于告知 View 层 Button 和 Menuitems 是否可用的开关数据。</w:t>
         <w:br/>
         <w:t>This leaves the View with almost nothing to do other than to move the data from the ViewModel into the HTML page.</w:t>
         <w:br/>
@@ -3530,7 +5139,7 @@
         <w:br/>
         <w:t>Conforming to these simple rules is not difficult, and it will save you a lot of headaches going forward. By separating the software into layers and conforming to the Dependency Rule, you will create a system that is intrinsically testable, with all the benefits that implies. When any of the external parts of the system become obsolete, such as the database, or the web framework, you can replace those obsolete elements with a minimum of fuss.</w:t>
         <w:br/>
-        <w:t>如你所见，遵守上面这些简单的规范并不困难，这样做能在未来避免各种令人头疼的问题。通过将系统划分层次，并确保这些层次遵守依赖关系规则，就可以构建出一个天生可测试的系统，这其中的好处是不言而喻的。而且，当系统外层的这些数据库或 Web 框架过时的时候，我们还可以很轻松地替换它们。开发工具</w:t>
+        <w:t>如你所见，遵守上面这些简单的规范并不困难，这样做能在未来避免各种令人头疼的问题。通过将系统划分层次，并确保这些层次遵守依赖关系规则，就可以构建出一个天生可测试的系统，这其中的好处是不言而喻的。而且，当系统外层的这些数据库或 Web 框架过时的时候，我们还可以很轻松地替换它们。</w:t>
       </w:r>
     </w:p>
     <w:p>
@@ -5119,101 +6728,6 @@
         <w:pStyle w:val="Title"/>
       </w:pPr>
       <w:r>
-        <w:t>Chap3. 编程范式总览</w:t>
-      </w:r>
-    </w:p>
-    <w:p>
-      <w:r>
-        <w:t>Chap3. PARADIGM OVERVIEW 编程范式总览</w:t>
-        <w:br/>
-        <w:t>STRUCTURED PROGRAMMING 结构化编程</w:t>
-        <w:br/>
-        <w:t>OBJECT-ORIENTED PROGRAMMING 面向对象编程</w:t>
-        <w:br/>
-        <w:t>FUNCTIONAL PROGRAMMING 函数式编程</w:t>
-        <w:br/>
-        <w:t>FOOD FOR THOUGHT 仅供思考</w:t>
-        <w:br/>
-        <w:t>CONCLUSION 本章小结</w:t>
-        <w:br/>
-        <w:t>Chap3. PARADIGM OVERVIEW 编程范式总览</w:t>
-        <w:br/>
-        <w:t>The three paradigms included in this overview chapter are structured programming, object-orient programming, and functional programming.</w:t>
-        <w:br/>
-        <w:t>本章将讲述三个编程范式，它们分别是结构化编程（structured programming）、 面向对象编程（object-oriented programming）以及函数式编程（functional programming）。</w:t>
-        <w:br/>
-        <w:t>STRUCTURED PROGRAMMING 结构化编程</w:t>
-        <w:br/>
-        <w:t>The first paradigm to be adopted (but not the first to be invented) was structured programming, which was discovered by Edsger Wybe Dijkstra in 1968. Dijkstra showed that the use of unrestrained jumps (goto statements) is harmful to program structure. As we’ll see in the chapters that follow, he replaced those jumps with the more familiar if/then/else and do/while/until constructs.</w:t>
-        <w:br/>
-        <w:t>结构化编程是第一个普遍被采用的编程范式（但是却不是第一个被提出的），由 Edsger Wybe Dijkstra 于 1968 年最先提出。与此同时，Dijkstra 还论证了使用 goto 这样的无限制跳转语句将会损害程序的整体结构。接下来的章节我们还会说到，二是这位 Dijkstra 最先主张用我们现在熟知的 if/then/else 语句和 do/while/until 语句来代替跳转语句的。</w:t>
-        <w:br/>
-        <w:t>We can summarize the structured programming paradigm as follows:</w:t>
-        <w:br/>
-        <w:t>我们可以将结构化编程范式归结为一句话：</w:t>
-        <w:br/>
-        <w:t>Structured programming imposes discipline on direct transfer of control.</w:t>
-        <w:br/>
-        <w:t>结构化编程对程序控制权的直接转移进行了限制和规范。</w:t>
-        <w:br/>
-        <w:t>OBJECT-ORIENTED PROGRAMMING 面向对象编程</w:t>
-        <w:br/>
-        <w:t>The second paradigm to be adopted was actually discovered two years earlier, in 1966, by Ole Johan Dahl and Kristen Nygaard. These two programmers noticed that the function call stack frame in the ALGOL language could be moved to a heap, thereby allowing local variables declared by a function to exist long after the function returned. The function became a constructor for a class, the local variables became instance variables, and the nested functions became methods. This led inevitably to the discovery of polymorphism through the disciplined use of function pointers.</w:t>
-        <w:br/>
-        <w:t>说到编程领域中第二个被广泛采用的编程范式，当然就是面向对象编程了：事实上，这个编程范式的提出比结构化编程还早了两年，是在 1966 年由 Ole Johan Dahl 和 Kriste Nygaard 在论文中总结归纳出来的。这两个程序员注意到在 ALGOL 语言中. 函数调用堆栈（call stack frame）可以被挪到堆内存区域里，这样函数定义的本地变量就可以在函数返回之后继续存在。这个函数就成为了一个类（class）的构造函数，而它所定义的本地变量就是类的成员变量，构造函数定义的嵌套函数就成为了成员方法（method）。这样一来，我们就可以利用多态（polymorphism）来限制用户对函数指针的使用。编程</w:t>
-        <w:br/>
-        <w:t>We can summarize the object-oriented programming paradigm as follows:</w:t>
-        <w:br/>
-        <w:t>在这里，我们也可以用一句话来总结面向对象编程：</w:t>
-        <w:br/>
-        <w:t>Object-oriented programming imposes discipline on indirect transfer of control.</w:t>
-        <w:br/>
-        <w:t>面向对象编程对程序控制权的间接转移进行了限制和规范。</w:t>
-        <w:br/>
-        <w:t>FUNCTIONAL PROGRAMMING 函数式编程</w:t>
-        <w:br/>
-        <w:t>The third paradigm, which has only recently begun to be adopted, was the first to be invented. Indeed, its invention predates computer programming itself. Functional programming is the direct result of the work of Alonzo Church, who in 1936 invented l-calculus while pursuing the same mathematical problem that was motivating Alan Turing at the same time. His l-calculus is the foundation of the LISP language, invented in 1958 by John McCarthy. A foundational notion of l-calculus is immutability—that is, the notion that the values of symbols do not change. This effectively means that a functional language has no assignment statement. Most functional languages do, in fact, have some means to alter the value of a variable, but only under very strict discipline.</w:t>
-        <w:br/>
-        <w:t>尽管第三个编程范式是近些年才刚刚开始被采用的，但它其实是三个范式中最先被发明的。事实上，函数式编程概念是基于与阿兰·图灵同时代的数学家 Alonzo Church 在 1936 年发明的入演算的直接衍生物。1958 年 John Mccarthy 利用其作为基础发明了 LISP 语言。众所周知，λ 演算法的一个核心思想是不可变性——某个符号所对应的值是永远不变的，所以从理论上来说，函数式编程语言中应该是没有赋值语句的。大部分函数式编程语言只允许在非常严格的限制条件下，才可以更改某个变量的值。</w:t>
-        <w:br/>
-        <w:t>We can summarize the functional programming paradigm as follows:</w:t>
-        <w:br/>
-        <w:t>因此，我们在这里可以将函数式编程范式总结为下面这句话：</w:t>
-        <w:br/>
-        <w:t>Functional programming imposes discipline upon assignment.</w:t>
-        <w:br/>
-        <w:t>函数式编程对程序中的赋值进行了限制和规范。</w:t>
-        <w:br/>
-        <w:t>FOOD FOR THOUGHT 仅供思考</w:t>
-        <w:br/>
-        <w:t>Notice the pattern that I’ve quite deliberately set up in introducing these three programming paradigms: Each of the paradigms removes capabilities from the programmer. None of them adds new capabilities. Each imposes some kind of extra discipline that is negative in its intent. The paradigms tell us what not to do, more than they tell us what to do.</w:t>
-        <w:br/>
-        <w:t>如你所见，我在介绍三个编程范式的时候，有意采用了上面这种格式，目的是凸显每个编程范式的实际含义——它们都从某一方面限制和规范了程序员的能力。没有一个范式是增加新能力的。也就是说，每个编程范式的目的都是设置限制。这些范式主要是为了告诉我们不能做什么，而不是可以做什么。</w:t>
-        <w:br/>
-        <w:t>Another way to look at this issue is to recognize that each paradigm takes something away from us. The three paradigms together remove goto statements, function pointers, and assignment. Is there anything left to take away?</w:t>
-        <w:br/>
-        <w:t>另外，我们应该认识到，这三个编程范式分别限制了 goto 语句、函数指针和赋值语句的使用。那么除此之外，还有什么可以去除的吗？</w:t>
-        <w:br/>
-        <w:t>Probably not. Thus these three paradigms are likely to be the only three we will see—at least the only three that are negative. Further evidence that there are no more such paradigms is that they were all discovered within the ten years between 1958 and 1968. In the many decades that have followed, no new paradigms have been added.</w:t>
-        <w:br/>
-        <w:t>可能没有了。因此这三个编程范式可能是仅有的三个了——如果单论去除能力的编程范式的话。支撑这一结论的另外一个证据是，三个编程范式都是在 1958 年到 1968 年这 10 年间被提出来的，后续再也没有新的编程范式出现过。</w:t>
-        <w:br/>
-        <w:t>CONCLUSION 本章小结</w:t>
-        <w:br/>
-        <w:t>What does this history lesson on paradigms have to do with architecture? Everything. We use polymorphism as the mechanism to cross architectural boundaries; we use functional programming to impose discipline on the location of and access to data; and we use structured programming as the algorithmic foundation of our modules.</w:t>
-        <w:br/>
-        <w:t>大家可能会问，这些编程范式的历史知识与软件架构有关系吗？当然有，而目关系相当密切。譬如说，多态是我们跨越架构边界的手段，函数式编程是我们规范和限制数据存放位置与访问权限的手段，结构化编程则是各模块的算法实现基础。编程</w:t>
-        <w:br/>
-        <w:t>Notice how well those three align with the three big concerns of architecture: function, separation of components, and data management.</w:t>
-        <w:br/>
-        <w:t>这和软件架构的三大关注重点不谋而合：功能性、组件独立性以及数据管理。</w:t>
-      </w:r>
-    </w:p>
-    <w:p>
-      <w:pPr>
-        <w:pStyle w:val="Title"/>
-      </w:pPr>
-      <w:r>
         <w:t>Chap30. 数据库只是实现细节</w:t>
       </w:r>
     </w:p>
@@ -5672,7 +7186,7 @@
         <w:br/>
         <w:t>THE PRODUCT 产品</w:t>
         <w:br/>
-        <w:t>For this case study, I’ve chosen a product with which I am rather intimately familiar: the software for a website that sells videos. Of course, it is reminiscent of cleancoders.com, the site where I sell my software tutorial videos.软件</w:t>
+        <w:t>For this case study, I’ve chosen a product with which I am rather intimately familiar: the software for a website that sells videos. Of course, it is reminiscent of cleancoders.com, the site where I sell my software tutorial videos.</w:t>
         <w:br/>
         <w:t>在这个案例分析中，我要讲的是一个我自己很熟悉的产品：线上收费视频网站。当然，这个有点像 cleancoders.com，我在这个网站上出售我的软件开发教程视频。</w:t>
         <w:br/>
@@ -5686,7 +7200,7 @@
         <w:br/>
         <w:t>Video authors need to supply their video files, written descriptions, and ancillary files with exams, problems, solutions, source code, and other materials.</w:t>
         <w:br/>
-        <w:t>视频作者需要负责上传视频文件、写简介，并且提供视频附带的一系列习题、课后作业、答案、源代码以及其他各类资料。编程</w:t>
+        <w:t>视频作者需要负责上传视频文件、写简介，并且提供视频附带的一系列习题、课后作业、答案、源代码以及其他各类资料。</w:t>
         <w:br/>
         <w:t>Administrators need to add new video series, add and delete videos to and from the series, and establish prices for various licenses.</w:t>
         <w:br/>
@@ -5704,7 +7218,7 @@
         <w:br/>
         <w:t>A typical use-case analysis</w:t>
         <w:br/>
-        <w:t>The four main actors are evident. According to the Single Responsibility Principle, these four actors will be the four primary sources of change for the system. Every time some new feature is added, or some existing feature is changed, that step will be taken to serve one of these actors. Therefore we want to partition the system such that a change to one actor does not affect any of the other actors.电视与视频设备</w:t>
+        <w:t>The four main actors are evident. According to the Single Responsibility Principle, these four actors will be the four primary sources of change for the system. Every time some new feature is added, or some existing feature is changed, that step will be taken to serve one of these actors. Therefore we want to partition the system such that a change to one actor does not affect any of the other actors.</w:t>
         <w:br/>
         <w:t>如你所见，图中显然存在着四个角色。根据单一职责原则（SRP），这四个角色将成为系统变更的主要驱动力。每当添加新功能，或者修改现有功能时，我们所做的一切都是在为这些角色服务。所以我们希望能够对系统进行分区处理，避免其中一个角色的变更需求影响其他角色。</w:t>
         <w:br/>
@@ -5764,7 +7278,7 @@
         <w:br/>
         <w:t>Also notice that the using relationships (open arrows) point with the flow of control, and that the inheritance relationships (closed arrows) point against the flow of control. This depicts our use of the Open–Closed Principle to make sure that the dependencies flow in the right direction, and that changes to low-level details do not ripple upward to affect high-level policies.</w:t>
         <w:br/>
-        <w:t>另外，还注意一下图中的“使用”关系（开放箭头），它和控制流方向是一致的：而”继承”关系（闭合箭头）则与之相反，它反映的是我们对开闭原则的应用，通过调整依赖关系，可以保证底层细节的变更不会影响到高层策略组件。软件</w:t>
+        <w:t>另外，还注意一下图中的“使用”关系（开放箭头），它和控制流方向是一致的：而”继承”关系（闭合箭头）则与之相反，它反映的是我们对开闭原则的应用，通过调整依赖关系，可以保证底层细节的变更不会影响到高层策略组件。</w:t>
         <w:br/>
         <w:t>CONCLUSION 本章小结</w:t>
         <w:br/>
@@ -5819,6 +7333,14 @@
         <w:br/>
         <w:t>PACKAGE BY LAYER 按层封装</w:t>
         <w:br/>
+        <w:t>深入探索</w:t>
+        <w:br/>
+        <w:t>书籍</w:t>
+        <w:br/>
+        <w:t>books</w:t>
+        <w:br/>
+        <w:t>programming language</w:t>
+        <w:br/>
         <w:t>The first, and perhaps simplest, design approach is the traditional horizontal layered architecture, where we separate our code based on what it does from a technical perspective. This is often called “package by layer.” Figure 34.1 shows what this might look like as a UML class diagram.</w:t>
         <w:br/>
         <w:t>我们首先想到的，也可能是最简单的设计方式，就是传统的水平分层架构。在这个架构里，我们将代码从技术角度进行分类。这通常被称为“按层封装”。图 34.1 用 UML 类图展示了这种设计。图书与文学</w:t>
@@ -5859,6 +7381,28 @@
         <w:br/>
         <w:t>PACKAGE BY FEATURE 按功能封装</w:t>
         <w:br/>
+        <w:t>深入探索</w:t>
+        <w:br/>
+        <w:t>软件研发</w:t>
+        <w:br/>
+        <w:t>函数库</w:t>
+        <w:br/>
+        <w:t>软件开发</w:t>
+        <w:br/>
+        <w:t>App</w:t>
+        <w:br/>
+        <w:t>refactoring</w:t>
+        <w:br/>
+        <w:t>programming languages</w:t>
+        <w:br/>
+        <w:t>应用</w:t>
+        <w:br/>
+        <w:t>frameworks</w:t>
+        <w:br/>
+        <w:t>programming</w:t>
+        <w:br/>
+        <w:t>软件框架</w:t>
+        <w:br/>
         <w:t>Another option for organizing your code is to adopt a “package by feature” style. This is a vertical slicing, based on related features, domain concepts, or aggregate roots (to use domain-driven design terminology). In the typical implementations that I’ve seen, all of the types are placed into a single Java package, which is named to reflect the concept that is being grouped.</w:t>
         <w:br/>
         <w:t>另外一种组织代码的形式是“按功能封装”，即垂直切分，根据相关的功能、业务概念或者聚合根（领域驱动设计原则中的术语）来切分。在常见的实现中，所有的类型都会放在一个相同的包中，以业务概念来命名。软件</w:t>
@@ -6058,1506 +7602,6 @@
         <w:t>The whole point of this chapter is to highlight that your best design intentions can be destroyed in a flash if you don’t consider the intricacies of the implementation strategy. Think about how to map your desired design on to code structures, how to organize that code, and which decoupling modes to apply during runtime and compile-time. Leave options open where applicable, but be pragmatic, and take into consideration the size of your team, their skill level, and the complexity of the solution in conjunction with your time and budgetary constraints. Also think about using your compiler to help you enforce your chosen architectural style, and watch out for coupling in other areas, such as data models. The devil is in the implementation details.编程</w:t>
         <w:br/>
         <w:t>这一章的中心思想就是，如果不考虑具体实现细节，再好的设计也无法长久。必须要将设计映射到对应的代码结构上，考虑如何组织代码树，以及在编译期和运行期采用哪种解耦合的模式。保持开放，但是一定要务实，同时要考虑到团队的大小、技术水平，以及对应的时间和预算限制。最好能利用编译器来维护所选的系统架构设计风格，小心防范来自其他地方的耦合模式，例如数据结构。所有的实现细节都是关键的！</w:t>
-      </w:r>
-    </w:p>
-    <w:p>
-      <w:pPr>
-        <w:pStyle w:val="Title"/>
-      </w:pPr>
-      <w:r>
-        <w:t>Chap4. 结构化编程</w:t>
-      </w:r>
-    </w:p>
-    <w:p>
-      <w:r>
-        <w:t>Chap4. STRUCTURED PROGRAMMING 结构化编程</w:t>
-        <w:br/>
-        <w:t>PROOF 可推导性</w:t>
-        <w:br/>
-        <w:t>A HARMFUL PROCLAMATION goto 是有害的</w:t>
-        <w:br/>
-        <w:t>FUNCTIONAL DECOMPOSITION 功能性降解拆分</w:t>
-        <w:br/>
-        <w:t>NO FORMAL PROOFS 形式化证明没有发生</w:t>
-        <w:br/>
-        <w:t>SCIENCE TO THE RESCUE 科学来救场</w:t>
-        <w:br/>
-        <w:t>TESTS 测试</w:t>
-        <w:br/>
-        <w:t>CONCLUSION 本章小结</w:t>
-        <w:br/>
-        <w:t>Chap4. STRUCTURED PROGRAMMING 结构化编程</w:t>
-        <w:br/>
-        <w:t>Edsger Wybe Dijkstra was born in Rotterdam in 1930. He survived the bombing of Rotterdam during World War II, along with the German occupation of the Netherlands, and in 1948 graduated from high school with the highest possible marks in math, physics, chemistry, and biology. In March 1952, at the age of 21 (and just 9 months before I was born), Dijkstra took a job with the Mathematical Center of Amsterdam as the Netherlands’ very first programmer.</w:t>
-        <w:br/>
-        <w:t>Edsger Wybe Dijkstra 于 1930 年出生在荷兰鹿特丹。生于乱世，他亲身经历了第二次世界大战中的鹿特丹大轰炸、德国占领荷兰等事件。1948 年，他以数学、物理、化学以及生物全满分的成绩高中毕业。1952 年 3 月，年仅 21 岁的 Dijkstra （此时距离我出生还有 9 个月时间）入职荷兰阿姆斯特丹数学中心，成为了荷兰的第一个程序员。数学</w:t>
-        <w:br/>
-        <w:t>In 1955, having been a programmer for three years, and while still a student, Dijkstra concluded that the intellectual challenge of programming was greater than the intellectual challenge of theoretical physics. As a result, he chose programming as his long-term career.</w:t>
-        <w:br/>
-        <w:t>1955 年，在从事编程工作 3 年之后，当时还是一个学生的 Dijkstra 就认为编程相比理论物理更有挑战性，因此他选择将编程作为终身职业。</w:t>
-        <w:br/>
-        <w:t>In 1957, Dijkstra married Maria Debets. At the time, you had to state your profession as part of the marriage rites in the Netherlands. The Dutch authorities were unwilling to accept “programmer” as Dijkstra’s profession; they had never heard of such a profession. To satisfy them, Dijkstra settled for “theoretical physicist” as his job title.</w:t>
-        <w:br/>
-        <w:t>1957 年，Dijkstra 与 Maria Debets 结婚了。在当时的荷兰，新郎新娘必须在结婚仪式上公布自己的职业。而当时的荷兰官方政府拒绝承认“程序员”这一职业，因为他们从来没有听说过。最终 Dijkstra 不得不继续使用”理论物理学家这一职位名称。</w:t>
-        <w:br/>
-        <w:t>As part of deciding to make programming his career, Dijkstra conferred with his boss, Adriaan van Wijngaarden. Dijkstra was concerned that no one had identified a discipline, or science, of programming, and that he would therefore not be taken seriously. His boss replied that Dijkstra might very well be one of the people who would discover such disciplines, thereby evolving software into a science.</w:t>
-        <w:br/>
-        <w:t>Dijkstra 和他的老板 Adriaan van Wijingaarden 曾经讨论过将“程序员”当作终身职业这件事，Dijkstra 最担心的是由于没有人认真地对待过编程这件事或者将它当作是一门学术学科对待，他的科研成果可能将不会得到认真对待。而 Adriaan 则建议 Dijkstra：为什么不亲自去开创这门学科呢?科学</w:t>
-        <w:br/>
-        <w:t>Dijkstra started his career in the era of vacuum tubes, when computers were huge, fragile, slow, unreliable, and (by today’s standards) extremely limited. In those early years, programs were written in binary, or in very crude assembly language. Input took the physical form of paper tape or punched cards. The edit/compile/test loop was hours—if not days—long.</w:t>
-        <w:br/>
-        <w:t>当时还是真空管阶段。计算机体积巨大，运行缓慢，还非常容易出故障，功能（与今天对比）十分有限。人们还是直接使用二进制数，或者使用非常原始的汇编语言编程。计算机的输入方式则还是用纸卷带或者是打孔卡片。要想执行完整的编辑、编译、测试流程是非常耗时的，通常需要数小时或者数天才能完成。</w:t>
-        <w:br/>
-        <w:t>It was in this primitive environment that Dijkstra made his great discoveries.</w:t>
-        <w:br/>
-        <w:t>Dijkstra 就是在这样原始的条件下做出其非凡的成就的。</w:t>
-        <w:br/>
-        <w:t>PROOF 可推导性</w:t>
-        <w:br/>
-        <w:t>深入探索</w:t>
-        <w:br/>
-        <w:t>Testing</w:t>
-        <w:br/>
-        <w:t>Software development</w:t>
-        <w:br/>
-        <w:t>PROGRAMMING</w:t>
-        <w:br/>
-        <w:t>The problem that Dijkstra recognized, early on, was that programming is hard, and that programmers don’t do it very well. A program of any complexity contains too many details for a human brain to manage without help. Overlooking just one small detail results in programs that may seem to work, but fail in surprising ways.软件</w:t>
-        <w:br/>
-        <w:t>Dijkstra 很早就得出的结论是：编程是一项难度很大的活动。一段程序无论复杂与否，都包含了很多的细节信息。如果没有工具的帮助，这些细节的信息是远远超过一个程序员的认知能力范围的。而在一段程序中，哪怕仅仅是一个小细节的错误，也会造成整个程序出错。</w:t>
-        <w:br/>
-        <w:t>Dijkstra’s solution was to apply the mathematical discipline of proof. His vision was the construction of a Euclidian hierarchy of postulates, theorems, corollaries, and lemmas. Dijkstra thought that programmers could use that hierarchy the way mathematicians do. In other words, programmers would use proven structures, and tie them together with code that they would then prove correct themselves.</w:t>
-        <w:br/>
-        <w:t>Dijkstra 提出的解决方案是采用数学推导方法。他的想法是借鉴数学中的公理（Postulate）、定理（Theorem）、推论（Corollary）和引理（Lemma），形成一种欧几里得结构。Dijkstra 认为程序员可以像数学家一样对自己的程序进行推理证明。换句话说，程序员可以用代码将一些已证明可用的结构串联起来，只要自行证明这些额外代码是正确的，就可以推导出整个程序的正确性。</w:t>
-        <w:br/>
-        <w:t>Of course, to get this going, Dijkstra realized that he would have to demonstrate the technique for writing basic proofs of simple algorithms. This he found to be quite challenging.</w:t>
-        <w:br/>
-        <w:t>当然，在这之前，必须先展示如何推导证明简单算法的正确性，这本身就是一件极具挑战性的工作。</w:t>
-        <w:br/>
-        <w:t>During his investigation, Dijkstra discovered that certain uses of goto statements prevent modules from being decomposed recursively into smaller and smaller units, thereby preventing use of the divide-and-conquer approach necessary for reasonable proofs.编程</w:t>
-        <w:br/>
-        <w:t>Dijkstra 在研究过程中发现了一个问题：goto 语句的某些用法会导致某个模块 无法被递归拆分成更小的、可证明的单元，这会导致无法采用分解法来将大型问题进一步拆分成更小的、可证明的部分。</w:t>
-        <w:br/>
-        <w:t>Other uses of goto, however, did not have this problem. Dijkstra realized that these “good” uses of goto corresponded to simple selection and iteration control structures such as if/then/else and do/while. Modules that used only those kinds of control structures could be recursively subdivided into provable units.</w:t>
-        <w:br/>
-        <w:t>goto 语句的其他用法虽然不会导致这种问题，但是 Dijkstra 意识到它们的实际效果其实和更简单的分支结构 if-then-else 以及循环结构 do-while 是一致的。如果代码中只采用了这两类控制结构，则一定可以将程序分解成更小的、可证明的单元。</w:t>
-        <w:br/>
-        <w:t>Dijkstra knew that those control structures, when combined with sequential execution, were special. They had been identified two years before by Böhm and Jacopini, who proved that all programs can be constructed from just three structures: sequence, selection, and iteration.</w:t>
-        <w:br/>
-        <w:t>事实上，Dijkstra 很早就知道将这些控制结构与顺序结构的程序组合起来很有用。因为在两年前，Bohm 和 Jocopini 刚刚证明了人们可以用顺序结构、分支结构、循环结构这三种结构构造出任何程序。</w:t>
-        <w:br/>
-        <w:t>This discovery was remarkable: The very control structures that made a module provable were the same minimum set of control structures from which all programs can be built. Thus structured programming was born.计算机硬件</w:t>
-        <w:br/>
-        <w:t>这个发现非常重要：因为它证明了我们构建可推导模块所需要的控制结构集与构建所有程序所需的控制结构集的最小集是等同的。这样—来，结构化编程就诞生了。</w:t>
-        <w:br/>
-        <w:t>Dijkstra showed that sequential statements could be proved correct through simple enumeration. The technique mathematically traced the inputs of the sequence to the outputs of the sequence. This approach was no different from any normal mathematical proof.</w:t>
-        <w:br/>
-        <w:t>Dijkstra 展示了顺序结构的正确性可以通过枚举法证明，其过程与其他一般的数学推导过程是一样的：针对序列中的每个输入，跟踪其对应的输出值的变化就可以了。</w:t>
-        <w:br/>
-        <w:t>Dijkstra tackled selection through reapplication of enumeration. Each path through the selection was enumerated. If both paths eventually produced appropriate mathematical results, then the proof was solid.</w:t>
-        <w:br/>
-        <w:t>同样的，Dijkstra 利用枚举法又证明了分支结构的可推导性。因为我们只要能用枚举法证明分支结构中每条路径的正确性，自然就可以推导出分支结构本身的正确性。</w:t>
-        <w:br/>
-        <w:t>Iteration was a bit different. To prove an iteration correct, Dijkstra had to use induction. He proved the case for 1 by enumeration. Then he proved the case that if N was assumed correct, N + 1 was correct, again by enumeration. He also proved the starting and ending criteria of the iteration by enumeration.开发工具</w:t>
-        <w:br/>
-        <w:t>循环结构的证明过程则有所不同，为了证明一段循环程序的正确性，Dijkstra 需要采用数学归纳法。具体来说就是，首先要用枚举法证明循环 1 次的正确性。接下来再证明如果循环 N 次是正确的，那么循环 N+1 次也同样也是正确的。最后还要用枚举法证明循环结构的起始与结束条件的正确性。</w:t>
-        <w:br/>
-        <w:t>Such proofs were laborious and complex—but they were proofs. With their development, the idea that a Euclidean hierarchy of theorems could be constructed seemed reachable.</w:t>
-        <w:br/>
-        <w:t>尽管这些证明过程本身非常复杂和烦琐，但确实是完备的。有了这样的证明过程，用欧几里得层级构造定理的方式来验证程序正确性的目标，貌似近在咫尺了。</w:t>
-        <w:br/>
-        <w:t>A HARMFUL PROCLAMATION goto 是有害的</w:t>
-        <w:br/>
-        <w:t>In 1968, Dijkstra wrote a letter to the editor of CACM, which was published in the March issue. The title of this letter was “Go To Statement Considered Harmful.” The article outlined his position on the three control structures.</w:t>
-        <w:br/>
-        <w:t>1968 年，Dijkstra 曾经给 CACM 的编辑写过一封信。这封信后来发表于 CACM 3 月刊，标题是 Go To Statement Considered Harmful，Dijkstra 在信中具体描绘了他对三种控制结构的看法。</w:t>
-        <w:br/>
-        <w:t>And the programming world caught fire. Back then we didn’t have an Internet, so people couldn’t post nasty memes of Dijkstra, and they couldn’t flame him online. But they could, and they did, write letters to the editors of many published journals.数学</w:t>
-        <w:br/>
-        <w:t>这可捅了个大篓子。由于当时还没有互联网，大家还不能直接上网发帖来对 Dijkstra 进行冷嘲热讽，他们唯一能做的，也是大部分人的选择，就是不停地给各种公开发表的报刊的编辑们写信。</w:t>
-        <w:br/>
-        <w:t>Those letters weren’t necessarily all polite. Some were intensely negative; others voiced strong support for his position. And so the battle was joined, ultimately to last about a decade.</w:t>
-        <w:br/>
-        <w:t>可想而知，有的信件的措辞并不那么友善，甚至是非常负面的。但是，也不乏强烈支持者。总之，这场火热的争论持续了超过 10 年。</w:t>
-        <w:br/>
-        <w:t>Eventually the argument petered out. The reason was simple: Dijkstra had won. As computer languages evolved, the goto statement moved ever rearward, until it all but disappeared. Most modern languages do not have a goto statement—and, of course, LISP never did.</w:t>
-        <w:br/>
-        <w:t>当然，这场辩论最终还是逐渐停止了。原因很简单：Dijkstra 是对的。随着编程语言的演进，goto 语句的重要性越来越小，最终甚至消失了。如今大部分的现代编程语言中都已经没有了 goto 语句。哦，对了，LISP 里从来就没有过！</w:t>
-        <w:br/>
-        <w:t>Nowadays we are all structured programmers, though not necessarily by choice. It’s just that our languages don’t give us the option to use undisciplined direct transfer of control.</w:t>
-        <w:br/>
-        <w:t>现如今，无论是否自愿，我们都是结构化编程范式的践行者了，因为我们用的编程语言基本上都已经禁止了不受限制的直接控制转移语句。编程</w:t>
-        <w:br/>
-        <w:t>Some may point to named breaks in Java or exceptions as goto analogs. In fact, these structures are not the utterly unrestricted transfers of control that older languages like Fortran or COBOL once had. Indeed, even languages that still support the goto keyword often restrict the target to within the scope of the current function.</w:t>
-        <w:br/>
-        <w:t>或许有些人会指出，Java 中的带命名的 break 语句或者 Exception 都和 goto 很类似。这些语法结构与老的编程语言（类似 FORTRAN 和 COBOL）中的完全无限制的 goto 语句根本不一样。就算那些还支持 goto 关键词的编程语言也通常限制了 goto 的目标不能超出当前函数范围。</w:t>
-        <w:br/>
-        <w:t>FUNCTIONAL DECOMPOSITION 功能性降解拆分</w:t>
-        <w:br/>
-        <w:t>Structured programming allows modules to be recursively decomposed into provable units, which in turn means that modules can be functionally decomposed. That is, you can take a large-scale problem statement and decompose it into high-level functions. Each of those functions can then be decomposed into lower-level functions, ad infinitum. Moreover, each of those decomposed functions can be represented using the restricted control structures of structured programming.</w:t>
-        <w:br/>
-        <w:t>既然结构化编程范式可将模块递归降解拆分为可推导的单元，这就意味着模块了可以按功能进行降解拆分。这样一来，我们就可以将一个大型问题拆分为一系列高级函数的组合，而这些高级函数各自又可以继续被拆分为一系列低级函数，如此无限递归。更重要的是，每个被拆分出来的函数也都可以用结构化编程范式来书写。</w:t>
-        <w:br/>
-        <w:t>Building on this foundation, disciplines such as structured analysis and structured design became popular in the late 1970s and throughout the 1980s. Men like Ed Yourdon, Larry Constantine, Tom DeMarco, and Meilir Page-Jones promoted and popularized these techniques throughout that period. By following these disciplines, programmers could break down large proposed systems into modules and components that could be further broken down into tiny provable functions.</w:t>
-        <w:br/>
-        <w:t>以此为理论基础，在 20 世纪 70 年代晚期到 10 年代中期出现的结构化分析与结构化设计工作才能广为人知。Ed Yourdon、Larry Constantine、Tom DeMarco 以及 Meilir Page Jones 在这期间为此做了很多推广工作。通过采用这些技巧，程序员可以将大型系统设计拆分成模块和组件，而这些模块和组件最终可以拆分为更小的、可证明的函数。</w:t>
-        <w:br/>
-        <w:t>NO FORMAL PROOFS 形式化证明没有发生</w:t>
-        <w:br/>
-        <w:t>But the proofs never came. The Euclidean hierarchy of theorems was never built. And programmers at large never saw the benefits of working through the laborious process of formally proving each and every little function correct. In the end, Dijkstra’s dream faded and died. Few of today’s programmers believe that formal proofs are an appropriate way to produce high-quality software.软件</w:t>
-        <w:br/>
-        <w:t>但是，人人都用完整的形式化证明的一天没有到来。大部分人不会真的按照欧几里得结构为每个小函数书写冗长复杂的正确性证明过程。Dijkstra 的梦想最终并没有实现。没有几个程序员会认为形式化验证是产出高质量软件的必备条件。</w:t>
-        <w:br/>
-        <w:t>Of course, formal, Euclidian style, mathematical proofs are not the only strategy for proving something correct. Another highly successful strategy is the scientific method.</w:t>
-        <w:br/>
-        <w:t>当然，形式化的、欧几里得式的数学推导证明并不是证明结构化编程正确性的唯一手段。下面我们来看另外一个十分成功的策略：科学证明法。</w:t>
-        <w:br/>
-        <w:t>SCIENCE TO THE RESCUE 科学来救场</w:t>
-        <w:br/>
-        <w:t>Science is fundamentally different from mathematics, in that scientific theories and laws cannot be proven correct. I cannot prove to you that Newton’s second law of motion, F = ma, or law of gravity, F = Gm1m2/r2, are correct. I can demonstrate these laws to you, and I can make measurements that show them correct to many decimal places, but I cannot prove them in the sense of a mathematical proof. No matter how many experiments I conduct or how much empirical evidence I gather, there is always the chance that some experiment will show that those laws of motion and gravity are incorrect.</w:t>
-        <w:br/>
-        <w:t>科学和数学在证明方法上有着根本性的不同，科学理论和科学定律通常是无法被证明的，譬如我们并没有办法证明牛顿第二运动定律 F=ma 或者万有引力定律 F=Gm1m2/r^2 是正确的，但我们可以用实际案例来演示这些定律的正确性，并通过高精度测量来证明当相关精度达到小数点后多少位时，被测量对象仍然一直满足这个定律。但我们始终没有办法像用数学方法一样推导出这个定律。而且，不管我们进行多少次正确的实验，也无法排除今后会存在某一次实验可以推翻牛顿第二运动定律与万有引力定律的可能性。数学</w:t>
-        <w:br/>
-        <w:t>That is the nature of scientific theories and laws: They are falsifiable but not provable.</w:t>
-        <w:br/>
-        <w:t>这就是科学理论和科学定律的特点：它们可以被证伪，但是没有办法被证明。</w:t>
-        <w:br/>
-        <w:t>And yet we bet our lives on these laws every day. Every time you get into a car, you bet your life that F = ma is a reliable description of the way the world works. Every time you take a step, you bet your health and safety that F = Gm1m2/r2 is correct.</w:t>
-        <w:br/>
-        <w:t>但是我们仍然每天都在依赖这些定律生活。开车的时候，我们就等于是在用性命担保 F=ma 是对世界运转方式的一个可靠的描述。每当我们迈出一步的时候，和等于在亲身证明 F=Gm1m2/r^2 是正确的。</w:t>
-        <w:br/>
-        <w:t>Science does not work by proving statements true, but rather by proving statements false. Those statements that we cannot prove false, after much effort, we deem to be true enough for our purposes.</w:t>
-        <w:br/>
-        <w:t>科学方法论不需要证明某条结论是正确的，只需要想办法证明它是错误的。如果某个结论经过一定的努力无法证伪，我们则认为它在当下是足够正确的。</w:t>
-        <w:br/>
-        <w:t>Of course, not all statements are provable. The statement “This is a lie” is neither true nor false. It is one of the simplest examples of a statement that is not provable.科学</w:t>
-        <w:br/>
-        <w:t>当然，不是所有的结论都可以被证明或者证伪的。举一个最简单的不可证明的例子：“这句话是假的”，非真也非伪。</w:t>
-        <w:br/>
-        <w:t>Ultimately, we can say that mathematics is the discipline of proving provable statements true. Science, in contrast, is the discipline of proving provable statements false.</w:t>
-        <w:br/>
-        <w:t>最终，我们可以说数学是要将可证明的结论证明，而与之相反，科学研究则是要将可证明的结论证伪。</w:t>
-        <w:br/>
-        <w:t>TESTS 测试</w:t>
-        <w:br/>
-        <w:t>Dijkstra once said, “Testing shows the presence, not the absence, of bugs.” In other words, a program can be proven incorrect by a test, but it cannot be proven correct. All that tests can do, after sufficient testing effort, is allow us to deem a program to be correct enough for our purposes.</w:t>
-        <w:br/>
-        <w:t>Dijkstra 曾经说过“测试只能展示 Bug 的存在，并不能证明不存在 Bug”，换句话说，一段程序可以由一个测试来证明其错误性，但是却不能被证明是正确的。测试的作用是让我们得出某段程序已经足够实现当前目标这一结论。</w:t>
-        <w:br/>
-        <w:t>The implications of this fact are stunning. Software development is not a mathematical endeavor, even though it seems to manipulate mathematical constructs. Rather, software is like a science. We show correctness by failing to prove incorrectness, despite our best efforts.编程</w:t>
-        <w:br/>
-        <w:t>这一事实所带来的影响是惊人的。软件开发虽然看起来是在操作很多数学结构，其实不是一个数学研究过程。恰恰相反，软件开发更像是一门科学研究学科，我们通过无法证伪来证明软件的正确性。</w:t>
-        <w:br/>
-        <w:t>Such proofs of incorrectness can be applied only to provable programs. A program that is not provable—due to unrestrained use of goto, for example—cannot be deemed correct no matter how many tests are applied to it.</w:t>
-        <w:br/>
-        <w:t>注意，这种证伪过程只能应用于可证明的程序上。某段程序如果是不可证明的，例如，其中采用了不加限制的 goto 语句，那么无论我们为它写多少测试，也不能够证明其正确性。</w:t>
-        <w:br/>
-        <w:t>Structured programming forces us to recursively decompose a program into a set of small provable functions. We can then use tests to try to prove those small provable functions incorrect. If such tests fail to prove incorrectness, then we deem the functions to be correct enough for our purposes.</w:t>
-        <w:br/>
-        <w:t>结构化编程范式促使我们先将一段程序递归降解为一系列可证明的小函数，然后再编写相关的测试来试图证明这些函数是错误的。如果这些测试无法证伪这些函数，那么我们就可以认为这些函数是足够正确的，进而推导整个程序是正确的。</w:t>
-        <w:br/>
-        <w:t>CONCLUSION 本章小结</w:t>
-        <w:br/>
-        <w:t>It is this ability to create falsifiable units of programming that makes structured programming valuable today. This is the reason that modern languages do not typically support unrestrained goto statements. Moreover, at the architectural level, this is why we still consider functional decomposition to be one of our best practices.</w:t>
-        <w:br/>
-        <w:t>结构化编程范式中最有价值的地方就是，它赋予了我们创造可证伪程序单元的能力。这就是为什么现代编程语言一般不支持无限制的 goto 语句。更重要的是，这也是为什么在架构设计领域，功能性降解拆分仍然是最佳实践之一。</w:t>
-        <w:br/>
-        <w:t>At every level, from the smallest function to the largest component, software is like a science and, therefore, is driven by falsifiability. Software architects strive to define modules, components, and services that are easily falsifiable (testable). To do so, they employ restrictive disciplines similar to structured programming, albeit at a much higher level.开发工具</w:t>
-        <w:br/>
-        <w:t>无论在哪一个层面上，从最小的函数到最大组件，软件开发的过程都和科学研究非常类似，它们都是由证伪驱动的。软件架构师需要定义可以方便地进行证伪（测试）的模块、组件以及服务。为了达到这个目的，他们需要将类似结构化编程的限制方法应用在更高的层面上。</w:t>
-        <w:br/>
-        <w:t>It is those restrictive disciplines that we will study in some detail in the chapters to come.</w:t>
-        <w:br/>
-        <w:t>我们在接下来的章节中将会深入研究这些限制性的方法。</w:t>
-      </w:r>
-    </w:p>
-    <w:p>
-      <w:pPr>
-        <w:pStyle w:val="Title"/>
-      </w:pPr>
-      <w:r>
-        <w:t>Chap5. 面向对象编程</w:t>
-      </w:r>
-    </w:p>
-    <w:p>
-      <w:r>
-        <w:t>Chap5. OBJECT-ORIENTED PROGRAMMING 面向对象编程</w:t>
-        <w:br/>
-        <w:t>ENCAPSULATION? 封装</w:t>
-        <w:br/>
-        <w:t>INHERITANCE? 继承</w:t>
-        <w:br/>
-        <w:t>POLYMORPHISM? 多态</w:t>
-        <w:br/>
-        <w:t>THE POWER OF POLYMORPHISM 多态的强大性</w:t>
-        <w:br/>
-        <w:t>DEPENDENCY INVERSION 依赖反转</w:t>
-        <w:br/>
-        <w:t>CONCLUSION 本章小结</w:t>
-        <w:br/>
-        <w:t>Chap5. OBJECT-ORIENTED PROGRAMMING 面向对象编程</w:t>
-        <w:br/>
-        <w:t>As we will see, the basis of a good architecture is the understanding and application of the principles of object-oriented design (OO). But just what is OO?</w:t>
-        <w:br/>
-        <w:t>稍后我们会讲到，设计一个优秀的软件架构要基于对面向对象设计（Object-Oriented Design）的深入理解及应用。但我们首先得弄明白一个问题：究竟什么是面向对象？</w:t>
-        <w:br/>
-        <w:t>One answer to this question is “The combination of data and function.” Although often cited, this is a very unsatisfying answer because it implies that o.f() is somehow different from f(o). This is absurd. Programmers were passing data structures into functions long before 1966, when Dahl and Nygaard moved the function call stack frame to the heap and invented OO.</w:t>
-        <w:br/>
-        <w:t>对于这个问题，一种常见的回答是“数据与函数的组合”。这种说法虽然被广为引用，但总显得并不是那么贴切，因为它似乎暗示了 o.f() 与 f(o) 之间是有区别的，这显然不是事实。面向对象理论是在 1966 年提出的，当时 Dahl 和 Nygaard 主要是将函数调用栈迁移到了堆区域中。数据结构被用作函数的调用参数这件事情远比这发生的时间更早。</w:t>
-        <w:br/>
-        <w:t>Another common answer to this question is “A way to model the real world.” This is an evasive answer at best. What does “modeling the real world” actually mean, and why is it something we would want to do? Perhaps this statement is intended to imply that OO makes software easier to understand because it has a closer relationship to the real world—but even that statement is evasive and too loosely defined. It does not tell us what OO is.</w:t>
-        <w:br/>
-        <w:t>另一种常见的回答是“面向对象编程是一种对真实世界进行建模的方式”，这种回答只能算作避重就轻。“对真实世界的建模”到底要如何进行？我们为什么要这么做，有什么好处？也许这句话意味着是“由于采用面向对象方式构建的软件与真实世界的关系更紧密，所以面向对象编程可以使得软件开发更容易”——即使这样说，也仍然逃避了关键问题——面向对象编程究竟是什么?</w:t>
-        <w:br/>
-        <w:t>Some folks fall back on three magic words to explain the nature of OO: encapsulation, inheritance, and polymorphism. The implication is that OO is the proper admixture of these three things, or at least that an OO language must support these three things.</w:t>
-        <w:br/>
-        <w:t>还有些人在回答这个问题的时候，往往会搬出一些神秘的词语，譬如封装（encapsulation）、继承（inheritance）、多态（polymorphism）。其隐含意思就是说面向对象编程是这三项的有机组合，或者任何一种支持面向对象的编程语言必须支持这三个特性。</w:t>
-        <w:br/>
-        <w:t>Let’s examine each of these concepts in turn.</w:t>
-        <w:br/>
-        <w:t>那么，我们接下来可以逐个来分析一下这三个概念。</w:t>
-        <w:br/>
-        <w:t>ENCAPSULATION? 封装</w:t>
-        <w:br/>
-        <w:t>The reason encapsulation is cited as part of the definition of OO is that OO languages provide easy and effective encapsulation of data and function. As a result, a line can be drawn around a cohesive set of data and functions. Outside of that line, the data is hidden and only some of the functions are known. We see this concept in action as the private data members and the public member functions of a class.</w:t>
-        <w:br/>
-        <w:t>导致封装这个概念经常被引用为面向对象编程定义的一部分。通过釆用封装特性，我们可以把一组相关联的数据和函数圈起来，便圈外血的代码只能看见部分函数，数据则完全不可见。譬如在实际应用中，类（class）中的公共函数和私有成员变量就是这样。</w:t>
-        <w:br/>
-        <w:t>This idea is certainly not unique to OO. Indeed, we had perfect encapsulation in C. Consider this simple C program:</w:t>
-        <w:br/>
-        <w:t>然而，这个特性其实并不是面向对象编程所独有的。其实，c 语言也支持完整的封装，下面来看一个简单的 c 程序：</w:t>
-        <w:br/>
-        <w:t>point.h</w:t>
-        <w:br/>
-        <w:t>struct Point;</w:t>
-        <w:br/>
-        <w:t>struct Point* makePoint(double x, double y);</w:t>
-        <w:br/>
-        <w:t>double distance (struct Point *p1, struct Point *p2);</w:t>
-        <w:br/>
-        <w:t>point.c</w:t>
-        <w:br/>
-        <w:t>#include "point.h"</w:t>
-        <w:br/>
-        <w:t>#include &lt;stdlib.h&gt;</w:t>
-        <w:br/>
-        <w:t>#include &lt;math.h&gt;</w:t>
-        <w:br/>
-        <w:t>struct Point {</w:t>
-        <w:br/>
-        <w:t xml:space="preserve">  double x,y;</w:t>
-        <w:br/>
-        <w:t>};</w:t>
-        <w:br/>
-        <w:t>struct Point* makepoint(double x, double y) {</w:t>
-        <w:br/>
-        <w:t xml:space="preserve">  struct Point* p = malloc(sizeof(struct Point));</w:t>
-        <w:br/>
-        <w:t xml:space="preserve">  p-&gt;x = x;</w:t>
-        <w:br/>
-        <w:t xml:space="preserve">  p-&gt;y = y;</w:t>
-        <w:br/>
-        <w:t xml:space="preserve">  return p;</w:t>
-        <w:br/>
-        <w:t>}</w:t>
-        <w:br/>
-        <w:t>double distance(struct Point* p1, struct Point* p2) {</w:t>
-        <w:br/>
-        <w:t xml:space="preserve">  double dx = p1-&gt;x - p2-&gt;x;</w:t>
-        <w:br/>
-        <w:t xml:space="preserve">  double dy = p1-&gt;y - p2-&gt;y;</w:t>
-        <w:br/>
-        <w:t xml:space="preserve">  return sqrt(dx*dx+dy*dy);</w:t>
-        <w:br/>
-        <w:t>}</w:t>
-        <w:br/>
-        <w:t>The users of point.h have no access whatsoever to the members of struct Point. They can call the makePoint() function, and the distance() function, but they have absolutely no knowledge of the implementation of either the Point data structure or the functions.</w:t>
-        <w:br/>
-        <w:t>显然，使用 point.h 的程序是没有 Point 结构体成员的访问权限的。它们只能调用 makePoint() 函数和 distance() 函数，但对它们来说，Point 这个数据结构体的内部细节，以及函数的具体实现方式都是不可见的。</w:t>
-        <w:br/>
-        <w:t>This is perfect encapsulation—in a non-OO language. C programmers used to do this kind of thing all the time. We would forward declare data structures and functions in header files, and then implement them in implementation files. Our users never had access to the elements in those implementation files.</w:t>
-        <w:br/>
-        <w:t>这正是完美封装 虽然 C 语言是非面向对象的编程语言。上述 C 程序是很常见的。在头文件中进行数据结构以及函数定义的前置声明（forward declare），然后 在程序文件中具体实现。程序文件中的具体实现细节对使用者来说是不可见的。</w:t>
-        <w:br/>
-        <w:t>But then came OO in the form of C++—and the perfect encapsulation of C was broken.</w:t>
-        <w:br/>
-        <w:t>而 C++作为一种面向对象编程语言，反而破坏了 c 的完美封装性。</w:t>
-        <w:br/>
-        <w:t>The C++ compiler, for technical reasons,1 needed the member variables of a class to be declared in the header file of that class. So our Point program changed to look like this:</w:t>
-        <w:br/>
-        <w:t>由于一些技术原，C++编译器要求类的成员变量必须在该类的头文件中声明。这样一来，我们的 point.h 程序随之就改成了这样：</w:t>
-        <w:br/>
-        <w:t>point.h</w:t>
-        <w:br/>
-        <w:t>class Point {</w:t>
-        <w:br/>
-        <w:t>public:</w:t>
-        <w:br/>
-        <w:t xml:space="preserve">  Point(double x, double y);</w:t>
-        <w:br/>
-        <w:t xml:space="preserve">  double distance(const Point&amp; p) const;</w:t>
-        <w:br/>
-        <w:t>private:</w:t>
-        <w:br/>
-        <w:t xml:space="preserve">  double x;</w:t>
-        <w:br/>
-        <w:t xml:space="preserve">  double y;</w:t>
-        <w:br/>
-        <w:t>};</w:t>
-        <w:br/>
-        <w:t>point.cc</w:t>
-        <w:br/>
-        <w:t>#include "point.h"</w:t>
-        <w:br/>
-        <w:t>#include &lt;math.h&gt;</w:t>
-        <w:br/>
-        <w:t>Point::Point(double x, double y)</w:t>
-        <w:br/>
-        <w:t>: x(x), y(y)</w:t>
-        <w:br/>
-        <w:t>{}</w:t>
-        <w:br/>
-        <w:t>double Point::distance(const Point&amp; p) const {</w:t>
-        <w:br/>
-        <w:t xml:space="preserve">  double dx = x-p.x;</w:t>
-        <w:br/>
-        <w:t xml:space="preserve">  double dy = y-p.y;</w:t>
-        <w:br/>
-        <w:t xml:space="preserve">  return sqrt(dx*dx + dy*dy);</w:t>
-        <w:br/>
-        <w:t>}</w:t>
-        <w:br/>
-        <w:t>Clients of the header file point.h know about the member variables x and y! The compiler will prevent access to them, but the client still knows they exist. For example, if those member names are changed, the point.cc file must be recompiled! Encapsulation has been broken.</w:t>
-        <w:br/>
-        <w:t>好了，point.h 文件的使用者现在知道了成员变量 x 和 y 的存在！虽然编译器会禁止对这两个变量的直接访问，但是使用者仍然知道了它们的存在。而且，如果 x 和 y 变量名称被改变了，point.cc 也必须重新编译才行！这样的封装性显然是不完美的。</w:t>
-        <w:br/>
-        <w:t>Indeed, the way encapsulation is partially repaired is by introducing the public, private, and protected keywords into the language. This, however, was a hack necessitated by the technical need for the compiler to see those variables in the header file.</w:t>
-        <w:br/>
-        <w:t>当然，C++通过在编程语言层面引入 public、private、protected 这些关键词，部分维护了封装性。但所有这些都是为了解决编译器自身的技术实现问题而引入的 hack——编译器由于技术实现原因必须在头文件中看到成员变量的定义。</w:t>
-        <w:br/>
-        <w:t>Java and C# simply abolished the header/implementation split altogether, thereby weakening encapsulation even more. In these languages, it is impossible to separate the declaration and definition of a class.</w:t>
-        <w:br/>
-        <w:t>而 Java 和 C# 则彻底抛弃了头文件与实现文件分离的编程方式，这其实进一步削弱了封装性。因为在这些语言中，我们是无法区分一个类的声明和定义的。</w:t>
-        <w:br/>
-        <w:t>For these reasons, it is difficult to accept that OO depends on strong encapsulation. Indeed, many OO languages2 have little or no enforced encapsulation.</w:t>
-        <w:br/>
-        <w:t>由于上述原因，我们很难说强封装是面向对象编程的必要条件。而事实上，有很多面向对象编程语言|对封装性并没有强制性的要求。</w:t>
-        <w:br/>
-        <w:t>OO certainly does depend on the idea that programmers are well-behaved enough to not circumvent encapsulated data. Even so, the languages that claim to provide OO have only weakened the once perfect encapsulation we enjoyed with C.</w:t>
-        <w:br/>
-        <w:t>面向对象编程在应用上确实会要求程序员尽量避免破坏数据的封装性。但实际情况是，那些声称自己提供面向对象编程支持的编程语言，相对于 C 这种完美封装的语言而言，其封装性都被削弱了，而不是加强了。</w:t>
-        <w:br/>
-        <w:t>INHERITANCE? 继承</w:t>
-        <w:br/>
-        <w:t>If OO languages did not give us better encapsulation, then they certainly gave us inheritance.</w:t>
-        <w:br/>
-        <w:t>既然面向对象编程语言并没有提供更好的封装性，那么在继承性方面又如何呢？</w:t>
-        <w:br/>
-        <w:t>Well—sort of. Inheritance is simply the redeclaration of a group of variables and functions within an enclosing scope. This is something C programmers3 were able to do manually long before there was an OO language.</w:t>
-        <w:br/>
-        <w:t>嗯，其实也就一般般吧。简而言之，继承的主要作用是让我们可以在某个作用域内对外部定义的某一组变量与函数进行覆盖。这事实上也是 c 程序员早在面向对象编程语言发明之前就一直在做的事了。</w:t>
-        <w:br/>
-        <w:t>Consider this addition to our original point.h C program:</w:t>
-        <w:br/>
-        <w:t>下面，看一下刚才的 C 程序 point.h 的扩展版：</w:t>
-        <w:br/>
-        <w:t>namedPoint.h</w:t>
-        <w:br/>
-        <w:t>struct NamedPoint;</w:t>
-        <w:br/>
-        <w:t>struct NamedPoint* makeNamedPoint(double x, double y, char* name);</w:t>
-        <w:br/>
-        <w:t>void setName(struct NamedPoint* np, char* name);</w:t>
-        <w:br/>
-        <w:t>char* getName(struct NamedPoint* np);</w:t>
-        <w:br/>
-        <w:t>namedPoint.c</w:t>
-        <w:br/>
-        <w:t>#include "namedPoint.h"</w:t>
-        <w:br/>
-        <w:t>#include &lt;stdlib.h&gt;</w:t>
-        <w:br/>
-        <w:t>struct NamedPoint {</w:t>
-        <w:br/>
-        <w:t xml:space="preserve">  double x,y;</w:t>
-        <w:br/>
-        <w:t xml:space="preserve">  char* name;</w:t>
-        <w:br/>
-        <w:t>};</w:t>
-        <w:br/>
-        <w:t>struct NamedPoint* makeNamedPoint(double x, double y, char* name) {</w:t>
-        <w:br/>
-        <w:t xml:space="preserve">  struct NamedPoint* p = malloc(sizeof(struct NamedPoint));</w:t>
-        <w:br/>
-        <w:t xml:space="preserve">  p-&gt;x = x;</w:t>
-        <w:br/>
-        <w:t xml:space="preserve">  p-&gt;y = y;</w:t>
-        <w:br/>
-        <w:t xml:space="preserve">  p-&gt;name = name;</w:t>
-        <w:br/>
-        <w:t xml:space="preserve">  return p;</w:t>
-        <w:br/>
-        <w:t>}</w:t>
-        <w:br/>
-        <w:t>void setName(struct NamedPoint* np, char* name) {</w:t>
-        <w:br/>
-        <w:t xml:space="preserve">  np-&gt;name = name;</w:t>
-        <w:br/>
-        <w:t>}</w:t>
-        <w:br/>
-        <w:t>char* getName(struct NamedPoint* np) {</w:t>
-        <w:br/>
-        <w:t xml:space="preserve">  return np-&gt;name;</w:t>
-        <w:br/>
-        <w:t>}</w:t>
-        <w:br/>
-        <w:t>main.c</w:t>
-        <w:br/>
-        <w:t>#include "point.h"</w:t>
-        <w:br/>
-        <w:t>#include "namedPoint.h"</w:t>
-        <w:br/>
-        <w:t>#include &lt;stdio.h&gt;</w:t>
-        <w:br/>
-        <w:t>int main(int ac, char** av) {</w:t>
-        <w:br/>
-        <w:t xml:space="preserve">  struct NamedPoint* origin = makeNamedPoint(0.0, 0.0, "origin");</w:t>
-        <w:br/>
-        <w:t xml:space="preserve">  struct NamedPoint* upperRight = makeNamedPoint  (1.0, 1.0, "upperRight");</w:t>
-        <w:br/>
-        <w:t xml:space="preserve">  printf("distance=%f\n",</w:t>
-        <w:br/>
-        <w:t xml:space="preserve">    distance(</w:t>
-        <w:br/>
-        <w:t xml:space="preserve">             (struct Point*) origin,</w:t>
-        <w:br/>
-        <w:t xml:space="preserve">             (struct Point*) upperRight));</w:t>
-        <w:br/>
-        <w:t>}</w:t>
-        <w:br/>
-        <w:t>If you look carefully at the main program, you’ll see that the NamedPoint data structure acts as though it is a derivative of the Point data structure. This is because the order of the first two fields in NamedPoint is the same as Point. In short, NamedPoint can masquerade as Point because NamedPoint is a pure superset of Point and maintains the ordering of the members that correspond to Point.</w:t>
-        <w:br/>
-        <w:t>请仔细观察 main 函数，这里 NamedPoint 数据结构是被当作 Point 数据结构的一个衍生体來使用的。之所以可以这样做，是因为 NamedPoint 结构体的前两个成员的顺用与 Point 结构休的完全一致。简单来说，NamedPoint 之所以可以被伪装成 Point 来使用，是因为 NamedPoint 是 Point 结构体的一个超集，同两者共同成员的顺序也是一样的。</w:t>
-        <w:br/>
-        <w:t>This kind of trickery was a common practice4 of programmers prior to the advent of OO. In fact, such trickery is how C++ implements single inheritance.</w:t>
-        <w:br/>
-        <w:t>面这种编程方式虽然看上去有些投机取巧，但是在面向对象理论被提出之前，这已经很常见了。其实，C++内部就是这样实现单继承的。</w:t>
-        <w:br/>
-        <w:t>Thus we might say that we had a kind of inheritance long before OO languages were invented. That statement wouldn’t quite be true, though. We had a trick, but it’s not nearly as convenient as true inheritance. Moreover, multiple inheritance is a considerably more difficult to achieve by such trickery.</w:t>
-        <w:br/>
-        <w:t>因此，我们可以说，早在面向对象编程语言被发明之前，对继承性的支持就已经存在很久了。当然了，这种支持用了一些投机取巧的手段，并不像如今的继昼：样便利易用，而且，多重继承（multiple inheritance）如果还想用这种方法来实现，就更难了。</w:t>
-        <w:br/>
-        <w:t>Note also that in main.c, I was forced to cast the NamedPoint arguments to Point. In a real OO language, such upcasting would be implicit.</w:t>
-        <w:br/>
-        <w:t>同时应该注意的是，在 main.c 中，程序员必须强制将 NamedPoint 的参数类型转换为 Point，而在真正的面向对象编程语言中，这种类型的向上转换通常应该是隐性的。</w:t>
-        <w:br/>
-        <w:t>It’s fair to say that while OO languages did not give us something completely brand new, it did make the masquerading of data structures significantly more convenient.</w:t>
-        <w:br/>
-        <w:t>综上所述，我们可以认为，虽然面向对象编程在继承性方面并没有开创出新，但是的确在数据结构的伪装性上提供了相当程度的便利性。</w:t>
-        <w:br/>
-        <w:t>To recap: We can award no point to OO for encapsulation, and perhaps a half-point for inheritance. So far, that’s not such a great score.</w:t>
-        <w:br/>
-        <w:t>回顾一下到目前为止的分析，面向对象编程在封装性上得 0 分，在继承性上勉强可以得 0.5 分（满分为 1)。</w:t>
-        <w:br/>
-        <w:t>But there’s one more attribute to consider.</w:t>
-        <w:br/>
-        <w:t>下面，我们还有最后一个特性要讨论。</w:t>
-        <w:br/>
-        <w:t>POLYMORPHISM? 多态</w:t>
-        <w:br/>
-        <w:t>Did we have polymorphic behavior before OO languages? Of course we did. Consider this simple C copy program.</w:t>
-        <w:br/>
-        <w:t>在面向编程对象语言被发明之前，我们所使用的编程语言能支持多态吗? 答案是肯定的，请注意看下面这段用 C 语言编写的 copy 程序：</w:t>
-        <w:br/>
-        <w:t>#include &lt;stdio.h&gt;</w:t>
-        <w:br/>
-        <w:t>void copy() {</w:t>
-        <w:br/>
-        <w:t xml:space="preserve">  int c;</w:t>
-        <w:br/>
-        <w:t xml:space="preserve">  while ((c=getchar()) != EOF)</w:t>
-        <w:br/>
-        <w:t xml:space="preserve">    putchar(c);</w:t>
-        <w:br/>
-        <w:t>}</w:t>
-        <w:br/>
-        <w:t>The function getchar() reads from STDIN. But which device is STDIN? The putchar() function writes to STDOUT. But which device is that? These functions are polymorphic—their behavior depends on the type of STDIN and STDOUT.</w:t>
-        <w:br/>
-        <w:t>在上述程序中，函数 getchar() 主要负责从 STDTN 中读取数据。但是 STDLLN 究竟指代的是哪个设备呢？同样的道理，putchar() 主要负责将数据写入 STDOUT，而 STDOUT 又指代的是哪个设备呢？很显然，这类函数其实就具有多态性，因为它们的行为依赖于 STDIN 和 STDOUT 的具体类型。</w:t>
-        <w:br/>
-        <w:t>It’s as though STDIN and STDOUT are Java-style interfaces that have implementations for each device. Of course, there are no interfaces in the example C program—so how does the call to getchar() actually get delivered to the device driver that reads the character?</w:t>
-        <w:br/>
-        <w:t>这里的 STDIN 和 STDOUT 与 Java 中的接口类似，各种设备都有各自的实现。当然，这个 C 程序中是没有接口这个概念的，那么 getchar() 这个调用的动作是 如何真正传递到设备驱动程序中，从而读取到具体内容的呢？</w:t>
-        <w:br/>
-        <w:t>The answer to that question is pretty straightforward. The UNIX operating system requires that every IO device driver provide five standard functions:5 open, close, read, write, and seek. The signatures of those functions must be identical for every IO driver.</w:t>
-        <w:br/>
-        <w:t>其实很简单，UNIX 操作系统强制要求每个 IO 设备都要提供 open、close、read、write 和 seek 这 5 个标准函数。也就是说，每个 IO 设备驱动程序对这 5 种函数的实现在函数调用上必须保持一致。</w:t>
-        <w:br/>
-        <w:t>The FILE data structure contains five pointers to functions. In our example, it might look like this:</w:t>
-        <w:br/>
-        <w:t>首先，FILE 数据结构体中包含了相对应的 5 个函数指针，分别用于指向这些函数：</w:t>
-        <w:br/>
-        <w:t>struct FILE {</w:t>
-        <w:br/>
-        <w:t xml:space="preserve">  void (*open)(char* name, int mode);</w:t>
-        <w:br/>
-        <w:t xml:space="preserve">  void (*close)();</w:t>
-        <w:br/>
-        <w:t xml:space="preserve">  int (*read)();</w:t>
-        <w:br/>
-        <w:t xml:space="preserve">  void (*write)(char);</w:t>
-        <w:br/>
-        <w:t xml:space="preserve">  void (*seek)(long index, int mode);</w:t>
-        <w:br/>
-        <w:t>};</w:t>
-        <w:br/>
-        <w:t>The IO driver for the console will define those functions and load up a FILE data structure with their addresses—something like this:</w:t>
-        <w:br/>
-        <w:t>然后，譬如控制台设备的 IO 驱动程序就会提供这 5 个函数的实际定义，将 FILE 结构体的函数指针指向这些对应的实现函数：</w:t>
-        <w:br/>
-        <w:t>#include "file.h"</w:t>
-        <w:br/>
-        <w:t>void open(char* name, int mode) {/*...*/}</w:t>
-        <w:br/>
-        <w:t>void close() {/*...*/};</w:t>
-        <w:br/>
-        <w:t>int read() {int c;/*...*/ return c;}</w:t>
-        <w:br/>
-        <w:t>void write(char c) {/*...*/}</w:t>
-        <w:br/>
-        <w:t>void seek(long index, int mode) {/*...*/}</w:t>
-        <w:br/>
-        <w:t>struct FILE console = {open, close, read, write, seek};</w:t>
-        <w:br/>
-        <w:t>Now if STDIN is defined as a FILE*, and if it points to the console data structure, then getchar() might be implemented this way:</w:t>
-        <w:br/>
-        <w:t>现在，如果 STDIN 的定义是 FILE*，并同时指向了 console 这个数据结构，那么 getchar() 的实现方式就是这样的：</w:t>
-        <w:br/>
-        <w:t>extern struct FILE* STDIN;</w:t>
-        <w:br/>
-        <w:t>int getchar() {</w:t>
-        <w:br/>
-        <w:t xml:space="preserve">  return STDIN-&gt;read();</w:t>
-        <w:br/>
-        <w:t>}</w:t>
-        <w:br/>
-        <w:t>In other words, getchar() simply calls the function pointed to by the read pointer of the FILE data structure pointed to by STDIN.</w:t>
-        <w:br/>
-        <w:t>换句话说，getchar() 只是调用了 STDIN 所指向的 FIL E 数据结构体中的 read 函数指针指向的函数。</w:t>
-        <w:br/>
-        <w:t>This simple trick is the basis for all polymorphism in OO. In C++, for example, every virtual function within a class has a pointer in a table called a vtable, and all calls to virtual functions go through that table. Constructors of derivatives simply load their versions of those functions into the vtable of the object being created.</w:t>
-        <w:br/>
-        <w:t>这个简单的编程技巧正是面向对象编程中多态的基础。例如在 C++中，类中的每个虚函数（virtual function）的地址都被记录在一个名叫 vtable 的数据结构里。我们对虚函数的每次调用都要先查询这个表，其衍生类的构造函数负责将该衍生类的虚函数地址加载到整个对象的 vtable 中。</w:t>
-        <w:br/>
-        <w:t>The bottom line is that polymorphism is an application of pointers to functions. Programmers have been using pointers to functions to achieve polymorphic behavior since Von Neumann architectures were first implemented in the late 1940s. In other words, OO has provided nothing new.</w:t>
-        <w:br/>
-        <w:t>归根结底，多态其实不过就是函数指针的一种应用。自从 20 世纪 40 年代末期冯·诺依曼架构诞生那天起，程序员们就一直在使用函数指针模拟多态了。也就是说，面向对象编程在多态方面没有提出任何新概念。</w:t>
-        <w:br/>
-        <w:t>Ah, but that’s not quite correct. OO languages may not have given us polymorphism, but they have made it much safer and much more convenient.</w:t>
-        <w:br/>
-        <w:t>当然了，面向对象编程语言虽然在多态上并没有理论创新，但它们也确实让多态变得更安全、更便于使用了。</w:t>
-        <w:br/>
-        <w:t>The problem with explicitly using pointers to functions to create polymorphic behavior is that pointers to functions are dangerous. Such use is driven by a set of manual conventions. You have to remember to follow the convention to initialize those pointers. You have to remember to follow the convention to call all your functions through those pointers. If any programmer fails to remember these conventions, the resulting bug can be devilishly hard to track down and eliminate.</w:t>
-        <w:br/>
-        <w:t>用函数指针显式实现多态的问题就在于函数指针的危险性。毕竟，函数指针的调用依赖于一系列需要人为遵守的约定。程序员必须严格按照固定约定来初始化函数指针，并同样严格地按照约定来调用这些指针。只要有一个程序员没有遵守这些约定，整个程序就会产生极其难以跟踪和消除的 Bug。</w:t>
-        <w:br/>
-        <w:t>OO languages eliminate these conventions and, therefore, these dangers. Using an OO language makes polymorphism trivial. That fact provides an enormous power that old C programmers could only dream of. On this basis, we can conclude that OO imposes discipline on indirect transfer of control.</w:t>
-        <w:br/>
-        <w:t>面向对象编程语言为我们消除人工遵守这些约定的必要，也就等于消除了这方面的危险性。采用面向对象编程语言让多态实现变得非常简单，让一个传统 C 程序员可以去做以前不敢想的事情。综上所述，我们认为面向对象编程其实是对程序间接控制权的转移进行了约束。</w:t>
-        <w:br/>
-        <w:t>THE POWER OF POLYMORPHISM 多态的强大性</w:t>
-        <w:br/>
-        <w:t>What’s so great about polymorphism? To better appreciate its charms, let’s reconsider the example copy program. What happens to that program if a new IO device is created? Suppose we want to use the copy program to copy data from a handwriting recognition device to a speech synthesizer device: How do we need to change the copy program to get it to work with those new devices?</w:t>
-        <w:br/>
-        <w:t>那么多态的优势在哪里呢？为了让读者更好地理解多态的好处，我们需要再来看一下刚才的 copy 程序。如果要支持新的 IO 设备，该程序需要做什么改动呢？譬如，假设我们想要用该 copy 程序从一个手写识别设备将数据复制到另一个语音合成设备中，我们需要针对 copy 程序做什么改动，才能实现这个目标呢？</w:t>
-        <w:br/>
-        <w:t>We don’t need any changes at all! Indeed, we don’t even need to recompile the copy program. Why? Because the source code of the copy program does not depend on the source code of the IO drivers. As long as those IO drivers implement the five standard functions defined by FILE, the copy program will be happy to use them.</w:t>
-        <w:br/>
-        <w:t>答案是完全不需要做任何改动！确实，我们甚至不需要重新编译该 copy 程序。为什么？因为 copy 程序的源代码并不依赖于 IO 设备驱动程序的代码。只要 IO 设备驱动程序实现了 FILE 结构体中定义的 5 个标准函数，该 copy 程序就可以正常使用它们。</w:t>
-        <w:br/>
-        <w:t>In short, the IO devices have become plugins to the copy program.</w:t>
-        <w:br/>
-        <w:t>简单来说，IO 设备变成了 copy 程序的插件。</w:t>
-        <w:br/>
-        <w:t>Why did the UNIX operating system make IO devices plugins? Because we learned, in the late 1950s, that our programs should be device independent. Why? Because we wrote lots of programs that were device dependent, only to discover that we really wanted those programs to do the same job but use a different device.</w:t>
-        <w:br/>
-        <w:t>为什么 UNIX 操作系统会将 IO 设备设计成插件形式呢？因为自 20 世纪 50 年代末期以来，我们学到了一个重要经验：程序应该与设备无关。这个经验从何而来呢？因为一度所有程序都是设备相关的，但是后来我们发现自己其实真正需要的是在不同的设备上实现同样的功能。</w:t>
-        <w:br/>
-        <w:t>For example, we often wrote programs that read input data from decks of cards,6 and then punched new decks of cards as output. Later, our customers stopped giving us decks of cards and started giving us reels of magnetic tape. This was very inconvenient, because it meant rewriting large portions of the original program. It would be very convenient if the same program worked interchangeably with cards or tape.</w:t>
-        <w:br/>
-        <w:t>例如，我们曾经写过一些程序，需要从卡片盒中的打孔卡片读取数据，同时要通过在新的卡片上打孔来输出数据。后来，客户不再使用打孔卡片，而开始使用磁带卷了。这就给我们带来了很多麻烦，很多程序都需要重写。于是我们就会想，如果这段程序可以同时操作打孔卡片和磁带那该多好。</w:t>
-        <w:br/>
-        <w:t>The plugin architecture was invented to support this kind of IO device independence, and has been implemented in almost every operating system since its introduction. Even so, most programmers did not extend the idea to their own programs, because using pointers to functions was dangerous.</w:t>
-        <w:br/>
-        <w:t>插件式架构就是为了支持这种 IO 不相关性而发明的，它几乎在随后的所有系统中都有应用。但即使多态有如此多优点，大部分程序员还是没有将插件特性引入他们自己的程序中，因为函数指针实在是太危险了。</w:t>
-        <w:br/>
-        <w:t>OO allows the plugin architecture to be used anywhere, for anything.</w:t>
-        <w:br/>
-        <w:t>而面向对象编程的出现使得这种插件式架构可以在任何地方被安全地使用。</w:t>
-        <w:br/>
-        <w:t>DEPENDENCY INVERSION 依赖反转</w:t>
-        <w:br/>
-        <w:t>Imagine what software was like before a safe and convenient mechanism for polymorphism was available. In the typical calling tree, main functions called high-level functions, which called mid-level functions, which called low-level functions. In that calling tree, however, source code dependencies inexorably followed the flow of control (Figure 5.1).</w:t>
-        <w:br/>
-        <w:t>我们可以想象一下在安全和便利的多态支持出现之前，软件是什么样子的。下面有一个典型的调用树的例子，main 函数调用了一些高层函数，这些高层函数又调用了一些中层函数，这些中层函数又继续调用了一些底层函数。在这里，源代码面的依赖不可避免地要跟随程序的控制流（详见图 5.1）。</w:t>
-        <w:br/>
-        <w:t>Source code dependencies versus flow of control</w:t>
-        <w:br/>
-        <w:t>For mainq1w2e3r4 to call one of the high-level functions, it had to mention the name of the module that contained that function In C, this was a #include. In Java, it was an import statement. In C#, it was a using statement. Indeed, every caller was forced to mention the name of the module that contained the callee.</w:t>
-        <w:br/>
-        <w:t>如你所见，main 函数为了调用高层函数，它就必须能够看到这个函数所在模块。在 C 中，我们会通过 #include 来实现，在 Java 中则通过 import 来实现，而在 C# 中则用的是 using 语句。总之，每个函数的调用方都必须要引用被调用方所在的模块。</w:t>
-        <w:br/>
-        <w:t>This requirement presented the software architect with few, if any, options. The flow of control was dictated by the behavior of the system, and the source code dependencies were dictated by that flow of control.</w:t>
-        <w:br/>
-        <w:t>显然，这样做就导致了我们在软件架构上别无选择。在这里，系统行为决定了控制流，而控制流则决定了源代码依赖关系。</w:t>
-        <w:br/>
-        <w:t>When polymorphism is brought into play, however, something very different can happen (Figure 5.2).</w:t>
-        <w:br/>
-        <w:t>但一旦我们使用了多态，情况就不一样了（详见图 5.2）。</w:t>
-        <w:br/>
-        <w:t>Dependency inversion</w:t>
-        <w:br/>
-        <w:t>In Figure 5.2, module HL1 calls the F() function in module ML1. The fact that it calls this function through an interface is a source code contrivance. At runtime, the interface doesn’t exist. HL1 simply calls F() within ML1.7</w:t>
-        <w:br/>
-        <w:t>在图 5.2 中，模块 HL1 调用了 ML1 模块中的 F() 函数，这里的调用是通过源代码级别的接口来实现的。当然在程序实际运行时，接口这个概念是不存在的，HL1 会调用 ML1 中的 F() 函数。</w:t>
-        <w:br/>
-        <w:t>Note, however, that the source code dependency (the inheritance relationship) between ML1 and the interface I points in the opposite direction compared to the flow of control. This is called dependency inversion, and its implications for the software architect are profound.</w:t>
-        <w:br/>
-        <w:t>请注意模块 ML1 和接口 I 在源代码上的依赖关系（或者叫继承关系），该关系的方向和控制流正好是相反的，我们称之为依赖反转。这种反转对软件架构设计的影响是非常大的。</w:t>
-        <w:br/>
-        <w:t>The fact that OO languages provide safe and convenient polymorphism means that any source code dependency, no matter where it is, can be inverted.</w:t>
-        <w:br/>
-        <w:t>事实上，通过利用面向编程语言所提供的这种安全便利的多态实现，无论我们面对怎样的源代码级别的依赖关系，都可以将其反转。</w:t>
-        <w:br/>
-        <w:t>Now look back at that calling tree in Figure 5.1, and its many source code dependencies. Any of those source code dependencies can be turned around by inserting an interface between them.</w:t>
-        <w:br/>
-        <w:t>现在，我们可以再回头来看图 5.1 中的调用树，就会发现其中的众多源代码依赖关系都可以通过引入接口的方式来进行反转。</w:t>
-        <w:br/>
-        <w:t>With this approach, software architects working in systems written in OO languages have absolute control over the direction of all source code dependencies in the system. They are not constrained to align those dependencies with the flow of control. No matter which module does the calling and which module is called, the software architect can point the source code dependency in either direction.</w:t>
-        <w:br/>
-        <w:t>通过这种方法，软件架构师可以完全控制采用了面向对象这种编程方式的系统中所有的源代码依赖关系，而不再受到系统控制流的限制。不管哪个模块调用或者被调用，软件架构师都可以随意更改源代码依赖关系。</w:t>
-        <w:br/>
-        <w:t>That is power! That is the power that OO provides. That’s what OO is really all about—at least from the architect’s point of view.</w:t>
-        <w:br/>
-        <w:t>这就是面向对象编程的好处，同时也是面向对象编程这种范式的核心本质至少对一个软件架构师来说是这样的。</w:t>
-        <w:br/>
-        <w:t>What can you do with that power? As an example, you can rearrange the source code dependencies of your system so that the database and the user interface (UI) depend on the business rules (Figure 5.3), rather than the other way around.</w:t>
-        <w:br/>
-        <w:t>这种能力有什么用呢？在下面的例子中，我们可以用它来让数据库模块和用户界面模块都依赖于业务逻辑模块（见图 5.3），而非相反。</w:t>
-        <w:br/>
-        <w:t>The database and the user interface depend on the business rules</w:t>
-        <w:br/>
-        <w:t>This means that the UI and the database can be plugins to the business rules. It means that the source code of the business rules never mentions the UI or the database.</w:t>
-        <w:br/>
-        <w:t>这意味着我们让用户界面和数据库都成为业务逻辑的插件。也就是说，业务逻辑模块的源代码不需要引入用户界面和数据库这两个模块。</w:t>
-        <w:br/>
-        <w:t>As a consequence, the business rules, the UI, and the database can be compiled into three separate components or deployment units (e.g., jar files, DLLs, or Gem files) that have the same dependencies as the source code. The component containing the business rules will not depend on the components containing the UI and database.</w:t>
-        <w:br/>
-        <w:t>这样一来，业务逻辑、用户界面以及数据库就可以被编译成三个独立的组件或者部署单元（例如 jar 文件、DLL 文件、Gem 文件等）了，这些组件或者部署单元的依赖关系与源代码的依赖关系是一致的，业务逻辑组件也不会依赖于用户界面和数据库这两个组件。</w:t>
-        <w:br/>
-        <w:t>In turn, the business rules can be deployed independently of the UI and the database. Changes to the UI or the database need not have any effect on the business rules. Those components can be deployed separately and independently.</w:t>
-        <w:br/>
-        <w:t>于是，业务逻辑组件就可以独立于用户界面和数据库来进行部署了，我们对用户界面或者数据库的修改将不会对业务逻辑产生任何影响，这些组件都可以被分另独立地部署。</w:t>
-        <w:br/>
-        <w:t>In short, when the source code in a component changes, only that component needs to be redeployed. This is independent deployability.</w:t>
-        <w:br/>
-        <w:t>简单来说，当某个组件的源代码需要修改时，仅仅需要重新部署该组件，不需要更改其他组件，这就是独立部署能力。</w:t>
-        <w:br/>
-        <w:t>If the modules in your system can be deployed independently, then they can be developed independently by different teams. That’s independent developability.</w:t>
-        <w:br/>
-        <w:t>如果系统中的所有组件都可以独立部署，那它们就可以由不同的团队并行开发，这就是所谓的独立开发能力。</w:t>
-        <w:br/>
-        <w:t>CONCLUSION 本章小结</w:t>
-        <w:br/>
-        <w:t>What is OO? There are many opinions and many answers to this question. To the software architect, however, the answer is clear: OO is the ability, through the use of polymorphism, to gain absolute control over every source code dependency in the system. It allows the architect to create a plugin architecture, in which modules that contain high-level policies are independent of modules that contain low-level details. The low-level details are relegated to plugin modules that can be deployed and developed independently from the modules that contain high-level policies.</w:t>
-        <w:br/>
-        <w:t>面向对象编程到底是什么？业界在这个问题上存在着很多不同的说法和意见。然而对一个软件架构师来说，其含义应该是非常明确的：面向对象编程就是以对象为手段来对源代码中的依赖关系进行控制的能力，这种能力让软件架构师可以构建出某种插件式架构，让高层策略性组件与底层实现性组件相分离，底层组件可必编译成插件，实现独立于高层组件的开发和部署。</w:t>
-      </w:r>
-    </w:p>
-    <w:p>
-      <w:pPr>
-        <w:pStyle w:val="Title"/>
-      </w:pPr>
-      <w:r>
-        <w:t>Chap6. 函数式编程</w:t>
-      </w:r>
-    </w:p>
-    <w:p>
-      <w:r>
-        <w:t>Chap6. FUNCTIONAL PROGRAMMING 函数式编程</w:t>
-        <w:br/>
-        <w:t>SQUARES OF INTEGERS 整数平方</w:t>
-        <w:br/>
-        <w:t>IMMUTABILITY AND ARCHITECTURE 不可变性与软件架构</w:t>
-        <w:br/>
-        <w:t>SEGREGATION OF MUTABILITY 可变性的隔离</w:t>
-        <w:br/>
-        <w:t>EVENT SOURCING 事件溯源</w:t>
-        <w:br/>
-        <w:t>CONCLUSION 本章小结</w:t>
-        <w:br/>
-        <w:t>Chap6. FUNCTIONAL PROGRAMMING 函数式编程</w:t>
-        <w:br/>
-        <w:t>In many ways, the concepts of functional programming predate programming itself. This paradigm is strongly based on the l-calculus invented by Alonzo Church in the 1930s.</w:t>
-        <w:br/>
-        <w:t>函数式编程所依赖的原理，在很多方而其实是早于编程本身出现的。因为函数式编程这种范式强烈依赖于 Alonzo Church 在 20 世纪 30 年代发明的 λ 演算。</w:t>
-        <w:br/>
-        <w:t>SQUARES OF INTEGERS 整数平方</w:t>
-        <w:br/>
-        <w:t>To explain what functional programming is, it’s best to examine some examples. Let’s investigate a simple problem: printing the squares of the first 25 integers.</w:t>
-        <w:br/>
-        <w:t>我们最好还是用一个例子来解释什么是函数式编程。请看下面的这个例子：这段代码想要输出前 25 个整数的平方值。</w:t>
-        <w:br/>
-        <w:t>In a language like Java, we might write the following:</w:t>
-        <w:br/>
-        <w:t>如果使用 Java 语言，代码如下：</w:t>
-        <w:br/>
-        <w:t>public class Squint {</w:t>
-        <w:br/>
-        <w:t xml:space="preserve">  public static void main(String args[]) {</w:t>
-        <w:br/>
-        <w:t xml:space="preserve">    for (int i=0; i&lt;25; i++)</w:t>
-        <w:br/>
-        <w:t xml:space="preserve">      System.out.println(i*i);</w:t>
-        <w:br/>
-        <w:t xml:space="preserve">  }</w:t>
-        <w:br/>
-        <w:t>}</w:t>
-        <w:br/>
-        <w:t>In a language like Clojure, which is a derivative of Lisp, and is functional, we might implement this same program as follows:</w:t>
-        <w:br/>
-        <w:t>下面我们改用 Clojure 语言来写这个程序，Clojure 是 LISP 语言的一种衍生体，属于函数式编程语言。其代码如下：</w:t>
-        <w:br/>
-        <w:t>(println (take 25 (map (fn [x] (* x x)) (range))))</w:t>
-        <w:br/>
-        <w:t>If you don’t know Lisp, then this might look a little strange. So let me reformat it a bit and add some comments.</w:t>
-        <w:br/>
-        <w:t>如果读者对 LISP 不熟悉，这段代码可能看起来很奇怪。没关系，让我们换一种格式，用注释来说明一下吧：</w:t>
-        <w:br/>
-        <w:t>(println ;___________________ Print</w:t>
-        <w:br/>
-        <w:t xml:space="preserve">  (take 25 ;_________________ the first 25</w:t>
-        <w:br/>
-        <w:t xml:space="preserve">    (map (fn [x] (* x x)) ;__ squares</w:t>
-        <w:br/>
-        <w:t xml:space="preserve">      (range)))) ;___________ of Integers</w:t>
-        <w:br/>
-        <w:t>It should be clear that println, take, map, and range are all functions. In Lisp, you call a function by putting it in parentheses. For example, (range) calls the range function.</w:t>
-        <w:br/>
-        <w:t>很明显，这里的 println、take、map 和 range 都是函数。在 LISP 中，函数是通过括号来调用的，例如（range）表达式就是在调用 range 函数。</w:t>
-        <w:br/>
-        <w:t>The expression (fn [x] (* x x)) is an anonymous function that calls the multiply function, passing its input argument in twice. In other words, it computes the square of its input.</w:t>
-        <w:br/>
-        <w:t>而表达式 (fn [x] (* xx)) 则是一个匿名函数，该函数用同样的值作为参数调用了乘法函数。换句话说，该函数计算的是平方值。</w:t>
-        <w:br/>
-        <w:t>Looking at the whole thing again, it’s best to start with the innermost function call.</w:t>
-        <w:br/>
-        <w:t>现在让我们回过头再看一下这整句代码，从最内侧的函数调用开始：</w:t>
-        <w:br/>
-        <w:t>The range function returns a never-ending list of integers starting with 0.</w:t>
-        <w:br/>
-        <w:t>This list is passed into the map function, which calls the anonymous squaring function on each element, producing a new never-ending list of all the squares.</w:t>
-        <w:br/>
-        <w:t>The list of squares is passed into the take function, which returns a new list with only the first 25 elements.</w:t>
-        <w:br/>
-        <w:t>The println function prints its input, which is a list of the first 25 squares of integers.</w:t>
-        <w:br/>
-        <w:t>range 函数会返回一个从 0 开始的整数无穷列表。</w:t>
-        <w:br/>
-        <w:t>然后该列表会被传入 map 函数，并针对列表中的每个元素，调用求平方值的匿名函数，产生了一个无穷多的、包含平方值的列表。</w:t>
-        <w:br/>
-        <w:t>接着再将这个列表传入 take 函数，后者会返回一个仅包含前 25 个元素的 新列表。</w:t>
-        <w:br/>
-        <w:t>println 函数将它的参数输出，该参数就是上面这个包含了 25 个平方值的 列表。</w:t>
-        <w:br/>
-        <w:t>If you find yourself terrified by the concept of never-ending lists, don’t worry. Only the first 25 elements of those never-ending lists are actually created. That’s because no element of a never-ending list is evaluated until it is accessed.</w:t>
-        <w:br/>
-        <w:t>读者不用担心上面提到的无穷列表。因为这些列表中的元素只有在被访问时才会被创建，所以实际上只有前 25 个元素是真正被创建了的。</w:t>
-        <w:br/>
-        <w:t>If you found all of that confusing, then you can look forward to a glorious time learning all about Clojure and functional programming. It is not my goal to teach you about these topics here.</w:t>
-        <w:br/>
-        <w:t>如果上述内容还是让读者觉得云里雾里的话，可以自行学习一下 Clojure 和函数式编程，本书的目标并不是要教你学会这门语言，因此不再展开。</w:t>
-        <w:br/>
-        <w:t>Instead, my goal here is to point out something very dramatic about the difference between the Clojure and Java programs. The Java program uses a mutable variable—a variable that changes state during the execution of the program. That variable is i—the loop control variable. No such mutable variable exists in the Clojure program. In the Clojure program, variables like x are initialized, but they are never modified.</w:t>
-        <w:br/>
-        <w:t>相反，我们讨论它的主要目标是要突显出 Clojure 和 Java 这两种语言之间的巨大区别。在 Java 程序中，我们使用的是可变量，即变量 i，该变量的值会随着程序执行的过程而改变，故被称为循环控制变量。而 Clojure 程序中是不存在这种变量的，变量 x 一旦被初始化之后，就不会再被更改了。</w:t>
-        <w:br/>
-        <w:t>This leads us to a surprising statement: Variables in functional languages do not vary.</w:t>
-        <w:br/>
-        <w:t>这句话有点出人意料：函数式编程语言中的变量（Variable）是不可变（Vary）的。</w:t>
-        <w:br/>
-        <w:t>IMMUTABILITY AND ARCHITECTURE 不可变性与软件架构</w:t>
-        <w:br/>
-        <w:t>Why is this point important as an architectural consideration? Why would an architect be concerned with the mutability of variables? The answer is absurdly simple: All race conditions, deadlock conditions, and concurrent update problems are due to mutable variables. You cannot have a race condition or a concurrent update problem if no variable is ever updated. You cannot have deadlocks without mutable locks.</w:t>
-        <w:br/>
-        <w:t>为什么不可变性是软件架构设计需要考虑的重点呢？为什么软件架构帅要操心变量的可变性呢？答案显而易见：所有的竞争问题、死锁问题、并发更新问题都是由可变变量导致的。如果变量永远不会被更改，那就不可能产生竞争或者并发更新问题。如果锁状态是不可变的，那就永远不会产生死锁问题。</w:t>
-        <w:br/>
-        <w:t>In other words, all the problems that we face in concurrent applications—all the problems we face in applications that require multiple threads, and multiple processors—cannot happen if there are no mutable variables.</w:t>
-        <w:br/>
-        <w:t>换句话说，一切并发应用遇到的问题，一切由于使用多线程、多处理器而引起的问题，如果没有可变变量的话都不对能发工。</w:t>
-        <w:br/>
-        <w:t>As an architect, you should be very interested in issues of concurrency. You want to make sure that the systems you design will be robust in the presence of multiple threads and processors. The question you must be asking yourself, then, is whether immutability is practicable.</w:t>
-        <w:br/>
-        <w:t>作为一个软件架构师，当然应该要对并发问题保持高度关注。我们需要确保自己设计的系统在多线程、多处理器环境中能稳定工作。所以在这里，我们实际应该要问的问题是：不可变性是否实际可行？</w:t>
-        <w:br/>
-        <w:t>The answer to that question is affirmative, if you have infinite storage and infinite processor speed. Lacking those infinite resources, the answer is a bit more nuanced. Yes, immutability can be practicable, if certain compromises are made.</w:t>
-        <w:br/>
-        <w:t>如果我们能忽略存储器与处理器在速度上的限制，那么答案是肯定的。否则的话，不可变性只有在一定情况下是可行的。</w:t>
-        <w:br/>
-        <w:t>Let’s look at some of those compromises.</w:t>
-        <w:br/>
-        <w:t>下面让我们来看一下它具体该如何做到可行。</w:t>
-        <w:br/>
-        <w:t>SEGREGATION OF MUTABILITY 可变性的隔离</w:t>
-        <w:br/>
-        <w:t>One of the most common compromises in regard to immutability is to segregate the application, or the services within the application, into mutable and immutable components. The immutable components perform their tasks in a purely functional way, without using any mutable variables. The immutable components communicate with one or more other components that are not purely functional, and allow for the state of variables to be mutated (Figure 6.1).</w:t>
-        <w:br/>
-        <w:t>一种常见方式是将应用程序，或者是应用程序的内部服务进行切分，划分为可变的和不可变的两种组件。不可变组件用纯函数的方式来执行任务，期间不更改任何状态。这些不可变的组件将通过与一个或多个非函数式组件通信的方式来修改变量状态（参见图 6.1）。</w:t>
-        <w:br/>
-        <w:t>Mutating state and transactional memory</w:t>
-        <w:br/>
-        <w:t>Since mutating state exposes those components to all the problems of concurrency, it is common practice to use some kind of transactional memory to protect the mutable variables from concurrent updates and race conditions.</w:t>
-        <w:br/>
-        <w:t>由于状态的修改会导致一系列并发问题的产生，所以我们通常会采用某种事务型内存来保护可变变量，避免同步更新和竞争状态的发生。</w:t>
-        <w:br/>
-        <w:t>Transactional memory simply treats variables in memory the same way a database treats records on disk.1 It protects those variables with a transaction- or retry-based scheme.</w:t>
-        <w:br/>
-        <w:t>事务型内存基本上与数据库保护磁盘数据的方式 1 类似，通常釆用的是事务或者重试机制。</w:t>
-        <w:br/>
-        <w:t>A simple example of this approach is Clojure’s atom facility:</w:t>
-        <w:br/>
-        <w:t>下面我们可以用 Clojure 中的 atom 机制来写一个简单的例子：</w:t>
-        <w:br/>
-        <w:t>(def counter (atom 0)) ; initialize counter to 0</w:t>
-        <w:br/>
-        <w:t>(swap! counter inc)    ; safely increment counter.</w:t>
-        <w:br/>
-        <w:t>In this code, the counter variable is defined as an atom. In Clojure, an atom is a special kind of variable whose value is allowed to mutate under very disciplined conditions that are enforced by the swap! function.</w:t>
-        <w:br/>
-        <w:t>在这段代码中，counter 变量被定义为 atom 类型。在 Clojure 中，atom 是一类特殊的变量，它被允许在 swap!函数定义的严格条件下进行更改。</w:t>
-        <w:br/>
-        <w:t>The swap! function, shown in the preceding code, takes two arguments: the atom to be mutated, and a function that computes the new value to be stored in the atom. In our example code, the counter atom will be changed to the value computed by the inc function, which simply increments its argument.</w:t>
-        <w:br/>
-        <w:t>至于 swap! 函数，如同上面代码所写，它需要两个参数：一个是被用来修改的 atom 类型实例，另一个是用来计算新值的函数。在上面的代码中，inc 函数会将参数加 1 并存入 counter 这个 atom 实例。</w:t>
-        <w:br/>
-        <w:t>The strategy used by swap! is a traditional compare and swap algorithm. The value of counter is read and passed to inc. When inc returns, the value of counter is locked and compared to the value that was passed to inc. If the value is the same, then the value returned by inc is stored in counter and the lock is released. Otherwise, the lock is released, and the strategy is retried from the beginning.</w:t>
-        <w:br/>
-        <w:t>在这里，swap!所采用的策略是传统的比较+替换算法。即先读取 counter 变量的值，再将其传入 inc 函数。然后当 inc 函数返回时，将原先用锁保护起来的 counter 值与传入 inc 时的值进行比较。如果两边的值一致，则将 inc 函数返回的值存入 counter，释放锁。否则，先释放锁，再从头进行重试。</w:t>
-        <w:br/>
-        <w:t>The atom facility is adequate for simple applications. Unfortunately, it cannot completely safeguard against concurrent updates and deadlocks when multiple dependent variables come into play. In those instances, more elaborate facilities can be used.</w:t>
-        <w:br/>
-        <w:t>当然，atom 这个机制只适用于上面这种简单的应用程序，它并不适用于解决由多个相关变量同时需要更改所引发的并发更新问题和死锁问题，要想解决这些问题，我们就需要用到更复杂的机制。</w:t>
-        <w:br/>
-        <w:t>The point is that well-structured applications will be segregated into those components that do not mutate variables and those that do. This kind of segregation is supported by the use of appropriate disciplines to protect those mutated variables.</w:t>
-        <w:br/>
-        <w:t>这里的要点是：一个架构设计良好的应用程序应该将状态修改的部分和不需要修改状态的部分隔离成单独的组件，然后用合适的机制来保护可变量。</w:t>
-        <w:br/>
-        <w:t>Architects would be wise to push as much processing as possible into the immutable components, and to drive as much code as possible out of those components that must allow mutation.</w:t>
-        <w:br/>
-        <w:t>软件架构师应该着力于将大部分处理逻辑都归于不可变组件中，可变状态组件的逻辑应该越少越好。</w:t>
-        <w:br/>
-        <w:t>EVENT SOURCING 事件溯源</w:t>
-        <w:br/>
-        <w:t>The limits of storage and processing power have been rapidly receding from view. Nowadays it is common for processors to execute billions of instructions per second and to have billions of bytes of RAM. The more memory we have, and the faster our machines are, the less we need mutable state.</w:t>
-        <w:br/>
-        <w:t>随着存储和处理能力的大幅进步，现在拥有每秒可以执行数十亿条指令的处理器，以及数十亿字节内存的计算机已经很常见了。而内存越大，处理速度越快，我们对可变状态的依赖就会越少。</w:t>
-        <w:br/>
-        <w:t>As a simple example, imagine a banking application that maintains the account balances of its customers. It mutates those balances when deposit and withdrawal transactions are executed.</w:t>
-        <w:br/>
-        <w:t>举个简单的例子，假设某个银行应用程序需要维护客户账户余额信息，当它放行存取款事务时，就要同时负责修改余额记录。</w:t>
-        <w:br/>
-        <w:t>Now imagine that instead of storing the account balances, we store only the transactions. Whenever anyone wants to know the balance of an account, we simply add up all the transactions for that account, from the beginning of time. This scheme requires no mutable variables.</w:t>
-        <w:br/>
-        <w:t>如果我们不保存具体账户余额，仅仅保存事务日志，那么当有人想查询账户余额时。我们就将全部交易记录取出，并且每次都得从最开始到当下进行累计。当然，这样的设计就不需要维护任何可变变量了。</w:t>
-        <w:br/>
-        <w:t>Obviously, this approach sounds absurd. Over time, the number of transactions would grow without bound, and the processing power required to compute the totals would become intolerable. To make this scheme work forever, we would need infinite storage and infinite processing power.</w:t>
-        <w:br/>
-        <w:t>但显而易见，这种实现是有些不合理的。因为随着时间的推移，事务的数目会无限制增长，每次处理总额所需要的处理能力很快就会变得不能接受。如果想使这种设计永远可行的话，我们将需要无限容量的存储，以及无限的处理能力。</w:t>
-        <w:br/>
-        <w:t>But perhaps we don’t have to make the scheme work forever. And perhaps we have enough storage and enough processing power to make the scheme work for the reasonable lifetime of the application.</w:t>
-        <w:br/>
-        <w:t>但是可能我们并不需要这个设计永远可行，而且可能在整个程序的生命周期内，我们有足够的存储和处理能力来满足它。</w:t>
-        <w:br/>
-        <w:t>This is the idea behind event sourcing.2 Event sourcing is a strategy wherein we store the transactions, but not the state. When state is required, we simply apply all the transactions from the beginning of time.</w:t>
-        <w:br/>
-        <w:t>这就是事件溯源，在这种体系下，我们只存储事务记录，不存储具体状态。当需要具体状态时，我们只要从头开始计算所有的事务即可。</w:t>
-        <w:br/>
-        <w:t>Of course, we can take shortcuts. For example, we can compute and save the state every midnight. Then, when the state information is required, we need compute only the transactions since midnight.</w:t>
-        <w:br/>
-        <w:t>Now consider the data storage required for this scheme: We would need a lot of it. Realistically, offline data storage has been growing so fast that we now consider trillions of bytes to be small—so we have a lot of it.</w:t>
-        <w:br/>
-        <w:t>在存储方面，这种架构的确需要很大的存储容量。如今离线数据存储器的增长是非常快的，现在 1 TB 对我们来说也已经不算什么了。</w:t>
-        <w:br/>
-        <w:t>More importantly, nothing ever gets deleted or updated from such a data store. As a consequence, our applications are not CRUD; they are just CR. Also, because neither updates nor deletions occur in the data store, there cannot be any concurrent update issues.</w:t>
-        <w:br/>
-        <w:t>更重要的是，这种数据存储模式中不存在删除和更新的情况，我们的应用程序不是 CRUD，而是 CR。因为更新和删除这两种操作都不存在了，自然也就不存在并发问题。</w:t>
-        <w:br/>
-        <w:t>If we have enough storage and enough processor power, we can make our applications entirely immutable—and, therefore, entirely functional.</w:t>
-        <w:br/>
-        <w:t>如果我们有足够大的存储量和处理能力，应用程序就可以用完全不可变的、纯函数式的方式来编程。</w:t>
-        <w:br/>
-        <w:t>If this still sounds absurd, it might help if you remembered that this is precisely the way your source code control system works.</w:t>
-        <w:br/>
-        <w:t>如果读者还是觉得这听起来不太靠谱，可以想想我们现在用的源代码管理程序，它们正是用这种方式工作的！</w:t>
-        <w:br/>
-        <w:t>CONCLUSION 本章小结</w:t>
-        <w:br/>
-        <w:t>To summarize:</w:t>
-        <w:br/>
-        <w:t>下面我们来总结一下：</w:t>
-        <w:br/>
-        <w:t>Structured programming is discipline imposed upon direct transfer of control.</w:t>
-        <w:br/>
-        <w:t>Object-oriented programming is discipline imposed upon indirect transfer of control.</w:t>
-        <w:br/>
-        <w:t>Functional programming is discipline imposed upon variable assignment.</w:t>
-        <w:br/>
-        <w:t>结构化编程是多对程序控制权的直接转移的限制。</w:t>
-        <w:br/>
-        <w:t>面向对象编程是对程序控制权的间接转移的限制。</w:t>
-        <w:br/>
-        <w:t>函数式编程是对程序中赋值操作的限制。</w:t>
-        <w:br/>
-        <w:t>Each of these three paradigms has taken something away from us. Each restricts some aspect of the way we write code. None of them has added to our power or our capabilities.</w:t>
-        <w:br/>
-        <w:t>这三个编程范式都对程序员提出了新的限制。每个范式都约束了某种编写代码的方式，没有一个编程范式是在增加新能力。</w:t>
-        <w:br/>
-        <w:t>What we have learned over the last half-century is what not to do.</w:t>
-        <w:br/>
-        <w:t>也就是说，我们过去 50 年学到的东西主要是——什么不应该做。</w:t>
-        <w:br/>
-        <w:t>With that realization, we have to face an unwelcome fact: Software is not a rapidly advancing technology. The rules of software are the same today as they were in 1946, when Alan Turing wrote the very first code that would execute in an electronic computer. The tools have changed, and the hardware has changed, but the essence of software remains the same.</w:t>
-        <w:br/>
-        <w:t>我们必须面对这种不友好的现实：软件构建并不是一个迅速前进的技术。今天构建软件的规则和 1946 年阿兰·图灵写下电子计算机的第一行代码时是一样的。尽管工具变化了，硬件变化了，但是软件编程的核心没有变。</w:t>
-        <w:br/>
-        <w:t>Software—the stuff of computer programs—is composed of sequence, selection, iteration, and indirection. Nothing more. Nothing less.</w:t>
-        <w:br/>
-        <w:t>总而言之，软件，或者说计算机程序无一例外是由顺序结构、分支结构、循环结构和间接转移这几种行为组合而成的，无可增加，也缺一不可。</w:t>
-      </w:r>
-    </w:p>
-    <w:p>
-      <w:pPr>
-        <w:pStyle w:val="Title"/>
-      </w:pPr>
-      <w:r>
-        <w:t>Chap7. SRP：单一职责原则</w:t>
-      </w:r>
-    </w:p>
-    <w:p>
-      <w:r>
-        <w:t>Chap7. SRP: THE SINGLE RESPONSIBILITY PRINCIPLE SRP：单一职责原则</w:t>
-        <w:br/>
-        <w:t>SYMPTOM 1: ACCIDENTAL DUPLICATION 反面案例 1：重复的假象</w:t>
-        <w:br/>
-        <w:t>SYMPTOM 2: MERGES 反面案例 2：代码合井</w:t>
-        <w:br/>
-        <w:t>SOLUTIONS 解决方案</w:t>
-        <w:br/>
-        <w:t>CONCLUSION 本章小结</w:t>
-        <w:br/>
-        <w:t>Chap7. SRP: THE SINGLE RESPONSIBILITY PRINCIPLE SRP：单一职责原则</w:t>
-        <w:br/>
-        <w:t>Of all the SOLID principles, the Single Responsibility Principle (SRP) might be the least well understood. That’s likely because it has a particularly inappropriate name. It is too easy for programmers to hear the name and then assume that it means that every module should do just one thing.</w:t>
-        <w:br/>
-        <w:t>SRP 是 SOLID 五大设计原则中最容易被误解的一个。也许是名字的原因，很多程序员根据 SRP 这个名字想当然地认为这个原则就是指：每个模块都应该只做一件事。</w:t>
-        <w:br/>
-        <w:t>Make no mistake, there is a principle like that. A function should do one, and only one, thing. We use that principle when we are refactoring large functions into smaller functions; we use it at the lowest levels. But it is not one of the SOLID principles—it is not the SRP.</w:t>
-        <w:br/>
-        <w:t>没错，后者的确也是一个设订原则，即确保一个函数只完成一个功能。我们在将大型函数亜构成小函数时经常会用到这个原则，但这只是一个面向底层实现细节的设计原则，并不是 SRP 的全部。</w:t>
-        <w:br/>
-        <w:t>Historically, the SRP has been described this way:</w:t>
-        <w:br/>
-        <w:t>在历史上，我们曾经这样描述 SRP 这一设计原则：</w:t>
-        <w:br/>
-        <w:t>A module should have one, and only one, reason to change.</w:t>
-        <w:br/>
-        <w:t>任何一个软件模块都应该有且仅有一个被修改的原因。</w:t>
-        <w:br/>
-        <w:t>Software systems are changed to satisfy users and stakeholders; those users and stakeholders are the “reason to change” that the principle is talking about. Indeed, we can rephrase the principle to say this:</w:t>
-        <w:br/>
-        <w:t>在现实环境中，软件系统为了满足用户和所有者的要求，必然要经常做出这样那样的修改。而该系统的用户或者所有者就是该设计原则中所指的“被修改的原因”。所以，我们也可以这样描述 SRP：</w:t>
-        <w:br/>
-        <w:t>A module should be responsible to one, and only one, user or stakeholder.</w:t>
-        <w:br/>
-        <w:t>任何一个软件模块都应该只对一个用户（User）或系统利益相关者（Stakeholder）负责。</w:t>
-        <w:br/>
-        <w:t>Unfortunately, the words “user” and “stakeholder” aren’t really the right words to use here. There will likely be more than one user or stakeholder who wants the system changed in the same way. Instead, we’re really referring to a group—one or more people who require that change. We’ll refer to that group as an actor.</w:t>
-        <w:br/>
-        <w:t>不过，这里的“用户”和 “系统利益相关者”在用词上也并不完全准确，它们很有可能指的是一个或多个用户和利益相关者，只要这些人希望对系统进行的变更是相似的，就可以归为一类——一个或多个有共同需求的人。在这里，我们将其称为行为者（actor）。</w:t>
-        <w:br/>
-        <w:t>Thus the final version of the SRP is:</w:t>
-        <w:br/>
-        <w:t>所以，对于 SRP 的最终描述就变成了：</w:t>
-        <w:br/>
-        <w:t>A module should be responsible to one, and only one, actor.</w:t>
-        <w:br/>
-        <w:t>任何一个软件模块都应该只对某一类行为者负责。</w:t>
-        <w:br/>
-        <w:t>Now, what do we mean by the word “module”? The simplest definition is just a source file. Most of the time that definition works fine. Some languages and development environments, though, don’t use source files to contain their code. In those cases a module is just a cohesive set of functions and data structures.</w:t>
-        <w:br/>
-        <w:t>那么，上文中提到的“软件模块”究竟又是在指什么呢？大部分情况下，其最简单的定义就是指一个源代码文件。然而，有些编程语言和编程环境并不是用源代码文件来存储程序的。在这些情况下，“软件模块”指的就是一组紧密相关的函数和数据结构。</w:t>
-        <w:br/>
-        <w:t>That word “cohesive” implies the SRP. Cohesion is the force that binds together the code responsible to a single actor.</w:t>
-        <w:br/>
-        <w:t>在这里，“相关”这个词实际上就隐含了 SRP 这一原则。代码与数据就是靠着与某一类行为者的相关性被组合在一起的。</w:t>
-        <w:br/>
-        <w:t>Perhaps the best way to understand this principle is by looking at the symptoms of violating it.</w:t>
-        <w:br/>
-        <w:t>或许，理解这个设计原则最好的办法就是计大家来看一些反面案例。</w:t>
-        <w:br/>
-        <w:t>SYMPTOM 1: ACCIDENTAL DUPLICATION 反面案例 1：重复的假象</w:t>
-        <w:br/>
-        <w:t>My favorite example is the Employee class from a payroll application. It has three methods: calculatePay(), reportHours(), and save() (Figure 7.1).</w:t>
-        <w:br/>
-        <w:t>这是我最喜欢举的一个例子：某个工资管理程序中的 Employee 类有三个函数 calculatePay()、reportHours() 和 save()（见图 7.1）。</w:t>
-        <w:br/>
-        <w:t>The Employee class</w:t>
-        <w:br/>
-        <w:t>This class violates the SRP because those three methods are responsible to three very different actors.</w:t>
-        <w:br/>
-        <w:t>如你所见，这个类的三个函数分别对应的是三类非常不同的行为者，违反了 SRP 设计原则。</w:t>
-        <w:br/>
-        <w:t>The calculatePay() method is specified by the accounting department, which reports to the CFO.</w:t>
-        <w:br/>
-        <w:t>The reportHours() method is specified and used by the human resources department, which reports to the COO.</w:t>
-        <w:br/>
-        <w:t>The save() method is specified by the database administrators (DBAs), who report to the CTO.</w:t>
-        <w:br/>
-        <w:t>calculatePay() 函数是由财务部门制定的，他们负责向 CFO 汇报。</w:t>
-        <w:br/>
-        <w:t>reportHours() 函数是由人力资源部门制定并使用的，他们负责向 COO 汇报。</w:t>
-        <w:br/>
-        <w:t>save() 函数是由 DBA 制定的，他们负责向 CTO 汇报。</w:t>
-        <w:br/>
-        <w:t>By putting the source code for these three methods into a single Employee class, the developers have coupled each of these actors to the others. This coupling can cause the actions of the CFO’s team to affect something that the COO’s team depends on.</w:t>
-        <w:br/>
-        <w:t>这三个函数被放在同一个源代码文件，即同一个 Employee 类中，程序员这样 做实际上就等于使三类行为者的行为耦合在了一起，这有可能会导致 CFO 团队的命令影响到 C 00 团队所依赖的功能。</w:t>
-        <w:br/>
-        <w:t>For example, suppose that the calculatePay() function and the reportHours() function share a common algorithm for calculating non-overtime hours. Suppose also that the developers, who are careful not to duplicate code, put that algorithm into a function named regularHours() (Figure 7.2).</w:t>
-        <w:br/>
-        <w:t>例如，calculatePay() 函数和 reportHours() 函数使用同样的逻辑来计算正常工作时数。程序员为了避免重复编码，通常会将该算法单独实现为一个名为 regularHours() 的函数（见图 7.2）。</w:t>
-        <w:br/>
-        <w:t>Shared algorithm</w:t>
-        <w:br/>
-        <w:t>Now suppose that the CFO’s team decides that the way non-overtime hours are calculated needs to be tweaked. In contrast, the COO’s team in HR does not want that particular tweak because they use non-overtime hours for a different purpose.</w:t>
-        <w:br/>
-        <w:t>接下来，假设 CFO 团队需要修改正常工作时数的计算方法，而 COO 带领的 HR 团队不需要这个修改，因为他们对数据的用法是不同的。</w:t>
-        <w:br/>
-        <w:t>A developer is tasked to make the change, and sees the convenient regularHours() function called by the calculatePay() method. Unfortunately, that developer does not notice that the function is also called by the reportHours() function.</w:t>
-        <w:br/>
-        <w:t>这时候，负责这项修改的程序员会注意到 calculatePay() 函数调用了 regularHours() 函数，但可能不会注意到该函数会同时被 reportHours() 调用。</w:t>
-        <w:br/>
-        <w:t>The developer makes the required change and carefully tests it. The CFO’s team validates that the new function works as desired, and the system is deployed.</w:t>
-        <w:br/>
-        <w:t>于是，该程序员就这样按照要求进行了修改，同时 CFO 团队的成员验证了新算法工作正常。这项修改最终被成功部署上线了。</w:t>
-        <w:br/>
-        <w:t>Of course, the COO’s team doesn’t know that this is happening. The HR personnel continue to use the reports generated by the reportHours() function—but now they contain incorrect numbers. Eventually the problem is discovered, and the COO is livid because the bad data has cost his budget millions of dollars.</w:t>
-        <w:br/>
-        <w:t>但是，COO 团队显然完全不知道这些事情的发生，HR 仍然在使用 reportHours() 产生的报表，随后就会发现他们的数据出错了！最终这个问题让 COO 十分愤怒，因为这些错误的数据给公司造成了几百万美元的损失。</w:t>
-        <w:br/>
-        <w:t>We’ve all seen things like this happen. These problems occur because we put code that different actors depend on into close proximity. The SRP says to separate the code that different actors depend on.</w:t>
-        <w:br/>
-        <w:t>与此类似的事情我们肯定多多少少都经历过。这类问题发生的根源就是因为我们将不同行为者所依赖的代码强凑到了一起。对此，SRP 强调这类代码一定要被分开。</w:t>
-        <w:br/>
-        <w:t>SYMPTOM 2: MERGES 反面案例 2：代码合井</w:t>
-        <w:br/>
-        <w:t>It’s not hard to imagine that merges will be common in source files that contain many different methods. This situation is especially likely if those methods are responsible to different actors.</w:t>
-        <w:br/>
-        <w:t>一个拥有很多函数的源代码文件必然会经历很多次代码合并，该文件中的这些函数分别服务不同行为者的情况就更常见了。</w:t>
-        <w:br/>
-        <w:t>For example, suppose that the CTO’s team of DBAs decides that there should be a simple schema change to the Employee table of the database. Suppose also that the COO’s team of HR clerks decides that they need a change in the format of the hours report.</w:t>
-        <w:br/>
-        <w:t>例如，CTO 团队的 DBA 决定要对 Employee 数据库表结构进行简单修改。与此同时，COO 团队的 HR 需要修改工作时数报表的格式。</w:t>
-        <w:br/>
-        <w:t>Two different developers, possibly from two different teams, check out the Employee class and begin to make changes. Unfortunately their changes collide. The result is a merge.</w:t>
-        <w:br/>
-        <w:t>这样一来，就很可能出现两个来自不同团队的程序员分别对 Employee 类进行 修改的情况。不出意外的话，他们各自的修改一定会互相冲突，这就必须要进行代码合并。</w:t>
-        <w:br/>
-        <w:t>I probably don’t need to tell you that merges are risky affairs. Our tools are pretty good nowadays, but no tool can deal with every merge case. In the end, there is always risk.</w:t>
-        <w:br/>
-        <w:t>In our example, the merge puts both the CTO and the COO at risk. It’s not inconceivable that the CFO could be affected as well.</w:t>
-        <w:br/>
-        <w:t>在这个例子中，这次代码合并不仅有可能让 CTO 和 COO 要求的功能出错，甚至连 CFO 原本正常的功能也可能收到影响。</w:t>
-        <w:br/>
-        <w:t>There are many other symptoms that we could investigate, but they all involve multiple people changing the same source file for different reasons.</w:t>
-        <w:br/>
-        <w:t>事实上，这样的案例还有很多，我们就不一一列举了。它们的一个共同点是，多人为了不同的目的修改了同一份源代码，这很容易造成问题的产生。</w:t>
-        <w:br/>
-        <w:t>Once again, the way to avoid this problem is to separate code that supports different actors.</w:t>
-        <w:br/>
-        <w:t>而避免这种问题产生的方法就是将服务不同行为者的代码进行切分。</w:t>
-        <w:br/>
-        <w:t>SOLUTIONS 解决方案</w:t>
-        <w:br/>
-        <w:t>There are many different solutions to this problem. Each moves the functions into different classes.</w:t>
-        <w:br/>
-        <w:t>我们有很多不同的方法可以用来解决上面的问题，每一种方法都需要将相关的函数划分成不同的类。</w:t>
-        <w:br/>
-        <w:t>Perhaps the most obvious way to solve the problem is to separate the data from the functions. The three classes share access to EmployeeData, which is a simple data structure with no methods (Figure 7.3). Each class holds only the source code necessary for its particular function. The three classes are not allowed to know about each other. Thus any accidental duplication is avoided.</w:t>
-        <w:br/>
-        <w:t>其中，最简单直接的办法是将数据与函数分离，设计三个类共同使用一个不包括函数的、十分简单的 EmployeeData 类（见图 7.3），每个类只包含与之相关的函数代码，互相不可见，这样就不存在互相依赖的情况了。</w:t>
-        <w:br/>
-        <w:t>The three classes do not know about each other</w:t>
-        <w:br/>
-        <w:t>The downside of this solution is that the developers now have three classes that they have to instantiate and track. A common solution to this dilemma is to use the Facade pattern (Figure 7.4).</w:t>
-        <w:br/>
-        <w:t>这种解决方案的坏处在于：程序员现在需要在程序里处理三个类。另一种解决办法是使用 Facade 设计模式（见图 7.4）。</w:t>
-        <w:br/>
-        <w:t>The Facade pattern</w:t>
-        <w:br/>
-        <w:t>The EmployeeFacade contains very little code. It is responsible for instantiating and delegating to the classes with the functions.</w:t>
-        <w:br/>
-        <w:t>这样一来，EmployeeFacade 类所需要的代码量就很少了，它仅仅包含了初始化和调用三个具体实现类的函数。</w:t>
-        <w:br/>
-        <w:t>Some developers prefer to keep the most important business rules closer to the data. This can be done by keeping the most important method in the original Employee class and then using that class as a Facade for the lesser functions (Figure 7.5).</w:t>
-        <w:br/>
-        <w:t>当然，也有些程序员更倾向于把最重要的业务逻辑与数据放在一起，那么我们也可以选择将最重要的函数保留在 Employee 类中，同时用这个类来调用其他没那么重要的函数（见图 7.5）。</w:t>
-        <w:br/>
-        <w:t>The most important method is kept in the original Employee class and used as a Facade for the lesser functions</w:t>
-        <w:br/>
-        <w:t>You might object to these solutions on the basis that every class would contain just one function. This is hardly the case. The number of functions required to calculate pay, generate a report, or save the data is likely to be large in each case. Each of those classes would have many private methods in them.</w:t>
-        <w:br/>
-        <w:t>读者也许会反对上面这些解决方案，因为看上去这里的每个类中都只有一个函数。事实上并非如此，因为无论是计算工资、生成报表还是保存数据都是一个很复杂的过程，每个类都可能包含了许多私有函数。</w:t>
-        <w:br/>
-        <w:t>Each of the classes that contain such a family of methods is a scope. Outside of that scope, no one knows that the private members of the family exist.</w:t>
-        <w:br/>
-        <w:t>总而言之，上面的每一个类都分别容纳了一组作用于相同作用域的函数，而在该作用域之外，它们各自的私有函数是互相不可见的。</w:t>
-        <w:br/>
-        <w:t>CONCLUSION 本章小结</w:t>
-        <w:br/>
-        <w:t>The Single Responsibility Principle is about functions and classes—but it reappears in a different form at two more levels. At the level of components, it becomes the Common Closure Principle. At the architectural level, it becomes the Axis of Change responsible for the creation of Architectural Boundaries. We’ll be studying all of these ideas in the chapters to come.</w:t>
-        <w:br/>
-        <w:t>单一职责原则主要讨论的是函数和类之间的关系——但是它在两个讨论层面上会以不同的形式出现。在组件层面，我们可以将其称为共同闭包原则（Common Closure Principle)，在软件架构层面，它则是用于奠定架构边界的变更轴心（Axis of Change）。我们在接下来的章节中会深入学习这些原则。</w:t>
-      </w:r>
-    </w:p>
-    <w:p>
-      <w:pPr>
-        <w:pStyle w:val="Title"/>
-      </w:pPr>
-      <w:r>
-        <w:t>Chap8. OCP：开闭原则</w:t>
-      </w:r>
-    </w:p>
-    <w:p>
-      <w:r>
-        <w:t>Chap8. OCP: THE OPEN-CLOSED PRINCIPLE OCP：开闭原则</w:t>
-        <w:br/>
-        <w:t>A THOUGHT EXPERIMENT 思想实验</w:t>
-        <w:br/>
-        <w:t>DIRECTIONAL CONTROL 依赖方向的控制</w:t>
-        <w:br/>
-        <w:t>INFORMATION HIDING 信息隐藏</w:t>
-        <w:br/>
-        <w:t>CONCLUSION 本章小结</w:t>
-        <w:br/>
-        <w:t>Chap8. OCP: THE OPEN-CLOSED PRINCIPLE OCP：开闭原则</w:t>
-        <w:br/>
-        <w:t>The Open-Closed Principle (OCP) was coined in 1988 by Bertrand Meyer.1 It says:</w:t>
-        <w:br/>
-        <w:t>开闭原则（OCP）是 Bertrand Meyer 在 1988 年提出的，该设计原则认为：</w:t>
-        <w:br/>
-        <w:t>A software artifact should be open for extension but closed for modification.</w:t>
-        <w:br/>
-        <w:t>设计良好的计算机软件应该易于扩展，同时抗拒修改。</w:t>
-        <w:br/>
-        <w:t>In other words, the behavior of a software artifact ought to be extendible, without having to modify that artifact.</w:t>
-        <w:br/>
-        <w:t>换句话说，一个设计良好的计算机系统应该在不需要修改的前提下就可以轻易被扩展。</w:t>
-        <w:br/>
-        <w:t>This, of course, is the most fundamental reason that we study software architecture. Clearly, if simple extensions to the requirements force massive changes to the software, then the architects of that software system have engaged in a spectacular failure.</w:t>
-        <w:br/>
-        <w:t>其实这也是我们研究软件架构的根本目的。如果对原始需求的小小延伸就需要对原有的软件系统进行大幅修改，那么这个系统的架构设计显然是失败的。</w:t>
-        <w:br/>
-        <w:t>Most students of software design recognize the OCP as a principle that guides them in the design of classes and modules. But the principle takes on even greater significance when we consider the level of architectural components.</w:t>
-        <w:br/>
-        <w:t>尽管大部分软件设计师都已经认可了 OCP 是设计类与模块时的重要原则，但是在软件架构层面，这项原则的意义则更为重大。</w:t>
-        <w:br/>
-        <w:t>A thought experiment will make this clear.</w:t>
-        <w:br/>
-        <w:t>下面，让我们用一个思想实验来做一些说明。</w:t>
-        <w:br/>
-        <w:t>A THOUGHT EXPERIMENT 思想实验</w:t>
-        <w:br/>
-        <w:t>Imagine, for a moment, that we have a system that displays a financial summary on a web page. The data on the page is scrollable, and negative numbers are rendered in red.</w:t>
-        <w:br/>
-        <w:t>假设我们现在要设计一个在 Web 页面上展示财务数据的系统，页面上的数据要可以滚动显示，其中负值应显示为红色。</w:t>
-        <w:br/>
-        <w:t>Now imagine that the stakeholders ask that this same information be turned into a report to be printed on a black-and-white printer. The report should be properly paginated, with appropriate page headers, page footers, and column labels. Negative numbers should be surrounded by parentheses.</w:t>
-        <w:br/>
-        <w:t>接下来，该系统的所有者又要求同样的数据需要形成一个报表，该报表要能用黑白打印机打印，并且其报表格式要得到合理分页，每页都要包含页头、页尾及栏目名。同时，负值应该以括号表示。</w:t>
-        <w:br/>
-        <w:t>Clearly, some new code must be written. But how much old code will have to change?</w:t>
-        <w:br/>
-        <w:t>显然，我们需要增加一些代码来完成这个要求。但在这里我们更关注的问题是，满足新的要求需要更改多少旧代码。</w:t>
-        <w:br/>
-        <w:t>A good software architecture would reduce the amount of changed code to the barest minimum. Ideally, zero.</w:t>
-        <w:br/>
-        <w:t>一个好的软件架构设计师会努力将旧代码的修改需求量降至最小，甚至为 0。</w:t>
-        <w:br/>
-        <w:t>How? By properly separating the things that change for different reasons (the Single Responsibility Principle), and then organizing the dependencies between those things properly (the Dependency Inversion Principle).</w:t>
-        <w:br/>
-        <w:t>但该如何实现这一点呢？我们可以先将满足不同需求的代码分组（即 SRP），然后再来调整这些分组之间的依赖关系（即 DIP）。</w:t>
-        <w:br/>
-        <w:t>By applying the SRP, we might come up with the data-flow view shown in Figure 8.1. Some analysis procedure inspects the financial data and produces reportable data, which is then formatted appropriately by the two reporter processes.</w:t>
-        <w:br/>
-        <w:t>利用 SRP，我们可以按图 8.1 中所展示的方式来处理数据流。即先用一段分析程序处理原始的财务数据，以形成报表的数据结构，最后再用两个不同的报表生成器来产生报表。</w:t>
-        <w:br/>
-        <w:t>Applying the SRP</w:t>
-        <w:br/>
-        <w:t>The essential insight here is that generating the report involves two separate responsibilities: the calculation of the reported data, and the presentation of that data into a web- and printer-friendly form.</w:t>
-        <w:br/>
-        <w:t>这里的核心就是将应用生成报表的过程拆成两个不同的操作。即先计算出报表数据，再生成具体的展示报表（分别以网页及纸质的形式展示）。</w:t>
-        <w:br/>
-        <w:t>Having made this separation, we need to organize the source code dependencies to ensure that changes to one of those responsibilities do not cause changes in the other. Also, the new organization should ensure that the behavior can be extended without undo modification.</w:t>
-        <w:br/>
-        <w:t>接下来，我们就该修改其源代码之间的依赖关系了。这样做的目的是保证其中一个操作被修改之后不会影响到另外一个操作。同时，我们所构建的新的组织形式应该保证该程序后续在行为上的扩展都无须修改现有代码。</w:t>
-        <w:br/>
-        <w:t>We accomplish this by partitioning the processes into classes, and separating those classes into components, as shown by the double lines in the diagram in Figure 8.2. In this figure, the component at the upper left is the Controller. At the upper right, we have the Interactor. At the lower right, there is the Database. Finally, at the lower left, there are four components that represent the Presenters and the Views.</w:t>
-        <w:br/>
-        <w:t>在具体实现上，我们会将整个程序进程划分成一系列的类，然后再将这些类分割成不同的组件。下面，我们用图 8.2 中的那些双线框来具体描述一下整个实现。在这个图中，左上角的组件是 Controller，右上角是 Interactor，右下角是 Database，左下角则有四个组件分别用于代表不同的 Presenter 和 View。</w:t>
-        <w:br/>
-        <w:t>Partitioning the processes into classes and separating the classes into components</w:t>
-        <w:br/>
-        <w:t>Classes marked with &lt;I&gt; are interfaces; those marked with &lt;DS&gt; are data structures. Open arrowheads are using relationships. Closed arrowheads are implements or inheritance relationships.</w:t>
-        <w:br/>
-        <w:t>在图 8.2 中，用 &lt;I&gt; 标记的类代表接口，用 &lt;DS&gt; 标记的则代表数据结构；开放箭头指代的是使用关系，闭合箭头则指代了实现与继承关系。</w:t>
-        <w:br/>
-        <w:t>The first thing to notice is that all the dependencies are source code dependencies. An arrow pointing from class A to class B means that the source code of class A mentions the name of class B, but class B mentions nothing about class A. Thus, in Figure 8.2, FinancialDataMapper knows about FinancialDataGateway through an implements relationship, but FinancialDataGateway knows nothing at all about FinancialDataMapper.</w:t>
-        <w:br/>
-        <w:t>首先，我们在图 8.2 中看到的所有依赖关系都是其源代码中存在的依赖关系。这里，从类 A 指向类 B 的箭头意味着 A 的源代码中涉及了 B，但 是 B 的源代码中并不涉及 A。因此在图 8.2 中，FinancialDataMapper 在实现接口时需要知道 FinancialDataGateway 的实现，而 FinancialDataGateway 则完全知道 FinancialDataMapper 的实现。</w:t>
-        <w:br/>
-        <w:t>The next thing to notice is that each double line is crossed in one direction only. This means that all component relationships are unidirectional, as shown in the component graph in Figure 8.3. These arrows point toward the components that we want to protect from change.</w:t>
-        <w:br/>
-        <w:t>其次，这里很重要的一点是这些双线框的边界都是单向跨越的。也就是说，上图中所有组件之间的关系都是单向依赖的，如图 8.3 所示，图中的箭头都指向那些我们不想经常更改的组件。</w:t>
-        <w:br/>
-        <w:t>The component relationships are unidirectional</w:t>
-        <w:br/>
-        <w:t>Let me say that again: If component A should be protected from changes in component B, then component B should depend on component A.</w:t>
-        <w:br/>
-        <w:t>让我们再来复述一下这里的设计原则：如果 A 组件不想被 B 组件上发生的修改所影响，那么就应该让 B 组件依赖于 A 组件。</w:t>
-        <w:br/>
-        <w:t>We want to protect the Controller from changes in the Presenters. We want to protect the Presenters from changes in the Views. We want to protect the Interactor from changes in—well, anything.</w:t>
-        <w:br/>
-        <w:t>所以现在的情况是，我们不想让发生在 Presenter 上的修改影响到 Controller，也不想让发生在 View 上的修改影响到 Presenter。而最关键的是，我们不想让任何修改影响到 Interactor。</w:t>
-        <w:br/>
-        <w:t>The Interactor is in the position that best conforms to the OCP. Changes to the Database, or the Controller, or the Presenters, or the Views, will have no impact on the Interactor.</w:t>
-        <w:br/>
-        <w:t>其中，Interactor 组件是整个系统中最符合 OCP 的。发生在 Database、Controller、Presenter 甚至 View 上的修改都不会影响到 Interactor。</w:t>
-        <w:br/>
-        <w:t>Why should the Interactor hold such a privileged position? Because it contains the business rules. The Interactor contains the highest-level policies of the application. All the other components are dealing with peripheral concerns. The Interactor deals with the central concern.</w:t>
-        <w:br/>
-        <w:t>为什么 Interactor 会被放在这么重要的位置上呢？因为它是该程序的业务逻辑所在之处，Interactor 中包含了其最高层次的应用策略。其他组件都只是负责处理周边的辅助逻辑，只有 Interactor 才是核心组件。</w:t>
-        <w:br/>
-        <w:t>Even though the Controller is peripheral to the Interactor, it is nevertheless central to the Presenters and Views. And while the Presenters might be peripheral to the Controller, they are central to the Views.</w:t>
-        <w:br/>
-        <w:t>虽然 Controller 组件只是 Interactor 的附属品，但它却是 Presenter 和 View 所服务的核心。同样的，虽然 Presenter 组件是 Controller 的附属品，但它却是 View 所服务的核心。</w:t>
-        <w:br/>
-        <w:t>Notice how this creates a hierarchy of protection based on the notion of “level.” Interactors are the highest-level concept, so they are the most protected. Views are among the lowest-level concepts, so they are the least protected. Presenters are higher level than Views, but lower level than the Controller or the Interactor.</w:t>
-        <w:br/>
-        <w:t>另外需要注意的是，这里利用“层级”这个概念创造了一系列不同的保护层级。譬如，Interactor 是最高层的抽象，所以它被保护得最严密，而 Presenter 比 View 时层级高，但比 Controller 和 Interactor 的层级低。</w:t>
-        <w:br/>
-        <w:t>This is how the OCP works at the architectural level. Architects separate functionality based on how, why, and when it changes, and then organize that separated functionality into a hierarchy of components. Higher-level components in that hierarchy are protected from the changes made to lower-level components.</w:t>
-        <w:br/>
-        <w:t>以上就是我们在软件架构层次上对 OCP 这一设计原则的应用。软件架构师可以根据相关函数被修改的原因、修改的方式及修改的时间来对其进行分组隔离，并将这些互相隔离的函数分组整理成组件结构，使得高阶组件不会因低阶组件被修改而受到影响。</w:t>
-        <w:br/>
-        <w:t>DIRECTIONAL CONTROL 依赖方向的控制</w:t>
-        <w:br/>
-        <w:t>If you recoiled in horror from the class design shown earlier, look again. Much of the complexity in that diagram was intended to make sure that the dependencies between the components pointed in the correct direction.</w:t>
-        <w:br/>
-        <w:t>如果刚刚的类设计把你吓着了，别害怕！你刚刚在图表中所看到的复杂度是我们想要对组件之间的依赖方向进行控制而产生的。</w:t>
-        <w:br/>
-        <w:t>For example, the FinancialDataGateway interface between the FinancialReportGenerator and the FinancialDataMapper exists to invert the dependency that would otherwise have pointed from the Interactor component to the Database component. The same is true of the FinancialReportPresenter interface, and the two View interfaces.</w:t>
-        <w:br/>
-        <w:t>例如，FinanciaIReportGenerator 和 FinancialDataMapper 之间的 Financial Da taGateway 接口是为了反转 Interactor 与 Database 之间的依赖关系而产生的。同样的，FinancialReportPresenter 接口与两个 View 接口之间也类似于这种情况。</w:t>
-        <w:br/>
-        <w:t>INFORMATION HIDING 信息隐藏</w:t>
-        <w:br/>
-        <w:t>The FinancialReportRequester interface serves a different purpose. It is there to protect the FinancialReportController from knowing too much about the internals of the Interactor. If that interface were not there, then the Controller would have transitive dependencies on the FinancialEntities.</w:t>
-        <w:br/>
-        <w:t>当然，FinancialReportRequester 接口的作用则完全不同，它的作用是保护 FinancialReportController 不过度依赖于 Interactor 的内部细节。如果没有这个接口，则 Controller 将会传递性地依赖于 FinancialEntities。</w:t>
-        <w:br/>
-        <w:t>Transitive dependencies are a violation of the general principle that software entities should not depend on things they don’t directly use. We’ll encounter that principle again when we talk about the Interface Segregation Principle and the Common Reuse Principle.</w:t>
-        <w:br/>
-        <w:t>这种传递性依赖违反了“软件系统不应该依赖其不直接使用的组件”这一基本原则。之后，我们会在讨论接口隔离原则和共同复用原则的时候再次提到这一点。</w:t>
-        <w:br/>
-        <w:t>So, even though our first priority is to protect the Interactor from changes to the Controller, we also want to protect the Controller from changes to the Interactor by hiding the internals of the Interactor.</w:t>
-        <w:br/>
-        <w:t>所以，虽然我们的首要目的是为了让 Interactor 屏蔽掉发生在 Controller 上的修改，但也需要通过隐藏 Interactor 内部细节的方法来让其屏蔽掉来自 Controller 的依赖。</w:t>
-        <w:br/>
-        <w:t>CONCLUSION 本章小结</w:t>
-        <w:br/>
-        <w:t>The OCP is one of the driving forces behind the architecture of systems. The goal is to make the system easy to extend without incurring a high impact of change. This goal is accomplished by partitioning the system into components, and arranging those components into a dependency hierarchy that protects higher-level components from changes in lower-level components.</w:t>
-        <w:br/>
-        <w:t>OCP 是我们进行系统架构设计的主导原则，其主要目标是让系统易于扩展，同时限制其每次被修改所影响的范围。实现方式是通过将系统划分为一系列组件，并且将这些组件间的依赖关系按层次结构进行组织，使得高阶组件不会因低阶组件被修改而受到影响。</w:t>
-      </w:r>
-    </w:p>
-    <w:p>
-      <w:pPr>
-        <w:pStyle w:val="Title"/>
-      </w:pPr>
-      <w:r>
-        <w:t>Chap9. LSP：里氏替换原则</w:t>
-      </w:r>
-    </w:p>
-    <w:p>
-      <w:r>
-        <w:t>Chap9. LSP: THE LISKOV SUBSTITUTION PRINCIPLE LSP：里氏替换原则</w:t>
-        <w:br/>
-        <w:t>GUIDING THE USE OF INHERITANCE 继承的使用指导</w:t>
-        <w:br/>
-        <w:t>THE SQUARE/RECTANGLE PROBLEM 正方形/长方形问题</w:t>
-        <w:br/>
-        <w:t>LSP AND ARCHITECTURE LSP 与软件架构</w:t>
-        <w:br/>
-        <w:t>EXAMPLE LSP VIOLATION 违反 LSP 的案例</w:t>
-        <w:br/>
-        <w:t>CONCLUSION 本章小结</w:t>
-        <w:br/>
-        <w:t>Chap9. LSP: THE LISKOV SUBSTITUTION PRINCIPLE LSP：里氏替换原则</w:t>
-        <w:br/>
-        <w:t>In 1988, Barbara Liskov wrote the following as a way of defining subtypes.</w:t>
-        <w:br/>
-        <w:t>1988 年，Barbara Liskov 在描述如何定义子类型时写下了这样一段话：</w:t>
-        <w:br/>
-        <w:t>What is wanted here is something like the following substitution property: If for each object o1 of type S there is an object o2 of type T such that for all programs P defined in terms of T, the behavior of P is unchanged when o1 is substituted for o2 then S is a subtype of T.1</w:t>
-        <w:br/>
-        <w:t>这里需要的是一种可替换性：如果对于每个类型是 S 的对象 o1 都存在一个类型为 T 的对象 o2，能使操作 T 类型的程序 P 在用 o2 替换 o1 时行为保持不变，我们就可以将 S 称为 T 的子类型。</w:t>
-        <w:br/>
-        <w:t>To understand this idea, which is known as the Liskov Substitution Principle (LSP), let’s look at some examples.</w:t>
-        <w:br/>
-        <w:t>为了让读者理解这段话中所体现的设计理念，也就是里氏替换原则（LSP），我们可以来看几个例子。</w:t>
-        <w:br/>
-        <w:t>GUIDING THE USE OF INHERITANCE 继承的使用指导</w:t>
-        <w:br/>
-        <w:t>Imagine that we have a class named License, as shown in Figure 9.1. This class has a method named calcFee(), which is called by the Billing application. There are two “subtypes” of License: PersonalLicense and BusinessLicense. They use different algorithms to calculate the license fee.</w:t>
-        <w:br/>
-        <w:t>假设我们有一个 License 类，其结构如图 9.1 所示。该类中有一个名为 calcFee() 的方法，该方法将由 Billing 应用程序来调用。而 License 类有两个“子类型”：PersonalLicense 与 BusinessLicense，这两个类会用不同的算法来计算授权费用。</w:t>
-        <w:br/>
-        <w:t>License, and its derivatives, conform to LSP</w:t>
-        <w:br/>
-        <w:t>This design conforms to the LSP because the behavior of the Billing application does not depend, in any way, on which of the two subtypes it uses. Both of the subtypes are substitutable for the License type.</w:t>
-        <w:br/>
-        <w:t>上述设计是符合 LSP 原则的，因为 Billing 应用程序的行为并不依赖于其使用的任何一个衍生类。也就是说，这两个衍生类的对象都是可以用来替换 License 类对象的。</w:t>
-        <w:br/>
-        <w:t>THE SQUARE/RECTANGLE PROBLEM 正方形/长方形问题</w:t>
-        <w:br/>
-        <w:t>The canonical example of a violation of the LSP is the famed (or infamous, depending on your perspective) square/rectangle problem (Figure 9.2).</w:t>
-        <w:br/>
-        <w:t>正方形/长方形问题是个著名（或者说臭名远扬）的违反 LSP 的设计案例（这个问题的结构如图 9.2 所示）。</w:t>
-        <w:br/>
-        <w:t>The infamous square/rectangle problem</w:t>
-        <w:br/>
-        <w:t>In this example, Square is not a proper subtype of Rectangle because the height and width of the Rectangle are independently mutable; in contrast, the height and width of the Square must change together. Since the User believes it is communicating with a Rectangle, it could easily get confused. The following code shows why:</w:t>
-        <w:br/>
-        <w:t>在这个案例中，Square 类并不是 Rectangle 类的子类型，因为 Rectangle 类的高和宽可以分别修改，而 Square 类的高和宽则必须一同修改。由于 User 类 始终认为自己在操作 Rectangle 类，因此会带来一些混淆。例如在下面的代码中：</w:t>
-        <w:br/>
-        <w:t>Rectangle r = …</w:t>
-        <w:br/>
-        <w:t>r.setW(5);</w:t>
-        <w:br/>
-        <w:t>r.setH(2);</w:t>
-        <w:br/>
-        <w:t>assert(r.area() == 10);</w:t>
-        <w:br/>
-        <w:t>If the … code produced a Square, then the assertion would fail.</w:t>
-        <w:br/>
-        <w:t>很显然，如果上述代码在…处返回的是 Square 类，则最后的这个 assert 是不会成立的。</w:t>
-        <w:br/>
-        <w:t>The only way to defend against this kind of LSP violation is to add mechanisms to the User (such as an if statement) that detects whether the Rectangle is, in fact, a Square. Since the behavior of the User depends on the types it uses, those types are not substitutable.</w:t>
-        <w:br/>
-        <w:t>如果想要防范这种违反 LSP 的行为，唯一的办法就是在 user 类中增加用于区分 Rectangle 和 Square 的检测逻辑（例如增加 if 语句）。但这样一来，user 为的行为又将依赖于它所使用的类，这两个类就不能互相替换了。</w:t>
-        <w:br/>
-        <w:t>LSP AND ARCHITECTURE LSP 与软件架构</w:t>
-        <w:br/>
-        <w:t>In the early years of the object-oriented revolution, we thought of the LSP as a way to guide the use of inheritance, as shown in the previous sections. However, over the years the LSP has morphed into a broader principle of software design that pertains to interfaces and implementations.</w:t>
-        <w:br/>
-        <w:t>在面向对象这场编程革命兴起的早期，我们的普遍认知正如上文所说，认为 LSP 只不过是指导如何使用继承关系的一种方法，然而随着时间的推移，LSP 逐渐演变成了一种更广泛的、指导接口与其实现方式的设计原则。</w:t>
-        <w:br/>
-        <w:t>The interfaces in question can be of many forms. We might have a Java-style interface, implemented by several classes. Or we might have several Ruby classes that share the same method signatures. Or we might have a set of services that all respond to the same REST interface.</w:t>
-        <w:br/>
-        <w:t>这里提到的接口可以有多种形式——可以是 Java 风格的接口，具有多个实现类；也可以像 Ruby 一样，几个类共用一样的方法签名，甚至可以是几个服务响应同一个 REST 接口。</w:t>
-        <w:br/>
-        <w:t>In all of these situations, and more, the LSP is applicable because there are users who depend on well-defined interfaces, and on the substitutability of the implementations of those interfaces.</w:t>
-        <w:br/>
-        <w:t>LSP 适用于上述所有的应用场景，因为这些场景中的用户都依赖于一种接口，并且都期待实现该接口的类之间能具有可替换性。</w:t>
-        <w:br/>
-        <w:t>The best way to understand the LSP from an architectural viewpoint is to look at what happens to the architecture of a system when the principle is violated.</w:t>
-        <w:br/>
-        <w:t>想要从软件架构的角度来理解 LSP 的意义，最好的办法还是来看几个反面案例。</w:t>
-        <w:br/>
-        <w:t>EXAMPLE LSP VIOLATION 违反 LSP 的案例</w:t>
-        <w:br/>
-        <w:t>Assume that we are building an aggregator for many taxi dispatch services. Customers use our website to find the most appropriate taxi to use, regardless of taxi company. Once the customer makes a decision, our system dispatches the chosen taxi by using a restful service.</w:t>
-        <w:br/>
-        <w:t>假设我们现在正在构建一个提供出租车调度服务的系统。在该系统中，用户可以通过访问我们的网站，从多个出租车公司内寻找最适合自己的出租车。当用户选定车子时，该系统会通过调用 restful 服务接口来调度这辆车。</w:t>
-        <w:br/>
-        <w:t>Now assume that the URI for the restful dispatch service is part of the information contained in the driver database. Once our system has chosen a driver appropriate for the customer, it gets that URI from the driver record and then uses it to dispatch the driver.</w:t>
-        <w:br/>
-        <w:t>接下来，我们再假设该 restful 调度服务接口的 URI 被存储在司机数据库中。一旦该系统选中了最合适的出租车司机，它就会从司机数据库的记录中读取相应的 URI 信息，并通过调用这个 URI 来调度汽车。</w:t>
-        <w:br/>
-        <w:t>Suppose Driver Bob has a dispatch URI that looks like this:</w:t>
-        <w:br/>
-        <w:t>也就是说，如果司机 Bob 的记录中包含如下调度 URI：</w:t>
-        <w:br/>
-        <w:t>purplecab.com/driver/Bob</w:t>
-        <w:br/>
-        <w:t>Our system will append the dispatch information onto this URI and send it with a PUT, as follows:</w:t>
-        <w:br/>
-        <w:t>那么，我们的系统就会将调度信息附加在这个 URI 上，并发送这样一个 PUT 请求：</w:t>
-        <w:br/>
-        <w:t>purplecab.com/driver/Bob</w:t>
-        <w:br/>
-        <w:t xml:space="preserve">       /pickupAddress/24 Maple St.</w:t>
-        <w:br/>
-        <w:t xml:space="preserve">       /pickupTime/153</w:t>
-        <w:br/>
-        <w:t xml:space="preserve">       /destination/ORD</w:t>
-        <w:br/>
-        <w:t>Clearly, this means that all the dispatch services, for all the different companies, must conform to the same REST interface. They must treat the pickupAddress, pickupTime, and destination fields identically.</w:t>
-        <w:br/>
-        <w:t>很显然，这意味着所存参与该调度服务的公司都必须遵守同样的 REST 接口，它们必须用同样的方式处理 pickupAddress、pickupTime 和 destination 字段。</w:t>
-        <w:br/>
-        <w:t>Now suppose the Acme taxi company hired some programmers who didn’t read the spec very carefully. They abbreviated the destination field to just dest. Acme is the largest taxi company in our area, and Acme’s CEO’s ex-wife is our CEO’s new wife, and … Well, you get the picture. What would happen to the architecture of our system?</w:t>
-        <w:br/>
-        <w:t>接下来，我们再假设 Acme 出租车公司现在招聘的程序员由于没有仔细阅读上述接口定义，结果将 destination 字段缩写成了 dest。而 Acme 又是本地最大的出租车公司，另外，Acme CEO 的前妻不巧还是我们 CEO 的新欢……你懂的！这这会对系统的架构造成什么影响呢？</w:t>
-        <w:br/>
-        <w:t>Obviously, we would need to add a special case. The dispatch request for any Acme driver would have to be constructed using a different set of rules from all the other drivers.</w:t>
-        <w:br/>
-        <w:t>显然，我们需要为系统增加一类特殊用例，以应对 Acme 司机的调度请求。这必须要用另外一套规则来构建。</w:t>
-        <w:br/>
-        <w:t>The simplest way to accomplish this goal would be to add an if statement to the module that constructed the dispatch command:</w:t>
-        <w:br/>
-        <w:t>最简单的做法当然是增加一条 if 语句：</w:t>
-        <w:br/>
-        <w:t>if (driver.getDispatchUri().startsWith("acme.com"))…</w:t>
-        <w:br/>
-        <w:t>But, of course, no architect worth his or her salt would allow such a construction to exist in the system. Putting the word “acme” into the code itself creates an opportunity for all kinds of horrible and mysterious errors, not to mention security breaches.</w:t>
-        <w:br/>
-        <w:t>然而很明显，任何一个称职的软件架构师都不会允许这样一条语句出现在自己的系统中。因为直接将“acme”这样的字串写入代码会留下各种各样神奇又可怕的错误隐患，甚至会导致安全问题。</w:t>
-        <w:br/>
-        <w:t>For example, what if Acme became even more successful and bought the Purple Taxi company. What if the merged company maintained the separate brands and the separate websites, but unified all of the original companies’ systems? Would we have to add another if statement for “purple”?</w:t>
-        <w:br/>
-        <w:t>例如，Acme 也许会变得更加成功，最终收购了 Purple 出租车公司。然后，它们在保留了各自名字的同时却统一了彼此的计算机系统。在这种情况下，系统中难道还要再增加一条“purple”的特例吗？</w:t>
-        <w:br/>
-        <w:t>Our architect would have to insulate the system from bugs like this by creating some kind of dispatch command creation module that was driven by a configuration database keyed by the dispatch URI. The configuration data might look something like this:</w:t>
-        <w:br/>
-        <w:t>软件架构师应该创建一个调度请求创建组件，并让该组件使用一个配置数据库来保存 URI 组装格式，这样的方式可以保护系统不受外界因素变化的影响。例如其配置信息可以如下：</w:t>
-        <w:br/>
-        <w:t>URI Dispatch Format</w:t>
-        <w:br/>
-        <w:t>Acme.com /pickupAddress/%s/pickupTime/%s/dest/%s</w:t>
-        <w:br/>
-        <w:t>*.* /pickupAddress/%s/pickupTime/%s/destination/%s</w:t>
-        <w:br/>
-        <w:t>And so our architect has had to add a significant and complex mechanism to deal with the fact that the interfaces of the restful services are not all substitutable.</w:t>
-        <w:br/>
-        <w:t>但这样一来，软件架构师就需要通过增加一个复杂的组件来应对并不完全能实现互相替换的 restful 服务接口。</w:t>
-        <w:br/>
-        <w:t>CONCLUSION 本章小结</w:t>
-        <w:br/>
-        <w:t>The LSP can, and should, be extended to the level of architecture. A simple violation of substitutability, can cause a system’s architecture to be polluted with a significant amount of extra mechanisms.</w:t>
-        <w:br/>
-        <w:t>LSP 可以且应该被应用于软件架构层面，因为一旦违背了可替换也该系统架构就不得不为此增添大量复杂的应对机制。</w:t>
       </w:r>
     </w:p>
     <w:p>
@@ -7619,7 +7663,7 @@
         <w:br/>
         <w:t>Software architecture begins with the code—and so we will begin our discussion of architecture by looking at what we’ve learned about code since code was first written.</w:t>
         <w:br/>
-        <w:t>任何软件架构的实现都离不开具体的代码，所以我们对软件架构的讨论应该从第一行被写下的代码开始。</w:t>
+        <w:t>任何软件架构的实现都离不开具体的代码，所以我们对软件架构的讨论应该从第一行被写下的代码开始。软件</w:t>
         <w:br/>
         <w:t>In 1938, Alan Turing laid the foundations of what was to become computer programming. He was not the first to conceive of a programmable machine, but he was the first to understand that programs were simply data. By 1945, Turing was writing real programs on real computers in code that we would recognize (if we squinted enough). Those programs used loops, branches, assignment, subroutines, stacks, and other familiar structures. Turing’s language was binary.</w:t>
         <w:br/>
@@ -7629,7 +7673,7 @@
         <w:br/>
         <w:t>从那时到现在，编程领域历经了数次变革，其中我们都很熟悉的就是编程语言的变革。首先是在 20 世纪 40 年代末期出现了汇编器（assembler），它能自动将一段程序转化为相应的二进制数序列，大幅解放了程序员。然后是 1951 年，Grace Hopper 发明了 A0，这是世界上第一个编译器（compiler）。事实上，编译器这个名字就是他定义和推广使用的。再接着就到了 1953 年，那一年 FORTRAN 面世了（就在我出生的第二年）。接下来就是层出不穷的新编程语言了——COBOL、PL/1、SNOBOL、C、Pascal、C++、Java 等等，不胜枚举。</w:t>
         <w:br/>
-        <w:t>Another, probably more significant, revolution was in programming paradigms. Paradigms are ways of programming, relatively unrelated to languages. A paradigm tells you which programming structures to use, and when to use them. To date, there have been three such paradigms. For reasons we shall discuss later, there are unlikely to be any others.</w:t>
+        <w:t>Another, probably more significant, revolution was in programming paradigms. Paradigms are ways of programming, relatively unrelated to languages. A paradigm tells you which programming structures to use, and when to use them. To date, there have been three such paradigms. For reasons we shall discuss later, there are unlikely to be any others.计算机硬件</w:t>
         <w:br/>
         <w:t>除此之外，计算机编程领域还经历了另外一个更巨大、更重要的变革，那就果编程范式（paradigm）的变迁。编程范式指的是程序的编写模式，与具体的编程语言关系相对较小。这些范式会告诉你应该在什么时候采用什么样的代码结构。直到今天，我们也一共只有三个编程范式，而且未来几乎不可能再出现新的，接下来我们就看一下为什么。</w:t>
       </w:r>

</xml_diff>